<commit_message>
Add Archivist badge progression
Co-authored-by: Copilot <223556219+Copilot@users.noreply.github.com>
</commit_message>
<xml_diff>
--- a/docs/BADGE-PIANO.docx
+++ b/docs/BADGE-PIANO.docx
@@ -2,7 +2,7 @@
 <file path=word/document.xml><?xml version="1.0" encoding="utf-8"?>
 <w:document xmlns:w="http://schemas.openxmlformats.org/wordprocessingml/2006/main" xmlns:m="http://schemas.openxmlformats.org/officeDocument/2006/math" xmlns:r="http://schemas.openxmlformats.org/officeDocument/2006/relationships" xmlns:o="urn:schemas-microsoft-com:office:office" xmlns:v="urn:schemas-microsoft-com:vml" xmlns:w10="urn:schemas-microsoft-com:office:word" xmlns:a="http://schemas.openxmlformats.org/drawingml/2006/main" xmlns:pic="http://schemas.openxmlformats.org/drawingml/2006/picture" xmlns:wp="http://schemas.openxmlformats.org/drawingml/2006/wordprocessingDrawing">
   <w:body>
-    <w:bookmarkStart w:id="99" w:name="badge-showtime-proposta-e-piano"/>
+    <w:bookmarkStart w:id="100" w:name="badge-showtime-proposta-e-piano"/>
     <w:p>
       <w:pPr>
         <w:pStyle w:val="Heading1"/>
@@ -91,13 +91,13 @@
         <w:t xml:space="preserve"> </w:t>
       </w:r>
       <w:r>
-        <w:t xml:space="preserve">backend Batch A1 distribuito e verificato; Sala trofei aggiornata</w:t>
+        <w:t xml:space="preserve">Batch A1 pubblicato; Archivista (A2.1) completato localmente e in</w:t>
       </w:r>
       <w:r>
         <w:t xml:space="preserve"> </w:t>
       </w:r>
       <w:r>
-        <w:t xml:space="preserve">validata localmente con dati reali, in attesa di pubblicazione web</w:t>
+        <w:t xml:space="preserve">attesa di rollout Supabase/web</w:t>
       </w:r>
     </w:p>
     <w:p>
@@ -8089,7 +8089,7 @@
     </w:p>
     <w:bookmarkEnd w:id="73"/>
     <w:bookmarkEnd w:id="74"/>
-    <w:bookmarkStart w:id="87" w:name="piano-di-implementazione"/>
+    <w:bookmarkStart w:id="88" w:name="piano-di-implementazione"/>
     <w:p>
       <w:pPr>
         <w:pStyle w:val="Heading2"/>
@@ -9157,7 +9157,7 @@
     </w:p>
     <w:bookmarkEnd w:id="80"/>
     <w:bookmarkEnd w:id="81"/>
-    <w:bookmarkStart w:id="84" w:name="verifica-batch-a1-badge-introduttivi"/>
+    <w:bookmarkStart w:id="82" w:name="verifica-batch-a1-badge-introduttivi"/>
     <w:p>
       <w:pPr>
         <w:pStyle w:val="Heading3"/>
@@ -9711,7 +9711,263 @@
         <w:t xml:space="preserve">usati dal progetto.</w:t>
       </w:r>
     </w:p>
-    <w:bookmarkStart w:id="82" w:name="batch-b-esplorazione-e-comportamento"/>
+    <w:bookmarkEnd w:id="82"/>
+    <w:bookmarkStart w:id="85" w:name="verifica-batch-a2.1-archivista"/>
+    <w:p>
+      <w:pPr>
+        <w:pStyle w:val="Heading3"/>
+      </w:pPr>
+      <w:r>
+        <w:t xml:space="preserve">Verifica Batch A2.1 — Archivista</w:t>
+      </w:r>
+    </w:p>
+    <w:p>
+      <w:pPr>
+        <w:pStyle w:val="Compact"/>
+        <w:numPr>
+          <w:ilvl w:val="0"/>
+          <w:numId w:val="1076"/>
+        </w:numPr>
+      </w:pPr>
+      <w:r>
+        <w:t xml:space="preserve">migration</w:t>
+      </w:r>
+      <w:r>
+        <w:t xml:space="preserve"> </w:t>
+      </w:r>
+      <w:r>
+        <w:rPr>
+          <w:rStyle w:val="VerbatimChar"/>
+        </w:rPr>
+        <w:t xml:space="preserve">0019_archivist_badge.sql</w:t>
+      </w:r>
+      <w:r>
+        <w:t xml:space="preserve"> </w:t>
+      </w:r>
+      <w:r>
+        <w:t xml:space="preserve">con soglie</w:t>
+      </w:r>
+      <w:r>
+        <w:t xml:space="preserve"> </w:t>
+      </w:r>
+      <w:r>
+        <w:rPr>
+          <w:rStyle w:val="VerbatimChar"/>
+        </w:rPr>
+        <w:t xml:space="preserve">500 / 1.500 / 2.500 / 5.000</w:t>
+      </w:r>
+      <w:r>
+        <w:t xml:space="preserve">;</w:t>
+      </w:r>
+    </w:p>
+    <w:p>
+      <w:pPr>
+        <w:pStyle w:val="Compact"/>
+        <w:numPr>
+          <w:ilvl w:val="0"/>
+          <w:numId w:val="1076"/>
+        </w:numPr>
+      </w:pPr>
+      <w:r>
+        <w:t xml:space="preserve">conteggio di ogni voce distinta della Libreria, indipendentemente da stato o tipo media;</w:t>
+      </w:r>
+    </w:p>
+    <w:p>
+      <w:pPr>
+        <w:pStyle w:val="Compact"/>
+        <w:numPr>
+          <w:ilvl w:val="0"/>
+          <w:numId w:val="1076"/>
+        </w:numPr>
+      </w:pPr>
+      <w:r>
+        <w:t xml:space="preserve">fact loader paginato oltre 1.000 righe;</w:t>
+      </w:r>
+    </w:p>
+    <w:p>
+      <w:pPr>
+        <w:pStyle w:val="Compact"/>
+        <w:numPr>
+          <w:ilvl w:val="0"/>
+          <w:numId w:val="1076"/>
+        </w:numPr>
+      </w:pPr>
+      <w:r>
+        <w:t xml:space="preserve">evidenza privata limitata a conteggio, versione e data già aggiunti dalla RPC, senza</w:t>
+      </w:r>
+      <w:r>
+        <w:t xml:space="preserve"> </w:t>
+      </w:r>
+      <w:r>
+        <w:t xml:space="preserve">duplicare migliaia di ID nel JSON;</w:t>
+      </w:r>
+    </w:p>
+    <w:p>
+      <w:pPr>
+        <w:pStyle w:val="Compact"/>
+        <w:numPr>
+          <w:ilvl w:val="0"/>
+          <w:numId w:val="1076"/>
+        </w:numPr>
+      </w:pPr>
+      <w:r>
+        <w:t xml:space="preserve">rivalutazione non bloccante soltanto dopo aggiunta o rimozione dalla Libreria;</w:t>
+      </w:r>
+    </w:p>
+    <w:p>
+      <w:pPr>
+        <w:pStyle w:val="Compact"/>
+        <w:numPr>
+          <w:ilvl w:val="0"/>
+          <w:numId w:val="1076"/>
+        </w:numPr>
+      </w:pPr>
+      <w:r>
+        <w:t xml:space="preserve">massimo storico e sblocchi permanenti gestiti dalla RPC condivisa;</w:t>
+      </w:r>
+    </w:p>
+    <w:p>
+      <w:pPr>
+        <w:pStyle w:val="Compact"/>
+        <w:numPr>
+          <w:ilvl w:val="0"/>
+          <w:numId w:val="1076"/>
+        </w:numPr>
+      </w:pPr>
+      <w:r>
+        <w:t xml:space="preserve">patch originale a schedario nelle varianti Bronzo, Argento, Oro e Platino;</w:t>
+      </w:r>
+    </w:p>
+    <w:p>
+      <w:pPr>
+        <w:pStyle w:val="Compact"/>
+        <w:numPr>
+          <w:ilvl w:val="0"/>
+          <w:numId w:val="1076"/>
+        </w:numPr>
+      </w:pPr>
+      <w:r>
+        <w:t xml:space="preserve">Cinefilo mantenuto prima di Archivista nell’ordine della Sala trofei;</w:t>
+      </w:r>
+    </w:p>
+    <w:p>
+      <w:pPr>
+        <w:pStyle w:val="Compact"/>
+        <w:numPr>
+          <w:ilvl w:val="0"/>
+          <w:numId w:val="1076"/>
+        </w:numPr>
+      </w:pPr>
+      <w:r>
+        <w:t xml:space="preserve">preview locale:</w:t>
+      </w:r>
+      <w:r>
+        <w:t xml:space="preserve"> </w:t>
+      </w:r>
+      <w:r>
+        <w:rPr>
+          <w:rStyle w:val="VerbatimChar"/>
+        </w:rPr>
+        <w:t xml:space="preserve">Archivista 0/4</w:t>
+      </w:r>
+      <w:r>
+        <w:t xml:space="preserve">, progresso</w:t>
+      </w:r>
+      <w:r>
+        <w:t xml:space="preserve"> </w:t>
+      </w:r>
+      <w:r>
+        <w:rPr>
+          <w:rStyle w:val="VerbatimChar"/>
+        </w:rPr>
+        <w:t xml:space="preserve">5/500</w:t>
+      </w:r>
+      <w:r>
+        <w:t xml:space="preserve">, hero</w:t>
+      </w:r>
+      <w:r>
+        <w:t xml:space="preserve"> </w:t>
+      </w:r>
+      <w:r>
+        <w:rPr>
+          <w:rStyle w:val="VerbatimChar"/>
+        </w:rPr>
+        <w:t xml:space="preserve">3/11</w:t>
+      </w:r>
+      <w:r>
+        <w:t xml:space="preserve">;</w:t>
+      </w:r>
+    </w:p>
+    <w:p>
+      <w:pPr>
+        <w:pStyle w:val="Compact"/>
+        <w:numPr>
+          <w:ilvl w:val="0"/>
+          <w:numId w:val="1076"/>
+        </w:numPr>
+      </w:pPr>
+      <w:r>
+        <w:t xml:space="preserve">patch e accordion verificati senza overflow a 360 e 390 px;</w:t>
+      </w:r>
+    </w:p>
+    <w:p>
+      <w:pPr>
+        <w:pStyle w:val="Compact"/>
+        <w:numPr>
+          <w:ilvl w:val="0"/>
+          <w:numId w:val="1076"/>
+        </w:numPr>
+      </w:pPr>
+      <w:r>
+        <w:rPr>
+          <w:rStyle w:val="VerbatimChar"/>
+        </w:rPr>
+        <w:t xml:space="preserve">16/16</w:t>
+      </w:r>
+      <w:r>
+        <w:t xml:space="preserve"> </w:t>
+      </w:r>
+      <w:r>
+        <w:t xml:space="preserve">test engine superati;</w:t>
+      </w:r>
+    </w:p>
+    <w:p>
+      <w:pPr>
+        <w:pStyle w:val="Compact"/>
+        <w:numPr>
+          <w:ilvl w:val="0"/>
+          <w:numId w:val="1076"/>
+        </w:numPr>
+      </w:pPr>
+      <w:r>
+        <w:t xml:space="preserve">test SQL transazionale pronto per soglia</w:t>
+      </w:r>
+      <w:r>
+        <w:t xml:space="preserve"> </w:t>
+      </w:r>
+      <w:r>
+        <w:rPr>
+          <w:rStyle w:val="VerbatimChar"/>
+        </w:rPr>
+        <w:t xml:space="preserve">1.500</w:t>
+      </w:r>
+      <w:r>
+        <w:t xml:space="preserve">, idempotenza e regressione a</w:t>
+      </w:r>
+      <w:r>
+        <w:t xml:space="preserve"> </w:t>
+      </w:r>
+      <w:r>
+        <w:rPr>
+          <w:rStyle w:val="VerbatimChar"/>
+        </w:rPr>
+        <w:t xml:space="preserve">5</w:t>
+      </w:r>
+      <w:r>
+        <w:t xml:space="preserve">.</w:t>
+      </w:r>
+    </w:p>
+    <w:bookmarkStart w:id="83" w:name="batch-b-esplorazione-e-comportamento"/>
     <w:p>
       <w:pPr>
         <w:pStyle w:val="Heading4"/>
@@ -9725,7 +9981,7 @@
         <w:pStyle w:val="Compact"/>
         <w:numPr>
           <w:ilvl w:val="0"/>
-          <w:numId w:val="1076"/>
+          <w:numId w:val="1077"/>
         </w:numPr>
       </w:pPr>
       <w:r>
@@ -9737,7 +9993,7 @@
         <w:pStyle w:val="Compact"/>
         <w:numPr>
           <w:ilvl w:val="0"/>
-          <w:numId w:val="1077"/>
+          <w:numId w:val="1078"/>
         </w:numPr>
       </w:pPr>
       <w:r>
@@ -9749,7 +10005,7 @@
         <w:pStyle w:val="Compact"/>
         <w:numPr>
           <w:ilvl w:val="0"/>
-          <w:numId w:val="1078"/>
+          <w:numId w:val="1079"/>
         </w:numPr>
       </w:pPr>
       <w:r>
@@ -9761,15 +10017,15 @@
         <w:pStyle w:val="Compact"/>
         <w:numPr>
           <w:ilvl w:val="0"/>
-          <w:numId w:val="1079"/>
+          <w:numId w:val="1080"/>
         </w:numPr>
       </w:pPr>
       <w:r>
         <w:t xml:space="preserve">Encore</w:t>
       </w:r>
     </w:p>
-    <w:bookmarkEnd w:id="82"/>
-    <w:bookmarkStart w:id="83" w:name="batch-c-diario-e-social"/>
+    <w:bookmarkEnd w:id="83"/>
+    <w:bookmarkStart w:id="84" w:name="batch-c-diario-e-social"/>
     <w:p>
       <w:pPr>
         <w:pStyle w:val="Heading4"/>
@@ -9783,7 +10039,7 @@
         <w:pStyle w:val="Compact"/>
         <w:numPr>
           <w:ilvl w:val="0"/>
-          <w:numId w:val="1080"/>
+          <w:numId w:val="1081"/>
         </w:numPr>
       </w:pPr>
       <w:r>
@@ -9795,16 +10051,16 @@
         <w:pStyle w:val="Compact"/>
         <w:numPr>
           <w:ilvl w:val="0"/>
-          <w:numId w:val="1081"/>
+          <w:numId w:val="1082"/>
         </w:numPr>
       </w:pPr>
       <w:r>
         <w:t xml:space="preserve">Passaparola</w:t>
       </w:r>
     </w:p>
-    <w:bookmarkEnd w:id="83"/>
     <w:bookmarkEnd w:id="84"/>
-    <w:bookmarkStart w:id="85" w:name="fase-4-profilo-e-rifiniture"/>
+    <w:bookmarkEnd w:id="85"/>
+    <w:bookmarkStart w:id="86" w:name="fase-4-profilo-e-rifiniture"/>
     <w:p>
       <w:pPr>
         <w:pStyle w:val="Heading3"/>
@@ -9818,7 +10074,7 @@
         <w:pStyle w:val="Compact"/>
         <w:numPr>
           <w:ilvl w:val="0"/>
-          <w:numId w:val="1082"/>
+          <w:numId w:val="1083"/>
         </w:numPr>
       </w:pPr>
       <w:r>
@@ -9830,7 +10086,7 @@
         <w:pStyle w:val="Compact"/>
         <w:numPr>
           <w:ilvl w:val="0"/>
-          <w:numId w:val="1083"/>
+          <w:numId w:val="1084"/>
         </w:numPr>
       </w:pPr>
       <w:r>
@@ -9842,7 +10098,7 @@
         <w:pStyle w:val="Compact"/>
         <w:numPr>
           <w:ilvl w:val="0"/>
-          <w:numId w:val="1084"/>
+          <w:numId w:val="1085"/>
         </w:numPr>
       </w:pPr>
       <w:r>
@@ -9854,7 +10110,7 @@
         <w:pStyle w:val="Compact"/>
         <w:numPr>
           <w:ilvl w:val="0"/>
-          <w:numId w:val="1085"/>
+          <w:numId w:val="1086"/>
         </w:numPr>
       </w:pPr>
       <w:r>
@@ -9866,7 +10122,7 @@
         <w:pStyle w:val="Compact"/>
         <w:numPr>
           <w:ilvl w:val="0"/>
-          <w:numId w:val="1086"/>
+          <w:numId w:val="1087"/>
         </w:numPr>
       </w:pPr>
       <w:r>
@@ -9878,15 +10134,15 @@
         <w:pStyle w:val="Compact"/>
         <w:numPr>
           <w:ilvl w:val="0"/>
-          <w:numId w:val="1087"/>
+          <w:numId w:val="1088"/>
         </w:numPr>
       </w:pPr>
       <w:r>
         <w:t xml:space="preserve">Riconciliazione completa</w:t>
       </w:r>
     </w:p>
-    <w:bookmarkEnd w:id="85"/>
-    <w:bookmarkStart w:id="86" w:name="fase-5-crediti-tmdb"/>
+    <w:bookmarkEnd w:id="86"/>
+    <w:bookmarkStart w:id="87" w:name="fase-5-crediti-tmdb"/>
     <w:p>
       <w:pPr>
         <w:pStyle w:val="Heading3"/>
@@ -9900,7 +10156,7 @@
         <w:pStyle w:val="Compact"/>
         <w:numPr>
           <w:ilvl w:val="0"/>
-          <w:numId w:val="1088"/>
+          <w:numId w:val="1089"/>
         </w:numPr>
       </w:pPr>
       <w:r>
@@ -9912,7 +10168,7 @@
         <w:pStyle w:val="Compact"/>
         <w:numPr>
           <w:ilvl w:val="0"/>
-          <w:numId w:val="1089"/>
+          <w:numId w:val="1090"/>
         </w:numPr>
       </w:pPr>
       <w:r>
@@ -9924,7 +10180,7 @@
         <w:pStyle w:val="Compact"/>
         <w:numPr>
           <w:ilvl w:val="0"/>
-          <w:numId w:val="1090"/>
+          <w:numId w:val="1091"/>
         </w:numPr>
       </w:pPr>
       <w:r>
@@ -9936,7 +10192,7 @@
         <w:pStyle w:val="Compact"/>
         <w:numPr>
           <w:ilvl w:val="0"/>
-          <w:numId w:val="1091"/>
+          <w:numId w:val="1092"/>
         </w:numPr>
       </w:pPr>
       <w:r>
@@ -9948,7 +10204,7 @@
         <w:pStyle w:val="Compact"/>
         <w:numPr>
           <w:ilvl w:val="0"/>
-          <w:numId w:val="1092"/>
+          <w:numId w:val="1093"/>
         </w:numPr>
       </w:pPr>
       <w:r>
@@ -9960,7 +10216,7 @@
         <w:pStyle w:val="Compact"/>
         <w:numPr>
           <w:ilvl w:val="0"/>
-          <w:numId w:val="1093"/>
+          <w:numId w:val="1094"/>
         </w:numPr>
       </w:pPr>
       <w:r>
@@ -9972,7 +10228,7 @@
         <w:pStyle w:val="Compact"/>
         <w:numPr>
           <w:ilvl w:val="0"/>
-          <w:numId w:val="1094"/>
+          <w:numId w:val="1095"/>
         </w:numPr>
       </w:pPr>
       <w:r>
@@ -9986,9 +10242,9 @@
         </w:pict>
       </w:r>
     </w:p>
-    <w:bookmarkEnd w:id="86"/>
     <w:bookmarkEnd w:id="87"/>
-    <w:bookmarkStart w:id="88" w:name="criteri-di-accettazione-v1"/>
+    <w:bookmarkEnd w:id="88"/>
+    <w:bookmarkStart w:id="89" w:name="criteri-di-accettazione-v1"/>
     <w:p>
       <w:pPr>
         <w:pStyle w:val="Heading2"/>
@@ -10002,7 +10258,7 @@
         <w:pStyle w:val="Compact"/>
         <w:numPr>
           <w:ilvl w:val="0"/>
-          <w:numId w:val="1095"/>
+          <w:numId w:val="1096"/>
         </w:numPr>
       </w:pPr>
       <w:r>
@@ -10014,7 +10270,7 @@
         <w:pStyle w:val="Compact"/>
         <w:numPr>
           <w:ilvl w:val="0"/>
-          <w:numId w:val="1095"/>
+          <w:numId w:val="1096"/>
         </w:numPr>
       </w:pPr>
       <w:r>
@@ -10026,7 +10282,7 @@
         <w:pStyle w:val="Compact"/>
         <w:numPr>
           <w:ilvl w:val="0"/>
-          <w:numId w:val="1095"/>
+          <w:numId w:val="1096"/>
         </w:numPr>
       </w:pPr>
       <w:r>
@@ -10038,7 +10294,7 @@
         <w:pStyle w:val="Compact"/>
         <w:numPr>
           <w:ilvl w:val="0"/>
-          <w:numId w:val="1095"/>
+          <w:numId w:val="1096"/>
         </w:numPr>
       </w:pPr>
       <w:r>
@@ -10050,7 +10306,7 @@
         <w:pStyle w:val="Compact"/>
         <w:numPr>
           <w:ilvl w:val="0"/>
-          <w:numId w:val="1095"/>
+          <w:numId w:val="1096"/>
         </w:numPr>
       </w:pPr>
       <w:r>
@@ -10062,7 +10318,7 @@
         <w:pStyle w:val="Compact"/>
         <w:numPr>
           <w:ilvl w:val="0"/>
-          <w:numId w:val="1095"/>
+          <w:numId w:val="1096"/>
         </w:numPr>
       </w:pPr>
       <w:r>
@@ -10074,7 +10330,7 @@
         <w:pStyle w:val="Compact"/>
         <w:numPr>
           <w:ilvl w:val="0"/>
-          <w:numId w:val="1095"/>
+          <w:numId w:val="1096"/>
         </w:numPr>
       </w:pPr>
       <w:r>
@@ -10086,7 +10342,7 @@
         <w:pStyle w:val="Compact"/>
         <w:numPr>
           <w:ilvl w:val="0"/>
-          <w:numId w:val="1095"/>
+          <w:numId w:val="1096"/>
         </w:numPr>
       </w:pPr>
       <w:r>
@@ -10098,7 +10354,7 @@
         <w:pStyle w:val="Compact"/>
         <w:numPr>
           <w:ilvl w:val="0"/>
-          <w:numId w:val="1095"/>
+          <w:numId w:val="1096"/>
         </w:numPr>
       </w:pPr>
       <w:r>
@@ -10110,7 +10366,7 @@
         <w:pStyle w:val="Compact"/>
         <w:numPr>
           <w:ilvl w:val="0"/>
-          <w:numId w:val="1095"/>
+          <w:numId w:val="1096"/>
         </w:numPr>
       </w:pPr>
       <w:r>
@@ -10124,8 +10380,8 @@
         </w:pict>
       </w:r>
     </w:p>
-    <w:bookmarkEnd w:id="88"/>
-    <w:bookmarkStart w:id="97" w:name="decisioni-v1-confermate"/>
+    <w:bookmarkEnd w:id="89"/>
+    <w:bookmarkStart w:id="98" w:name="decisioni-v1-confermate"/>
     <w:p>
       <w:pPr>
         <w:pStyle w:val="Heading2"/>
@@ -10134,7 +10390,7 @@
         <w:t xml:space="preserve">12. Decisioni V1 confermate</w:t>
       </w:r>
     </w:p>
-    <w:bookmarkStart w:id="89" w:name="nomi"/>
+    <w:bookmarkStart w:id="90" w:name="nomi"/>
     <w:p>
       <w:pPr>
         <w:pStyle w:val="Heading3"/>
@@ -10148,7 +10404,7 @@
         <w:pStyle w:val="Compact"/>
         <w:numPr>
           <w:ilvl w:val="0"/>
-          <w:numId w:val="1096"/>
+          <w:numId w:val="1097"/>
         </w:numPr>
       </w:pPr>
       <w:r>
@@ -10160,7 +10416,7 @@
         <w:pStyle w:val="Compact"/>
         <w:numPr>
           <w:ilvl w:val="0"/>
-          <w:numId w:val="1097"/>
+          <w:numId w:val="1098"/>
         </w:numPr>
       </w:pPr>
       <w:r>
@@ -10172,7 +10428,7 @@
         <w:pStyle w:val="Compact"/>
         <w:numPr>
           <w:ilvl w:val="0"/>
-          <w:numId w:val="1098"/>
+          <w:numId w:val="1099"/>
         </w:numPr>
       </w:pPr>
       <w:r>
@@ -10184,7 +10440,7 @@
         <w:pStyle w:val="Compact"/>
         <w:numPr>
           <w:ilvl w:val="0"/>
-          <w:numId w:val="1099"/>
+          <w:numId w:val="1100"/>
         </w:numPr>
       </w:pPr>
       <w:r>
@@ -10196,15 +10452,15 @@
         <w:pStyle w:val="Compact"/>
         <w:numPr>
           <w:ilvl w:val="0"/>
-          <w:numId w:val="1100"/>
+          <w:numId w:val="1101"/>
         </w:numPr>
       </w:pPr>
       <w:r>
         <w:t xml:space="preserve">“Coppia d’oro”</w:t>
       </w:r>
     </w:p>
-    <w:bookmarkEnd w:id="89"/>
-    <w:bookmarkStart w:id="90" w:name="soglie"/>
+    <w:bookmarkEnd w:id="90"/>
+    <w:bookmarkStart w:id="91" w:name="soglie"/>
     <w:p>
       <w:pPr>
         <w:pStyle w:val="Heading3"/>
@@ -10218,7 +10474,7 @@
         <w:pStyle w:val="Compact"/>
         <w:numPr>
           <w:ilvl w:val="0"/>
-          <w:numId w:val="1101"/>
+          <w:numId w:val="1102"/>
         </w:numPr>
       </w:pPr>
       <w:r>
@@ -10230,7 +10486,7 @@
         <w:pStyle w:val="Compact"/>
         <w:numPr>
           <w:ilvl w:val="0"/>
-          <w:numId w:val="1102"/>
+          <w:numId w:val="1103"/>
         </w:numPr>
       </w:pPr>
       <w:r>
@@ -10242,7 +10498,7 @@
         <w:pStyle w:val="Compact"/>
         <w:numPr>
           <w:ilvl w:val="0"/>
-          <w:numId w:val="1103"/>
+          <w:numId w:val="1104"/>
         </w:numPr>
       </w:pPr>
       <w:r>
@@ -10254,7 +10510,7 @@
         <w:pStyle w:val="Compact"/>
         <w:numPr>
           <w:ilvl w:val="0"/>
-          <w:numId w:val="1104"/>
+          <w:numId w:val="1105"/>
         </w:numPr>
       </w:pPr>
       <w:r>
@@ -10266,7 +10522,7 @@
         <w:pStyle w:val="Compact"/>
         <w:numPr>
           <w:ilvl w:val="0"/>
-          <w:numId w:val="1105"/>
+          <w:numId w:val="1106"/>
         </w:numPr>
       </w:pPr>
       <w:r>
@@ -10278,7 +10534,7 @@
         <w:pStyle w:val="Compact"/>
         <w:numPr>
           <w:ilvl w:val="0"/>
-          <w:numId w:val="1106"/>
+          <w:numId w:val="1107"/>
         </w:numPr>
       </w:pPr>
       <w:r>
@@ -10290,15 +10546,15 @@
         <w:pStyle w:val="Compact"/>
         <w:numPr>
           <w:ilvl w:val="0"/>
-          <w:numId w:val="1107"/>
+          <w:numId w:val="1108"/>
         </w:numPr>
       </w:pPr>
       <w:r>
         <w:t xml:space="preserve">Critico conta tutte le voci distinte con nota, incluse revisioni e rewatch</w:t>
       </w:r>
     </w:p>
-    <w:bookmarkEnd w:id="90"/>
-    <w:bookmarkStart w:id="91" w:name="badge-introduttivi-1"/>
+    <w:bookmarkEnd w:id="91"/>
+    <w:bookmarkStart w:id="92" w:name="badge-introduttivi-1"/>
     <w:p>
       <w:pPr>
         <w:pStyle w:val="Heading3"/>
@@ -10312,7 +10568,7 @@
         <w:pStyle w:val="Compact"/>
         <w:numPr>
           <w:ilvl w:val="0"/>
-          <w:numId w:val="1108"/>
+          <w:numId w:val="1109"/>
         </w:numPr>
       </w:pPr>
       <w:r>
@@ -10324,7 +10580,7 @@
         <w:pStyle w:val="Compact"/>
         <w:numPr>
           <w:ilvl w:val="0"/>
-          <w:numId w:val="1109"/>
+          <w:numId w:val="1110"/>
         </w:numPr>
       </w:pPr>
       <w:r>
@@ -10336,7 +10592,7 @@
         <w:pStyle w:val="Compact"/>
         <w:numPr>
           <w:ilvl w:val="0"/>
-          <w:numId w:val="1110"/>
+          <w:numId w:val="1111"/>
         </w:numPr>
       </w:pPr>
       <w:r>
@@ -10348,7 +10604,7 @@
         <w:pStyle w:val="Compact"/>
         <w:numPr>
           <w:ilvl w:val="0"/>
-          <w:numId w:val="1111"/>
+          <w:numId w:val="1112"/>
         </w:numPr>
       </w:pPr>
       <w:r>
@@ -10360,15 +10616,15 @@
         <w:pStyle w:val="Compact"/>
         <w:numPr>
           <w:ilvl w:val="0"/>
-          <w:numId w:val="1112"/>
+          <w:numId w:val="1113"/>
         </w:numPr>
       </w:pPr>
       <w:r>
         <w:t xml:space="preserve">Stagione 0 / Speciali esclusa da Stagione chiusa</w:t>
       </w:r>
     </w:p>
-    <w:bookmarkEnd w:id="91"/>
-    <w:bookmarkStart w:id="92" w:name="serie-completata"/>
+    <w:bookmarkEnd w:id="92"/>
+    <w:bookmarkStart w:id="93" w:name="serie-completata"/>
     <w:p>
       <w:pPr>
         <w:pStyle w:val="Heading3"/>
@@ -10382,7 +10638,7 @@
         <w:pStyle w:val="Compact"/>
         <w:numPr>
           <w:ilvl w:val="0"/>
-          <w:numId w:val="1113"/>
+          <w:numId w:val="1114"/>
         </w:numPr>
       </w:pPr>
       <w:r>
@@ -10403,7 +10659,7 @@
         <w:pStyle w:val="Compact"/>
         <w:numPr>
           <w:ilvl w:val="0"/>
-          <w:numId w:val="1114"/>
+          <w:numId w:val="1115"/>
         </w:numPr>
       </w:pPr>
       <w:r>
@@ -10415,7 +10671,7 @@
         <w:pStyle w:val="Compact"/>
         <w:numPr>
           <w:ilvl w:val="0"/>
-          <w:numId w:val="1115"/>
+          <w:numId w:val="1116"/>
         </w:numPr>
       </w:pPr>
       <w:r>
@@ -10427,15 +10683,15 @@
         <w:pStyle w:val="Compact"/>
         <w:numPr>
           <w:ilvl w:val="0"/>
-          <w:numId w:val="1116"/>
+          <w:numId w:val="1117"/>
         </w:numPr>
       </w:pPr>
       <w:r>
         <w:t xml:space="preserve">Sblocco permanente anche dopo modifiche ai metadati TMDB</w:t>
       </w:r>
     </w:p>
-    <w:bookmarkEnd w:id="92"/>
-    <w:bookmarkStart w:id="93" w:name="generi-canonici"/>
+    <w:bookmarkEnd w:id="93"/>
+    <w:bookmarkStart w:id="94" w:name="generi-canonici"/>
     <w:p>
       <w:pPr>
         <w:pStyle w:val="Heading3"/>
@@ -10449,7 +10705,7 @@
         <w:pStyle w:val="Compact"/>
         <w:numPr>
           <w:ilvl w:val="0"/>
-          <w:numId w:val="1117"/>
+          <w:numId w:val="1118"/>
         </w:numPr>
       </w:pPr>
       <w:r>
@@ -10461,7 +10717,7 @@
         <w:pStyle w:val="Compact"/>
         <w:numPr>
           <w:ilvl w:val="0"/>
-          <w:numId w:val="1118"/>
+          <w:numId w:val="1119"/>
         </w:numPr>
       </w:pPr>
       <w:r>
@@ -10473,7 +10729,7 @@
         <w:pStyle w:val="Compact"/>
         <w:numPr>
           <w:ilvl w:val="0"/>
-          <w:numId w:val="1119"/>
+          <w:numId w:val="1120"/>
         </w:numPr>
       </w:pPr>
       <w:r>
@@ -10485,7 +10741,7 @@
         <w:pStyle w:val="Compact"/>
         <w:numPr>
           <w:ilvl w:val="0"/>
-          <w:numId w:val="1120"/>
+          <w:numId w:val="1121"/>
         </w:numPr>
       </w:pPr>
       <w:r>
@@ -10913,8 +11169,8 @@
         <w:t xml:space="preserve">genere narrativo. Gli altri generi associati allo stesso titolo restano validi.</w:t>
       </w:r>
     </w:p>
-    <w:bookmarkEnd w:id="93"/>
-    <w:bookmarkStart w:id="94" w:name="social"/>
+    <w:bookmarkEnd w:id="94"/>
+    <w:bookmarkStart w:id="95" w:name="social"/>
     <w:p>
       <w:pPr>
         <w:pStyle w:val="Heading3"/>
@@ -10928,7 +11184,7 @@
         <w:pStyle w:val="Compact"/>
         <w:numPr>
           <w:ilvl w:val="0"/>
-          <w:numId w:val="1121"/>
+          <w:numId w:val="1122"/>
         </w:numPr>
       </w:pPr>
       <w:r>
@@ -10940,7 +11196,7 @@
         <w:pStyle w:val="Compact"/>
         <w:numPr>
           <w:ilvl w:val="0"/>
-          <w:numId w:val="1122"/>
+          <w:numId w:val="1123"/>
         </w:numPr>
       </w:pPr>
       <w:r>
@@ -10952,7 +11208,7 @@
         <w:pStyle w:val="Compact"/>
         <w:numPr>
           <w:ilvl w:val="0"/>
-          <w:numId w:val="1123"/>
+          <w:numId w:val="1124"/>
         </w:numPr>
       </w:pPr>
       <w:r>
@@ -10964,7 +11220,7 @@
         <w:pStyle w:val="Compact"/>
         <w:numPr>
           <w:ilvl w:val="0"/>
-          <w:numId w:val="1124"/>
+          <w:numId w:val="1125"/>
         </w:numPr>
       </w:pPr>
       <w:r>
@@ -10976,15 +11232,15 @@
         <w:pStyle w:val="Compact"/>
         <w:numPr>
           <w:ilvl w:val="0"/>
-          <w:numId w:val="1125"/>
+          <w:numId w:val="1126"/>
         </w:numPr>
       </w:pPr>
       <w:r>
         <w:t xml:space="preserve">Reinvii e riaperture non incrementano il progresso</w:t>
       </w:r>
     </w:p>
-    <w:bookmarkEnd w:id="94"/>
-    <w:bookmarkStart w:id="95" w:name="ux"/>
+    <w:bookmarkEnd w:id="95"/>
+    <w:bookmarkStart w:id="96" w:name="ux"/>
     <w:p>
       <w:pPr>
         <w:pStyle w:val="Heading3"/>
@@ -10998,7 +11254,7 @@
         <w:pStyle w:val="Compact"/>
         <w:numPr>
           <w:ilvl w:val="0"/>
-          <w:numId w:val="1126"/>
+          <w:numId w:val="1127"/>
         </w:numPr>
       </w:pPr>
       <w:r>
@@ -11010,7 +11266,7 @@
         <w:pStyle w:val="Compact"/>
         <w:numPr>
           <w:ilvl w:val="0"/>
-          <w:numId w:val="1127"/>
+          <w:numId w:val="1128"/>
         </w:numPr>
       </w:pPr>
       <w:r>
@@ -11022,7 +11278,7 @@
         <w:pStyle w:val="Compact"/>
         <w:numPr>
           <w:ilvl w:val="0"/>
-          <w:numId w:val="1128"/>
+          <w:numId w:val="1129"/>
         </w:numPr>
       </w:pPr>
       <w:r>
@@ -11034,7 +11290,7 @@
         <w:pStyle w:val="Compact"/>
         <w:numPr>
           <w:ilvl w:val="0"/>
-          <w:numId w:val="1129"/>
+          <w:numId w:val="1130"/>
         </w:numPr>
       </w:pPr>
       <w:r>
@@ -11046,7 +11302,7 @@
         <w:pStyle w:val="Compact"/>
         <w:numPr>
           <w:ilvl w:val="0"/>
-          <w:numId w:val="1130"/>
+          <w:numId w:val="1131"/>
         </w:numPr>
       </w:pPr>
       <w:r>
@@ -11058,7 +11314,7 @@
         <w:pStyle w:val="Compact"/>
         <w:numPr>
           <w:ilvl w:val="0"/>
-          <w:numId w:val="1131"/>
+          <w:numId w:val="1132"/>
         </w:numPr>
       </w:pPr>
       <w:r>
@@ -11070,7 +11326,7 @@
         <w:pStyle w:val="Compact"/>
         <w:numPr>
           <w:ilvl w:val="0"/>
-          <w:numId w:val="1132"/>
+          <w:numId w:val="1133"/>
         </w:numPr>
       </w:pPr>
       <w:r>
@@ -11082,7 +11338,7 @@
         <w:pStyle w:val="Compact"/>
         <w:numPr>
           <w:ilvl w:val="0"/>
-          <w:numId w:val="1133"/>
+          <w:numId w:val="1134"/>
         </w:numPr>
       </w:pPr>
       <w:r>
@@ -11094,7 +11350,7 @@
         <w:pStyle w:val="Compact"/>
         <w:numPr>
           <w:ilvl w:val="0"/>
-          <w:numId w:val="1134"/>
+          <w:numId w:val="1135"/>
         </w:numPr>
       </w:pPr>
       <w:r>
@@ -11106,7 +11362,7 @@
         <w:pStyle w:val="Compact"/>
         <w:numPr>
           <w:ilvl w:val="0"/>
-          <w:numId w:val="1135"/>
+          <w:numId w:val="1136"/>
         </w:numPr>
       </w:pPr>
       <w:r>
@@ -11118,15 +11374,15 @@
         <w:pStyle w:val="Compact"/>
         <w:numPr>
           <w:ilvl w:val="0"/>
-          <w:numId w:val="1136"/>
+          <w:numId w:val="1137"/>
         </w:numPr>
       </w:pPr>
       <w:r>
         <w:t xml:space="preserve">Banner di sblocco con sfondo pieno, senza trasparenza</w:t>
       </w:r>
     </w:p>
-    <w:bookmarkEnd w:id="95"/>
-    <w:bookmarkStart w:id="96" w:name="operatività"/>
+    <w:bookmarkEnd w:id="96"/>
+    <w:bookmarkStart w:id="97" w:name="operatività"/>
     <w:p>
       <w:pPr>
         <w:pStyle w:val="Heading3"/>
@@ -11140,7 +11396,7 @@
         <w:pStyle w:val="Compact"/>
         <w:numPr>
           <w:ilvl w:val="0"/>
-          <w:numId w:val="1137"/>
+          <w:numId w:val="1138"/>
         </w:numPr>
       </w:pPr>
       <w:r>
@@ -11152,7 +11408,7 @@
         <w:pStyle w:val="Compact"/>
         <w:numPr>
           <w:ilvl w:val="0"/>
-          <w:numId w:val="1138"/>
+          <w:numId w:val="1139"/>
         </w:numPr>
       </w:pPr>
       <w:r>
@@ -11164,7 +11420,7 @@
         <w:pStyle w:val="Compact"/>
         <w:numPr>
           <w:ilvl w:val="0"/>
-          <w:numId w:val="1139"/>
+          <w:numId w:val="1140"/>
         </w:numPr>
       </w:pPr>
       <w:r>
@@ -11176,7 +11432,7 @@
         <w:pStyle w:val="Compact"/>
         <w:numPr>
           <w:ilvl w:val="0"/>
-          <w:numId w:val="1140"/>
+          <w:numId w:val="1141"/>
         </w:numPr>
       </w:pPr>
       <w:r>
@@ -11197,7 +11453,7 @@
         <w:pStyle w:val="Compact"/>
         <w:numPr>
           <w:ilvl w:val="0"/>
-          <w:numId w:val="1141"/>
+          <w:numId w:val="1142"/>
         </w:numPr>
       </w:pPr>
       <w:r>
@@ -11209,7 +11465,7 @@
         <w:pStyle w:val="Compact"/>
         <w:numPr>
           <w:ilvl w:val="0"/>
-          <w:numId w:val="1142"/>
+          <w:numId w:val="1143"/>
         </w:numPr>
       </w:pPr>
       <w:r>
@@ -11221,7 +11477,7 @@
         <w:pStyle w:val="Compact"/>
         <w:numPr>
           <w:ilvl w:val="0"/>
-          <w:numId w:val="1143"/>
+          <w:numId w:val="1144"/>
         </w:numPr>
       </w:pPr>
       <w:r>
@@ -11233,7 +11489,7 @@
         <w:pStyle w:val="Compact"/>
         <w:numPr>
           <w:ilvl w:val="0"/>
-          <w:numId w:val="1144"/>
+          <w:numId w:val="1145"/>
         </w:numPr>
       </w:pPr>
       <w:r>
@@ -11245,7 +11501,7 @@
         <w:pStyle w:val="Compact"/>
         <w:numPr>
           <w:ilvl w:val="0"/>
-          <w:numId w:val="1145"/>
+          <w:numId w:val="1146"/>
         </w:numPr>
       </w:pPr>
       <w:r>
@@ -11257,7 +11513,7 @@
         <w:pStyle w:val="Compact"/>
         <w:numPr>
           <w:ilvl w:val="0"/>
-          <w:numId w:val="1146"/>
+          <w:numId w:val="1147"/>
         </w:numPr>
       </w:pPr>
       <w:r>
@@ -11269,7 +11525,7 @@
         <w:pStyle w:val="Compact"/>
         <w:numPr>
           <w:ilvl w:val="0"/>
-          <w:numId w:val="1147"/>
+          <w:numId w:val="1148"/>
         </w:numPr>
       </w:pPr>
       <w:r>
@@ -11281,7 +11537,7 @@
         <w:pStyle w:val="Compact"/>
         <w:numPr>
           <w:ilvl w:val="0"/>
-          <w:numId w:val="1148"/>
+          <w:numId w:val="1149"/>
         </w:numPr>
       </w:pPr>
       <w:r>
@@ -11293,7 +11549,7 @@
         <w:pStyle w:val="Compact"/>
         <w:numPr>
           <w:ilvl w:val="0"/>
-          <w:numId w:val="1149"/>
+          <w:numId w:val="1150"/>
         </w:numPr>
       </w:pPr>
       <w:r>
@@ -11305,7 +11561,7 @@
         <w:pStyle w:val="Compact"/>
         <w:numPr>
           <w:ilvl w:val="0"/>
-          <w:numId w:val="1150"/>
+          <w:numId w:val="1151"/>
         </w:numPr>
       </w:pPr>
       <w:r>
@@ -11317,7 +11573,19 @@
         <w:pStyle w:val="Compact"/>
         <w:numPr>
           <w:ilvl w:val="0"/>
-          <w:numId w:val="1151"/>
+          <w:numId w:val="1152"/>
+        </w:numPr>
+      </w:pPr>
+      <w:r>
+        <w:t xml:space="preserve">Seconda famiglia progressiva: Archivista</w:t>
+      </w:r>
+    </w:p>
+    <w:p>
+      <w:pPr>
+        <w:pStyle w:val="Compact"/>
+        <w:numPr>
+          <w:ilvl w:val="0"/>
+          <w:numId w:val="1153"/>
         </w:numPr>
       </w:pPr>
       <w:r>
@@ -11331,9 +11599,9 @@
         </w:pict>
       </w:r>
     </w:p>
-    <w:bookmarkEnd w:id="96"/>
     <w:bookmarkEnd w:id="97"/>
-    <w:bookmarkStart w:id="98" w:name="prossimo-passo-consigliato"/>
+    <w:bookmarkEnd w:id="98"/>
+    <w:bookmarkStart w:id="99" w:name="prossimo-passo-consigliato"/>
     <w:p>
       <w:pPr>
         <w:pStyle w:val="Heading2"/>
@@ -11355,7 +11623,7 @@
         <w:pStyle w:val="BodyText"/>
       </w:pPr>
       <w:r>
-        <w:t xml:space="preserve">Il prossimo passo operativo è completare il rilascio web del</w:t>
+        <w:t xml:space="preserve">Il prossimo passo operativo è completare il rollout di</w:t>
       </w:r>
       <w:r>
         <w:t xml:space="preserve"> </w:t>
@@ -11365,7 +11633,7 @@
           <w:b/>
           <w:bCs/>
         </w:rPr>
-        <w:t xml:space="preserve">Batch A1</w:t>
+        <w:t xml:space="preserve">Archivista</w:t>
       </w:r>
       <w:r>
         <w:t xml:space="preserve">:</w:t>
@@ -11376,35 +11644,35 @@
         <w:pStyle w:val="Compact"/>
         <w:numPr>
           <w:ilvl w:val="0"/>
-          <w:numId w:val="1152"/>
-        </w:numPr>
-      </w:pPr>
-      <w:r>
-        <w:t xml:space="preserve">approvare la Sala trofei locale con i dati reali dell’account Test;</w:t>
-      </w:r>
-    </w:p>
-    <w:p>
-      <w:pPr>
-        <w:pStyle w:val="Compact"/>
-        <w:numPr>
-          <w:ilvl w:val="0"/>
-          <w:numId w:val="1152"/>
-        </w:numPr>
-      </w:pPr>
-      <w:r>
-        <w:t xml:space="preserve">creare il commit del Batch A1;</w:t>
-      </w:r>
-    </w:p>
-    <w:p>
-      <w:pPr>
-        <w:pStyle w:val="Compact"/>
-        <w:numPr>
-          <w:ilvl w:val="0"/>
-          <w:numId w:val="1152"/>
-        </w:numPr>
-      </w:pPr>
-      <w:r>
-        <w:t xml:space="preserve">pubblicare</w:t>
+          <w:numId w:val="1154"/>
+        </w:numPr>
+      </w:pPr>
+      <w:r>
+        <w:t xml:space="preserve">distribuire la Edge Function aggiornata, ancora retrocompatibile;</w:t>
+      </w:r>
+    </w:p>
+    <w:p>
+      <w:pPr>
+        <w:pStyle w:val="Compact"/>
+        <w:numPr>
+          <w:ilvl w:val="0"/>
+          <w:numId w:val="1154"/>
+        </w:numPr>
+      </w:pPr>
+      <w:r>
+        <w:t xml:space="preserve">pubblicare la Sala trofei con la patch Archivista;</w:t>
+      </w:r>
+    </w:p>
+    <w:p>
+      <w:pPr>
+        <w:pStyle w:val="Compact"/>
+        <w:numPr>
+          <w:ilvl w:val="0"/>
+          <w:numId w:val="1154"/>
+        </w:numPr>
+      </w:pPr>
+      <w:r>
+        <w:t xml:space="preserve">applicare la migration</w:t>
       </w:r>
       <w:r>
         <w:t xml:space="preserve"> </w:t>
@@ -11413,41 +11681,50 @@
         <w:rPr>
           <w:rStyle w:val="VerbatimChar"/>
         </w:rPr>
-        <w:t xml:space="preserve">main</w:t>
-      </w:r>
-      <w:r>
-        <w:t xml:space="preserve"> </w:t>
-      </w:r>
-      <w:r>
-        <w:t xml:space="preserve">e monitorare Azure Static Web Apps;</w:t>
-      </w:r>
-    </w:p>
-    <w:p>
-      <w:pPr>
-        <w:pStyle w:val="Compact"/>
-        <w:numPr>
-          <w:ilvl w:val="0"/>
-          <w:numId w:val="1152"/>
-        </w:numPr>
-      </w:pPr>
-      <w:r>
-        <w:t xml:space="preserve">eseguire lo smoke test in produzione;</w:t>
-      </w:r>
-    </w:p>
-    <w:p>
-      <w:pPr>
-        <w:pStyle w:val="Compact"/>
-        <w:numPr>
-          <w:ilvl w:val="0"/>
-          <w:numId w:val="1152"/>
-        </w:numPr>
-      </w:pPr>
-      <w:r>
-        <w:t xml:space="preserve">proseguire con Batch A2: Serialista, Archivista e Nostalgico.</w:t>
-      </w:r>
-    </w:p>
-    <w:bookmarkEnd w:id="98"/>
+        <w:t xml:space="preserve">0019_archivist_badge.sql</w:t>
+      </w:r>
+      <w:r>
+        <w:t xml:space="preserve">;</w:t>
+      </w:r>
+    </w:p>
+    <w:p>
+      <w:pPr>
+        <w:pStyle w:val="Compact"/>
+        <w:numPr>
+          <w:ilvl w:val="0"/>
+          <w:numId w:val="1154"/>
+        </w:numPr>
+      </w:pPr>
+      <w:r>
+        <w:t xml:space="preserve">verificare backfill e idempotenza sull’account Test;</w:t>
+      </w:r>
+    </w:p>
+    <w:p>
+      <w:pPr>
+        <w:pStyle w:val="Compact"/>
+        <w:numPr>
+          <w:ilvl w:val="0"/>
+          <w:numId w:val="1154"/>
+        </w:numPr>
+      </w:pPr>
+      <w:r>
+        <w:t xml:space="preserve">verificare il progresso reale sull’account principale;</w:t>
+      </w:r>
+    </w:p>
+    <w:p>
+      <w:pPr>
+        <w:pStyle w:val="Compact"/>
+        <w:numPr>
+          <w:ilvl w:val="0"/>
+          <w:numId w:val="1154"/>
+        </w:numPr>
+      </w:pPr>
+      <w:r>
+        <w:t xml:space="preserve">proseguire con Nostalgico e infine Serialista.</w:t>
+      </w:r>
+    </w:p>
     <w:bookmarkEnd w:id="99"/>
+    <w:bookmarkEnd w:id="100"/>
     <w:sectPr>
       <w:footerReference r:id="rId9" w:type="default"/>
       <w:pgSz w:h="15840" w:w="12240"/>
@@ -12391,7 +12668,7 @@
     <w:abstractNumId w:val="992"/>
   </w:num>
   <w:num w:numId="1073">
-    <w:abstractNumId w:val="992"/>
+    <w:abstractNumId w:val="993"/>
   </w:num>
   <w:num w:numId="1074">
     <w:abstractNumId w:val="992"/>
@@ -12400,7 +12677,7 @@
     <w:abstractNumId w:val="991"/>
   </w:num>
   <w:num w:numId="1076">
-    <w:abstractNumId w:val="992"/>
+    <w:abstractNumId w:val="991"/>
   </w:num>
   <w:num w:numId="1077">
     <w:abstractNumId w:val="992"/>
@@ -12457,10 +12734,10 @@
     <w:abstractNumId w:val="992"/>
   </w:num>
   <w:num w:numId="1095">
-    <w:abstractNumId w:val="991"/>
+    <w:abstractNumId w:val="992"/>
   </w:num>
   <w:num w:numId="1096">
-    <w:abstractNumId w:val="993"/>
+    <w:abstractNumId w:val="991"/>
   </w:num>
   <w:num w:numId="1097">
     <w:abstractNumId w:val="993"/>
@@ -12628,6 +12905,12 @@
     <w:abstractNumId w:val="993"/>
   </w:num>
   <w:num w:numId="1152">
+    <w:abstractNumId w:val="993"/>
+  </w:num>
+  <w:num w:numId="1153">
+    <w:abstractNumId w:val="993"/>
+  </w:num>
+  <w:num w:numId="1154">
     <w:abstractNumId w:val="99411"/>
     <w:lvlOverride w:ilvl="0">
       <w:startOverride w:val="1"/>
@@ -24746,6 +25029,232 @@
     <w:basedOn w:val="VerbatimChar"/>
     <w:rPr/>
   </w:style>
+  <w:style w:customStyle="1" w:styleId="KeywordTok" w:type="character">
+    <w:name w:val="KeywordTok"/>
+    <w:basedOn w:val="VerbatimChar"/>
+    <w:rPr>
+      <w:b/>
+      <w:color w:val="007020"/>
+    </w:rPr>
+  </w:style>
+  <w:style w:customStyle="1" w:styleId="DataTypeTok" w:type="character">
+    <w:name w:val="DataTypeTok"/>
+    <w:basedOn w:val="VerbatimChar"/>
+    <w:rPr>
+      <w:color w:val="902000"/>
+    </w:rPr>
+  </w:style>
+  <w:style w:customStyle="1" w:styleId="DecValTok" w:type="character">
+    <w:name w:val="DecValTok"/>
+    <w:basedOn w:val="VerbatimChar"/>
+    <w:rPr>
+      <w:color w:val="40a070"/>
+    </w:rPr>
+  </w:style>
+  <w:style w:customStyle="1" w:styleId="BaseNTok" w:type="character">
+    <w:name w:val="BaseNTok"/>
+    <w:basedOn w:val="VerbatimChar"/>
+    <w:rPr>
+      <w:color w:val="40a070"/>
+    </w:rPr>
+  </w:style>
+  <w:style w:customStyle="1" w:styleId="FloatTok" w:type="character">
+    <w:name w:val="FloatTok"/>
+    <w:basedOn w:val="VerbatimChar"/>
+    <w:rPr>
+      <w:color w:val="40a070"/>
+    </w:rPr>
+  </w:style>
+  <w:style w:customStyle="1" w:styleId="ConstantTok" w:type="character">
+    <w:name w:val="ConstantTok"/>
+    <w:basedOn w:val="VerbatimChar"/>
+    <w:rPr>
+      <w:color w:val="880000"/>
+    </w:rPr>
+  </w:style>
+  <w:style w:customStyle="1" w:styleId="CharTok" w:type="character">
+    <w:name w:val="CharTok"/>
+    <w:basedOn w:val="VerbatimChar"/>
+    <w:rPr>
+      <w:color w:val="4070a0"/>
+    </w:rPr>
+  </w:style>
+  <w:style w:customStyle="1" w:styleId="SpecialCharTok" w:type="character">
+    <w:name w:val="SpecialCharTok"/>
+    <w:basedOn w:val="VerbatimChar"/>
+    <w:rPr>
+      <w:color w:val="4070a0"/>
+    </w:rPr>
+  </w:style>
+  <w:style w:customStyle="1" w:styleId="StringTok" w:type="character">
+    <w:name w:val="StringTok"/>
+    <w:basedOn w:val="VerbatimChar"/>
+    <w:rPr>
+      <w:color w:val="4070a0"/>
+    </w:rPr>
+  </w:style>
+  <w:style w:customStyle="1" w:styleId="VerbatimStringTok" w:type="character">
+    <w:name w:val="VerbatimStringTok"/>
+    <w:basedOn w:val="VerbatimChar"/>
+    <w:rPr>
+      <w:color w:val="4070a0"/>
+    </w:rPr>
+  </w:style>
+  <w:style w:customStyle="1" w:styleId="SpecialStringTok" w:type="character">
+    <w:name w:val="SpecialStringTok"/>
+    <w:basedOn w:val="VerbatimChar"/>
+    <w:rPr>
+      <w:color w:val="bb6688"/>
+    </w:rPr>
+  </w:style>
+  <w:style w:customStyle="1" w:styleId="ImportTok" w:type="character">
+    <w:name w:val="ImportTok"/>
+    <w:basedOn w:val="VerbatimChar"/>
+    <w:rPr>
+      <w:b/>
+      <w:color w:val="008000"/>
+    </w:rPr>
+  </w:style>
+  <w:style w:customStyle="1" w:styleId="CommentTok" w:type="character">
+    <w:name w:val="CommentTok"/>
+    <w:basedOn w:val="VerbatimChar"/>
+    <w:rPr>
+      <w:i/>
+      <w:color w:val="60a0b0"/>
+    </w:rPr>
+  </w:style>
+  <w:style w:customStyle="1" w:styleId="DocumentationTok" w:type="character">
+    <w:name w:val="DocumentationTok"/>
+    <w:basedOn w:val="VerbatimChar"/>
+    <w:rPr>
+      <w:i/>
+      <w:color w:val="ba2121"/>
+    </w:rPr>
+  </w:style>
+  <w:style w:customStyle="1" w:styleId="AnnotationTok" w:type="character">
+    <w:name w:val="AnnotationTok"/>
+    <w:basedOn w:val="VerbatimChar"/>
+    <w:rPr>
+      <w:b/>
+      <w:i/>
+      <w:color w:val="60a0b0"/>
+    </w:rPr>
+  </w:style>
+  <w:style w:customStyle="1" w:styleId="CommentVarTok" w:type="character">
+    <w:name w:val="CommentVarTok"/>
+    <w:basedOn w:val="VerbatimChar"/>
+    <w:rPr>
+      <w:b/>
+      <w:i/>
+      <w:color w:val="60a0b0"/>
+    </w:rPr>
+  </w:style>
+  <w:style w:customStyle="1" w:styleId="OtherTok" w:type="character">
+    <w:name w:val="OtherTok"/>
+    <w:basedOn w:val="VerbatimChar"/>
+    <w:rPr>
+      <w:color w:val="007020"/>
+    </w:rPr>
+  </w:style>
+  <w:style w:customStyle="1" w:styleId="FunctionTok" w:type="character">
+    <w:name w:val="FunctionTok"/>
+    <w:basedOn w:val="VerbatimChar"/>
+    <w:rPr>
+      <w:color w:val="06287e"/>
+    </w:rPr>
+  </w:style>
+  <w:style w:customStyle="1" w:styleId="VariableTok" w:type="character">
+    <w:name w:val="VariableTok"/>
+    <w:basedOn w:val="VerbatimChar"/>
+    <w:rPr>
+      <w:color w:val="19177c"/>
+    </w:rPr>
+  </w:style>
+  <w:style w:customStyle="1" w:styleId="ControlFlowTok" w:type="character">
+    <w:name w:val="ControlFlowTok"/>
+    <w:basedOn w:val="VerbatimChar"/>
+    <w:rPr>
+      <w:b/>
+      <w:color w:val="007020"/>
+    </w:rPr>
+  </w:style>
+  <w:style w:customStyle="1" w:styleId="OperatorTok" w:type="character">
+    <w:name w:val="OperatorTok"/>
+    <w:basedOn w:val="VerbatimChar"/>
+    <w:rPr>
+      <w:color w:val="666666"/>
+    </w:rPr>
+  </w:style>
+  <w:style w:customStyle="1" w:styleId="BuiltInTok" w:type="character">
+    <w:name w:val="BuiltInTok"/>
+    <w:basedOn w:val="VerbatimChar"/>
+    <w:rPr>
+      <w:color w:val="008000"/>
+    </w:rPr>
+  </w:style>
+  <w:style w:customStyle="1" w:styleId="ExtensionTok" w:type="character">
+    <w:name w:val="ExtensionTok"/>
+    <w:basedOn w:val="VerbatimChar"/>
+    <w:rPr/>
+  </w:style>
+  <w:style w:customStyle="1" w:styleId="PreprocessorTok" w:type="character">
+    <w:name w:val="PreprocessorTok"/>
+    <w:basedOn w:val="VerbatimChar"/>
+    <w:rPr>
+      <w:color w:val="bc7a00"/>
+    </w:rPr>
+  </w:style>
+  <w:style w:customStyle="1" w:styleId="AttributeTok" w:type="character">
+    <w:name w:val="AttributeTok"/>
+    <w:basedOn w:val="VerbatimChar"/>
+    <w:rPr>
+      <w:color w:val="7d9029"/>
+    </w:rPr>
+  </w:style>
+  <w:style w:customStyle="1" w:styleId="RegionMarkerTok" w:type="character">
+    <w:name w:val="RegionMarkerTok"/>
+    <w:basedOn w:val="VerbatimChar"/>
+    <w:rPr/>
+  </w:style>
+  <w:style w:customStyle="1" w:styleId="InformationTok" w:type="character">
+    <w:name w:val="InformationTok"/>
+    <w:basedOn w:val="VerbatimChar"/>
+    <w:rPr>
+      <w:b/>
+      <w:i/>
+      <w:color w:val="60a0b0"/>
+    </w:rPr>
+  </w:style>
+  <w:style w:customStyle="1" w:styleId="WarningTok" w:type="character">
+    <w:name w:val="WarningTok"/>
+    <w:basedOn w:val="VerbatimChar"/>
+    <w:rPr>
+      <w:b/>
+      <w:i/>
+      <w:color w:val="60a0b0"/>
+    </w:rPr>
+  </w:style>
+  <w:style w:customStyle="1" w:styleId="AlertTok" w:type="character">
+    <w:name w:val="AlertTok"/>
+    <w:basedOn w:val="VerbatimChar"/>
+    <w:rPr>
+      <w:b/>
+      <w:color w:val="ff0000"/>
+    </w:rPr>
+  </w:style>
+  <w:style w:customStyle="1" w:styleId="ErrorTok" w:type="character">
+    <w:name w:val="ErrorTok"/>
+    <w:basedOn w:val="VerbatimChar"/>
+    <w:rPr>
+      <w:b/>
+      <w:color w:val="ff0000"/>
+    </w:rPr>
+  </w:style>
+  <w:style w:customStyle="1" w:styleId="NormalTok" w:type="character">
+    <w:name w:val="NormalTok"/>
+    <w:basedOn w:val="VerbatimChar"/>
+    <w:rPr/>
+  </w:style>
   <w:style w:type="character" w:customStyle="1" w:styleId="KeywordTok">
     <w:name w:val="KeywordTok"/>
     <w:basedOn w:val="VerbatimChar"/>

</xml_diff>

<commit_message>
Document Archivist badge rollout
Co-authored-by: Copilot <223556219+Copilot@users.noreply.github.com>
</commit_message>
<xml_diff>
--- a/docs/BADGE-PIANO.docx
+++ b/docs/BADGE-PIANO.docx
@@ -91,13 +91,7 @@
         <w:t xml:space="preserve"> </w:t>
       </w:r>
       <w:r>
-        <w:t xml:space="preserve">Batch A1 pubblicato; Archivista (A2.1) completato localmente e in</w:t>
-      </w:r>
-      <w:r>
-        <w:t xml:space="preserve"> </w:t>
-      </w:r>
-      <w:r>
-        <w:t xml:space="preserve">attesa di rollout Supabase/web</w:t>
+        <w:t xml:space="preserve">Batch A1 e Archivista (A2.1) pubblicati e verificati in produzione</w:t>
       </w:r>
     </w:p>
     <w:p>
@@ -9967,6 +9961,177 @@
         <w:t xml:space="preserve">.</w:t>
       </w:r>
     </w:p>
+    <w:p>
+      <w:pPr>
+        <w:pStyle w:val="Compact"/>
+        <w:numPr>
+          <w:ilvl w:val="0"/>
+          <w:numId w:val="1076"/>
+        </w:numPr>
+      </w:pPr>
+      <w:r>
+        <w:t xml:space="preserve">Edge Function distribuita prima dell’attivazione del catalogo;</w:t>
+      </w:r>
+    </w:p>
+    <w:p>
+      <w:pPr>
+        <w:pStyle w:val="Compact"/>
+        <w:numPr>
+          <w:ilvl w:val="0"/>
+          <w:numId w:val="1076"/>
+        </w:numPr>
+      </w:pPr>
+      <w:r>
+        <w:t xml:space="preserve">deploy Azure completato sul commit</w:t>
+      </w:r>
+      <w:r>
+        <w:t xml:space="preserve"> </w:t>
+      </w:r>
+      <w:r>
+        <w:rPr>
+          <w:rStyle w:val="VerbatimChar"/>
+        </w:rPr>
+        <w:t xml:space="preserve">f50cc38</w:t>
+      </w:r>
+      <w:r>
+        <w:t xml:space="preserve">;</w:t>
+      </w:r>
+    </w:p>
+    <w:p>
+      <w:pPr>
+        <w:pStyle w:val="Compact"/>
+        <w:numPr>
+          <w:ilvl w:val="0"/>
+          <w:numId w:val="1076"/>
+        </w:numPr>
+      </w:pPr>
+      <w:r>
+        <w:t xml:space="preserve">migration</w:t>
+      </w:r>
+      <w:r>
+        <w:t xml:space="preserve"> </w:t>
+      </w:r>
+      <w:r>
+        <w:rPr>
+          <w:rStyle w:val="VerbatimChar"/>
+        </w:rPr>
+        <w:t xml:space="preserve">0019_archivist_badge.sql</w:t>
+      </w:r>
+      <w:r>
+        <w:t xml:space="preserve"> </w:t>
+      </w:r>
+      <w:r>
+        <w:t xml:space="preserve">applicata e testo UTF-8 verificato;</w:t>
+      </w:r>
+    </w:p>
+    <w:p>
+      <w:pPr>
+        <w:pStyle w:val="Compact"/>
+        <w:numPr>
+          <w:ilvl w:val="0"/>
+          <w:numId w:val="1076"/>
+        </w:numPr>
+      </w:pPr>
+      <w:r>
+        <w:t xml:space="preserve">test SQL transazionale superato senza dati residui;</w:t>
+      </w:r>
+    </w:p>
+    <w:p>
+      <w:pPr>
+        <w:pStyle w:val="Compact"/>
+        <w:numPr>
+          <w:ilvl w:val="0"/>
+          <w:numId w:val="1076"/>
+        </w:numPr>
+      </w:pPr>
+      <w:r>
+        <w:t xml:space="preserve">account</w:t>
+      </w:r>
+      <w:r>
+        <w:t xml:space="preserve"> </w:t>
+      </w:r>
+      <w:r>
+        <w:rPr>
+          <w:rStyle w:val="VerbatimChar"/>
+        </w:rPr>
+        <w:t xml:space="preserve">@testshowtime</w:t>
+      </w:r>
+      <w:r>
+        <w:t xml:space="preserve">:</w:t>
+      </w:r>
+      <w:r>
+        <w:t xml:space="preserve"> </w:t>
+      </w:r>
+      <w:r>
+        <w:rPr>
+          <w:rStyle w:val="VerbatimChar"/>
+        </w:rPr>
+        <w:t xml:space="preserve">5/500</w:t>
+      </w:r>
+      <w:r>
+        <w:t xml:space="preserve">, refresh idempotente e hero</w:t>
+      </w:r>
+      <w:r>
+        <w:t xml:space="preserve"> </w:t>
+      </w:r>
+      <w:r>
+        <w:rPr>
+          <w:rStyle w:val="VerbatimChar"/>
+        </w:rPr>
+        <w:t xml:space="preserve">3/11</w:t>
+      </w:r>
+      <w:r>
+        <w:t xml:space="preserve">;</w:t>
+      </w:r>
+    </w:p>
+    <w:p>
+      <w:pPr>
+        <w:pStyle w:val="Compact"/>
+        <w:numPr>
+          <w:ilvl w:val="0"/>
+          <w:numId w:val="1076"/>
+        </w:numPr>
+      </w:pPr>
+      <w:r>
+        <w:t xml:space="preserve">account principale:</w:t>
+      </w:r>
+      <w:r>
+        <w:t xml:space="preserve"> </w:t>
+      </w:r>
+      <w:r>
+        <w:rPr>
+          <w:rStyle w:val="VerbatimChar"/>
+        </w:rPr>
+        <w:t xml:space="preserve">360/500</w:t>
+      </w:r>
+      <w:r>
+        <w:t xml:space="preserve">, refresh idempotente e hero</w:t>
+      </w:r>
+      <w:r>
+        <w:t xml:space="preserve"> </w:t>
+      </w:r>
+      <w:r>
+        <w:rPr>
+          <w:rStyle w:val="VerbatimChar"/>
+        </w:rPr>
+        <w:t xml:space="preserve">4/11</w:t>
+      </w:r>
+      <w:r>
+        <w:t xml:space="preserve">;</w:t>
+      </w:r>
+    </w:p>
+    <w:p>
+      <w:pPr>
+        <w:pStyle w:val="Compact"/>
+        <w:numPr>
+          <w:ilvl w:val="0"/>
+          <w:numId w:val="1076"/>
+        </w:numPr>
+      </w:pPr>
+      <w:r>
+        <w:t xml:space="preserve">produzione senza errori console né overflow a 360/390 px.</w:t>
+      </w:r>
+    </w:p>
     <w:bookmarkStart w:id="83" w:name="batch-b-esplorazione-e-comportamento"/>
     <w:p>
       <w:pPr>
@@ -11623,7 +11788,7 @@
         <w:pStyle w:val="BodyText"/>
       </w:pPr>
       <w:r>
-        <w:t xml:space="preserve">Il prossimo passo operativo è completare il rollout di</w:t>
+        <w:t xml:space="preserve">Il prossimo passo operativo è</w:t>
       </w:r>
       <w:r>
         <w:t xml:space="preserve"> </w:t>
@@ -11633,7 +11798,7 @@
           <w:b/>
           <w:bCs/>
         </w:rPr>
-        <w:t xml:space="preserve">Archivista</w:t>
+        <w:t xml:space="preserve">Nostalgico</w:t>
       </w:r>
       <w:r>
         <w:t xml:space="preserve">:</w:t>
@@ -11648,7 +11813,7 @@
         </w:numPr>
       </w:pPr>
       <w:r>
-        <w:t xml:space="preserve">distribuire la Edge Function aggiornata, ancora retrocompatibile;</w:t>
+        <w:t xml:space="preserve">contare film e serie completati usciti prima del 1990;</w:t>
       </w:r>
     </w:p>
     <w:p>
@@ -11660,7 +11825,7 @@
         </w:numPr>
       </w:pPr>
       <w:r>
-        <w:t xml:space="preserve">pubblicare la Sala trofei con la patch Archivista;</w:t>
+        <w:t xml:space="preserve">includere lo storico importato;</w:t>
       </w:r>
     </w:p>
     <w:p>
@@ -11672,7 +11837,7 @@
         </w:numPr>
       </w:pPr>
       <w:r>
-        <w:t xml:space="preserve">applicare la migration</w:t>
+        <w:t xml:space="preserve">aggiungere le soglie</w:t>
       </w:r>
       <w:r>
         <w:t xml:space="preserve"> </w:t>
@@ -11681,7 +11846,7 @@
         <w:rPr>
           <w:rStyle w:val="VerbatimChar"/>
         </w:rPr>
-        <w:t xml:space="preserve">0019_archivist_badge.sql</w:t>
+        <w:t xml:space="preserve">50 / 150 / 250 / 500</w:t>
       </w:r>
       <w:r>
         <w:t xml:space="preserve">;</w:t>
@@ -11696,7 +11861,7 @@
         </w:numPr>
       </w:pPr>
       <w:r>
-        <w:t xml:space="preserve">verificare backfill e idempotenza sull’account Test;</w:t>
+        <w:t xml:space="preserve">creare la patch dedicata e il relativo accordion;</w:t>
       </w:r>
     </w:p>
     <w:p>
@@ -11708,7 +11873,7 @@
         </w:numPr>
       </w:pPr>
       <w:r>
-        <w:t xml:space="preserve">verificare il progresso reale sull’account principale;</w:t>
+        <w:t xml:space="preserve">verificare il backfill sugli account reali;</w:t>
       </w:r>
     </w:p>
     <w:p>
@@ -11720,7 +11885,7 @@
         </w:numPr>
       </w:pPr>
       <w:r>
-        <w:t xml:space="preserve">proseguire con Nostalgico e infine Serialista.</w:t>
+        <w:t xml:space="preserve">proseguire infine con Serialista.</w:t>
       </w:r>
     </w:p>
     <w:bookmarkEnd w:id="99"/>
@@ -25255,6 +25420,232 @@
     <w:basedOn w:val="VerbatimChar"/>
     <w:rPr/>
   </w:style>
+  <w:style w:customStyle="1" w:styleId="KeywordTok" w:type="character">
+    <w:name w:val="KeywordTok"/>
+    <w:basedOn w:val="VerbatimChar"/>
+    <w:rPr>
+      <w:b/>
+      <w:color w:val="007020"/>
+    </w:rPr>
+  </w:style>
+  <w:style w:customStyle="1" w:styleId="DataTypeTok" w:type="character">
+    <w:name w:val="DataTypeTok"/>
+    <w:basedOn w:val="VerbatimChar"/>
+    <w:rPr>
+      <w:color w:val="902000"/>
+    </w:rPr>
+  </w:style>
+  <w:style w:customStyle="1" w:styleId="DecValTok" w:type="character">
+    <w:name w:val="DecValTok"/>
+    <w:basedOn w:val="VerbatimChar"/>
+    <w:rPr>
+      <w:color w:val="40a070"/>
+    </w:rPr>
+  </w:style>
+  <w:style w:customStyle="1" w:styleId="BaseNTok" w:type="character">
+    <w:name w:val="BaseNTok"/>
+    <w:basedOn w:val="VerbatimChar"/>
+    <w:rPr>
+      <w:color w:val="40a070"/>
+    </w:rPr>
+  </w:style>
+  <w:style w:customStyle="1" w:styleId="FloatTok" w:type="character">
+    <w:name w:val="FloatTok"/>
+    <w:basedOn w:val="VerbatimChar"/>
+    <w:rPr>
+      <w:color w:val="40a070"/>
+    </w:rPr>
+  </w:style>
+  <w:style w:customStyle="1" w:styleId="ConstantTok" w:type="character">
+    <w:name w:val="ConstantTok"/>
+    <w:basedOn w:val="VerbatimChar"/>
+    <w:rPr>
+      <w:color w:val="880000"/>
+    </w:rPr>
+  </w:style>
+  <w:style w:customStyle="1" w:styleId="CharTok" w:type="character">
+    <w:name w:val="CharTok"/>
+    <w:basedOn w:val="VerbatimChar"/>
+    <w:rPr>
+      <w:color w:val="4070a0"/>
+    </w:rPr>
+  </w:style>
+  <w:style w:customStyle="1" w:styleId="SpecialCharTok" w:type="character">
+    <w:name w:val="SpecialCharTok"/>
+    <w:basedOn w:val="VerbatimChar"/>
+    <w:rPr>
+      <w:color w:val="4070a0"/>
+    </w:rPr>
+  </w:style>
+  <w:style w:customStyle="1" w:styleId="StringTok" w:type="character">
+    <w:name w:val="StringTok"/>
+    <w:basedOn w:val="VerbatimChar"/>
+    <w:rPr>
+      <w:color w:val="4070a0"/>
+    </w:rPr>
+  </w:style>
+  <w:style w:customStyle="1" w:styleId="VerbatimStringTok" w:type="character">
+    <w:name w:val="VerbatimStringTok"/>
+    <w:basedOn w:val="VerbatimChar"/>
+    <w:rPr>
+      <w:color w:val="4070a0"/>
+    </w:rPr>
+  </w:style>
+  <w:style w:customStyle="1" w:styleId="SpecialStringTok" w:type="character">
+    <w:name w:val="SpecialStringTok"/>
+    <w:basedOn w:val="VerbatimChar"/>
+    <w:rPr>
+      <w:color w:val="bb6688"/>
+    </w:rPr>
+  </w:style>
+  <w:style w:customStyle="1" w:styleId="ImportTok" w:type="character">
+    <w:name w:val="ImportTok"/>
+    <w:basedOn w:val="VerbatimChar"/>
+    <w:rPr>
+      <w:b/>
+      <w:color w:val="008000"/>
+    </w:rPr>
+  </w:style>
+  <w:style w:customStyle="1" w:styleId="CommentTok" w:type="character">
+    <w:name w:val="CommentTok"/>
+    <w:basedOn w:val="VerbatimChar"/>
+    <w:rPr>
+      <w:i/>
+      <w:color w:val="60a0b0"/>
+    </w:rPr>
+  </w:style>
+  <w:style w:customStyle="1" w:styleId="DocumentationTok" w:type="character">
+    <w:name w:val="DocumentationTok"/>
+    <w:basedOn w:val="VerbatimChar"/>
+    <w:rPr>
+      <w:i/>
+      <w:color w:val="ba2121"/>
+    </w:rPr>
+  </w:style>
+  <w:style w:customStyle="1" w:styleId="AnnotationTok" w:type="character">
+    <w:name w:val="AnnotationTok"/>
+    <w:basedOn w:val="VerbatimChar"/>
+    <w:rPr>
+      <w:b/>
+      <w:i/>
+      <w:color w:val="60a0b0"/>
+    </w:rPr>
+  </w:style>
+  <w:style w:customStyle="1" w:styleId="CommentVarTok" w:type="character">
+    <w:name w:val="CommentVarTok"/>
+    <w:basedOn w:val="VerbatimChar"/>
+    <w:rPr>
+      <w:b/>
+      <w:i/>
+      <w:color w:val="60a0b0"/>
+    </w:rPr>
+  </w:style>
+  <w:style w:customStyle="1" w:styleId="OtherTok" w:type="character">
+    <w:name w:val="OtherTok"/>
+    <w:basedOn w:val="VerbatimChar"/>
+    <w:rPr>
+      <w:color w:val="007020"/>
+    </w:rPr>
+  </w:style>
+  <w:style w:customStyle="1" w:styleId="FunctionTok" w:type="character">
+    <w:name w:val="FunctionTok"/>
+    <w:basedOn w:val="VerbatimChar"/>
+    <w:rPr>
+      <w:color w:val="06287e"/>
+    </w:rPr>
+  </w:style>
+  <w:style w:customStyle="1" w:styleId="VariableTok" w:type="character">
+    <w:name w:val="VariableTok"/>
+    <w:basedOn w:val="VerbatimChar"/>
+    <w:rPr>
+      <w:color w:val="19177c"/>
+    </w:rPr>
+  </w:style>
+  <w:style w:customStyle="1" w:styleId="ControlFlowTok" w:type="character">
+    <w:name w:val="ControlFlowTok"/>
+    <w:basedOn w:val="VerbatimChar"/>
+    <w:rPr>
+      <w:b/>
+      <w:color w:val="007020"/>
+    </w:rPr>
+  </w:style>
+  <w:style w:customStyle="1" w:styleId="OperatorTok" w:type="character">
+    <w:name w:val="OperatorTok"/>
+    <w:basedOn w:val="VerbatimChar"/>
+    <w:rPr>
+      <w:color w:val="666666"/>
+    </w:rPr>
+  </w:style>
+  <w:style w:customStyle="1" w:styleId="BuiltInTok" w:type="character">
+    <w:name w:val="BuiltInTok"/>
+    <w:basedOn w:val="VerbatimChar"/>
+    <w:rPr>
+      <w:color w:val="008000"/>
+    </w:rPr>
+  </w:style>
+  <w:style w:customStyle="1" w:styleId="ExtensionTok" w:type="character">
+    <w:name w:val="ExtensionTok"/>
+    <w:basedOn w:val="VerbatimChar"/>
+    <w:rPr/>
+  </w:style>
+  <w:style w:customStyle="1" w:styleId="PreprocessorTok" w:type="character">
+    <w:name w:val="PreprocessorTok"/>
+    <w:basedOn w:val="VerbatimChar"/>
+    <w:rPr>
+      <w:color w:val="bc7a00"/>
+    </w:rPr>
+  </w:style>
+  <w:style w:customStyle="1" w:styleId="AttributeTok" w:type="character">
+    <w:name w:val="AttributeTok"/>
+    <w:basedOn w:val="VerbatimChar"/>
+    <w:rPr>
+      <w:color w:val="7d9029"/>
+    </w:rPr>
+  </w:style>
+  <w:style w:customStyle="1" w:styleId="RegionMarkerTok" w:type="character">
+    <w:name w:val="RegionMarkerTok"/>
+    <w:basedOn w:val="VerbatimChar"/>
+    <w:rPr/>
+  </w:style>
+  <w:style w:customStyle="1" w:styleId="InformationTok" w:type="character">
+    <w:name w:val="InformationTok"/>
+    <w:basedOn w:val="VerbatimChar"/>
+    <w:rPr>
+      <w:b/>
+      <w:i/>
+      <w:color w:val="60a0b0"/>
+    </w:rPr>
+  </w:style>
+  <w:style w:customStyle="1" w:styleId="WarningTok" w:type="character">
+    <w:name w:val="WarningTok"/>
+    <w:basedOn w:val="VerbatimChar"/>
+    <w:rPr>
+      <w:b/>
+      <w:i/>
+      <w:color w:val="60a0b0"/>
+    </w:rPr>
+  </w:style>
+  <w:style w:customStyle="1" w:styleId="AlertTok" w:type="character">
+    <w:name w:val="AlertTok"/>
+    <w:basedOn w:val="VerbatimChar"/>
+    <w:rPr>
+      <w:b/>
+      <w:color w:val="ff0000"/>
+    </w:rPr>
+  </w:style>
+  <w:style w:customStyle="1" w:styleId="ErrorTok" w:type="character">
+    <w:name w:val="ErrorTok"/>
+    <w:basedOn w:val="VerbatimChar"/>
+    <w:rPr>
+      <w:b/>
+      <w:color w:val="ff0000"/>
+    </w:rPr>
+  </w:style>
+  <w:style w:customStyle="1" w:styleId="NormalTok" w:type="character">
+    <w:name w:val="NormalTok"/>
+    <w:basedOn w:val="VerbatimChar"/>
+    <w:rPr/>
+  </w:style>
   <w:style w:type="character" w:customStyle="1" w:styleId="KeywordTok">
     <w:name w:val="KeywordTok"/>
     <w:basedOn w:val="VerbatimChar"/>

</xml_diff>

<commit_message>
Add Nostalgic badge progression
Co-authored-by: Copilot <223556219+Copilot@users.noreply.github.com>
</commit_message>
<xml_diff>
--- a/docs/BADGE-PIANO.docx
+++ b/docs/BADGE-PIANO.docx
@@ -2,7 +2,7 @@
 <file path=word/document.xml><?xml version="1.0" encoding="utf-8"?>
 <w:document xmlns:w="http://schemas.openxmlformats.org/wordprocessingml/2006/main" xmlns:m="http://schemas.openxmlformats.org/officeDocument/2006/math" xmlns:r="http://schemas.openxmlformats.org/officeDocument/2006/relationships" xmlns:o="urn:schemas-microsoft-com:office:office" xmlns:v="urn:schemas-microsoft-com:vml" xmlns:w10="urn:schemas-microsoft-com:office:word" xmlns:a="http://schemas.openxmlformats.org/drawingml/2006/main" xmlns:pic="http://schemas.openxmlformats.org/drawingml/2006/picture" xmlns:wp="http://schemas.openxmlformats.org/drawingml/2006/wordprocessingDrawing">
   <w:body>
-    <w:bookmarkStart w:id="100" w:name="badge-showtime-proposta-e-piano"/>
+    <w:bookmarkStart w:id="101" w:name="badge-showtime-proposta-e-piano"/>
     <w:p>
       <w:pPr>
         <w:pStyle w:val="Heading1"/>
@@ -91,7 +91,13 @@
         <w:t xml:space="preserve"> </w:t>
       </w:r>
       <w:r>
-        <w:t xml:space="preserve">Batch A1 e Archivista (A2.1) pubblicati e verificati in produzione</w:t>
+        <w:t xml:space="preserve">Batch A1 e Archivista (A2.1) pubblicati; Nostalgico (A2.2)</w:t>
+      </w:r>
+      <w:r>
+        <w:t xml:space="preserve"> </w:t>
+      </w:r>
+      <w:r>
+        <w:t xml:space="preserve">completato localmente e in attesa di rollout</w:t>
       </w:r>
     </w:p>
     <w:p>
@@ -8083,7 +8089,7 @@
     </w:p>
     <w:bookmarkEnd w:id="73"/>
     <w:bookmarkEnd w:id="74"/>
-    <w:bookmarkStart w:id="88" w:name="piano-di-implementazione"/>
+    <w:bookmarkStart w:id="89" w:name="piano-di-implementazione"/>
     <w:p>
       <w:pPr>
         <w:pStyle w:val="Heading2"/>
@@ -9706,7 +9712,7 @@
       </w:r>
     </w:p>
     <w:bookmarkEnd w:id="82"/>
-    <w:bookmarkStart w:id="85" w:name="verifica-batch-a2.1-archivista"/>
+    <w:bookmarkStart w:id="83" w:name="verifica-batch-a2.1-archivista"/>
     <w:p>
       <w:pPr>
         <w:pStyle w:val="Heading3"/>
@@ -10132,7 +10138,311 @@
         <w:t xml:space="preserve">produzione senza errori console né overflow a 360/390 px.</w:t>
       </w:r>
     </w:p>
-    <w:bookmarkStart w:id="83" w:name="batch-b-esplorazione-e-comportamento"/>
+    <w:bookmarkEnd w:id="83"/>
+    <w:bookmarkStart w:id="86" w:name="verifica-batch-a2.2-nostalgico"/>
+    <w:p>
+      <w:pPr>
+        <w:pStyle w:val="Heading3"/>
+      </w:pPr>
+      <w:r>
+        <w:t xml:space="preserve">Verifica Batch A2.2 — Nostalgico</w:t>
+      </w:r>
+    </w:p>
+    <w:p>
+      <w:pPr>
+        <w:pStyle w:val="Compact"/>
+        <w:numPr>
+          <w:ilvl w:val="0"/>
+          <w:numId w:val="1077"/>
+        </w:numPr>
+      </w:pPr>
+      <w:r>
+        <w:t xml:space="preserve">migration</w:t>
+      </w:r>
+      <w:r>
+        <w:t xml:space="preserve"> </w:t>
+      </w:r>
+      <w:r>
+        <w:rPr>
+          <w:rStyle w:val="VerbatimChar"/>
+        </w:rPr>
+        <w:t xml:space="preserve">0020_nostalgic_badge.sql</w:t>
+      </w:r>
+      <w:r>
+        <w:t xml:space="preserve"> </w:t>
+      </w:r>
+      <w:r>
+        <w:t xml:space="preserve">con soglie</w:t>
+      </w:r>
+      <w:r>
+        <w:t xml:space="preserve"> </w:t>
+      </w:r>
+      <w:r>
+        <w:rPr>
+          <w:rStyle w:val="VerbatimChar"/>
+        </w:rPr>
+        <w:t xml:space="preserve">50 / 150 / 250 / 500</w:t>
+      </w:r>
+      <w:r>
+        <w:t xml:space="preserve">;</w:t>
+      </w:r>
+    </w:p>
+    <w:p>
+      <w:pPr>
+        <w:pStyle w:val="Compact"/>
+        <w:numPr>
+          <w:ilvl w:val="0"/>
+          <w:numId w:val="1077"/>
+        </w:numPr>
+      </w:pPr>
+      <w:r>
+        <w:t xml:space="preserve">conta film e serie nello stato</w:t>
+      </w:r>
+      <w:r>
+        <w:t xml:space="preserve"> </w:t>
+      </w:r>
+      <w:r>
+        <w:rPr>
+          <w:rStyle w:val="VerbatimChar"/>
+        </w:rPr>
+        <w:t xml:space="preserve">Visto</w:t>
+      </w:r>
+      <w:r>
+        <w:t xml:space="preserve"> </w:t>
+      </w:r>
+      <w:r>
+        <w:t xml:space="preserve">con anno TMDB valido precedente al 1990;</w:t>
+      </w:r>
+    </w:p>
+    <w:p>
+      <w:pPr>
+        <w:pStyle w:val="Compact"/>
+        <w:numPr>
+          <w:ilvl w:val="0"/>
+          <w:numId w:val="1077"/>
+        </w:numPr>
+      </w:pPr>
+      <w:r>
+        <w:t xml:space="preserve">include storico importato;</w:t>
+      </w:r>
+    </w:p>
+    <w:p>
+      <w:pPr>
+        <w:pStyle w:val="Compact"/>
+        <w:numPr>
+          <w:ilvl w:val="0"/>
+          <w:numId w:val="1077"/>
+        </w:numPr>
+      </w:pPr>
+      <w:r>
+        <w:t xml:space="preserve">esclude il 1990, anni mancanti,</w:t>
+      </w:r>
+      <w:r>
+        <w:t xml:space="preserve"> </w:t>
+      </w:r>
+      <w:r>
+        <w:rPr>
+          <w:rStyle w:val="VerbatimChar"/>
+        </w:rPr>
+        <w:t xml:space="preserve">0000</w:t>
+      </w:r>
+      <w:r>
+        <w:t xml:space="preserve"> </w:t>
+      </w:r>
+      <w:r>
+        <w:t xml:space="preserve">e valori non formati da quattro cifre;</w:t>
+      </w:r>
+    </w:p>
+    <w:p>
+      <w:pPr>
+        <w:pStyle w:val="Compact"/>
+        <w:numPr>
+          <w:ilvl w:val="0"/>
+          <w:numId w:val="1077"/>
+        </w:numPr>
+      </w:pPr>
+      <w:r>
+        <w:t xml:space="preserve">helper puro e testato per il confine temporale;</w:t>
+      </w:r>
+    </w:p>
+    <w:p>
+      <w:pPr>
+        <w:pStyle w:val="Compact"/>
+        <w:numPr>
+          <w:ilvl w:val="0"/>
+          <w:numId w:val="1077"/>
+        </w:numPr>
+      </w:pPr>
+      <w:r>
+        <w:t xml:space="preserve">loader paginato oltre 1.000 titoli completati;</w:t>
+      </w:r>
+    </w:p>
+    <w:p>
+      <w:pPr>
+        <w:pStyle w:val="Compact"/>
+        <w:numPr>
+          <w:ilvl w:val="0"/>
+          <w:numId w:val="1077"/>
+        </w:numPr>
+      </w:pPr>
+      <w:r>
+        <w:t xml:space="preserve">rivalutazioni non bloccanti dopo cambi di stato film e progresso serie;</w:t>
+      </w:r>
+    </w:p>
+    <w:p>
+      <w:pPr>
+        <w:pStyle w:val="Compact"/>
+        <w:numPr>
+          <w:ilvl w:val="0"/>
+          <w:numId w:val="1077"/>
+        </w:numPr>
+      </w:pPr>
+      <w:r>
+        <w:t xml:space="preserve">evidenza privata limitata a conteggio, versione e data;</w:t>
+      </w:r>
+    </w:p>
+    <w:p>
+      <w:pPr>
+        <w:pStyle w:val="Compact"/>
+        <w:numPr>
+          <w:ilvl w:val="0"/>
+          <w:numId w:val="1077"/>
+        </w:numPr>
+      </w:pPr>
+      <w:r>
+        <w:t xml:space="preserve">patch originale a televisore CRT nelle quattro varianti metalliche;</w:t>
+      </w:r>
+    </w:p>
+    <w:p>
+      <w:pPr>
+        <w:pStyle w:val="Compact"/>
+        <w:numPr>
+          <w:ilvl w:val="0"/>
+          <w:numId w:val="1077"/>
+        </w:numPr>
+      </w:pPr>
+      <w:r>
+        <w:t xml:space="preserve">ordine Sala trofei: Cinefilo, Archivista, Nostalgico;</w:t>
+      </w:r>
+    </w:p>
+    <w:p>
+      <w:pPr>
+        <w:pStyle w:val="Compact"/>
+        <w:numPr>
+          <w:ilvl w:val="0"/>
+          <w:numId w:val="1077"/>
+        </w:numPr>
+      </w:pPr>
+      <w:r>
+        <w:t xml:space="preserve">preview locale:</w:t>
+      </w:r>
+      <w:r>
+        <w:t xml:space="preserve"> </w:t>
+      </w:r>
+      <w:r>
+        <w:rPr>
+          <w:rStyle w:val="VerbatimChar"/>
+        </w:rPr>
+        <w:t xml:space="preserve">Nostalgico 0/4</w:t>
+      </w:r>
+      <w:r>
+        <w:t xml:space="preserve">, progresso</w:t>
+      </w:r>
+      <w:r>
+        <w:t xml:space="preserve"> </w:t>
+      </w:r>
+      <w:r>
+        <w:rPr>
+          <w:rStyle w:val="VerbatimChar"/>
+        </w:rPr>
+        <w:t xml:space="preserve">0/50</w:t>
+      </w:r>
+      <w:r>
+        <w:t xml:space="preserve">, hero</w:t>
+      </w:r>
+      <w:r>
+        <w:t xml:space="preserve"> </w:t>
+      </w:r>
+      <w:r>
+        <w:rPr>
+          <w:rStyle w:val="VerbatimChar"/>
+        </w:rPr>
+        <w:t xml:space="preserve">3/15</w:t>
+      </w:r>
+      <w:r>
+        <w:t xml:space="preserve">;</w:t>
+      </w:r>
+    </w:p>
+    <w:p>
+      <w:pPr>
+        <w:pStyle w:val="Compact"/>
+        <w:numPr>
+          <w:ilvl w:val="0"/>
+          <w:numId w:val="1077"/>
+        </w:numPr>
+      </w:pPr>
+      <w:r>
+        <w:t xml:space="preserve">patch e accordion verificati senza overflow a 360 e 390 px;</w:t>
+      </w:r>
+    </w:p>
+    <w:p>
+      <w:pPr>
+        <w:pStyle w:val="Compact"/>
+        <w:numPr>
+          <w:ilvl w:val="0"/>
+          <w:numId w:val="1077"/>
+        </w:numPr>
+      </w:pPr>
+      <w:r>
+        <w:rPr>
+          <w:rStyle w:val="VerbatimChar"/>
+        </w:rPr>
+        <w:t xml:space="preserve">20/20</w:t>
+      </w:r>
+      <w:r>
+        <w:t xml:space="preserve"> </w:t>
+      </w:r>
+      <w:r>
+        <w:t xml:space="preserve">test engine superati;</w:t>
+      </w:r>
+    </w:p>
+    <w:p>
+      <w:pPr>
+        <w:pStyle w:val="Compact"/>
+        <w:numPr>
+          <w:ilvl w:val="0"/>
+          <w:numId w:val="1077"/>
+        </w:numPr>
+      </w:pPr>
+      <w:r>
+        <w:t xml:space="preserve">test SQL transazionale pronto per soglia</w:t>
+      </w:r>
+      <w:r>
+        <w:t xml:space="preserve"> </w:t>
+      </w:r>
+      <w:r>
+        <w:rPr>
+          <w:rStyle w:val="VerbatimChar"/>
+        </w:rPr>
+        <w:t xml:space="preserve">150</w:t>
+      </w:r>
+      <w:r>
+        <w:t xml:space="preserve">, idempotenza e regressione a</w:t>
+      </w:r>
+      <w:r>
+        <w:t xml:space="preserve"> </w:t>
+      </w:r>
+      <w:r>
+        <w:rPr>
+          <w:rStyle w:val="VerbatimChar"/>
+        </w:rPr>
+        <w:t xml:space="preserve">0</w:t>
+      </w:r>
+      <w:r>
+        <w:t xml:space="preserve">.</w:t>
+      </w:r>
+    </w:p>
+    <w:bookmarkStart w:id="84" w:name="batch-b-esplorazione-e-comportamento"/>
     <w:p>
       <w:pPr>
         <w:pStyle w:val="Heading4"/>
@@ -10146,7 +10456,7 @@
         <w:pStyle w:val="Compact"/>
         <w:numPr>
           <w:ilvl w:val="0"/>
-          <w:numId w:val="1077"/>
+          <w:numId w:val="1078"/>
         </w:numPr>
       </w:pPr>
       <w:r>
@@ -10158,7 +10468,7 @@
         <w:pStyle w:val="Compact"/>
         <w:numPr>
           <w:ilvl w:val="0"/>
-          <w:numId w:val="1078"/>
+          <w:numId w:val="1079"/>
         </w:numPr>
       </w:pPr>
       <w:r>
@@ -10170,7 +10480,7 @@
         <w:pStyle w:val="Compact"/>
         <w:numPr>
           <w:ilvl w:val="0"/>
-          <w:numId w:val="1079"/>
+          <w:numId w:val="1080"/>
         </w:numPr>
       </w:pPr>
       <w:r>
@@ -10182,15 +10492,15 @@
         <w:pStyle w:val="Compact"/>
         <w:numPr>
           <w:ilvl w:val="0"/>
-          <w:numId w:val="1080"/>
+          <w:numId w:val="1081"/>
         </w:numPr>
       </w:pPr>
       <w:r>
         <w:t xml:space="preserve">Encore</w:t>
       </w:r>
     </w:p>
-    <w:bookmarkEnd w:id="83"/>
-    <w:bookmarkStart w:id="84" w:name="batch-c-diario-e-social"/>
+    <w:bookmarkEnd w:id="84"/>
+    <w:bookmarkStart w:id="85" w:name="batch-c-diario-e-social"/>
     <w:p>
       <w:pPr>
         <w:pStyle w:val="Heading4"/>
@@ -10204,7 +10514,7 @@
         <w:pStyle w:val="Compact"/>
         <w:numPr>
           <w:ilvl w:val="0"/>
-          <w:numId w:val="1081"/>
+          <w:numId w:val="1082"/>
         </w:numPr>
       </w:pPr>
       <w:r>
@@ -10216,16 +10526,16 @@
         <w:pStyle w:val="Compact"/>
         <w:numPr>
           <w:ilvl w:val="0"/>
-          <w:numId w:val="1082"/>
+          <w:numId w:val="1083"/>
         </w:numPr>
       </w:pPr>
       <w:r>
         <w:t xml:space="preserve">Passaparola</w:t>
       </w:r>
     </w:p>
-    <w:bookmarkEnd w:id="84"/>
     <w:bookmarkEnd w:id="85"/>
-    <w:bookmarkStart w:id="86" w:name="fase-4-profilo-e-rifiniture"/>
+    <w:bookmarkEnd w:id="86"/>
+    <w:bookmarkStart w:id="87" w:name="fase-4-profilo-e-rifiniture"/>
     <w:p>
       <w:pPr>
         <w:pStyle w:val="Heading3"/>
@@ -10239,7 +10549,7 @@
         <w:pStyle w:val="Compact"/>
         <w:numPr>
           <w:ilvl w:val="0"/>
-          <w:numId w:val="1083"/>
+          <w:numId w:val="1084"/>
         </w:numPr>
       </w:pPr>
       <w:r>
@@ -10251,7 +10561,7 @@
         <w:pStyle w:val="Compact"/>
         <w:numPr>
           <w:ilvl w:val="0"/>
-          <w:numId w:val="1084"/>
+          <w:numId w:val="1085"/>
         </w:numPr>
       </w:pPr>
       <w:r>
@@ -10263,7 +10573,7 @@
         <w:pStyle w:val="Compact"/>
         <w:numPr>
           <w:ilvl w:val="0"/>
-          <w:numId w:val="1085"/>
+          <w:numId w:val="1086"/>
         </w:numPr>
       </w:pPr>
       <w:r>
@@ -10275,7 +10585,7 @@
         <w:pStyle w:val="Compact"/>
         <w:numPr>
           <w:ilvl w:val="0"/>
-          <w:numId w:val="1086"/>
+          <w:numId w:val="1087"/>
         </w:numPr>
       </w:pPr>
       <w:r>
@@ -10287,7 +10597,7 @@
         <w:pStyle w:val="Compact"/>
         <w:numPr>
           <w:ilvl w:val="0"/>
-          <w:numId w:val="1087"/>
+          <w:numId w:val="1088"/>
         </w:numPr>
       </w:pPr>
       <w:r>
@@ -10299,15 +10609,15 @@
         <w:pStyle w:val="Compact"/>
         <w:numPr>
           <w:ilvl w:val="0"/>
-          <w:numId w:val="1088"/>
+          <w:numId w:val="1089"/>
         </w:numPr>
       </w:pPr>
       <w:r>
         <w:t xml:space="preserve">Riconciliazione completa</w:t>
       </w:r>
     </w:p>
-    <w:bookmarkEnd w:id="86"/>
-    <w:bookmarkStart w:id="87" w:name="fase-5-crediti-tmdb"/>
+    <w:bookmarkEnd w:id="87"/>
+    <w:bookmarkStart w:id="88" w:name="fase-5-crediti-tmdb"/>
     <w:p>
       <w:pPr>
         <w:pStyle w:val="Heading3"/>
@@ -10321,7 +10631,7 @@
         <w:pStyle w:val="Compact"/>
         <w:numPr>
           <w:ilvl w:val="0"/>
-          <w:numId w:val="1089"/>
+          <w:numId w:val="1090"/>
         </w:numPr>
       </w:pPr>
       <w:r>
@@ -10333,7 +10643,7 @@
         <w:pStyle w:val="Compact"/>
         <w:numPr>
           <w:ilvl w:val="0"/>
-          <w:numId w:val="1090"/>
+          <w:numId w:val="1091"/>
         </w:numPr>
       </w:pPr>
       <w:r>
@@ -10345,7 +10655,7 @@
         <w:pStyle w:val="Compact"/>
         <w:numPr>
           <w:ilvl w:val="0"/>
-          <w:numId w:val="1091"/>
+          <w:numId w:val="1092"/>
         </w:numPr>
       </w:pPr>
       <w:r>
@@ -10357,7 +10667,7 @@
         <w:pStyle w:val="Compact"/>
         <w:numPr>
           <w:ilvl w:val="0"/>
-          <w:numId w:val="1092"/>
+          <w:numId w:val="1093"/>
         </w:numPr>
       </w:pPr>
       <w:r>
@@ -10369,7 +10679,7 @@
         <w:pStyle w:val="Compact"/>
         <w:numPr>
           <w:ilvl w:val="0"/>
-          <w:numId w:val="1093"/>
+          <w:numId w:val="1094"/>
         </w:numPr>
       </w:pPr>
       <w:r>
@@ -10381,7 +10691,7 @@
         <w:pStyle w:val="Compact"/>
         <w:numPr>
           <w:ilvl w:val="0"/>
-          <w:numId w:val="1094"/>
+          <w:numId w:val="1095"/>
         </w:numPr>
       </w:pPr>
       <w:r>
@@ -10393,7 +10703,7 @@
         <w:pStyle w:val="Compact"/>
         <w:numPr>
           <w:ilvl w:val="0"/>
-          <w:numId w:val="1095"/>
+          <w:numId w:val="1096"/>
         </w:numPr>
       </w:pPr>
       <w:r>
@@ -10407,9 +10717,9 @@
         </w:pict>
       </w:r>
     </w:p>
-    <w:bookmarkEnd w:id="87"/>
     <w:bookmarkEnd w:id="88"/>
-    <w:bookmarkStart w:id="89" w:name="criteri-di-accettazione-v1"/>
+    <w:bookmarkEnd w:id="89"/>
+    <w:bookmarkStart w:id="90" w:name="criteri-di-accettazione-v1"/>
     <w:p>
       <w:pPr>
         <w:pStyle w:val="Heading2"/>
@@ -10423,7 +10733,7 @@
         <w:pStyle w:val="Compact"/>
         <w:numPr>
           <w:ilvl w:val="0"/>
-          <w:numId w:val="1096"/>
+          <w:numId w:val="1097"/>
         </w:numPr>
       </w:pPr>
       <w:r>
@@ -10435,7 +10745,7 @@
         <w:pStyle w:val="Compact"/>
         <w:numPr>
           <w:ilvl w:val="0"/>
-          <w:numId w:val="1096"/>
+          <w:numId w:val="1097"/>
         </w:numPr>
       </w:pPr>
       <w:r>
@@ -10447,7 +10757,7 @@
         <w:pStyle w:val="Compact"/>
         <w:numPr>
           <w:ilvl w:val="0"/>
-          <w:numId w:val="1096"/>
+          <w:numId w:val="1097"/>
         </w:numPr>
       </w:pPr>
       <w:r>
@@ -10459,7 +10769,7 @@
         <w:pStyle w:val="Compact"/>
         <w:numPr>
           <w:ilvl w:val="0"/>
-          <w:numId w:val="1096"/>
+          <w:numId w:val="1097"/>
         </w:numPr>
       </w:pPr>
       <w:r>
@@ -10471,7 +10781,7 @@
         <w:pStyle w:val="Compact"/>
         <w:numPr>
           <w:ilvl w:val="0"/>
-          <w:numId w:val="1096"/>
+          <w:numId w:val="1097"/>
         </w:numPr>
       </w:pPr>
       <w:r>
@@ -10483,7 +10793,7 @@
         <w:pStyle w:val="Compact"/>
         <w:numPr>
           <w:ilvl w:val="0"/>
-          <w:numId w:val="1096"/>
+          <w:numId w:val="1097"/>
         </w:numPr>
       </w:pPr>
       <w:r>
@@ -10495,7 +10805,7 @@
         <w:pStyle w:val="Compact"/>
         <w:numPr>
           <w:ilvl w:val="0"/>
-          <w:numId w:val="1096"/>
+          <w:numId w:val="1097"/>
         </w:numPr>
       </w:pPr>
       <w:r>
@@ -10507,7 +10817,7 @@
         <w:pStyle w:val="Compact"/>
         <w:numPr>
           <w:ilvl w:val="0"/>
-          <w:numId w:val="1096"/>
+          <w:numId w:val="1097"/>
         </w:numPr>
       </w:pPr>
       <w:r>
@@ -10519,7 +10829,7 @@
         <w:pStyle w:val="Compact"/>
         <w:numPr>
           <w:ilvl w:val="0"/>
-          <w:numId w:val="1096"/>
+          <w:numId w:val="1097"/>
         </w:numPr>
       </w:pPr>
       <w:r>
@@ -10531,7 +10841,7 @@
         <w:pStyle w:val="Compact"/>
         <w:numPr>
           <w:ilvl w:val="0"/>
-          <w:numId w:val="1096"/>
+          <w:numId w:val="1097"/>
         </w:numPr>
       </w:pPr>
       <w:r>
@@ -10545,8 +10855,8 @@
         </w:pict>
       </w:r>
     </w:p>
-    <w:bookmarkEnd w:id="89"/>
-    <w:bookmarkStart w:id="98" w:name="decisioni-v1-confermate"/>
+    <w:bookmarkEnd w:id="90"/>
+    <w:bookmarkStart w:id="99" w:name="decisioni-v1-confermate"/>
     <w:p>
       <w:pPr>
         <w:pStyle w:val="Heading2"/>
@@ -10555,7 +10865,7 @@
         <w:t xml:space="preserve">12. Decisioni V1 confermate</w:t>
       </w:r>
     </w:p>
-    <w:bookmarkStart w:id="90" w:name="nomi"/>
+    <w:bookmarkStart w:id="91" w:name="nomi"/>
     <w:p>
       <w:pPr>
         <w:pStyle w:val="Heading3"/>
@@ -10569,7 +10879,7 @@
         <w:pStyle w:val="Compact"/>
         <w:numPr>
           <w:ilvl w:val="0"/>
-          <w:numId w:val="1097"/>
+          <w:numId w:val="1098"/>
         </w:numPr>
       </w:pPr>
       <w:r>
@@ -10581,7 +10891,7 @@
         <w:pStyle w:val="Compact"/>
         <w:numPr>
           <w:ilvl w:val="0"/>
-          <w:numId w:val="1098"/>
+          <w:numId w:val="1099"/>
         </w:numPr>
       </w:pPr>
       <w:r>
@@ -10593,7 +10903,7 @@
         <w:pStyle w:val="Compact"/>
         <w:numPr>
           <w:ilvl w:val="0"/>
-          <w:numId w:val="1099"/>
+          <w:numId w:val="1100"/>
         </w:numPr>
       </w:pPr>
       <w:r>
@@ -10605,7 +10915,7 @@
         <w:pStyle w:val="Compact"/>
         <w:numPr>
           <w:ilvl w:val="0"/>
-          <w:numId w:val="1100"/>
+          <w:numId w:val="1101"/>
         </w:numPr>
       </w:pPr>
       <w:r>
@@ -10617,15 +10927,15 @@
         <w:pStyle w:val="Compact"/>
         <w:numPr>
           <w:ilvl w:val="0"/>
-          <w:numId w:val="1101"/>
+          <w:numId w:val="1102"/>
         </w:numPr>
       </w:pPr>
       <w:r>
         <w:t xml:space="preserve">“Coppia d’oro”</w:t>
       </w:r>
     </w:p>
-    <w:bookmarkEnd w:id="90"/>
-    <w:bookmarkStart w:id="91" w:name="soglie"/>
+    <w:bookmarkEnd w:id="91"/>
+    <w:bookmarkStart w:id="92" w:name="soglie"/>
     <w:p>
       <w:pPr>
         <w:pStyle w:val="Heading3"/>
@@ -10639,7 +10949,7 @@
         <w:pStyle w:val="Compact"/>
         <w:numPr>
           <w:ilvl w:val="0"/>
-          <w:numId w:val="1102"/>
+          <w:numId w:val="1103"/>
         </w:numPr>
       </w:pPr>
       <w:r>
@@ -10651,7 +10961,7 @@
         <w:pStyle w:val="Compact"/>
         <w:numPr>
           <w:ilvl w:val="0"/>
-          <w:numId w:val="1103"/>
+          <w:numId w:val="1104"/>
         </w:numPr>
       </w:pPr>
       <w:r>
@@ -10663,7 +10973,7 @@
         <w:pStyle w:val="Compact"/>
         <w:numPr>
           <w:ilvl w:val="0"/>
-          <w:numId w:val="1104"/>
+          <w:numId w:val="1105"/>
         </w:numPr>
       </w:pPr>
       <w:r>
@@ -10675,7 +10985,7 @@
         <w:pStyle w:val="Compact"/>
         <w:numPr>
           <w:ilvl w:val="0"/>
-          <w:numId w:val="1105"/>
+          <w:numId w:val="1106"/>
         </w:numPr>
       </w:pPr>
       <w:r>
@@ -10687,7 +10997,7 @@
         <w:pStyle w:val="Compact"/>
         <w:numPr>
           <w:ilvl w:val="0"/>
-          <w:numId w:val="1106"/>
+          <w:numId w:val="1107"/>
         </w:numPr>
       </w:pPr>
       <w:r>
@@ -10699,7 +11009,7 @@
         <w:pStyle w:val="Compact"/>
         <w:numPr>
           <w:ilvl w:val="0"/>
-          <w:numId w:val="1107"/>
+          <w:numId w:val="1108"/>
         </w:numPr>
       </w:pPr>
       <w:r>
@@ -10711,15 +11021,15 @@
         <w:pStyle w:val="Compact"/>
         <w:numPr>
           <w:ilvl w:val="0"/>
-          <w:numId w:val="1108"/>
+          <w:numId w:val="1109"/>
         </w:numPr>
       </w:pPr>
       <w:r>
         <w:t xml:space="preserve">Critico conta tutte le voci distinte con nota, incluse revisioni e rewatch</w:t>
       </w:r>
     </w:p>
-    <w:bookmarkEnd w:id="91"/>
-    <w:bookmarkStart w:id="92" w:name="badge-introduttivi-1"/>
+    <w:bookmarkEnd w:id="92"/>
+    <w:bookmarkStart w:id="93" w:name="badge-introduttivi-1"/>
     <w:p>
       <w:pPr>
         <w:pStyle w:val="Heading3"/>
@@ -10733,7 +11043,7 @@
         <w:pStyle w:val="Compact"/>
         <w:numPr>
           <w:ilvl w:val="0"/>
-          <w:numId w:val="1109"/>
+          <w:numId w:val="1110"/>
         </w:numPr>
       </w:pPr>
       <w:r>
@@ -10745,7 +11055,7 @@
         <w:pStyle w:val="Compact"/>
         <w:numPr>
           <w:ilvl w:val="0"/>
-          <w:numId w:val="1110"/>
+          <w:numId w:val="1111"/>
         </w:numPr>
       </w:pPr>
       <w:r>
@@ -10757,7 +11067,7 @@
         <w:pStyle w:val="Compact"/>
         <w:numPr>
           <w:ilvl w:val="0"/>
-          <w:numId w:val="1111"/>
+          <w:numId w:val="1112"/>
         </w:numPr>
       </w:pPr>
       <w:r>
@@ -10769,7 +11079,7 @@
         <w:pStyle w:val="Compact"/>
         <w:numPr>
           <w:ilvl w:val="0"/>
-          <w:numId w:val="1112"/>
+          <w:numId w:val="1113"/>
         </w:numPr>
       </w:pPr>
       <w:r>
@@ -10781,15 +11091,15 @@
         <w:pStyle w:val="Compact"/>
         <w:numPr>
           <w:ilvl w:val="0"/>
-          <w:numId w:val="1113"/>
+          <w:numId w:val="1114"/>
         </w:numPr>
       </w:pPr>
       <w:r>
         <w:t xml:space="preserve">Stagione 0 / Speciali esclusa da Stagione chiusa</w:t>
       </w:r>
     </w:p>
-    <w:bookmarkEnd w:id="92"/>
-    <w:bookmarkStart w:id="93" w:name="serie-completata"/>
+    <w:bookmarkEnd w:id="93"/>
+    <w:bookmarkStart w:id="94" w:name="serie-completata"/>
     <w:p>
       <w:pPr>
         <w:pStyle w:val="Heading3"/>
@@ -10803,7 +11113,7 @@
         <w:pStyle w:val="Compact"/>
         <w:numPr>
           <w:ilvl w:val="0"/>
-          <w:numId w:val="1114"/>
+          <w:numId w:val="1115"/>
         </w:numPr>
       </w:pPr>
       <w:r>
@@ -10824,7 +11134,7 @@
         <w:pStyle w:val="Compact"/>
         <w:numPr>
           <w:ilvl w:val="0"/>
-          <w:numId w:val="1115"/>
+          <w:numId w:val="1116"/>
         </w:numPr>
       </w:pPr>
       <w:r>
@@ -10836,7 +11146,7 @@
         <w:pStyle w:val="Compact"/>
         <w:numPr>
           <w:ilvl w:val="0"/>
-          <w:numId w:val="1116"/>
+          <w:numId w:val="1117"/>
         </w:numPr>
       </w:pPr>
       <w:r>
@@ -10848,15 +11158,15 @@
         <w:pStyle w:val="Compact"/>
         <w:numPr>
           <w:ilvl w:val="0"/>
-          <w:numId w:val="1117"/>
+          <w:numId w:val="1118"/>
         </w:numPr>
       </w:pPr>
       <w:r>
         <w:t xml:space="preserve">Sblocco permanente anche dopo modifiche ai metadati TMDB</w:t>
       </w:r>
     </w:p>
-    <w:bookmarkEnd w:id="93"/>
-    <w:bookmarkStart w:id="94" w:name="generi-canonici"/>
+    <w:bookmarkEnd w:id="94"/>
+    <w:bookmarkStart w:id="95" w:name="generi-canonici"/>
     <w:p>
       <w:pPr>
         <w:pStyle w:val="Heading3"/>
@@ -10870,7 +11180,7 @@
         <w:pStyle w:val="Compact"/>
         <w:numPr>
           <w:ilvl w:val="0"/>
-          <w:numId w:val="1118"/>
+          <w:numId w:val="1119"/>
         </w:numPr>
       </w:pPr>
       <w:r>
@@ -10882,7 +11192,7 @@
         <w:pStyle w:val="Compact"/>
         <w:numPr>
           <w:ilvl w:val="0"/>
-          <w:numId w:val="1119"/>
+          <w:numId w:val="1120"/>
         </w:numPr>
       </w:pPr>
       <w:r>
@@ -10894,7 +11204,7 @@
         <w:pStyle w:val="Compact"/>
         <w:numPr>
           <w:ilvl w:val="0"/>
-          <w:numId w:val="1120"/>
+          <w:numId w:val="1121"/>
         </w:numPr>
       </w:pPr>
       <w:r>
@@ -10906,7 +11216,7 @@
         <w:pStyle w:val="Compact"/>
         <w:numPr>
           <w:ilvl w:val="0"/>
-          <w:numId w:val="1121"/>
+          <w:numId w:val="1122"/>
         </w:numPr>
       </w:pPr>
       <w:r>
@@ -11334,8 +11644,8 @@
         <w:t xml:space="preserve">genere narrativo. Gli altri generi associati allo stesso titolo restano validi.</w:t>
       </w:r>
     </w:p>
-    <w:bookmarkEnd w:id="94"/>
-    <w:bookmarkStart w:id="95" w:name="social"/>
+    <w:bookmarkEnd w:id="95"/>
+    <w:bookmarkStart w:id="96" w:name="social"/>
     <w:p>
       <w:pPr>
         <w:pStyle w:val="Heading3"/>
@@ -11349,7 +11659,7 @@
         <w:pStyle w:val="Compact"/>
         <w:numPr>
           <w:ilvl w:val="0"/>
-          <w:numId w:val="1122"/>
+          <w:numId w:val="1123"/>
         </w:numPr>
       </w:pPr>
       <w:r>
@@ -11361,7 +11671,7 @@
         <w:pStyle w:val="Compact"/>
         <w:numPr>
           <w:ilvl w:val="0"/>
-          <w:numId w:val="1123"/>
+          <w:numId w:val="1124"/>
         </w:numPr>
       </w:pPr>
       <w:r>
@@ -11373,7 +11683,7 @@
         <w:pStyle w:val="Compact"/>
         <w:numPr>
           <w:ilvl w:val="0"/>
-          <w:numId w:val="1124"/>
+          <w:numId w:val="1125"/>
         </w:numPr>
       </w:pPr>
       <w:r>
@@ -11385,7 +11695,7 @@
         <w:pStyle w:val="Compact"/>
         <w:numPr>
           <w:ilvl w:val="0"/>
-          <w:numId w:val="1125"/>
+          <w:numId w:val="1126"/>
         </w:numPr>
       </w:pPr>
       <w:r>
@@ -11397,15 +11707,15 @@
         <w:pStyle w:val="Compact"/>
         <w:numPr>
           <w:ilvl w:val="0"/>
-          <w:numId w:val="1126"/>
+          <w:numId w:val="1127"/>
         </w:numPr>
       </w:pPr>
       <w:r>
         <w:t xml:space="preserve">Reinvii e riaperture non incrementano il progresso</w:t>
       </w:r>
     </w:p>
-    <w:bookmarkEnd w:id="95"/>
-    <w:bookmarkStart w:id="96" w:name="ux"/>
+    <w:bookmarkEnd w:id="96"/>
+    <w:bookmarkStart w:id="97" w:name="ux"/>
     <w:p>
       <w:pPr>
         <w:pStyle w:val="Heading3"/>
@@ -11419,7 +11729,7 @@
         <w:pStyle w:val="Compact"/>
         <w:numPr>
           <w:ilvl w:val="0"/>
-          <w:numId w:val="1127"/>
+          <w:numId w:val="1128"/>
         </w:numPr>
       </w:pPr>
       <w:r>
@@ -11431,7 +11741,7 @@
         <w:pStyle w:val="Compact"/>
         <w:numPr>
           <w:ilvl w:val="0"/>
-          <w:numId w:val="1128"/>
+          <w:numId w:val="1129"/>
         </w:numPr>
       </w:pPr>
       <w:r>
@@ -11443,7 +11753,7 @@
         <w:pStyle w:val="Compact"/>
         <w:numPr>
           <w:ilvl w:val="0"/>
-          <w:numId w:val="1129"/>
+          <w:numId w:val="1130"/>
         </w:numPr>
       </w:pPr>
       <w:r>
@@ -11455,7 +11765,7 @@
         <w:pStyle w:val="Compact"/>
         <w:numPr>
           <w:ilvl w:val="0"/>
-          <w:numId w:val="1130"/>
+          <w:numId w:val="1131"/>
         </w:numPr>
       </w:pPr>
       <w:r>
@@ -11467,7 +11777,7 @@
         <w:pStyle w:val="Compact"/>
         <w:numPr>
           <w:ilvl w:val="0"/>
-          <w:numId w:val="1131"/>
+          <w:numId w:val="1132"/>
         </w:numPr>
       </w:pPr>
       <w:r>
@@ -11479,7 +11789,7 @@
         <w:pStyle w:val="Compact"/>
         <w:numPr>
           <w:ilvl w:val="0"/>
-          <w:numId w:val="1132"/>
+          <w:numId w:val="1133"/>
         </w:numPr>
       </w:pPr>
       <w:r>
@@ -11491,7 +11801,7 @@
         <w:pStyle w:val="Compact"/>
         <w:numPr>
           <w:ilvl w:val="0"/>
-          <w:numId w:val="1133"/>
+          <w:numId w:val="1134"/>
         </w:numPr>
       </w:pPr>
       <w:r>
@@ -11503,7 +11813,7 @@
         <w:pStyle w:val="Compact"/>
         <w:numPr>
           <w:ilvl w:val="0"/>
-          <w:numId w:val="1134"/>
+          <w:numId w:val="1135"/>
         </w:numPr>
       </w:pPr>
       <w:r>
@@ -11515,7 +11825,7 @@
         <w:pStyle w:val="Compact"/>
         <w:numPr>
           <w:ilvl w:val="0"/>
-          <w:numId w:val="1135"/>
+          <w:numId w:val="1136"/>
         </w:numPr>
       </w:pPr>
       <w:r>
@@ -11527,7 +11837,7 @@
         <w:pStyle w:val="Compact"/>
         <w:numPr>
           <w:ilvl w:val="0"/>
-          <w:numId w:val="1136"/>
+          <w:numId w:val="1137"/>
         </w:numPr>
       </w:pPr>
       <w:r>
@@ -11539,15 +11849,15 @@
         <w:pStyle w:val="Compact"/>
         <w:numPr>
           <w:ilvl w:val="0"/>
-          <w:numId w:val="1137"/>
+          <w:numId w:val="1138"/>
         </w:numPr>
       </w:pPr>
       <w:r>
         <w:t xml:space="preserve">Banner di sblocco con sfondo pieno, senza trasparenza</w:t>
       </w:r>
     </w:p>
-    <w:bookmarkEnd w:id="96"/>
-    <w:bookmarkStart w:id="97" w:name="operatività"/>
+    <w:bookmarkEnd w:id="97"/>
+    <w:bookmarkStart w:id="98" w:name="operatività"/>
     <w:p>
       <w:pPr>
         <w:pStyle w:val="Heading3"/>
@@ -11561,7 +11871,7 @@
         <w:pStyle w:val="Compact"/>
         <w:numPr>
           <w:ilvl w:val="0"/>
-          <w:numId w:val="1138"/>
+          <w:numId w:val="1139"/>
         </w:numPr>
       </w:pPr>
       <w:r>
@@ -11573,7 +11883,7 @@
         <w:pStyle w:val="Compact"/>
         <w:numPr>
           <w:ilvl w:val="0"/>
-          <w:numId w:val="1139"/>
+          <w:numId w:val="1140"/>
         </w:numPr>
       </w:pPr>
       <w:r>
@@ -11585,7 +11895,7 @@
         <w:pStyle w:val="Compact"/>
         <w:numPr>
           <w:ilvl w:val="0"/>
-          <w:numId w:val="1140"/>
+          <w:numId w:val="1141"/>
         </w:numPr>
       </w:pPr>
       <w:r>
@@ -11597,7 +11907,7 @@
         <w:pStyle w:val="Compact"/>
         <w:numPr>
           <w:ilvl w:val="0"/>
-          <w:numId w:val="1141"/>
+          <w:numId w:val="1142"/>
         </w:numPr>
       </w:pPr>
       <w:r>
@@ -11618,7 +11928,7 @@
         <w:pStyle w:val="Compact"/>
         <w:numPr>
           <w:ilvl w:val="0"/>
-          <w:numId w:val="1142"/>
+          <w:numId w:val="1143"/>
         </w:numPr>
       </w:pPr>
       <w:r>
@@ -11630,7 +11940,7 @@
         <w:pStyle w:val="Compact"/>
         <w:numPr>
           <w:ilvl w:val="0"/>
-          <w:numId w:val="1143"/>
+          <w:numId w:val="1144"/>
         </w:numPr>
       </w:pPr>
       <w:r>
@@ -11642,7 +11952,7 @@
         <w:pStyle w:val="Compact"/>
         <w:numPr>
           <w:ilvl w:val="0"/>
-          <w:numId w:val="1144"/>
+          <w:numId w:val="1145"/>
         </w:numPr>
       </w:pPr>
       <w:r>
@@ -11654,7 +11964,7 @@
         <w:pStyle w:val="Compact"/>
         <w:numPr>
           <w:ilvl w:val="0"/>
-          <w:numId w:val="1145"/>
+          <w:numId w:val="1146"/>
         </w:numPr>
       </w:pPr>
       <w:r>
@@ -11666,7 +11976,7 @@
         <w:pStyle w:val="Compact"/>
         <w:numPr>
           <w:ilvl w:val="0"/>
-          <w:numId w:val="1146"/>
+          <w:numId w:val="1147"/>
         </w:numPr>
       </w:pPr>
       <w:r>
@@ -11678,7 +11988,7 @@
         <w:pStyle w:val="Compact"/>
         <w:numPr>
           <w:ilvl w:val="0"/>
-          <w:numId w:val="1147"/>
+          <w:numId w:val="1148"/>
         </w:numPr>
       </w:pPr>
       <w:r>
@@ -11690,7 +12000,7 @@
         <w:pStyle w:val="Compact"/>
         <w:numPr>
           <w:ilvl w:val="0"/>
-          <w:numId w:val="1148"/>
+          <w:numId w:val="1149"/>
         </w:numPr>
       </w:pPr>
       <w:r>
@@ -11702,7 +12012,7 @@
         <w:pStyle w:val="Compact"/>
         <w:numPr>
           <w:ilvl w:val="0"/>
-          <w:numId w:val="1149"/>
+          <w:numId w:val="1150"/>
         </w:numPr>
       </w:pPr>
       <w:r>
@@ -11714,7 +12024,7 @@
         <w:pStyle w:val="Compact"/>
         <w:numPr>
           <w:ilvl w:val="0"/>
-          <w:numId w:val="1150"/>
+          <w:numId w:val="1151"/>
         </w:numPr>
       </w:pPr>
       <w:r>
@@ -11726,7 +12036,7 @@
         <w:pStyle w:val="Compact"/>
         <w:numPr>
           <w:ilvl w:val="0"/>
-          <w:numId w:val="1151"/>
+          <w:numId w:val="1152"/>
         </w:numPr>
       </w:pPr>
       <w:r>
@@ -11738,7 +12048,7 @@
         <w:pStyle w:val="Compact"/>
         <w:numPr>
           <w:ilvl w:val="0"/>
-          <w:numId w:val="1152"/>
+          <w:numId w:val="1153"/>
         </w:numPr>
       </w:pPr>
       <w:r>
@@ -11750,7 +12060,19 @@
         <w:pStyle w:val="Compact"/>
         <w:numPr>
           <w:ilvl w:val="0"/>
-          <w:numId w:val="1153"/>
+          <w:numId w:val="1154"/>
+        </w:numPr>
+      </w:pPr>
+      <w:r>
+        <w:t xml:space="preserve">Terza famiglia progressiva: Nostalgico</w:t>
+      </w:r>
+    </w:p>
+    <w:p>
+      <w:pPr>
+        <w:pStyle w:val="Compact"/>
+        <w:numPr>
+          <w:ilvl w:val="0"/>
+          <w:numId w:val="1155"/>
         </w:numPr>
       </w:pPr>
       <w:r>
@@ -11764,9 +12086,9 @@
         </w:pict>
       </w:r>
     </w:p>
-    <w:bookmarkEnd w:id="97"/>
     <w:bookmarkEnd w:id="98"/>
-    <w:bookmarkStart w:id="99" w:name="prossimo-passo-consigliato"/>
+    <w:bookmarkEnd w:id="99"/>
+    <w:bookmarkStart w:id="100" w:name="prossimo-passo-consigliato"/>
     <w:p>
       <w:pPr>
         <w:pStyle w:val="Heading2"/>
@@ -11788,7 +12110,7 @@
         <w:pStyle w:val="BodyText"/>
       </w:pPr>
       <w:r>
-        <w:t xml:space="preserve">Il prossimo passo operativo è</w:t>
+        <w:t xml:space="preserve">Il prossimo passo operativo è completare il rollout di</w:t>
       </w:r>
       <w:r>
         <w:t xml:space="preserve"> </w:t>
@@ -11809,35 +12131,35 @@
         <w:pStyle w:val="Compact"/>
         <w:numPr>
           <w:ilvl w:val="0"/>
-          <w:numId w:val="1154"/>
-        </w:numPr>
-      </w:pPr>
-      <w:r>
-        <w:t xml:space="preserve">contare film e serie completati usciti prima del 1990;</w:t>
-      </w:r>
-    </w:p>
-    <w:p>
-      <w:pPr>
-        <w:pStyle w:val="Compact"/>
-        <w:numPr>
-          <w:ilvl w:val="0"/>
-          <w:numId w:val="1154"/>
-        </w:numPr>
-      </w:pPr>
-      <w:r>
-        <w:t xml:space="preserve">includere lo storico importato;</w:t>
-      </w:r>
-    </w:p>
-    <w:p>
-      <w:pPr>
-        <w:pStyle w:val="Compact"/>
-        <w:numPr>
-          <w:ilvl w:val="0"/>
-          <w:numId w:val="1154"/>
-        </w:numPr>
-      </w:pPr>
-      <w:r>
-        <w:t xml:space="preserve">aggiungere le soglie</w:t>
+          <w:numId w:val="1156"/>
+        </w:numPr>
+      </w:pPr>
+      <w:r>
+        <w:t xml:space="preserve">distribuire la Edge Function aggiornata;</w:t>
+      </w:r>
+    </w:p>
+    <w:p>
+      <w:pPr>
+        <w:pStyle w:val="Compact"/>
+        <w:numPr>
+          <w:ilvl w:val="0"/>
+          <w:numId w:val="1156"/>
+        </w:numPr>
+      </w:pPr>
+      <w:r>
+        <w:t xml:space="preserve">pubblicare la Sala trofei con la patch CRT;</w:t>
+      </w:r>
+    </w:p>
+    <w:p>
+      <w:pPr>
+        <w:pStyle w:val="Compact"/>
+        <w:numPr>
+          <w:ilvl w:val="0"/>
+          <w:numId w:val="1156"/>
+        </w:numPr>
+      </w:pPr>
+      <w:r>
+        <w:t xml:space="preserve">applicare la migration</w:t>
       </w:r>
       <w:r>
         <w:t xml:space="preserve"> </w:t>
@@ -11846,7 +12168,7 @@
         <w:rPr>
           <w:rStyle w:val="VerbatimChar"/>
         </w:rPr>
-        <w:t xml:space="preserve">50 / 150 / 250 / 500</w:t>
+        <w:t xml:space="preserve">0020_nostalgic_badge.sql</w:t>
       </w:r>
       <w:r>
         <w:t xml:space="preserve">;</w:t>
@@ -11857,39 +12179,39 @@
         <w:pStyle w:val="Compact"/>
         <w:numPr>
           <w:ilvl w:val="0"/>
-          <w:numId w:val="1154"/>
-        </w:numPr>
-      </w:pPr>
-      <w:r>
-        <w:t xml:space="preserve">creare la patch dedicata e il relativo accordion;</w:t>
-      </w:r>
-    </w:p>
-    <w:p>
-      <w:pPr>
-        <w:pStyle w:val="Compact"/>
-        <w:numPr>
-          <w:ilvl w:val="0"/>
-          <w:numId w:val="1154"/>
-        </w:numPr>
-      </w:pPr>
-      <w:r>
-        <w:t xml:space="preserve">verificare il backfill sugli account reali;</w:t>
-      </w:r>
-    </w:p>
-    <w:p>
-      <w:pPr>
-        <w:pStyle w:val="Compact"/>
-        <w:numPr>
-          <w:ilvl w:val="0"/>
-          <w:numId w:val="1154"/>
+          <w:numId w:val="1156"/>
+        </w:numPr>
+      </w:pPr>
+      <w:r>
+        <w:t xml:space="preserve">verificare backfill e idempotenza sull’account Test;</w:t>
+      </w:r>
+    </w:p>
+    <w:p>
+      <w:pPr>
+        <w:pStyle w:val="Compact"/>
+        <w:numPr>
+          <w:ilvl w:val="0"/>
+          <w:numId w:val="1156"/>
+        </w:numPr>
+      </w:pPr>
+      <w:r>
+        <w:t xml:space="preserve">verificare il progresso e gli eventuali sblocchi sull’account principale;</w:t>
+      </w:r>
+    </w:p>
+    <w:p>
+      <w:pPr>
+        <w:pStyle w:val="Compact"/>
+        <w:numPr>
+          <w:ilvl w:val="0"/>
+          <w:numId w:val="1156"/>
         </w:numPr>
       </w:pPr>
       <w:r>
         <w:t xml:space="preserve">proseguire infine con Serialista.</w:t>
       </w:r>
     </w:p>
-    <w:bookmarkEnd w:id="99"/>
     <w:bookmarkEnd w:id="100"/>
+    <w:bookmarkEnd w:id="101"/>
     <w:sectPr>
       <w:footerReference r:id="rId9" w:type="default"/>
       <w:pgSz w:h="15840" w:w="12240"/>
@@ -12836,7 +13158,7 @@
     <w:abstractNumId w:val="993"/>
   </w:num>
   <w:num w:numId="1074">
-    <w:abstractNumId w:val="992"/>
+    <w:abstractNumId w:val="993"/>
   </w:num>
   <w:num w:numId="1075">
     <w:abstractNumId w:val="991"/>
@@ -12845,7 +13167,7 @@
     <w:abstractNumId w:val="991"/>
   </w:num>
   <w:num w:numId="1077">
-    <w:abstractNumId w:val="992"/>
+    <w:abstractNumId w:val="991"/>
   </w:num>
   <w:num w:numId="1078">
     <w:abstractNumId w:val="992"/>
@@ -12902,10 +13224,10 @@
     <w:abstractNumId w:val="992"/>
   </w:num>
   <w:num w:numId="1096">
-    <w:abstractNumId w:val="991"/>
+    <w:abstractNumId w:val="992"/>
   </w:num>
   <w:num w:numId="1097">
-    <w:abstractNumId w:val="993"/>
+    <w:abstractNumId w:val="991"/>
   </w:num>
   <w:num w:numId="1098">
     <w:abstractNumId w:val="993"/>
@@ -13076,6 +13398,12 @@
     <w:abstractNumId w:val="993"/>
   </w:num>
   <w:num w:numId="1154">
+    <w:abstractNumId w:val="993"/>
+  </w:num>
+  <w:num w:numId="1155">
+    <w:abstractNumId w:val="993"/>
+  </w:num>
+  <w:num w:numId="1156">
     <w:abstractNumId w:val="99411"/>
     <w:lvlOverride w:ilvl="0">
       <w:startOverride w:val="1"/>
@@ -24967,6 +25295,232 @@
     <w:pPr>
       <w:wordWrap w:val="off"/>
     </w:pPr>
+  </w:style>
+  <w:style w:customStyle="1" w:styleId="KeywordTok" w:type="character">
+    <w:name w:val="KeywordTok"/>
+    <w:basedOn w:val="VerbatimChar"/>
+    <w:rPr>
+      <w:b/>
+      <w:color w:val="007020"/>
+    </w:rPr>
+  </w:style>
+  <w:style w:customStyle="1" w:styleId="DataTypeTok" w:type="character">
+    <w:name w:val="DataTypeTok"/>
+    <w:basedOn w:val="VerbatimChar"/>
+    <w:rPr>
+      <w:color w:val="902000"/>
+    </w:rPr>
+  </w:style>
+  <w:style w:customStyle="1" w:styleId="DecValTok" w:type="character">
+    <w:name w:val="DecValTok"/>
+    <w:basedOn w:val="VerbatimChar"/>
+    <w:rPr>
+      <w:color w:val="40a070"/>
+    </w:rPr>
+  </w:style>
+  <w:style w:customStyle="1" w:styleId="BaseNTok" w:type="character">
+    <w:name w:val="BaseNTok"/>
+    <w:basedOn w:val="VerbatimChar"/>
+    <w:rPr>
+      <w:color w:val="40a070"/>
+    </w:rPr>
+  </w:style>
+  <w:style w:customStyle="1" w:styleId="FloatTok" w:type="character">
+    <w:name w:val="FloatTok"/>
+    <w:basedOn w:val="VerbatimChar"/>
+    <w:rPr>
+      <w:color w:val="40a070"/>
+    </w:rPr>
+  </w:style>
+  <w:style w:customStyle="1" w:styleId="ConstantTok" w:type="character">
+    <w:name w:val="ConstantTok"/>
+    <w:basedOn w:val="VerbatimChar"/>
+    <w:rPr>
+      <w:color w:val="880000"/>
+    </w:rPr>
+  </w:style>
+  <w:style w:customStyle="1" w:styleId="CharTok" w:type="character">
+    <w:name w:val="CharTok"/>
+    <w:basedOn w:val="VerbatimChar"/>
+    <w:rPr>
+      <w:color w:val="4070a0"/>
+    </w:rPr>
+  </w:style>
+  <w:style w:customStyle="1" w:styleId="SpecialCharTok" w:type="character">
+    <w:name w:val="SpecialCharTok"/>
+    <w:basedOn w:val="VerbatimChar"/>
+    <w:rPr>
+      <w:color w:val="4070a0"/>
+    </w:rPr>
+  </w:style>
+  <w:style w:customStyle="1" w:styleId="StringTok" w:type="character">
+    <w:name w:val="StringTok"/>
+    <w:basedOn w:val="VerbatimChar"/>
+    <w:rPr>
+      <w:color w:val="4070a0"/>
+    </w:rPr>
+  </w:style>
+  <w:style w:customStyle="1" w:styleId="VerbatimStringTok" w:type="character">
+    <w:name w:val="VerbatimStringTok"/>
+    <w:basedOn w:val="VerbatimChar"/>
+    <w:rPr>
+      <w:color w:val="4070a0"/>
+    </w:rPr>
+  </w:style>
+  <w:style w:customStyle="1" w:styleId="SpecialStringTok" w:type="character">
+    <w:name w:val="SpecialStringTok"/>
+    <w:basedOn w:val="VerbatimChar"/>
+    <w:rPr>
+      <w:color w:val="bb6688"/>
+    </w:rPr>
+  </w:style>
+  <w:style w:customStyle="1" w:styleId="ImportTok" w:type="character">
+    <w:name w:val="ImportTok"/>
+    <w:basedOn w:val="VerbatimChar"/>
+    <w:rPr>
+      <w:b/>
+      <w:color w:val="008000"/>
+    </w:rPr>
+  </w:style>
+  <w:style w:customStyle="1" w:styleId="CommentTok" w:type="character">
+    <w:name w:val="CommentTok"/>
+    <w:basedOn w:val="VerbatimChar"/>
+    <w:rPr>
+      <w:i/>
+      <w:color w:val="60a0b0"/>
+    </w:rPr>
+  </w:style>
+  <w:style w:customStyle="1" w:styleId="DocumentationTok" w:type="character">
+    <w:name w:val="DocumentationTok"/>
+    <w:basedOn w:val="VerbatimChar"/>
+    <w:rPr>
+      <w:i/>
+      <w:color w:val="ba2121"/>
+    </w:rPr>
+  </w:style>
+  <w:style w:customStyle="1" w:styleId="AnnotationTok" w:type="character">
+    <w:name w:val="AnnotationTok"/>
+    <w:basedOn w:val="VerbatimChar"/>
+    <w:rPr>
+      <w:b/>
+      <w:i/>
+      <w:color w:val="60a0b0"/>
+    </w:rPr>
+  </w:style>
+  <w:style w:customStyle="1" w:styleId="CommentVarTok" w:type="character">
+    <w:name w:val="CommentVarTok"/>
+    <w:basedOn w:val="VerbatimChar"/>
+    <w:rPr>
+      <w:b/>
+      <w:i/>
+      <w:color w:val="60a0b0"/>
+    </w:rPr>
+  </w:style>
+  <w:style w:customStyle="1" w:styleId="OtherTok" w:type="character">
+    <w:name w:val="OtherTok"/>
+    <w:basedOn w:val="VerbatimChar"/>
+    <w:rPr>
+      <w:color w:val="007020"/>
+    </w:rPr>
+  </w:style>
+  <w:style w:customStyle="1" w:styleId="FunctionTok" w:type="character">
+    <w:name w:val="FunctionTok"/>
+    <w:basedOn w:val="VerbatimChar"/>
+    <w:rPr>
+      <w:color w:val="06287e"/>
+    </w:rPr>
+  </w:style>
+  <w:style w:customStyle="1" w:styleId="VariableTok" w:type="character">
+    <w:name w:val="VariableTok"/>
+    <w:basedOn w:val="VerbatimChar"/>
+    <w:rPr>
+      <w:color w:val="19177c"/>
+    </w:rPr>
+  </w:style>
+  <w:style w:customStyle="1" w:styleId="ControlFlowTok" w:type="character">
+    <w:name w:val="ControlFlowTok"/>
+    <w:basedOn w:val="VerbatimChar"/>
+    <w:rPr>
+      <w:b/>
+      <w:color w:val="007020"/>
+    </w:rPr>
+  </w:style>
+  <w:style w:customStyle="1" w:styleId="OperatorTok" w:type="character">
+    <w:name w:val="OperatorTok"/>
+    <w:basedOn w:val="VerbatimChar"/>
+    <w:rPr>
+      <w:color w:val="666666"/>
+    </w:rPr>
+  </w:style>
+  <w:style w:customStyle="1" w:styleId="BuiltInTok" w:type="character">
+    <w:name w:val="BuiltInTok"/>
+    <w:basedOn w:val="VerbatimChar"/>
+    <w:rPr>
+      <w:color w:val="008000"/>
+    </w:rPr>
+  </w:style>
+  <w:style w:customStyle="1" w:styleId="ExtensionTok" w:type="character">
+    <w:name w:val="ExtensionTok"/>
+    <w:basedOn w:val="VerbatimChar"/>
+    <w:rPr/>
+  </w:style>
+  <w:style w:customStyle="1" w:styleId="PreprocessorTok" w:type="character">
+    <w:name w:val="PreprocessorTok"/>
+    <w:basedOn w:val="VerbatimChar"/>
+    <w:rPr>
+      <w:color w:val="bc7a00"/>
+    </w:rPr>
+  </w:style>
+  <w:style w:customStyle="1" w:styleId="AttributeTok" w:type="character">
+    <w:name w:val="AttributeTok"/>
+    <w:basedOn w:val="VerbatimChar"/>
+    <w:rPr>
+      <w:color w:val="7d9029"/>
+    </w:rPr>
+  </w:style>
+  <w:style w:customStyle="1" w:styleId="RegionMarkerTok" w:type="character">
+    <w:name w:val="RegionMarkerTok"/>
+    <w:basedOn w:val="VerbatimChar"/>
+    <w:rPr/>
+  </w:style>
+  <w:style w:customStyle="1" w:styleId="InformationTok" w:type="character">
+    <w:name w:val="InformationTok"/>
+    <w:basedOn w:val="VerbatimChar"/>
+    <w:rPr>
+      <w:b/>
+      <w:i/>
+      <w:color w:val="60a0b0"/>
+    </w:rPr>
+  </w:style>
+  <w:style w:customStyle="1" w:styleId="WarningTok" w:type="character">
+    <w:name w:val="WarningTok"/>
+    <w:basedOn w:val="VerbatimChar"/>
+    <w:rPr>
+      <w:b/>
+      <w:i/>
+      <w:color w:val="60a0b0"/>
+    </w:rPr>
+  </w:style>
+  <w:style w:customStyle="1" w:styleId="AlertTok" w:type="character">
+    <w:name w:val="AlertTok"/>
+    <w:basedOn w:val="VerbatimChar"/>
+    <w:rPr>
+      <w:b/>
+      <w:color w:val="ff0000"/>
+    </w:rPr>
+  </w:style>
+  <w:style w:customStyle="1" w:styleId="ErrorTok" w:type="character">
+    <w:name w:val="ErrorTok"/>
+    <w:basedOn w:val="VerbatimChar"/>
+    <w:rPr>
+      <w:b/>
+      <w:color w:val="ff0000"/>
+    </w:rPr>
+  </w:style>
+  <w:style w:customStyle="1" w:styleId="NormalTok" w:type="character">
+    <w:name w:val="NormalTok"/>
+    <w:basedOn w:val="VerbatimChar"/>
+    <w:rPr/>
   </w:style>
   <w:style w:customStyle="1" w:styleId="KeywordTok" w:type="character">
     <w:name w:val="KeywordTok"/>

</xml_diff>

<commit_message>
Document Nostalgic badge rollout
Co-authored-by: Copilot <223556219+Copilot@users.noreply.github.com>
</commit_message>
<xml_diff>
--- a/docs/BADGE-PIANO.docx
+++ b/docs/BADGE-PIANO.docx
@@ -91,13 +91,13 @@
         <w:t xml:space="preserve"> </w:t>
       </w:r>
       <w:r>
-        <w:t xml:space="preserve">Batch A1 e Archivista (A2.1) pubblicati; Nostalgico (A2.2)</w:t>
+        <w:t xml:space="preserve">Batch A1, Archivista (A2.1) e Nostalgico (A2.2) pubblicati e</w:t>
       </w:r>
       <w:r>
         <w:t xml:space="preserve"> </w:t>
       </w:r>
       <w:r>
-        <w:t xml:space="preserve">completato localmente e in attesa di rollout</w:t>
+        <w:t xml:space="preserve">verificati in produzione</w:t>
       </w:r>
     </w:p>
     <w:p>
@@ -10442,6 +10442,204 @@
         <w:t xml:space="preserve">.</w:t>
       </w:r>
     </w:p>
+    <w:p>
+      <w:pPr>
+        <w:pStyle w:val="Compact"/>
+        <w:numPr>
+          <w:ilvl w:val="0"/>
+          <w:numId w:val="1077"/>
+        </w:numPr>
+      </w:pPr>
+      <w:r>
+        <w:t xml:space="preserve">Edge Function monolitica verificata e distribuita con loader ed evaluator Nostalgico;</w:t>
+      </w:r>
+    </w:p>
+    <w:p>
+      <w:pPr>
+        <w:pStyle w:val="Compact"/>
+        <w:numPr>
+          <w:ilvl w:val="0"/>
+          <w:numId w:val="1077"/>
+        </w:numPr>
+      </w:pPr>
+      <w:r>
+        <w:t xml:space="preserve">primo tentativo di backfill fermato esplicitamente con</w:t>
+      </w:r>
+      <w:r>
+        <w:t xml:space="preserve"> </w:t>
+      </w:r>
+      <w:r>
+        <w:rPr>
+          <w:rStyle w:val="VerbatimChar"/>
+        </w:rPr>
+        <w:t xml:space="preserve">409 facts_loader_not_found</w:t>
+      </w:r>
+      <w:r>
+        <w:t xml:space="preserve"> </w:t>
+      </w:r>
+      <w:r>
+        <w:t xml:space="preserve">prima di qualsiasi persistenza; artifact corretto e ridistribuito;</w:t>
+      </w:r>
+    </w:p>
+    <w:p>
+      <w:pPr>
+        <w:pStyle w:val="Compact"/>
+        <w:numPr>
+          <w:ilvl w:val="0"/>
+          <w:numId w:val="1077"/>
+        </w:numPr>
+      </w:pPr>
+      <w:r>
+        <w:t xml:space="preserve">deploy Azure completato sul commit</w:t>
+      </w:r>
+      <w:r>
+        <w:t xml:space="preserve"> </w:t>
+      </w:r>
+      <w:r>
+        <w:rPr>
+          <w:rStyle w:val="VerbatimChar"/>
+        </w:rPr>
+        <w:t xml:space="preserve">226db27</w:t>
+      </w:r>
+      <w:r>
+        <w:t xml:space="preserve">;</w:t>
+      </w:r>
+    </w:p>
+    <w:p>
+      <w:pPr>
+        <w:pStyle w:val="Compact"/>
+        <w:numPr>
+          <w:ilvl w:val="0"/>
+          <w:numId w:val="1077"/>
+        </w:numPr>
+      </w:pPr>
+      <w:r>
+        <w:t xml:space="preserve">migration</w:t>
+      </w:r>
+      <w:r>
+        <w:t xml:space="preserve"> </w:t>
+      </w:r>
+      <w:r>
+        <w:rPr>
+          <w:rStyle w:val="VerbatimChar"/>
+        </w:rPr>
+        <w:t xml:space="preserve">0020_nostalgic_badge.sql</w:t>
+      </w:r>
+      <w:r>
+        <w:t xml:space="preserve"> </w:t>
+      </w:r>
+      <w:r>
+        <w:t xml:space="preserve">applicata con encoding UTF-8;</w:t>
+      </w:r>
+    </w:p>
+    <w:p>
+      <w:pPr>
+        <w:pStyle w:val="Compact"/>
+        <w:numPr>
+          <w:ilvl w:val="0"/>
+          <w:numId w:val="1077"/>
+        </w:numPr>
+      </w:pPr>
+      <w:r>
+        <w:t xml:space="preserve">test SQL transazionale superato senza dati residui;</w:t>
+      </w:r>
+    </w:p>
+    <w:p>
+      <w:pPr>
+        <w:pStyle w:val="Compact"/>
+        <w:numPr>
+          <w:ilvl w:val="0"/>
+          <w:numId w:val="1077"/>
+        </w:numPr>
+      </w:pPr>
+      <w:r>
+        <w:t xml:space="preserve">account</w:t>
+      </w:r>
+      <w:r>
+        <w:t xml:space="preserve"> </w:t>
+      </w:r>
+      <w:r>
+        <w:rPr>
+          <w:rStyle w:val="VerbatimChar"/>
+        </w:rPr>
+        <w:t xml:space="preserve">@testshowtime</w:t>
+      </w:r>
+      <w:r>
+        <w:t xml:space="preserve">:</w:t>
+      </w:r>
+      <w:r>
+        <w:t xml:space="preserve"> </w:t>
+      </w:r>
+      <w:r>
+        <w:rPr>
+          <w:rStyle w:val="VerbatimChar"/>
+        </w:rPr>
+        <w:t xml:space="preserve">0/50</w:t>
+      </w:r>
+      <w:r>
+        <w:t xml:space="preserve">, refresh idempotente e hero</w:t>
+      </w:r>
+      <w:r>
+        <w:t xml:space="preserve"> </w:t>
+      </w:r>
+      <w:r>
+        <w:rPr>
+          <w:rStyle w:val="VerbatimChar"/>
+        </w:rPr>
+        <w:t xml:space="preserve">3/15</w:t>
+      </w:r>
+      <w:r>
+        <w:t xml:space="preserve">;</w:t>
+      </w:r>
+    </w:p>
+    <w:p>
+      <w:pPr>
+        <w:pStyle w:val="Compact"/>
+        <w:numPr>
+          <w:ilvl w:val="0"/>
+          <w:numId w:val="1077"/>
+        </w:numPr>
+      </w:pPr>
+      <w:r>
+        <w:t xml:space="preserve">account principale:</w:t>
+      </w:r>
+      <w:r>
+        <w:t xml:space="preserve"> </w:t>
+      </w:r>
+      <w:r>
+        <w:rPr>
+          <w:rStyle w:val="VerbatimChar"/>
+        </w:rPr>
+        <w:t xml:space="preserve">32/50</w:t>
+      </w:r>
+      <w:r>
+        <w:t xml:space="preserve">, refresh idempotente e hero</w:t>
+      </w:r>
+      <w:r>
+        <w:t xml:space="preserve"> </w:t>
+      </w:r>
+      <w:r>
+        <w:rPr>
+          <w:rStyle w:val="VerbatimChar"/>
+        </w:rPr>
+        <w:t xml:space="preserve">4/15</w:t>
+      </w:r>
+      <w:r>
+        <w:t xml:space="preserve">;</w:t>
+      </w:r>
+    </w:p>
+    <w:p>
+      <w:pPr>
+        <w:pStyle w:val="Compact"/>
+        <w:numPr>
+          <w:ilvl w:val="0"/>
+          <w:numId w:val="1077"/>
+        </w:numPr>
+      </w:pPr>
+      <w:r>
+        <w:t xml:space="preserve">produzione senza errori console né overflow a 360/390 px.</w:t>
+      </w:r>
+    </w:p>
     <w:bookmarkStart w:id="84" w:name="batch-b-esplorazione-e-comportamento"/>
     <w:p>
       <w:pPr>
@@ -12110,7 +12308,7 @@
         <w:pStyle w:val="BodyText"/>
       </w:pPr>
       <w:r>
-        <w:t xml:space="preserve">Il prossimo passo operativo è completare il rollout di</w:t>
+        <w:t xml:space="preserve">Il prossimo passo operativo è</w:t>
       </w:r>
       <w:r>
         <w:t xml:space="preserve"> </w:t>
@@ -12120,7 +12318,7 @@
           <w:b/>
           <w:bCs/>
         </w:rPr>
-        <w:t xml:space="preserve">Nostalgico</w:t>
+        <w:t xml:space="preserve">Serialista</w:t>
       </w:r>
       <w:r>
         <w:t xml:space="preserve">:</w:t>
@@ -12135,31 +12333,7 @@
         </w:numPr>
       </w:pPr>
       <w:r>
-        <w:t xml:space="preserve">distribuire la Edge Function aggiornata;</w:t>
-      </w:r>
-    </w:p>
-    <w:p>
-      <w:pPr>
-        <w:pStyle w:val="Compact"/>
-        <w:numPr>
-          <w:ilvl w:val="0"/>
-          <w:numId w:val="1156"/>
-        </w:numPr>
-      </w:pPr>
-      <w:r>
-        <w:t xml:space="preserve">pubblicare la Sala trofei con la patch CRT;</w:t>
-      </w:r>
-    </w:p>
-    <w:p>
-      <w:pPr>
-        <w:pStyle w:val="Compact"/>
-        <w:numPr>
-          <w:ilvl w:val="0"/>
-          <w:numId w:val="1156"/>
-        </w:numPr>
-      </w:pPr>
-      <w:r>
-        <w:t xml:space="preserve">applicare la migration</w:t>
+        <w:t xml:space="preserve">considerare soltanto serie TMDB con stato</w:t>
       </w:r>
       <w:r>
         <w:t xml:space="preserve"> </w:t>
@@ -12168,7 +12342,7 @@
         <w:rPr>
           <w:rStyle w:val="VerbatimChar"/>
         </w:rPr>
-        <w:t xml:space="preserve">0020_nostalgic_badge.sql</w:t>
+        <w:t xml:space="preserve">Ended</w:t>
       </w:r>
       <w:r>
         <w:t xml:space="preserve">;</w:t>
@@ -12183,7 +12357,7 @@
         </w:numPr>
       </w:pPr>
       <w:r>
-        <w:t xml:space="preserve">verificare backfill e idempotenza sull’account Test;</w:t>
+        <w:t xml:space="preserve">verificare tutti gli episodi regolari, escludendo Stagione 0 / Speciali;</w:t>
       </w:r>
     </w:p>
     <w:p>
@@ -12195,7 +12369,7 @@
         </w:numPr>
       </w:pPr>
       <w:r>
-        <w:t xml:space="preserve">verificare il progresso e gli eventuali sblocchi sull’account principale;</w:t>
+        <w:t xml:space="preserve">includere progresso importato e attività reale;</w:t>
       </w:r>
     </w:p>
     <w:p>
@@ -12207,7 +12381,43 @@
         </w:numPr>
       </w:pPr>
       <w:r>
-        <w:t xml:space="preserve">proseguire infine con Serialista.</w:t>
+        <w:t xml:space="preserve">aggiungere le soglie</w:t>
+      </w:r>
+      <w:r>
+        <w:t xml:space="preserve"> </w:t>
+      </w:r>
+      <w:r>
+        <w:rPr>
+          <w:rStyle w:val="VerbatimChar"/>
+        </w:rPr>
+        <w:t xml:space="preserve">25 / 100 / 250 / 500</w:t>
+      </w:r>
+      <w:r>
+        <w:t xml:space="preserve">;</w:t>
+      </w:r>
+    </w:p>
+    <w:p>
+      <w:pPr>
+        <w:pStyle w:val="Compact"/>
+        <w:numPr>
+          <w:ilvl w:val="0"/>
+          <w:numId w:val="1156"/>
+        </w:numPr>
+      </w:pPr>
+      <w:r>
+        <w:t xml:space="preserve">creare patch e accordion dedicati;</w:t>
+      </w:r>
+    </w:p>
+    <w:p>
+      <w:pPr>
+        <w:pStyle w:val="Compact"/>
+        <w:numPr>
+          <w:ilvl w:val="0"/>
+          <w:numId w:val="1156"/>
+        </w:numPr>
+      </w:pPr>
+      <w:r>
+        <w:t xml:space="preserve">completare il Batch A2 con backfill e test reali.</w:t>
       </w:r>
     </w:p>
     <w:bookmarkEnd w:id="100"/>
@@ -26200,6 +26410,232 @@
     <w:basedOn w:val="VerbatimChar"/>
     <w:rPr/>
   </w:style>
+  <w:style w:customStyle="1" w:styleId="KeywordTok" w:type="character">
+    <w:name w:val="KeywordTok"/>
+    <w:basedOn w:val="VerbatimChar"/>
+    <w:rPr>
+      <w:b/>
+      <w:color w:val="007020"/>
+    </w:rPr>
+  </w:style>
+  <w:style w:customStyle="1" w:styleId="DataTypeTok" w:type="character">
+    <w:name w:val="DataTypeTok"/>
+    <w:basedOn w:val="VerbatimChar"/>
+    <w:rPr>
+      <w:color w:val="902000"/>
+    </w:rPr>
+  </w:style>
+  <w:style w:customStyle="1" w:styleId="DecValTok" w:type="character">
+    <w:name w:val="DecValTok"/>
+    <w:basedOn w:val="VerbatimChar"/>
+    <w:rPr>
+      <w:color w:val="40a070"/>
+    </w:rPr>
+  </w:style>
+  <w:style w:customStyle="1" w:styleId="BaseNTok" w:type="character">
+    <w:name w:val="BaseNTok"/>
+    <w:basedOn w:val="VerbatimChar"/>
+    <w:rPr>
+      <w:color w:val="40a070"/>
+    </w:rPr>
+  </w:style>
+  <w:style w:customStyle="1" w:styleId="FloatTok" w:type="character">
+    <w:name w:val="FloatTok"/>
+    <w:basedOn w:val="VerbatimChar"/>
+    <w:rPr>
+      <w:color w:val="40a070"/>
+    </w:rPr>
+  </w:style>
+  <w:style w:customStyle="1" w:styleId="ConstantTok" w:type="character">
+    <w:name w:val="ConstantTok"/>
+    <w:basedOn w:val="VerbatimChar"/>
+    <w:rPr>
+      <w:color w:val="880000"/>
+    </w:rPr>
+  </w:style>
+  <w:style w:customStyle="1" w:styleId="CharTok" w:type="character">
+    <w:name w:val="CharTok"/>
+    <w:basedOn w:val="VerbatimChar"/>
+    <w:rPr>
+      <w:color w:val="4070a0"/>
+    </w:rPr>
+  </w:style>
+  <w:style w:customStyle="1" w:styleId="SpecialCharTok" w:type="character">
+    <w:name w:val="SpecialCharTok"/>
+    <w:basedOn w:val="VerbatimChar"/>
+    <w:rPr>
+      <w:color w:val="4070a0"/>
+    </w:rPr>
+  </w:style>
+  <w:style w:customStyle="1" w:styleId="StringTok" w:type="character">
+    <w:name w:val="StringTok"/>
+    <w:basedOn w:val="VerbatimChar"/>
+    <w:rPr>
+      <w:color w:val="4070a0"/>
+    </w:rPr>
+  </w:style>
+  <w:style w:customStyle="1" w:styleId="VerbatimStringTok" w:type="character">
+    <w:name w:val="VerbatimStringTok"/>
+    <w:basedOn w:val="VerbatimChar"/>
+    <w:rPr>
+      <w:color w:val="4070a0"/>
+    </w:rPr>
+  </w:style>
+  <w:style w:customStyle="1" w:styleId="SpecialStringTok" w:type="character">
+    <w:name w:val="SpecialStringTok"/>
+    <w:basedOn w:val="VerbatimChar"/>
+    <w:rPr>
+      <w:color w:val="bb6688"/>
+    </w:rPr>
+  </w:style>
+  <w:style w:customStyle="1" w:styleId="ImportTok" w:type="character">
+    <w:name w:val="ImportTok"/>
+    <w:basedOn w:val="VerbatimChar"/>
+    <w:rPr>
+      <w:b/>
+      <w:color w:val="008000"/>
+    </w:rPr>
+  </w:style>
+  <w:style w:customStyle="1" w:styleId="CommentTok" w:type="character">
+    <w:name w:val="CommentTok"/>
+    <w:basedOn w:val="VerbatimChar"/>
+    <w:rPr>
+      <w:i/>
+      <w:color w:val="60a0b0"/>
+    </w:rPr>
+  </w:style>
+  <w:style w:customStyle="1" w:styleId="DocumentationTok" w:type="character">
+    <w:name w:val="DocumentationTok"/>
+    <w:basedOn w:val="VerbatimChar"/>
+    <w:rPr>
+      <w:i/>
+      <w:color w:val="ba2121"/>
+    </w:rPr>
+  </w:style>
+  <w:style w:customStyle="1" w:styleId="AnnotationTok" w:type="character">
+    <w:name w:val="AnnotationTok"/>
+    <w:basedOn w:val="VerbatimChar"/>
+    <w:rPr>
+      <w:b/>
+      <w:i/>
+      <w:color w:val="60a0b0"/>
+    </w:rPr>
+  </w:style>
+  <w:style w:customStyle="1" w:styleId="CommentVarTok" w:type="character">
+    <w:name w:val="CommentVarTok"/>
+    <w:basedOn w:val="VerbatimChar"/>
+    <w:rPr>
+      <w:b/>
+      <w:i/>
+      <w:color w:val="60a0b0"/>
+    </w:rPr>
+  </w:style>
+  <w:style w:customStyle="1" w:styleId="OtherTok" w:type="character">
+    <w:name w:val="OtherTok"/>
+    <w:basedOn w:val="VerbatimChar"/>
+    <w:rPr>
+      <w:color w:val="007020"/>
+    </w:rPr>
+  </w:style>
+  <w:style w:customStyle="1" w:styleId="FunctionTok" w:type="character">
+    <w:name w:val="FunctionTok"/>
+    <w:basedOn w:val="VerbatimChar"/>
+    <w:rPr>
+      <w:color w:val="06287e"/>
+    </w:rPr>
+  </w:style>
+  <w:style w:customStyle="1" w:styleId="VariableTok" w:type="character">
+    <w:name w:val="VariableTok"/>
+    <w:basedOn w:val="VerbatimChar"/>
+    <w:rPr>
+      <w:color w:val="19177c"/>
+    </w:rPr>
+  </w:style>
+  <w:style w:customStyle="1" w:styleId="ControlFlowTok" w:type="character">
+    <w:name w:val="ControlFlowTok"/>
+    <w:basedOn w:val="VerbatimChar"/>
+    <w:rPr>
+      <w:b/>
+      <w:color w:val="007020"/>
+    </w:rPr>
+  </w:style>
+  <w:style w:customStyle="1" w:styleId="OperatorTok" w:type="character">
+    <w:name w:val="OperatorTok"/>
+    <w:basedOn w:val="VerbatimChar"/>
+    <w:rPr>
+      <w:color w:val="666666"/>
+    </w:rPr>
+  </w:style>
+  <w:style w:customStyle="1" w:styleId="BuiltInTok" w:type="character">
+    <w:name w:val="BuiltInTok"/>
+    <w:basedOn w:val="VerbatimChar"/>
+    <w:rPr>
+      <w:color w:val="008000"/>
+    </w:rPr>
+  </w:style>
+  <w:style w:customStyle="1" w:styleId="ExtensionTok" w:type="character">
+    <w:name w:val="ExtensionTok"/>
+    <w:basedOn w:val="VerbatimChar"/>
+    <w:rPr/>
+  </w:style>
+  <w:style w:customStyle="1" w:styleId="PreprocessorTok" w:type="character">
+    <w:name w:val="PreprocessorTok"/>
+    <w:basedOn w:val="VerbatimChar"/>
+    <w:rPr>
+      <w:color w:val="bc7a00"/>
+    </w:rPr>
+  </w:style>
+  <w:style w:customStyle="1" w:styleId="AttributeTok" w:type="character">
+    <w:name w:val="AttributeTok"/>
+    <w:basedOn w:val="VerbatimChar"/>
+    <w:rPr>
+      <w:color w:val="7d9029"/>
+    </w:rPr>
+  </w:style>
+  <w:style w:customStyle="1" w:styleId="RegionMarkerTok" w:type="character">
+    <w:name w:val="RegionMarkerTok"/>
+    <w:basedOn w:val="VerbatimChar"/>
+    <w:rPr/>
+  </w:style>
+  <w:style w:customStyle="1" w:styleId="InformationTok" w:type="character">
+    <w:name w:val="InformationTok"/>
+    <w:basedOn w:val="VerbatimChar"/>
+    <w:rPr>
+      <w:b/>
+      <w:i/>
+      <w:color w:val="60a0b0"/>
+    </w:rPr>
+  </w:style>
+  <w:style w:customStyle="1" w:styleId="WarningTok" w:type="character">
+    <w:name w:val="WarningTok"/>
+    <w:basedOn w:val="VerbatimChar"/>
+    <w:rPr>
+      <w:b/>
+      <w:i/>
+      <w:color w:val="60a0b0"/>
+    </w:rPr>
+  </w:style>
+  <w:style w:customStyle="1" w:styleId="AlertTok" w:type="character">
+    <w:name w:val="AlertTok"/>
+    <w:basedOn w:val="VerbatimChar"/>
+    <w:rPr>
+      <w:b/>
+      <w:color w:val="ff0000"/>
+    </w:rPr>
+  </w:style>
+  <w:style w:customStyle="1" w:styleId="ErrorTok" w:type="character">
+    <w:name w:val="ErrorTok"/>
+    <w:basedOn w:val="VerbatimChar"/>
+    <w:rPr>
+      <w:b/>
+      <w:color w:val="ff0000"/>
+    </w:rPr>
+  </w:style>
+  <w:style w:customStyle="1" w:styleId="NormalTok" w:type="character">
+    <w:name w:val="NormalTok"/>
+    <w:basedOn w:val="VerbatimChar"/>
+    <w:rPr/>
+  </w:style>
   <w:style w:type="character" w:customStyle="1" w:styleId="KeywordTok">
     <w:name w:val="KeywordTok"/>
     <w:basedOn w:val="VerbatimChar"/>

</xml_diff>

<commit_message>
Add Serialist badge progression
Co-authored-by: Copilot <223556219+Copilot@users.noreply.github.com>
</commit_message>
<xml_diff>
--- a/docs/BADGE-PIANO.docx
+++ b/docs/BADGE-PIANO.docx
@@ -2,7 +2,7 @@
 <file path=word/document.xml><?xml version="1.0" encoding="utf-8"?>
 <w:document xmlns:w="http://schemas.openxmlformats.org/wordprocessingml/2006/main" xmlns:m="http://schemas.openxmlformats.org/officeDocument/2006/math" xmlns:r="http://schemas.openxmlformats.org/officeDocument/2006/relationships" xmlns:o="urn:schemas-microsoft-com:office:office" xmlns:v="urn:schemas-microsoft-com:vml" xmlns:w10="urn:schemas-microsoft-com:office:word" xmlns:a="http://schemas.openxmlformats.org/drawingml/2006/main" xmlns:pic="http://schemas.openxmlformats.org/drawingml/2006/picture" xmlns:wp="http://schemas.openxmlformats.org/drawingml/2006/wordprocessingDrawing">
   <w:body>
-    <w:bookmarkStart w:id="101" w:name="badge-showtime-proposta-e-piano"/>
+    <w:bookmarkStart w:id="102" w:name="badge-showtime-proposta-e-piano"/>
     <w:p>
       <w:pPr>
         <w:pStyle w:val="Heading1"/>
@@ -91,13 +91,13 @@
         <w:t xml:space="preserve"> </w:t>
       </w:r>
       <w:r>
-        <w:t xml:space="preserve">Batch A1, Archivista (A2.1) e Nostalgico (A2.2) pubblicati e</w:t>
+        <w:t xml:space="preserve">Batch A1, Archivista (A2.1) e Nostalgico (A2.2) pubblicati;</w:t>
       </w:r>
       <w:r>
         <w:t xml:space="preserve"> </w:t>
       </w:r>
       <w:r>
-        <w:t xml:space="preserve">verificati in produzione</w:t>
+        <w:t xml:space="preserve">Serialista (A2.3) completato localmente e in attesa di rollout</w:t>
       </w:r>
     </w:p>
     <w:p>
@@ -8089,7 +8089,7 @@
     </w:p>
     <w:bookmarkEnd w:id="73"/>
     <w:bookmarkEnd w:id="74"/>
-    <w:bookmarkStart w:id="89" w:name="piano-di-implementazione"/>
+    <w:bookmarkStart w:id="90" w:name="piano-di-implementazione"/>
     <w:p>
       <w:pPr>
         <w:pStyle w:val="Heading2"/>
@@ -10139,7 +10139,7 @@
       </w:r>
     </w:p>
     <w:bookmarkEnd w:id="83"/>
-    <w:bookmarkStart w:id="86" w:name="verifica-batch-a2.2-nostalgico"/>
+    <w:bookmarkStart w:id="84" w:name="verifica-batch-a2.2-nostalgico"/>
     <w:p>
       <w:pPr>
         <w:pStyle w:val="Heading3"/>
@@ -10640,13 +10640,14 @@
         <w:t xml:space="preserve">produzione senza errori console né overflow a 360/390 px.</w:t>
       </w:r>
     </w:p>
-    <w:bookmarkStart w:id="84" w:name="batch-b-esplorazione-e-comportamento"/>
-    <w:p>
-      <w:pPr>
-        <w:pStyle w:val="Heading4"/>
-      </w:pPr>
-      <w:r>
-        <w:t xml:space="preserve">Batch B — Esplorazione e comportamento</w:t>
+    <w:bookmarkEnd w:id="84"/>
+    <w:bookmarkStart w:id="87" w:name="verifica-batch-a2.3-serialista"/>
+    <w:p>
+      <w:pPr>
+        <w:pStyle w:val="Heading3"/>
+      </w:pPr>
+      <w:r>
+        <w:t xml:space="preserve">Verifica Batch A2.3 — Serialista</w:t>
       </w:r>
     </w:p>
     <w:p>
@@ -10658,664 +10659,46 @@
         </w:numPr>
       </w:pPr>
       <w:r>
-        <w:t xml:space="preserve">Esploratore di generi</w:t>
-      </w:r>
-    </w:p>
-    <w:p>
-      <w:pPr>
-        <w:pStyle w:val="Compact"/>
-        <w:numPr>
-          <w:ilvl w:val="0"/>
-          <w:numId w:val="1079"/>
-        </w:numPr>
-      </w:pPr>
-      <w:r>
-        <w:t xml:space="preserve">Ancora un episodio</w:t>
-      </w:r>
-    </w:p>
-    <w:p>
-      <w:pPr>
-        <w:pStyle w:val="Compact"/>
-        <w:numPr>
-          <w:ilvl w:val="0"/>
-          <w:numId w:val="1080"/>
-        </w:numPr>
-      </w:pPr>
-      <w:r>
-        <w:t xml:space="preserve">Maratoneta</w:t>
-      </w:r>
-    </w:p>
-    <w:p>
-      <w:pPr>
-        <w:pStyle w:val="Compact"/>
-        <w:numPr>
-          <w:ilvl w:val="0"/>
-          <w:numId w:val="1081"/>
-        </w:numPr>
-      </w:pPr>
-      <w:r>
-        <w:t xml:space="preserve">Encore</w:t>
-      </w:r>
-    </w:p>
-    <w:bookmarkEnd w:id="84"/>
-    <w:bookmarkStart w:id="85" w:name="batch-c-diario-e-social"/>
-    <w:p>
-      <w:pPr>
-        <w:pStyle w:val="Heading4"/>
-      </w:pPr>
-      <w:r>
-        <w:t xml:space="preserve">Batch C — Diario e Social</w:t>
-      </w:r>
-    </w:p>
-    <w:p>
-      <w:pPr>
-        <w:pStyle w:val="Compact"/>
-        <w:numPr>
-          <w:ilvl w:val="0"/>
-          <w:numId w:val="1082"/>
-        </w:numPr>
-      </w:pPr>
-      <w:r>
-        <w:t xml:space="preserve">Critico</w:t>
-      </w:r>
-    </w:p>
-    <w:p>
-      <w:pPr>
-        <w:pStyle w:val="Compact"/>
-        <w:numPr>
-          <w:ilvl w:val="0"/>
-          <w:numId w:val="1083"/>
-        </w:numPr>
-      </w:pPr>
-      <w:r>
-        <w:t xml:space="preserve">Passaparola</w:t>
-      </w:r>
-    </w:p>
-    <w:bookmarkEnd w:id="85"/>
-    <w:bookmarkEnd w:id="86"/>
-    <w:bookmarkStart w:id="87" w:name="fase-4-profilo-e-rifiniture"/>
-    <w:p>
-      <w:pPr>
-        <w:pStyle w:val="Heading3"/>
-      </w:pPr>
-      <w:r>
-        <w:t xml:space="preserve">Fase 4 — Profilo e rifiniture</w:t>
-      </w:r>
-    </w:p>
-    <w:p>
-      <w:pPr>
-        <w:pStyle w:val="Compact"/>
-        <w:numPr>
-          <w:ilvl w:val="0"/>
-          <w:numId w:val="1084"/>
-        </w:numPr>
-      </w:pPr>
-      <w:r>
-        <w:t xml:space="preserve">Selezione di 1–3 badge pubblici</w:t>
-      </w:r>
-    </w:p>
-    <w:p>
-      <w:pPr>
-        <w:pStyle w:val="Compact"/>
-        <w:numPr>
-          <w:ilvl w:val="0"/>
-          <w:numId w:val="1085"/>
-        </w:numPr>
-      </w:pPr>
-      <w:r>
-        <w:t xml:space="preserve">Badge in evidenza sul profilo follower</w:t>
-      </w:r>
-    </w:p>
-    <w:p>
-      <w:pPr>
-        <w:pStyle w:val="Compact"/>
-        <w:numPr>
-          <w:ilvl w:val="0"/>
-          <w:numId w:val="1086"/>
-        </w:numPr>
-      </w:pPr>
-      <w:r>
-        <w:t xml:space="preserve">Accessibilità</w:t>
-      </w:r>
-    </w:p>
-    <w:p>
-      <w:pPr>
-        <w:pStyle w:val="Compact"/>
-        <w:numPr>
-          <w:ilvl w:val="0"/>
-          <w:numId w:val="1087"/>
-        </w:numPr>
-      </w:pPr>
-      <w:r>
-        <w:t xml:space="preserve">Localizzazione testi</w:t>
-      </w:r>
-    </w:p>
-    <w:p>
-      <w:pPr>
-        <w:pStyle w:val="Compact"/>
-        <w:numPr>
-          <w:ilvl w:val="0"/>
-          <w:numId w:val="1088"/>
-        </w:numPr>
-      </w:pPr>
-      <w:r>
-        <w:t xml:space="preserve">Telemetria errori dell’engine</w:t>
-      </w:r>
-    </w:p>
-    <w:p>
-      <w:pPr>
-        <w:pStyle w:val="Compact"/>
-        <w:numPr>
-          <w:ilvl w:val="0"/>
-          <w:numId w:val="1089"/>
-        </w:numPr>
-      </w:pPr>
-      <w:r>
-        <w:t xml:space="preserve">Riconciliazione completa</w:t>
-      </w:r>
-    </w:p>
-    <w:bookmarkEnd w:id="87"/>
-    <w:bookmarkStart w:id="88" w:name="fase-5-crediti-tmdb"/>
-    <w:p>
-      <w:pPr>
-        <w:pStyle w:val="Heading3"/>
-      </w:pPr>
-      <w:r>
-        <w:t xml:space="preserve">Fase 5 — Crediti TMDB</w:t>
-      </w:r>
-    </w:p>
-    <w:p>
-      <w:pPr>
-        <w:pStyle w:val="Compact"/>
-        <w:numPr>
-          <w:ilvl w:val="0"/>
-          <w:numId w:val="1090"/>
-        </w:numPr>
-      </w:pPr>
-      <w:r>
-        <w:t xml:space="preserve">Cache persistente dei crediti persona/titolo</w:t>
-      </w:r>
-    </w:p>
-    <w:p>
-      <w:pPr>
-        <w:pStyle w:val="Compact"/>
-        <w:numPr>
-          <w:ilvl w:val="0"/>
-          <w:numId w:val="1091"/>
-        </w:numPr>
-      </w:pPr>
-      <w:r>
-        <w:t xml:space="preserve">Volto familiare</w:t>
-      </w:r>
-    </w:p>
-    <w:p>
-      <w:pPr>
-        <w:pStyle w:val="Compact"/>
-        <w:numPr>
-          <w:ilvl w:val="0"/>
-          <w:numId w:val="1092"/>
-        </w:numPr>
-      </w:pPr>
-      <w:r>
-        <w:t xml:space="preserve">Occhio d’autore</w:t>
-      </w:r>
-    </w:p>
-    <w:p>
-      <w:pPr>
-        <w:pStyle w:val="Compact"/>
-        <w:numPr>
-          <w:ilvl w:val="0"/>
-          <w:numId w:val="1093"/>
-        </w:numPr>
-      </w:pPr>
-      <w:r>
-        <w:t xml:space="preserve">Coppia d’oro</w:t>
-      </w:r>
-    </w:p>
-    <w:p>
-      <w:pPr>
-        <w:pStyle w:val="Compact"/>
-        <w:numPr>
-          <w:ilvl w:val="0"/>
-          <w:numId w:val="1094"/>
-        </w:numPr>
-      </w:pPr>
-      <w:r>
-        <w:t xml:space="preserve">Attraverso le epoche</w:t>
-      </w:r>
-    </w:p>
-    <w:p>
-      <w:pPr>
-        <w:pStyle w:val="Compact"/>
-        <w:numPr>
-          <w:ilvl w:val="0"/>
-          <w:numId w:val="1095"/>
-        </w:numPr>
-      </w:pPr>
-      <w:r>
-        <w:t xml:space="preserve">Camaleonte</w:t>
-      </w:r>
-    </w:p>
-    <w:p>
-      <w:pPr>
-        <w:pStyle w:val="Compact"/>
-        <w:numPr>
-          <w:ilvl w:val="0"/>
-          <w:numId w:val="1096"/>
-        </w:numPr>
-      </w:pPr>
-      <w:r>
-        <w:t xml:space="preserve">Evoluzione d’autore</w:t>
-      </w:r>
-    </w:p>
-    <w:p>
-      <w:r>
-        <w:pict>
-          <v:rect style="width:0;height:1.5pt" o:hralign="center" o:hrstd="t" o:hr="t"/>
-        </w:pict>
-      </w:r>
-    </w:p>
-    <w:bookmarkEnd w:id="88"/>
-    <w:bookmarkEnd w:id="89"/>
-    <w:bookmarkStart w:id="90" w:name="criteri-di-accettazione-v1"/>
-    <w:p>
-      <w:pPr>
-        <w:pStyle w:val="Heading2"/>
-      </w:pPr>
-      <w:r>
-        <w:t xml:space="preserve">11. Criteri di accettazione V1</w:t>
-      </w:r>
-    </w:p>
-    <w:p>
-      <w:pPr>
-        <w:pStyle w:val="Compact"/>
-        <w:numPr>
-          <w:ilvl w:val="0"/>
-          <w:numId w:val="1097"/>
-        </w:numPr>
-      </w:pPr>
-      <w:r>
-        <w:t xml:space="preserve">Ogni badge ha una regola deterministica e versionata.</w:t>
-      </w:r>
-    </w:p>
-    <w:p>
-      <w:pPr>
-        <w:pStyle w:val="Compact"/>
-        <w:numPr>
-          <w:ilvl w:val="0"/>
-          <w:numId w:val="1097"/>
-        </w:numPr>
-      </w:pPr>
-      <w:r>
-        <w:t xml:space="preserve">Importato e tracked sono trattati secondo le regole dichiarate.</w:t>
-      </w:r>
-    </w:p>
-    <w:p>
-      <w:pPr>
-        <w:pStyle w:val="Compact"/>
-        <w:numPr>
-          <w:ilvl w:val="0"/>
-          <w:numId w:val="1097"/>
-        </w:numPr>
-      </w:pPr>
-      <w:r>
-        <w:t xml:space="preserve">Gli sblocchi sono permanenti e idempotenti.</w:t>
-      </w:r>
-    </w:p>
-    <w:p>
-      <w:pPr>
-        <w:pStyle w:val="Compact"/>
-        <w:numPr>
-          <w:ilvl w:val="0"/>
-          <w:numId w:val="1097"/>
-        </w:numPr>
-      </w:pPr>
-      <w:r>
-        <w:t xml:space="preserve">Nessun badge viene duplicato.</w:t>
-      </w:r>
-    </w:p>
-    <w:p>
-      <w:pPr>
-        <w:pStyle w:val="Compact"/>
-        <w:numPr>
-          <w:ilvl w:val="0"/>
-          <w:numId w:val="1097"/>
-        </w:numPr>
-      </w:pPr>
-      <w:r>
-        <w:t xml:space="preserve">Il progresso mostrato corrisponde ai dati reali.</w:t>
-      </w:r>
-    </w:p>
-    <w:p>
-      <w:pPr>
-        <w:pStyle w:val="Compact"/>
-        <w:numPr>
-          <w:ilvl w:val="0"/>
-          <w:numId w:val="1097"/>
-        </w:numPr>
-      </w:pPr>
-      <w:r>
-        <w:t xml:space="preserve">Il sistema non altera Libreria, Diario o Statistiche.</w:t>
-      </w:r>
-    </w:p>
-    <w:p>
-      <w:pPr>
-        <w:pStyle w:val="Compact"/>
-        <w:numPr>
-          <w:ilvl w:val="0"/>
-          <w:numId w:val="1097"/>
-        </w:numPr>
-      </w:pPr>
-      <w:r>
-        <w:t xml:space="preserve">Un errore di valutazione non blocca la mutazione principale.</w:t>
-      </w:r>
-    </w:p>
-    <w:p>
-      <w:pPr>
-        <w:pStyle w:val="Compact"/>
-        <w:numPr>
-          <w:ilvl w:val="0"/>
-          <w:numId w:val="1097"/>
-        </w:numPr>
-      </w:pPr>
-      <w:r>
-        <w:t xml:space="preserve">La Sala trofei funziona a 390 px senza overflow.</w:t>
-      </w:r>
-    </w:p>
-    <w:p>
-      <w:pPr>
-        <w:pStyle w:val="Compact"/>
-        <w:numPr>
-          <w:ilvl w:val="0"/>
-          <w:numId w:val="1097"/>
-        </w:numPr>
-      </w:pPr>
-      <w:r>
-        <w:t xml:space="preserve">RLS impedisce di leggere badge privati di altri utenti.</w:t>
-      </w:r>
-    </w:p>
-    <w:p>
-      <w:pPr>
-        <w:pStyle w:val="Compact"/>
-        <w:numPr>
-          <w:ilvl w:val="0"/>
-          <w:numId w:val="1097"/>
-        </w:numPr>
-      </w:pPr>
-      <w:r>
-        <w:t xml:space="preserve">Le superfici follower espongono solo badge scelti dall’utente.</w:t>
-      </w:r>
-    </w:p>
-    <w:p>
-      <w:r>
-        <w:pict>
-          <v:rect style="width:0;height:1.5pt" o:hralign="center" o:hrstd="t" o:hr="t"/>
-        </w:pict>
-      </w:r>
-    </w:p>
-    <w:bookmarkEnd w:id="90"/>
-    <w:bookmarkStart w:id="99" w:name="decisioni-v1-confermate"/>
-    <w:p>
-      <w:pPr>
-        <w:pStyle w:val="Heading2"/>
-      </w:pPr>
-      <w:r>
-        <w:t xml:space="preserve">12. Decisioni V1 confermate</w:t>
-      </w:r>
-    </w:p>
-    <w:bookmarkStart w:id="91" w:name="nomi"/>
-    <w:p>
-      <w:pPr>
-        <w:pStyle w:val="Heading3"/>
-      </w:pPr>
-      <w:r>
-        <w:t xml:space="preserve">Nomi</w:t>
-      </w:r>
-    </w:p>
-    <w:p>
-      <w:pPr>
-        <w:pStyle w:val="Compact"/>
-        <w:numPr>
-          <w:ilvl w:val="0"/>
-          <w:numId w:val="1098"/>
-        </w:numPr>
-      </w:pPr>
-      <w:r>
-        <w:t xml:space="preserve">Nomi italiani della proposta approvati</w:t>
-      </w:r>
-    </w:p>
-    <w:p>
-      <w:pPr>
-        <w:pStyle w:val="Compact"/>
-        <w:numPr>
-          <w:ilvl w:val="0"/>
-          <w:numId w:val="1099"/>
-        </w:numPr>
-      </w:pPr>
-      <w:r>
-        <w:t xml:space="preserve">“Ancora un episodio”</w:t>
-      </w:r>
-    </w:p>
-    <w:p>
-      <w:pPr>
-        <w:pStyle w:val="Compact"/>
-        <w:numPr>
-          <w:ilvl w:val="0"/>
-          <w:numId w:val="1100"/>
-        </w:numPr>
-      </w:pPr>
-      <w:r>
-        <w:t xml:space="preserve">“Volto familiare”</w:t>
-      </w:r>
-    </w:p>
-    <w:p>
-      <w:pPr>
-        <w:pStyle w:val="Compact"/>
-        <w:numPr>
-          <w:ilvl w:val="0"/>
-          <w:numId w:val="1101"/>
-        </w:numPr>
-      </w:pPr>
-      <w:r>
-        <w:t xml:space="preserve">“Occhio d’autore”</w:t>
-      </w:r>
-    </w:p>
-    <w:p>
-      <w:pPr>
-        <w:pStyle w:val="Compact"/>
-        <w:numPr>
-          <w:ilvl w:val="0"/>
-          <w:numId w:val="1102"/>
-        </w:numPr>
-      </w:pPr>
-      <w:r>
-        <w:t xml:space="preserve">“Coppia d’oro”</w:t>
-      </w:r>
-    </w:p>
-    <w:bookmarkEnd w:id="91"/>
-    <w:bookmarkStart w:id="92" w:name="soglie"/>
-    <w:p>
-      <w:pPr>
-        <w:pStyle w:val="Heading3"/>
-      </w:pPr>
-      <w:r>
-        <w:t xml:space="preserve">Soglie</w:t>
-      </w:r>
-    </w:p>
-    <w:p>
-      <w:pPr>
-        <w:pStyle w:val="Compact"/>
-        <w:numPr>
-          <w:ilvl w:val="0"/>
-          <w:numId w:val="1103"/>
-        </w:numPr>
-      </w:pPr>
-      <w:r>
-        <w:t xml:space="preserve">Soglie cumulative moltiplicate almeno ×5</w:t>
-      </w:r>
-    </w:p>
-    <w:p>
-      <w:pPr>
-        <w:pStyle w:val="Compact"/>
-        <w:numPr>
-          <w:ilvl w:val="0"/>
-          <w:numId w:val="1104"/>
-        </w:numPr>
-      </w:pPr>
-      <w:r>
-        <w:t xml:space="preserve">Arrotondamento per eccesso a numeri leggibili</w:t>
-      </w:r>
-    </w:p>
-    <w:p>
-      <w:pPr>
-        <w:pStyle w:val="Compact"/>
-        <w:numPr>
-          <w:ilvl w:val="0"/>
-          <w:numId w:val="1105"/>
-        </w:numPr>
-      </w:pPr>
-      <w:r>
-        <w:t xml:space="preserve">Requisiti strutturali lasciati invariati</w:t>
-      </w:r>
-    </w:p>
-    <w:p>
-      <w:pPr>
-        <w:pStyle w:val="Compact"/>
-        <w:numPr>
-          <w:ilvl w:val="0"/>
-          <w:numId w:val="1106"/>
-        </w:numPr>
-      </w:pPr>
-      <w:r>
-        <w:t xml:space="preserve">Livelli Bronzo, Argento, Oro e Platino</w:t>
-      </w:r>
-    </w:p>
-    <w:p>
-      <w:pPr>
-        <w:pStyle w:val="Compact"/>
-        <w:numPr>
-          <w:ilvl w:val="0"/>
-          <w:numId w:val="1107"/>
-        </w:numPr>
-      </w:pPr>
-      <w:r>
-        <w:t xml:space="preserve">Tutte le famiglie a progressione arrivano a Platino</w:t>
-      </w:r>
-    </w:p>
-    <w:p>
-      <w:pPr>
-        <w:pStyle w:val="Compact"/>
-        <w:numPr>
-          <w:ilvl w:val="0"/>
-          <w:numId w:val="1108"/>
-        </w:numPr>
-      </w:pPr>
-      <w:r>
-        <w:t xml:space="preserve">Maratoneta accetta lo stesso giorno o due date consecutive</w:t>
-      </w:r>
-    </w:p>
-    <w:p>
-      <w:pPr>
-        <w:pStyle w:val="Compact"/>
-        <w:numPr>
-          <w:ilvl w:val="0"/>
-          <w:numId w:val="1109"/>
-        </w:numPr>
-      </w:pPr>
-      <w:r>
-        <w:t xml:space="preserve">Critico conta tutte le voci distinte con nota, incluse revisioni e rewatch</w:t>
-      </w:r>
-    </w:p>
-    <w:bookmarkEnd w:id="92"/>
-    <w:bookmarkStart w:id="93" w:name="badge-introduttivi-1"/>
-    <w:p>
-      <w:pPr>
-        <w:pStyle w:val="Heading3"/>
-      </w:pPr>
-      <w:r>
-        <w:t xml:space="preserve">Badge introduttivi</w:t>
-      </w:r>
-    </w:p>
-    <w:p>
-      <w:pPr>
-        <w:pStyle w:val="Compact"/>
-        <w:numPr>
-          <w:ilvl w:val="0"/>
-          <w:numId w:val="1110"/>
-        </w:numPr>
-      </w:pPr>
-      <w:r>
-        <w:t xml:space="preserve">Primo ciak</w:t>
-      </w:r>
-    </w:p>
-    <w:p>
-      <w:pPr>
-        <w:pStyle w:val="Compact"/>
-        <w:numPr>
-          <w:ilvl w:val="0"/>
-          <w:numId w:val="1111"/>
-        </w:numPr>
-      </w:pPr>
-      <w:r>
-        <w:t xml:space="preserve">Prima recensione</w:t>
-      </w:r>
-    </w:p>
-    <w:p>
-      <w:pPr>
-        <w:pStyle w:val="Compact"/>
-        <w:numPr>
-          <w:ilvl w:val="0"/>
-          <w:numId w:val="1112"/>
-        </w:numPr>
-      </w:pPr>
-      <w:r>
-        <w:t xml:space="preserve">Stagione chiusa</w:t>
-      </w:r>
-    </w:p>
-    <w:p>
-      <w:pPr>
-        <w:pStyle w:val="Compact"/>
-        <w:numPr>
-          <w:ilvl w:val="0"/>
-          <w:numId w:val="1113"/>
-        </w:numPr>
-      </w:pPr>
-      <w:r>
-        <w:t xml:space="preserve">Badge singoli, senza livelli</w:t>
-      </w:r>
-    </w:p>
-    <w:p>
-      <w:pPr>
-        <w:pStyle w:val="Compact"/>
-        <w:numPr>
-          <w:ilvl w:val="0"/>
-          <w:numId w:val="1114"/>
-        </w:numPr>
-      </w:pPr>
-      <w:r>
-        <w:t xml:space="preserve">Stagione 0 / Speciali esclusa da Stagione chiusa</w:t>
-      </w:r>
-    </w:p>
-    <w:bookmarkEnd w:id="93"/>
-    <w:bookmarkStart w:id="94" w:name="serie-completata"/>
-    <w:p>
-      <w:pPr>
-        <w:pStyle w:val="Heading3"/>
-      </w:pPr>
-      <w:r>
-        <w:t xml:space="preserve">Serie completata</w:t>
-      </w:r>
-    </w:p>
-    <w:p>
-      <w:pPr>
-        <w:pStyle w:val="Compact"/>
-        <w:numPr>
-          <w:ilvl w:val="0"/>
-          <w:numId w:val="1115"/>
-        </w:numPr>
-      </w:pPr>
-      <w:r>
-        <w:t xml:space="preserve">Stato TMDB</w:t>
+        <w:t xml:space="preserve">migration</w:t>
+      </w:r>
+      <w:r>
+        <w:t xml:space="preserve"> </w:t>
+      </w:r>
+      <w:r>
+        <w:rPr>
+          <w:rStyle w:val="VerbatimChar"/>
+        </w:rPr>
+        <w:t xml:space="preserve">0021_serialist_badge.sql</w:t>
+      </w:r>
+      <w:r>
+        <w:t xml:space="preserve"> </w:t>
+      </w:r>
+      <w:r>
+        <w:t xml:space="preserve">con soglie</w:t>
+      </w:r>
+      <w:r>
+        <w:t xml:space="preserve"> </w:t>
+      </w:r>
+      <w:r>
+        <w:rPr>
+          <w:rStyle w:val="VerbatimChar"/>
+        </w:rPr>
+        <w:t xml:space="preserve">25 / 100 / 250 / 500</w:t>
+      </w:r>
+      <w:r>
+        <w:t xml:space="preserve">;</w:t>
+      </w:r>
+    </w:p>
+    <w:p>
+      <w:pPr>
+        <w:pStyle w:val="Compact"/>
+        <w:numPr>
+          <w:ilvl w:val="0"/>
+          <w:numId w:val="1078"/>
+        </w:numPr>
+      </w:pPr>
+      <w:r>
+        <w:t xml:space="preserve">considera soltanto serie TMDB con stato esatto</w:t>
       </w:r>
       <w:r>
         <w:t xml:space="preserve"> </w:t>
@@ -11326,6 +10709,927 @@
         </w:rPr>
         <w:t xml:space="preserve">Ended</w:t>
       </w:r>
+      <w:r>
+        <w:t xml:space="preserve">;</w:t>
+      </w:r>
+    </w:p>
+    <w:p>
+      <w:pPr>
+        <w:pStyle w:val="Compact"/>
+        <w:numPr>
+          <w:ilvl w:val="0"/>
+          <w:numId w:val="1078"/>
+        </w:numPr>
+      </w:pPr>
+      <w:r>
+        <w:t xml:space="preserve">verifica ogni episodio di ogni stagione regolare, senza compensare episodi mancanti</w:t>
+      </w:r>
+      <w:r>
+        <w:t xml:space="preserve"> </w:t>
+      </w:r>
+      <w:r>
+        <w:t xml:space="preserve">con extra o Speciali;</w:t>
+      </w:r>
+    </w:p>
+    <w:p>
+      <w:pPr>
+        <w:pStyle w:val="Compact"/>
+        <w:numPr>
+          <w:ilvl w:val="0"/>
+          <w:numId w:val="1078"/>
+        </w:numPr>
+      </w:pPr>
+      <w:r>
+        <w:t xml:space="preserve">Stagione 0 / Speciali esclusa;</w:t>
+      </w:r>
+    </w:p>
+    <w:p>
+      <w:pPr>
+        <w:pStyle w:val="Compact"/>
+        <w:numPr>
+          <w:ilvl w:val="0"/>
+          <w:numId w:val="1078"/>
+        </w:numPr>
+      </w:pPr>
+      <w:r>
+        <w:t xml:space="preserve">storico importato e attività reale entrambi validi;</w:t>
+      </w:r>
+    </w:p>
+    <w:p>
+      <w:pPr>
+        <w:pStyle w:val="Compact"/>
+        <w:numPr>
+          <w:ilvl w:val="0"/>
+          <w:numId w:val="1078"/>
+        </w:numPr>
+      </w:pPr>
+      <w:r>
+        <w:t xml:space="preserve">cache TMDB persistente condivisa con TTL 7 giorni;</w:t>
+      </w:r>
+    </w:p>
+    <w:p>
+      <w:pPr>
+        <w:pStyle w:val="Compact"/>
+        <w:numPr>
+          <w:ilvl w:val="0"/>
+          <w:numId w:val="1078"/>
+        </w:numPr>
+      </w:pPr>
+      <w:r>
+        <w:t xml:space="preserve">cache senza permessi client e scrivibile soltanto dal</w:t>
+      </w:r>
+      <w:r>
+        <w:t xml:space="preserve"> </w:t>
+      </w:r>
+      <w:r>
+        <w:rPr>
+          <w:rStyle w:val="VerbatimChar"/>
+        </w:rPr>
+        <w:t xml:space="preserve">service_role</w:t>
+      </w:r>
+      <w:r>
+        <w:t xml:space="preserve">;</w:t>
+      </w:r>
+    </w:p>
+    <w:p>
+      <w:pPr>
+        <w:pStyle w:val="Compact"/>
+        <w:numPr>
+          <w:ilvl w:val="0"/>
+          <w:numId w:val="1078"/>
+        </w:numPr>
+      </w:pPr>
+      <w:r>
+        <w:t xml:space="preserve">massimo 4 richieste TMDB concorrenti e retry esplicito su</w:t>
+      </w:r>
+      <w:r>
+        <w:t xml:space="preserve"> </w:t>
+      </w:r>
+      <w:r>
+        <w:rPr>
+          <w:rStyle w:val="VerbatimChar"/>
+        </w:rPr>
+        <w:t xml:space="preserve">429</w:t>
+      </w:r>
+      <w:r>
+        <w:t xml:space="preserve">;</w:t>
+      </w:r>
+    </w:p>
+    <w:p>
+      <w:pPr>
+        <w:pStyle w:val="Compact"/>
+        <w:numPr>
+          <w:ilvl w:val="0"/>
+          <w:numId w:val="1078"/>
+        </w:numPr>
+      </w:pPr>
+      <w:r>
+        <w:t xml:space="preserve">patch originale a pila di episodi nelle quattro varianti metalliche;</w:t>
+      </w:r>
+    </w:p>
+    <w:p>
+      <w:pPr>
+        <w:pStyle w:val="Compact"/>
+        <w:numPr>
+          <w:ilvl w:val="0"/>
+          <w:numId w:val="1078"/>
+        </w:numPr>
+      </w:pPr>
+      <w:r>
+        <w:t xml:space="preserve">posizione Sala trofei: immediatamente sotto Cinefilo;</w:t>
+      </w:r>
+    </w:p>
+    <w:p>
+      <w:pPr>
+        <w:pStyle w:val="Compact"/>
+        <w:numPr>
+          <w:ilvl w:val="0"/>
+          <w:numId w:val="1078"/>
+        </w:numPr>
+      </w:pPr>
+      <w:r>
+        <w:t xml:space="preserve">preview locale:</w:t>
+      </w:r>
+      <w:r>
+        <w:t xml:space="preserve"> </w:t>
+      </w:r>
+      <w:r>
+        <w:rPr>
+          <w:rStyle w:val="VerbatimChar"/>
+        </w:rPr>
+        <w:t xml:space="preserve">Serialista 0/4</w:t>
+      </w:r>
+      <w:r>
+        <w:t xml:space="preserve">, progresso</w:t>
+      </w:r>
+      <w:r>
+        <w:t xml:space="preserve"> </w:t>
+      </w:r>
+      <w:r>
+        <w:rPr>
+          <w:rStyle w:val="VerbatimChar"/>
+        </w:rPr>
+        <w:t xml:space="preserve">0/25</w:t>
+      </w:r>
+      <w:r>
+        <w:t xml:space="preserve">, hero</w:t>
+      </w:r>
+      <w:r>
+        <w:t xml:space="preserve"> </w:t>
+      </w:r>
+      <w:r>
+        <w:rPr>
+          <w:rStyle w:val="VerbatimChar"/>
+        </w:rPr>
+        <w:t xml:space="preserve">3/19</w:t>
+      </w:r>
+      <w:r>
+        <w:t xml:space="preserve">;</w:t>
+      </w:r>
+    </w:p>
+    <w:p>
+      <w:pPr>
+        <w:pStyle w:val="Compact"/>
+        <w:numPr>
+          <w:ilvl w:val="0"/>
+          <w:numId w:val="1078"/>
+        </w:numPr>
+      </w:pPr>
+      <w:r>
+        <w:t xml:space="preserve">patch e accordion verificati senza overflow a 360 e 390 px;</w:t>
+      </w:r>
+    </w:p>
+    <w:p>
+      <w:pPr>
+        <w:pStyle w:val="Compact"/>
+        <w:numPr>
+          <w:ilvl w:val="0"/>
+          <w:numId w:val="1078"/>
+        </w:numPr>
+      </w:pPr>
+      <w:r>
+        <w:rPr>
+          <w:rStyle w:val="VerbatimChar"/>
+        </w:rPr>
+        <w:t xml:space="preserve">24/24</w:t>
+      </w:r>
+      <w:r>
+        <w:t xml:space="preserve"> </w:t>
+      </w:r>
+      <w:r>
+        <w:t xml:space="preserve">test engine superati;</w:t>
+      </w:r>
+    </w:p>
+    <w:p>
+      <w:pPr>
+        <w:pStyle w:val="Compact"/>
+        <w:numPr>
+          <w:ilvl w:val="0"/>
+          <w:numId w:val="1078"/>
+        </w:numPr>
+      </w:pPr>
+      <w:r>
+        <w:t xml:space="preserve">test SQL transazionale pronto per soglia</w:t>
+      </w:r>
+      <w:r>
+        <w:t xml:space="preserve"> </w:t>
+      </w:r>
+      <w:r>
+        <w:rPr>
+          <w:rStyle w:val="VerbatimChar"/>
+        </w:rPr>
+        <w:t xml:space="preserve">100</w:t>
+      </w:r>
+      <w:r>
+        <w:t xml:space="preserve">, idempotenza, regressione a</w:t>
+      </w:r>
+      <w:r>
+        <w:t xml:space="preserve"> </w:t>
+      </w:r>
+      <w:r>
+        <w:rPr>
+          <w:rStyle w:val="VerbatimChar"/>
+        </w:rPr>
+        <w:t xml:space="preserve">0</w:t>
+      </w:r>
+      <w:r>
+        <w:t xml:space="preserve"> </w:t>
+      </w:r>
+      <w:r>
+        <w:t xml:space="preserve">e</w:t>
+      </w:r>
+      <w:r>
+        <w:t xml:space="preserve"> </w:t>
+      </w:r>
+      <w:r>
+        <w:t xml:space="preserve">permessi della cache.</w:t>
+      </w:r>
+    </w:p>
+    <w:bookmarkStart w:id="85" w:name="batch-b-esplorazione-e-comportamento"/>
+    <w:p>
+      <w:pPr>
+        <w:pStyle w:val="Heading4"/>
+      </w:pPr>
+      <w:r>
+        <w:t xml:space="preserve">Batch B — Esplorazione e comportamento</w:t>
+      </w:r>
+    </w:p>
+    <w:p>
+      <w:pPr>
+        <w:pStyle w:val="Compact"/>
+        <w:numPr>
+          <w:ilvl w:val="0"/>
+          <w:numId w:val="1079"/>
+        </w:numPr>
+      </w:pPr>
+      <w:r>
+        <w:t xml:space="preserve">Esploratore di generi</w:t>
+      </w:r>
+    </w:p>
+    <w:p>
+      <w:pPr>
+        <w:pStyle w:val="Compact"/>
+        <w:numPr>
+          <w:ilvl w:val="0"/>
+          <w:numId w:val="1080"/>
+        </w:numPr>
+      </w:pPr>
+      <w:r>
+        <w:t xml:space="preserve">Ancora un episodio</w:t>
+      </w:r>
+    </w:p>
+    <w:p>
+      <w:pPr>
+        <w:pStyle w:val="Compact"/>
+        <w:numPr>
+          <w:ilvl w:val="0"/>
+          <w:numId w:val="1081"/>
+        </w:numPr>
+      </w:pPr>
+      <w:r>
+        <w:t xml:space="preserve">Maratoneta</w:t>
+      </w:r>
+    </w:p>
+    <w:p>
+      <w:pPr>
+        <w:pStyle w:val="Compact"/>
+        <w:numPr>
+          <w:ilvl w:val="0"/>
+          <w:numId w:val="1082"/>
+        </w:numPr>
+      </w:pPr>
+      <w:r>
+        <w:t xml:space="preserve">Encore</w:t>
+      </w:r>
+    </w:p>
+    <w:bookmarkEnd w:id="85"/>
+    <w:bookmarkStart w:id="86" w:name="batch-c-diario-e-social"/>
+    <w:p>
+      <w:pPr>
+        <w:pStyle w:val="Heading4"/>
+      </w:pPr>
+      <w:r>
+        <w:t xml:space="preserve">Batch C — Diario e Social</w:t>
+      </w:r>
+    </w:p>
+    <w:p>
+      <w:pPr>
+        <w:pStyle w:val="Compact"/>
+        <w:numPr>
+          <w:ilvl w:val="0"/>
+          <w:numId w:val="1083"/>
+        </w:numPr>
+      </w:pPr>
+      <w:r>
+        <w:t xml:space="preserve">Critico</w:t>
+      </w:r>
+    </w:p>
+    <w:p>
+      <w:pPr>
+        <w:pStyle w:val="Compact"/>
+        <w:numPr>
+          <w:ilvl w:val="0"/>
+          <w:numId w:val="1084"/>
+        </w:numPr>
+      </w:pPr>
+      <w:r>
+        <w:t xml:space="preserve">Passaparola</w:t>
+      </w:r>
+    </w:p>
+    <w:bookmarkEnd w:id="86"/>
+    <w:bookmarkEnd w:id="87"/>
+    <w:bookmarkStart w:id="88" w:name="fase-4-profilo-e-rifiniture"/>
+    <w:p>
+      <w:pPr>
+        <w:pStyle w:val="Heading3"/>
+      </w:pPr>
+      <w:r>
+        <w:t xml:space="preserve">Fase 4 — Profilo e rifiniture</w:t>
+      </w:r>
+    </w:p>
+    <w:p>
+      <w:pPr>
+        <w:pStyle w:val="Compact"/>
+        <w:numPr>
+          <w:ilvl w:val="0"/>
+          <w:numId w:val="1085"/>
+        </w:numPr>
+      </w:pPr>
+      <w:r>
+        <w:t xml:space="preserve">Selezione di 1–3 badge pubblici</w:t>
+      </w:r>
+    </w:p>
+    <w:p>
+      <w:pPr>
+        <w:pStyle w:val="Compact"/>
+        <w:numPr>
+          <w:ilvl w:val="0"/>
+          <w:numId w:val="1086"/>
+        </w:numPr>
+      </w:pPr>
+      <w:r>
+        <w:t xml:space="preserve">Badge in evidenza sul profilo follower</w:t>
+      </w:r>
+    </w:p>
+    <w:p>
+      <w:pPr>
+        <w:pStyle w:val="Compact"/>
+        <w:numPr>
+          <w:ilvl w:val="0"/>
+          <w:numId w:val="1087"/>
+        </w:numPr>
+      </w:pPr>
+      <w:r>
+        <w:t xml:space="preserve">Accessibilità</w:t>
+      </w:r>
+    </w:p>
+    <w:p>
+      <w:pPr>
+        <w:pStyle w:val="Compact"/>
+        <w:numPr>
+          <w:ilvl w:val="0"/>
+          <w:numId w:val="1088"/>
+        </w:numPr>
+      </w:pPr>
+      <w:r>
+        <w:t xml:space="preserve">Localizzazione testi</w:t>
+      </w:r>
+    </w:p>
+    <w:p>
+      <w:pPr>
+        <w:pStyle w:val="Compact"/>
+        <w:numPr>
+          <w:ilvl w:val="0"/>
+          <w:numId w:val="1089"/>
+        </w:numPr>
+      </w:pPr>
+      <w:r>
+        <w:t xml:space="preserve">Telemetria errori dell’engine</w:t>
+      </w:r>
+    </w:p>
+    <w:p>
+      <w:pPr>
+        <w:pStyle w:val="Compact"/>
+        <w:numPr>
+          <w:ilvl w:val="0"/>
+          <w:numId w:val="1090"/>
+        </w:numPr>
+      </w:pPr>
+      <w:r>
+        <w:t xml:space="preserve">Riconciliazione completa</w:t>
+      </w:r>
+    </w:p>
+    <w:bookmarkEnd w:id="88"/>
+    <w:bookmarkStart w:id="89" w:name="fase-5-crediti-tmdb"/>
+    <w:p>
+      <w:pPr>
+        <w:pStyle w:val="Heading3"/>
+      </w:pPr>
+      <w:r>
+        <w:t xml:space="preserve">Fase 5 — Crediti TMDB</w:t>
+      </w:r>
+    </w:p>
+    <w:p>
+      <w:pPr>
+        <w:pStyle w:val="Compact"/>
+        <w:numPr>
+          <w:ilvl w:val="0"/>
+          <w:numId w:val="1091"/>
+        </w:numPr>
+      </w:pPr>
+      <w:r>
+        <w:t xml:space="preserve">Cache persistente dei crediti persona/titolo</w:t>
+      </w:r>
+    </w:p>
+    <w:p>
+      <w:pPr>
+        <w:pStyle w:val="Compact"/>
+        <w:numPr>
+          <w:ilvl w:val="0"/>
+          <w:numId w:val="1092"/>
+        </w:numPr>
+      </w:pPr>
+      <w:r>
+        <w:t xml:space="preserve">Volto familiare</w:t>
+      </w:r>
+    </w:p>
+    <w:p>
+      <w:pPr>
+        <w:pStyle w:val="Compact"/>
+        <w:numPr>
+          <w:ilvl w:val="0"/>
+          <w:numId w:val="1093"/>
+        </w:numPr>
+      </w:pPr>
+      <w:r>
+        <w:t xml:space="preserve">Occhio d’autore</w:t>
+      </w:r>
+    </w:p>
+    <w:p>
+      <w:pPr>
+        <w:pStyle w:val="Compact"/>
+        <w:numPr>
+          <w:ilvl w:val="0"/>
+          <w:numId w:val="1094"/>
+        </w:numPr>
+      </w:pPr>
+      <w:r>
+        <w:t xml:space="preserve">Coppia d’oro</w:t>
+      </w:r>
+    </w:p>
+    <w:p>
+      <w:pPr>
+        <w:pStyle w:val="Compact"/>
+        <w:numPr>
+          <w:ilvl w:val="0"/>
+          <w:numId w:val="1095"/>
+        </w:numPr>
+      </w:pPr>
+      <w:r>
+        <w:t xml:space="preserve">Attraverso le epoche</w:t>
+      </w:r>
+    </w:p>
+    <w:p>
+      <w:pPr>
+        <w:pStyle w:val="Compact"/>
+        <w:numPr>
+          <w:ilvl w:val="0"/>
+          <w:numId w:val="1096"/>
+        </w:numPr>
+      </w:pPr>
+      <w:r>
+        <w:t xml:space="preserve">Camaleonte</w:t>
+      </w:r>
+    </w:p>
+    <w:p>
+      <w:pPr>
+        <w:pStyle w:val="Compact"/>
+        <w:numPr>
+          <w:ilvl w:val="0"/>
+          <w:numId w:val="1097"/>
+        </w:numPr>
+      </w:pPr>
+      <w:r>
+        <w:t xml:space="preserve">Evoluzione d’autore</w:t>
+      </w:r>
+    </w:p>
+    <w:p>
+      <w:r>
+        <w:pict>
+          <v:rect style="width:0;height:1.5pt" o:hralign="center" o:hrstd="t" o:hr="t"/>
+        </w:pict>
+      </w:r>
+    </w:p>
+    <w:bookmarkEnd w:id="89"/>
+    <w:bookmarkEnd w:id="90"/>
+    <w:bookmarkStart w:id="91" w:name="criteri-di-accettazione-v1"/>
+    <w:p>
+      <w:pPr>
+        <w:pStyle w:val="Heading2"/>
+      </w:pPr>
+      <w:r>
+        <w:t xml:space="preserve">11. Criteri di accettazione V1</w:t>
+      </w:r>
+    </w:p>
+    <w:p>
+      <w:pPr>
+        <w:pStyle w:val="Compact"/>
+        <w:numPr>
+          <w:ilvl w:val="0"/>
+          <w:numId w:val="1098"/>
+        </w:numPr>
+      </w:pPr>
+      <w:r>
+        <w:t xml:space="preserve">Ogni badge ha una regola deterministica e versionata.</w:t>
+      </w:r>
+    </w:p>
+    <w:p>
+      <w:pPr>
+        <w:pStyle w:val="Compact"/>
+        <w:numPr>
+          <w:ilvl w:val="0"/>
+          <w:numId w:val="1098"/>
+        </w:numPr>
+      </w:pPr>
+      <w:r>
+        <w:t xml:space="preserve">Importato e tracked sono trattati secondo le regole dichiarate.</w:t>
+      </w:r>
+    </w:p>
+    <w:p>
+      <w:pPr>
+        <w:pStyle w:val="Compact"/>
+        <w:numPr>
+          <w:ilvl w:val="0"/>
+          <w:numId w:val="1098"/>
+        </w:numPr>
+      </w:pPr>
+      <w:r>
+        <w:t xml:space="preserve">Gli sblocchi sono permanenti e idempotenti.</w:t>
+      </w:r>
+    </w:p>
+    <w:p>
+      <w:pPr>
+        <w:pStyle w:val="Compact"/>
+        <w:numPr>
+          <w:ilvl w:val="0"/>
+          <w:numId w:val="1098"/>
+        </w:numPr>
+      </w:pPr>
+      <w:r>
+        <w:t xml:space="preserve">Nessun badge viene duplicato.</w:t>
+      </w:r>
+    </w:p>
+    <w:p>
+      <w:pPr>
+        <w:pStyle w:val="Compact"/>
+        <w:numPr>
+          <w:ilvl w:val="0"/>
+          <w:numId w:val="1098"/>
+        </w:numPr>
+      </w:pPr>
+      <w:r>
+        <w:t xml:space="preserve">Il progresso mostrato corrisponde ai dati reali.</w:t>
+      </w:r>
+    </w:p>
+    <w:p>
+      <w:pPr>
+        <w:pStyle w:val="Compact"/>
+        <w:numPr>
+          <w:ilvl w:val="0"/>
+          <w:numId w:val="1098"/>
+        </w:numPr>
+      </w:pPr>
+      <w:r>
+        <w:t xml:space="preserve">Il sistema non altera Libreria, Diario o Statistiche.</w:t>
+      </w:r>
+    </w:p>
+    <w:p>
+      <w:pPr>
+        <w:pStyle w:val="Compact"/>
+        <w:numPr>
+          <w:ilvl w:val="0"/>
+          <w:numId w:val="1098"/>
+        </w:numPr>
+      </w:pPr>
+      <w:r>
+        <w:t xml:space="preserve">Un errore di valutazione non blocca la mutazione principale.</w:t>
+      </w:r>
+    </w:p>
+    <w:p>
+      <w:pPr>
+        <w:pStyle w:val="Compact"/>
+        <w:numPr>
+          <w:ilvl w:val="0"/>
+          <w:numId w:val="1098"/>
+        </w:numPr>
+      </w:pPr>
+      <w:r>
+        <w:t xml:space="preserve">La Sala trofei funziona a 390 px senza overflow.</w:t>
+      </w:r>
+    </w:p>
+    <w:p>
+      <w:pPr>
+        <w:pStyle w:val="Compact"/>
+        <w:numPr>
+          <w:ilvl w:val="0"/>
+          <w:numId w:val="1098"/>
+        </w:numPr>
+      </w:pPr>
+      <w:r>
+        <w:t xml:space="preserve">RLS impedisce di leggere badge privati di altri utenti.</w:t>
+      </w:r>
+    </w:p>
+    <w:p>
+      <w:pPr>
+        <w:pStyle w:val="Compact"/>
+        <w:numPr>
+          <w:ilvl w:val="0"/>
+          <w:numId w:val="1098"/>
+        </w:numPr>
+      </w:pPr>
+      <w:r>
+        <w:t xml:space="preserve">Le superfici follower espongono solo badge scelti dall’utente.</w:t>
+      </w:r>
+    </w:p>
+    <w:p>
+      <w:r>
+        <w:pict>
+          <v:rect style="width:0;height:1.5pt" o:hralign="center" o:hrstd="t" o:hr="t"/>
+        </w:pict>
+      </w:r>
+    </w:p>
+    <w:bookmarkEnd w:id="91"/>
+    <w:bookmarkStart w:id="100" w:name="decisioni-v1-confermate"/>
+    <w:p>
+      <w:pPr>
+        <w:pStyle w:val="Heading2"/>
+      </w:pPr>
+      <w:r>
+        <w:t xml:space="preserve">12. Decisioni V1 confermate</w:t>
+      </w:r>
+    </w:p>
+    <w:bookmarkStart w:id="92" w:name="nomi"/>
+    <w:p>
+      <w:pPr>
+        <w:pStyle w:val="Heading3"/>
+      </w:pPr>
+      <w:r>
+        <w:t xml:space="preserve">Nomi</w:t>
+      </w:r>
+    </w:p>
+    <w:p>
+      <w:pPr>
+        <w:pStyle w:val="Compact"/>
+        <w:numPr>
+          <w:ilvl w:val="0"/>
+          <w:numId w:val="1099"/>
+        </w:numPr>
+      </w:pPr>
+      <w:r>
+        <w:t xml:space="preserve">Nomi italiani della proposta approvati</w:t>
+      </w:r>
+    </w:p>
+    <w:p>
+      <w:pPr>
+        <w:pStyle w:val="Compact"/>
+        <w:numPr>
+          <w:ilvl w:val="0"/>
+          <w:numId w:val="1100"/>
+        </w:numPr>
+      </w:pPr>
+      <w:r>
+        <w:t xml:space="preserve">“Ancora un episodio”</w:t>
+      </w:r>
+    </w:p>
+    <w:p>
+      <w:pPr>
+        <w:pStyle w:val="Compact"/>
+        <w:numPr>
+          <w:ilvl w:val="0"/>
+          <w:numId w:val="1101"/>
+        </w:numPr>
+      </w:pPr>
+      <w:r>
+        <w:t xml:space="preserve">“Volto familiare”</w:t>
+      </w:r>
+    </w:p>
+    <w:p>
+      <w:pPr>
+        <w:pStyle w:val="Compact"/>
+        <w:numPr>
+          <w:ilvl w:val="0"/>
+          <w:numId w:val="1102"/>
+        </w:numPr>
+      </w:pPr>
+      <w:r>
+        <w:t xml:space="preserve">“Occhio d’autore”</w:t>
+      </w:r>
+    </w:p>
+    <w:p>
+      <w:pPr>
+        <w:pStyle w:val="Compact"/>
+        <w:numPr>
+          <w:ilvl w:val="0"/>
+          <w:numId w:val="1103"/>
+        </w:numPr>
+      </w:pPr>
+      <w:r>
+        <w:t xml:space="preserve">“Coppia d’oro”</w:t>
+      </w:r>
+    </w:p>
+    <w:bookmarkEnd w:id="92"/>
+    <w:bookmarkStart w:id="93" w:name="soglie"/>
+    <w:p>
+      <w:pPr>
+        <w:pStyle w:val="Heading3"/>
+      </w:pPr>
+      <w:r>
+        <w:t xml:space="preserve">Soglie</w:t>
+      </w:r>
+    </w:p>
+    <w:p>
+      <w:pPr>
+        <w:pStyle w:val="Compact"/>
+        <w:numPr>
+          <w:ilvl w:val="0"/>
+          <w:numId w:val="1104"/>
+        </w:numPr>
+      </w:pPr>
+      <w:r>
+        <w:t xml:space="preserve">Soglie cumulative moltiplicate almeno ×5</w:t>
+      </w:r>
+    </w:p>
+    <w:p>
+      <w:pPr>
+        <w:pStyle w:val="Compact"/>
+        <w:numPr>
+          <w:ilvl w:val="0"/>
+          <w:numId w:val="1105"/>
+        </w:numPr>
+      </w:pPr>
+      <w:r>
+        <w:t xml:space="preserve">Arrotondamento per eccesso a numeri leggibili</w:t>
+      </w:r>
+    </w:p>
+    <w:p>
+      <w:pPr>
+        <w:pStyle w:val="Compact"/>
+        <w:numPr>
+          <w:ilvl w:val="0"/>
+          <w:numId w:val="1106"/>
+        </w:numPr>
+      </w:pPr>
+      <w:r>
+        <w:t xml:space="preserve">Requisiti strutturali lasciati invariati</w:t>
+      </w:r>
+    </w:p>
+    <w:p>
+      <w:pPr>
+        <w:pStyle w:val="Compact"/>
+        <w:numPr>
+          <w:ilvl w:val="0"/>
+          <w:numId w:val="1107"/>
+        </w:numPr>
+      </w:pPr>
+      <w:r>
+        <w:t xml:space="preserve">Livelli Bronzo, Argento, Oro e Platino</w:t>
+      </w:r>
+    </w:p>
+    <w:p>
+      <w:pPr>
+        <w:pStyle w:val="Compact"/>
+        <w:numPr>
+          <w:ilvl w:val="0"/>
+          <w:numId w:val="1108"/>
+        </w:numPr>
+      </w:pPr>
+      <w:r>
+        <w:t xml:space="preserve">Tutte le famiglie a progressione arrivano a Platino</w:t>
+      </w:r>
+    </w:p>
+    <w:p>
+      <w:pPr>
+        <w:pStyle w:val="Compact"/>
+        <w:numPr>
+          <w:ilvl w:val="0"/>
+          <w:numId w:val="1109"/>
+        </w:numPr>
+      </w:pPr>
+      <w:r>
+        <w:t xml:space="preserve">Maratoneta accetta lo stesso giorno o due date consecutive</w:t>
+      </w:r>
+    </w:p>
+    <w:p>
+      <w:pPr>
+        <w:pStyle w:val="Compact"/>
+        <w:numPr>
+          <w:ilvl w:val="0"/>
+          <w:numId w:val="1110"/>
+        </w:numPr>
+      </w:pPr>
+      <w:r>
+        <w:t xml:space="preserve">Critico conta tutte le voci distinte con nota, incluse revisioni e rewatch</w:t>
+      </w:r>
+    </w:p>
+    <w:bookmarkEnd w:id="93"/>
+    <w:bookmarkStart w:id="94" w:name="badge-introduttivi-1"/>
+    <w:p>
+      <w:pPr>
+        <w:pStyle w:val="Heading3"/>
+      </w:pPr>
+      <w:r>
+        <w:t xml:space="preserve">Badge introduttivi</w:t>
+      </w:r>
+    </w:p>
+    <w:p>
+      <w:pPr>
+        <w:pStyle w:val="Compact"/>
+        <w:numPr>
+          <w:ilvl w:val="0"/>
+          <w:numId w:val="1111"/>
+        </w:numPr>
+      </w:pPr>
+      <w:r>
+        <w:t xml:space="preserve">Primo ciak</w:t>
+      </w:r>
+    </w:p>
+    <w:p>
+      <w:pPr>
+        <w:pStyle w:val="Compact"/>
+        <w:numPr>
+          <w:ilvl w:val="0"/>
+          <w:numId w:val="1112"/>
+        </w:numPr>
+      </w:pPr>
+      <w:r>
+        <w:t xml:space="preserve">Prima recensione</w:t>
+      </w:r>
+    </w:p>
+    <w:p>
+      <w:pPr>
+        <w:pStyle w:val="Compact"/>
+        <w:numPr>
+          <w:ilvl w:val="0"/>
+          <w:numId w:val="1113"/>
+        </w:numPr>
+      </w:pPr>
+      <w:r>
+        <w:t xml:space="preserve">Stagione chiusa</w:t>
+      </w:r>
+    </w:p>
+    <w:p>
+      <w:pPr>
+        <w:pStyle w:val="Compact"/>
+        <w:numPr>
+          <w:ilvl w:val="0"/>
+          <w:numId w:val="1114"/>
+        </w:numPr>
+      </w:pPr>
+      <w:r>
+        <w:t xml:space="preserve">Badge singoli, senza livelli</w:t>
+      </w:r>
+    </w:p>
+    <w:p>
+      <w:pPr>
+        <w:pStyle w:val="Compact"/>
+        <w:numPr>
+          <w:ilvl w:val="0"/>
+          <w:numId w:val="1115"/>
+        </w:numPr>
+      </w:pPr>
+      <w:r>
+        <w:t xml:space="preserve">Stagione 0 / Speciali esclusa da Stagione chiusa</w:t>
+      </w:r>
+    </w:p>
+    <w:bookmarkEnd w:id="94"/>
+    <w:bookmarkStart w:id="95" w:name="serie-completata"/>
+    <w:p>
+      <w:pPr>
+        <w:pStyle w:val="Heading3"/>
+      </w:pPr>
+      <w:r>
+        <w:t xml:space="preserve">Serie completata</w:t>
+      </w:r>
     </w:p>
     <w:p>
       <w:pPr>
@@ -11336,6 +11640,27 @@
         </w:numPr>
       </w:pPr>
       <w:r>
+        <w:t xml:space="preserve">Stato TMDB</w:t>
+      </w:r>
+      <w:r>
+        <w:t xml:space="preserve"> </w:t>
+      </w:r>
+      <w:r>
+        <w:rPr>
+          <w:rStyle w:val="VerbatimChar"/>
+        </w:rPr>
+        <w:t xml:space="preserve">Ended</w:t>
+      </w:r>
+    </w:p>
+    <w:p>
+      <w:pPr>
+        <w:pStyle w:val="Compact"/>
+        <w:numPr>
+          <w:ilvl w:val="0"/>
+          <w:numId w:val="1117"/>
+        </w:numPr>
+      </w:pPr>
+      <w:r>
         <w:t xml:space="preserve">Tutti gli episodi catalogati risultano visti</w:t>
       </w:r>
     </w:p>
@@ -11344,7 +11669,7 @@
         <w:pStyle w:val="Compact"/>
         <w:numPr>
           <w:ilvl w:val="0"/>
-          <w:numId w:val="1117"/>
+          <w:numId w:val="1118"/>
         </w:numPr>
       </w:pPr>
       <w:r>
@@ -11356,15 +11681,15 @@
         <w:pStyle w:val="Compact"/>
         <w:numPr>
           <w:ilvl w:val="0"/>
-          <w:numId w:val="1118"/>
+          <w:numId w:val="1119"/>
         </w:numPr>
       </w:pPr>
       <w:r>
         <w:t xml:space="preserve">Sblocco permanente anche dopo modifiche ai metadati TMDB</w:t>
       </w:r>
     </w:p>
-    <w:bookmarkEnd w:id="94"/>
-    <w:bookmarkStart w:id="95" w:name="generi-canonici"/>
+    <w:bookmarkEnd w:id="95"/>
+    <w:bookmarkStart w:id="96" w:name="generi-canonici"/>
     <w:p>
       <w:pPr>
         <w:pStyle w:val="Heading3"/>
@@ -11378,7 +11703,7 @@
         <w:pStyle w:val="Compact"/>
         <w:numPr>
           <w:ilvl w:val="0"/>
-          <w:numId w:val="1119"/>
+          <w:numId w:val="1120"/>
         </w:numPr>
       </w:pPr>
       <w:r>
@@ -11390,7 +11715,7 @@
         <w:pStyle w:val="Compact"/>
         <w:numPr>
           <w:ilvl w:val="0"/>
-          <w:numId w:val="1120"/>
+          <w:numId w:val="1121"/>
         </w:numPr>
       </w:pPr>
       <w:r>
@@ -11402,7 +11727,7 @@
         <w:pStyle w:val="Compact"/>
         <w:numPr>
           <w:ilvl w:val="0"/>
-          <w:numId w:val="1121"/>
+          <w:numId w:val="1122"/>
         </w:numPr>
       </w:pPr>
       <w:r>
@@ -11414,7 +11739,7 @@
         <w:pStyle w:val="Compact"/>
         <w:numPr>
           <w:ilvl w:val="0"/>
-          <w:numId w:val="1122"/>
+          <w:numId w:val="1123"/>
         </w:numPr>
       </w:pPr>
       <w:r>
@@ -11842,8 +12167,8 @@
         <w:t xml:space="preserve">genere narrativo. Gli altri generi associati allo stesso titolo restano validi.</w:t>
       </w:r>
     </w:p>
-    <w:bookmarkEnd w:id="95"/>
-    <w:bookmarkStart w:id="96" w:name="social"/>
+    <w:bookmarkEnd w:id="96"/>
+    <w:bookmarkStart w:id="97" w:name="social"/>
     <w:p>
       <w:pPr>
         <w:pStyle w:val="Heading3"/>
@@ -11857,7 +12182,7 @@
         <w:pStyle w:val="Compact"/>
         <w:numPr>
           <w:ilvl w:val="0"/>
-          <w:numId w:val="1123"/>
+          <w:numId w:val="1124"/>
         </w:numPr>
       </w:pPr>
       <w:r>
@@ -11869,7 +12194,7 @@
         <w:pStyle w:val="Compact"/>
         <w:numPr>
           <w:ilvl w:val="0"/>
-          <w:numId w:val="1124"/>
+          <w:numId w:val="1125"/>
         </w:numPr>
       </w:pPr>
       <w:r>
@@ -11881,7 +12206,7 @@
         <w:pStyle w:val="Compact"/>
         <w:numPr>
           <w:ilvl w:val="0"/>
-          <w:numId w:val="1125"/>
+          <w:numId w:val="1126"/>
         </w:numPr>
       </w:pPr>
       <w:r>
@@ -11893,7 +12218,7 @@
         <w:pStyle w:val="Compact"/>
         <w:numPr>
           <w:ilvl w:val="0"/>
-          <w:numId w:val="1126"/>
+          <w:numId w:val="1127"/>
         </w:numPr>
       </w:pPr>
       <w:r>
@@ -11905,15 +12230,15 @@
         <w:pStyle w:val="Compact"/>
         <w:numPr>
           <w:ilvl w:val="0"/>
-          <w:numId w:val="1127"/>
+          <w:numId w:val="1128"/>
         </w:numPr>
       </w:pPr>
       <w:r>
         <w:t xml:space="preserve">Reinvii e riaperture non incrementano il progresso</w:t>
       </w:r>
     </w:p>
-    <w:bookmarkEnd w:id="96"/>
-    <w:bookmarkStart w:id="97" w:name="ux"/>
+    <w:bookmarkEnd w:id="97"/>
+    <w:bookmarkStart w:id="98" w:name="ux"/>
     <w:p>
       <w:pPr>
         <w:pStyle w:val="Heading3"/>
@@ -11927,7 +12252,7 @@
         <w:pStyle w:val="Compact"/>
         <w:numPr>
           <w:ilvl w:val="0"/>
-          <w:numId w:val="1128"/>
+          <w:numId w:val="1129"/>
         </w:numPr>
       </w:pPr>
       <w:r>
@@ -11939,7 +12264,7 @@
         <w:pStyle w:val="Compact"/>
         <w:numPr>
           <w:ilvl w:val="0"/>
-          <w:numId w:val="1129"/>
+          <w:numId w:val="1130"/>
         </w:numPr>
       </w:pPr>
       <w:r>
@@ -11951,7 +12276,7 @@
         <w:pStyle w:val="Compact"/>
         <w:numPr>
           <w:ilvl w:val="0"/>
-          <w:numId w:val="1130"/>
+          <w:numId w:val="1131"/>
         </w:numPr>
       </w:pPr>
       <w:r>
@@ -11963,7 +12288,7 @@
         <w:pStyle w:val="Compact"/>
         <w:numPr>
           <w:ilvl w:val="0"/>
-          <w:numId w:val="1131"/>
+          <w:numId w:val="1132"/>
         </w:numPr>
       </w:pPr>
       <w:r>
@@ -11975,7 +12300,7 @@
         <w:pStyle w:val="Compact"/>
         <w:numPr>
           <w:ilvl w:val="0"/>
-          <w:numId w:val="1132"/>
+          <w:numId w:val="1133"/>
         </w:numPr>
       </w:pPr>
       <w:r>
@@ -11987,7 +12312,7 @@
         <w:pStyle w:val="Compact"/>
         <w:numPr>
           <w:ilvl w:val="0"/>
-          <w:numId w:val="1133"/>
+          <w:numId w:val="1134"/>
         </w:numPr>
       </w:pPr>
       <w:r>
@@ -11999,7 +12324,7 @@
         <w:pStyle w:val="Compact"/>
         <w:numPr>
           <w:ilvl w:val="0"/>
-          <w:numId w:val="1134"/>
+          <w:numId w:val="1135"/>
         </w:numPr>
       </w:pPr>
       <w:r>
@@ -12011,7 +12336,7 @@
         <w:pStyle w:val="Compact"/>
         <w:numPr>
           <w:ilvl w:val="0"/>
-          <w:numId w:val="1135"/>
+          <w:numId w:val="1136"/>
         </w:numPr>
       </w:pPr>
       <w:r>
@@ -12023,7 +12348,7 @@
         <w:pStyle w:val="Compact"/>
         <w:numPr>
           <w:ilvl w:val="0"/>
-          <w:numId w:val="1136"/>
+          <w:numId w:val="1137"/>
         </w:numPr>
       </w:pPr>
       <w:r>
@@ -12035,7 +12360,7 @@
         <w:pStyle w:val="Compact"/>
         <w:numPr>
           <w:ilvl w:val="0"/>
-          <w:numId w:val="1137"/>
+          <w:numId w:val="1138"/>
         </w:numPr>
       </w:pPr>
       <w:r>
@@ -12047,15 +12372,15 @@
         <w:pStyle w:val="Compact"/>
         <w:numPr>
           <w:ilvl w:val="0"/>
-          <w:numId w:val="1138"/>
+          <w:numId w:val="1139"/>
         </w:numPr>
       </w:pPr>
       <w:r>
         <w:t xml:space="preserve">Banner di sblocco con sfondo pieno, senza trasparenza</w:t>
       </w:r>
     </w:p>
-    <w:bookmarkEnd w:id="97"/>
-    <w:bookmarkStart w:id="98" w:name="operatività"/>
+    <w:bookmarkEnd w:id="98"/>
+    <w:bookmarkStart w:id="99" w:name="operatività"/>
     <w:p>
       <w:pPr>
         <w:pStyle w:val="Heading3"/>
@@ -12069,7 +12394,7 @@
         <w:pStyle w:val="Compact"/>
         <w:numPr>
           <w:ilvl w:val="0"/>
-          <w:numId w:val="1139"/>
+          <w:numId w:val="1140"/>
         </w:numPr>
       </w:pPr>
       <w:r>
@@ -12081,7 +12406,7 @@
         <w:pStyle w:val="Compact"/>
         <w:numPr>
           <w:ilvl w:val="0"/>
-          <w:numId w:val="1140"/>
+          <w:numId w:val="1141"/>
         </w:numPr>
       </w:pPr>
       <w:r>
@@ -12093,7 +12418,7 @@
         <w:pStyle w:val="Compact"/>
         <w:numPr>
           <w:ilvl w:val="0"/>
-          <w:numId w:val="1141"/>
+          <w:numId w:val="1142"/>
         </w:numPr>
       </w:pPr>
       <w:r>
@@ -12105,7 +12430,7 @@
         <w:pStyle w:val="Compact"/>
         <w:numPr>
           <w:ilvl w:val="0"/>
-          <w:numId w:val="1142"/>
+          <w:numId w:val="1143"/>
         </w:numPr>
       </w:pPr>
       <w:r>
@@ -12126,7 +12451,7 @@
         <w:pStyle w:val="Compact"/>
         <w:numPr>
           <w:ilvl w:val="0"/>
-          <w:numId w:val="1143"/>
+          <w:numId w:val="1144"/>
         </w:numPr>
       </w:pPr>
       <w:r>
@@ -12138,7 +12463,7 @@
         <w:pStyle w:val="Compact"/>
         <w:numPr>
           <w:ilvl w:val="0"/>
-          <w:numId w:val="1144"/>
+          <w:numId w:val="1145"/>
         </w:numPr>
       </w:pPr>
       <w:r>
@@ -12150,7 +12475,7 @@
         <w:pStyle w:val="Compact"/>
         <w:numPr>
           <w:ilvl w:val="0"/>
-          <w:numId w:val="1145"/>
+          <w:numId w:val="1146"/>
         </w:numPr>
       </w:pPr>
       <w:r>
@@ -12162,7 +12487,7 @@
         <w:pStyle w:val="Compact"/>
         <w:numPr>
           <w:ilvl w:val="0"/>
-          <w:numId w:val="1146"/>
+          <w:numId w:val="1147"/>
         </w:numPr>
       </w:pPr>
       <w:r>
@@ -12174,7 +12499,7 @@
         <w:pStyle w:val="Compact"/>
         <w:numPr>
           <w:ilvl w:val="0"/>
-          <w:numId w:val="1147"/>
+          <w:numId w:val="1148"/>
         </w:numPr>
       </w:pPr>
       <w:r>
@@ -12186,7 +12511,7 @@
         <w:pStyle w:val="Compact"/>
         <w:numPr>
           <w:ilvl w:val="0"/>
-          <w:numId w:val="1148"/>
+          <w:numId w:val="1149"/>
         </w:numPr>
       </w:pPr>
       <w:r>
@@ -12198,7 +12523,7 @@
         <w:pStyle w:val="Compact"/>
         <w:numPr>
           <w:ilvl w:val="0"/>
-          <w:numId w:val="1149"/>
+          <w:numId w:val="1150"/>
         </w:numPr>
       </w:pPr>
       <w:r>
@@ -12210,7 +12535,7 @@
         <w:pStyle w:val="Compact"/>
         <w:numPr>
           <w:ilvl w:val="0"/>
-          <w:numId w:val="1150"/>
+          <w:numId w:val="1151"/>
         </w:numPr>
       </w:pPr>
       <w:r>
@@ -12222,7 +12547,7 @@
         <w:pStyle w:val="Compact"/>
         <w:numPr>
           <w:ilvl w:val="0"/>
-          <w:numId w:val="1151"/>
+          <w:numId w:val="1152"/>
         </w:numPr>
       </w:pPr>
       <w:r>
@@ -12234,7 +12559,7 @@
         <w:pStyle w:val="Compact"/>
         <w:numPr>
           <w:ilvl w:val="0"/>
-          <w:numId w:val="1152"/>
+          <w:numId w:val="1153"/>
         </w:numPr>
       </w:pPr>
       <w:r>
@@ -12246,7 +12571,7 @@
         <w:pStyle w:val="Compact"/>
         <w:numPr>
           <w:ilvl w:val="0"/>
-          <w:numId w:val="1153"/>
+          <w:numId w:val="1154"/>
         </w:numPr>
       </w:pPr>
       <w:r>
@@ -12258,7 +12583,7 @@
         <w:pStyle w:val="Compact"/>
         <w:numPr>
           <w:ilvl w:val="0"/>
-          <w:numId w:val="1154"/>
+          <w:numId w:val="1155"/>
         </w:numPr>
       </w:pPr>
       <w:r>
@@ -12270,7 +12595,19 @@
         <w:pStyle w:val="Compact"/>
         <w:numPr>
           <w:ilvl w:val="0"/>
-          <w:numId w:val="1155"/>
+          <w:numId w:val="1156"/>
+        </w:numPr>
+      </w:pPr>
+      <w:r>
+        <w:t xml:space="preserve">Quarta famiglia progressiva: Serialista</w:t>
+      </w:r>
+    </w:p>
+    <w:p>
+      <w:pPr>
+        <w:pStyle w:val="Compact"/>
+        <w:numPr>
+          <w:ilvl w:val="0"/>
+          <w:numId w:val="1157"/>
         </w:numPr>
       </w:pPr>
       <w:r>
@@ -12284,9 +12621,9 @@
         </w:pict>
       </w:r>
     </w:p>
-    <w:bookmarkEnd w:id="98"/>
     <w:bookmarkEnd w:id="99"/>
-    <w:bookmarkStart w:id="100" w:name="prossimo-passo-consigliato"/>
+    <w:bookmarkEnd w:id="100"/>
+    <w:bookmarkStart w:id="101" w:name="prossimo-passo-consigliato"/>
     <w:p>
       <w:pPr>
         <w:pStyle w:val="Heading2"/>
@@ -12308,7 +12645,7 @@
         <w:pStyle w:val="BodyText"/>
       </w:pPr>
       <w:r>
-        <w:t xml:space="preserve">Il prossimo passo operativo è</w:t>
+        <w:t xml:space="preserve">Il prossimo passo operativo è completare il rollout di</w:t>
       </w:r>
       <w:r>
         <w:t xml:space="preserve"> </w:t>
@@ -12329,11 +12666,35 @@
         <w:pStyle w:val="Compact"/>
         <w:numPr>
           <w:ilvl w:val="0"/>
-          <w:numId w:val="1156"/>
-        </w:numPr>
-      </w:pPr>
-      <w:r>
-        <w:t xml:space="preserve">considerare soltanto serie TMDB con stato</w:t>
+          <w:numId w:val="1158"/>
+        </w:numPr>
+      </w:pPr>
+      <w:r>
+        <w:t xml:space="preserve">distribuire la Edge Function con cache protetta;</w:t>
+      </w:r>
+    </w:p>
+    <w:p>
+      <w:pPr>
+        <w:pStyle w:val="Compact"/>
+        <w:numPr>
+          <w:ilvl w:val="0"/>
+          <w:numId w:val="1158"/>
+        </w:numPr>
+      </w:pPr>
+      <w:r>
+        <w:t xml:space="preserve">pubblicare la patch subito sotto Cinefilo;</w:t>
+      </w:r>
+    </w:p>
+    <w:p>
+      <w:pPr>
+        <w:pStyle w:val="Compact"/>
+        <w:numPr>
+          <w:ilvl w:val="0"/>
+          <w:numId w:val="1158"/>
+        </w:numPr>
+      </w:pPr>
+      <w:r>
+        <w:t xml:space="preserve">applicare la migration</w:t>
       </w:r>
       <w:r>
         <w:t xml:space="preserve"> </w:t>
@@ -12342,7 +12703,7 @@
         <w:rPr>
           <w:rStyle w:val="VerbatimChar"/>
         </w:rPr>
-        <w:t xml:space="preserve">Ended</w:t>
+        <w:t xml:space="preserve">0021_serialist_badge.sql</w:t>
       </w:r>
       <w:r>
         <w:t xml:space="preserve">;</w:t>
@@ -12353,75 +12714,39 @@
         <w:pStyle w:val="Compact"/>
         <w:numPr>
           <w:ilvl w:val="0"/>
-          <w:numId w:val="1156"/>
-        </w:numPr>
-      </w:pPr>
-      <w:r>
-        <w:t xml:space="preserve">verificare tutti gli episodi regolari, escludendo Stagione 0 / Speciali;</w:t>
-      </w:r>
-    </w:p>
-    <w:p>
-      <w:pPr>
-        <w:pStyle w:val="Compact"/>
-        <w:numPr>
-          <w:ilvl w:val="0"/>
-          <w:numId w:val="1156"/>
-        </w:numPr>
-      </w:pPr>
-      <w:r>
-        <w:t xml:space="preserve">includere progresso importato e attività reale;</w:t>
-      </w:r>
-    </w:p>
-    <w:p>
-      <w:pPr>
-        <w:pStyle w:val="Compact"/>
-        <w:numPr>
-          <w:ilvl w:val="0"/>
-          <w:numId w:val="1156"/>
-        </w:numPr>
-      </w:pPr>
-      <w:r>
-        <w:t xml:space="preserve">aggiungere le soglie</w:t>
-      </w:r>
-      <w:r>
-        <w:t xml:space="preserve"> </w:t>
-      </w:r>
-      <w:r>
-        <w:rPr>
-          <w:rStyle w:val="VerbatimChar"/>
-        </w:rPr>
-        <w:t xml:space="preserve">25 / 100 / 250 / 500</w:t>
-      </w:r>
-      <w:r>
-        <w:t xml:space="preserve">;</w:t>
-      </w:r>
-    </w:p>
-    <w:p>
-      <w:pPr>
-        <w:pStyle w:val="Compact"/>
-        <w:numPr>
-          <w:ilvl w:val="0"/>
-          <w:numId w:val="1156"/>
-        </w:numPr>
-      </w:pPr>
-      <w:r>
-        <w:t xml:space="preserve">creare patch e accordion dedicati;</w:t>
-      </w:r>
-    </w:p>
-    <w:p>
-      <w:pPr>
-        <w:pStyle w:val="Compact"/>
-        <w:numPr>
-          <w:ilvl w:val="0"/>
-          <w:numId w:val="1156"/>
-        </w:numPr>
-      </w:pPr>
-      <w:r>
-        <w:t xml:space="preserve">completare il Batch A2 con backfill e test reali.</w:t>
-      </w:r>
-    </w:p>
-    <w:bookmarkEnd w:id="100"/>
+          <w:numId w:val="1158"/>
+        </w:numPr>
+      </w:pPr>
+      <w:r>
+        <w:t xml:space="preserve">verificare cache, backfill e idempotenza sull’account Test;</w:t>
+      </w:r>
+    </w:p>
+    <w:p>
+      <w:pPr>
+        <w:pStyle w:val="Compact"/>
+        <w:numPr>
+          <w:ilvl w:val="0"/>
+          <w:numId w:val="1158"/>
+        </w:numPr>
+      </w:pPr>
+      <w:r>
+        <w:t xml:space="preserve">verificare progresso e sblocchi sull’account principale;</w:t>
+      </w:r>
+    </w:p>
+    <w:p>
+      <w:pPr>
+        <w:pStyle w:val="Compact"/>
+        <w:numPr>
+          <w:ilvl w:val="0"/>
+          <w:numId w:val="1158"/>
+        </w:numPr>
+      </w:pPr>
+      <w:r>
+        <w:t xml:space="preserve">chiudere il Batch A2 e scegliere il primo badge del Batch B.</w:t>
+      </w:r>
+    </w:p>
     <w:bookmarkEnd w:id="101"/>
+    <w:bookmarkEnd w:id="102"/>
     <w:sectPr>
       <w:footerReference r:id="rId9" w:type="default"/>
       <w:pgSz w:h="15840" w:w="12240"/>
@@ -13362,7 +13687,7 @@
     <w:abstractNumId w:val="993"/>
   </w:num>
   <w:num w:numId="1072">
-    <w:abstractNumId w:val="992"/>
+    <w:abstractNumId w:val="993"/>
   </w:num>
   <w:num w:numId="1073">
     <w:abstractNumId w:val="993"/>
@@ -13380,7 +13705,7 @@
     <w:abstractNumId w:val="991"/>
   </w:num>
   <w:num w:numId="1078">
-    <w:abstractNumId w:val="992"/>
+    <w:abstractNumId w:val="991"/>
   </w:num>
   <w:num w:numId="1079">
     <w:abstractNumId w:val="992"/>
@@ -13437,10 +13762,10 @@
     <w:abstractNumId w:val="992"/>
   </w:num>
   <w:num w:numId="1097">
-    <w:abstractNumId w:val="991"/>
+    <w:abstractNumId w:val="992"/>
   </w:num>
   <w:num w:numId="1098">
-    <w:abstractNumId w:val="993"/>
+    <w:abstractNumId w:val="991"/>
   </w:num>
   <w:num w:numId="1099">
     <w:abstractNumId w:val="993"/>
@@ -13614,6 +13939,12 @@
     <w:abstractNumId w:val="993"/>
   </w:num>
   <w:num w:numId="1156">
+    <w:abstractNumId w:val="993"/>
+  </w:num>
+  <w:num w:numId="1157">
+    <w:abstractNumId w:val="993"/>
+  </w:num>
+  <w:num w:numId="1158">
     <w:abstractNumId w:val="99411"/>
     <w:lvlOverride w:ilvl="0">
       <w:startOverride w:val="1"/>
@@ -25505,6 +25836,232 @@
     <w:pPr>
       <w:wordWrap w:val="off"/>
     </w:pPr>
+  </w:style>
+  <w:style w:customStyle="1" w:styleId="KeywordTok" w:type="character">
+    <w:name w:val="KeywordTok"/>
+    <w:basedOn w:val="VerbatimChar"/>
+    <w:rPr>
+      <w:b/>
+      <w:color w:val="007020"/>
+    </w:rPr>
+  </w:style>
+  <w:style w:customStyle="1" w:styleId="DataTypeTok" w:type="character">
+    <w:name w:val="DataTypeTok"/>
+    <w:basedOn w:val="VerbatimChar"/>
+    <w:rPr>
+      <w:color w:val="902000"/>
+    </w:rPr>
+  </w:style>
+  <w:style w:customStyle="1" w:styleId="DecValTok" w:type="character">
+    <w:name w:val="DecValTok"/>
+    <w:basedOn w:val="VerbatimChar"/>
+    <w:rPr>
+      <w:color w:val="40a070"/>
+    </w:rPr>
+  </w:style>
+  <w:style w:customStyle="1" w:styleId="BaseNTok" w:type="character">
+    <w:name w:val="BaseNTok"/>
+    <w:basedOn w:val="VerbatimChar"/>
+    <w:rPr>
+      <w:color w:val="40a070"/>
+    </w:rPr>
+  </w:style>
+  <w:style w:customStyle="1" w:styleId="FloatTok" w:type="character">
+    <w:name w:val="FloatTok"/>
+    <w:basedOn w:val="VerbatimChar"/>
+    <w:rPr>
+      <w:color w:val="40a070"/>
+    </w:rPr>
+  </w:style>
+  <w:style w:customStyle="1" w:styleId="ConstantTok" w:type="character">
+    <w:name w:val="ConstantTok"/>
+    <w:basedOn w:val="VerbatimChar"/>
+    <w:rPr>
+      <w:color w:val="880000"/>
+    </w:rPr>
+  </w:style>
+  <w:style w:customStyle="1" w:styleId="CharTok" w:type="character">
+    <w:name w:val="CharTok"/>
+    <w:basedOn w:val="VerbatimChar"/>
+    <w:rPr>
+      <w:color w:val="4070a0"/>
+    </w:rPr>
+  </w:style>
+  <w:style w:customStyle="1" w:styleId="SpecialCharTok" w:type="character">
+    <w:name w:val="SpecialCharTok"/>
+    <w:basedOn w:val="VerbatimChar"/>
+    <w:rPr>
+      <w:color w:val="4070a0"/>
+    </w:rPr>
+  </w:style>
+  <w:style w:customStyle="1" w:styleId="StringTok" w:type="character">
+    <w:name w:val="StringTok"/>
+    <w:basedOn w:val="VerbatimChar"/>
+    <w:rPr>
+      <w:color w:val="4070a0"/>
+    </w:rPr>
+  </w:style>
+  <w:style w:customStyle="1" w:styleId="VerbatimStringTok" w:type="character">
+    <w:name w:val="VerbatimStringTok"/>
+    <w:basedOn w:val="VerbatimChar"/>
+    <w:rPr>
+      <w:color w:val="4070a0"/>
+    </w:rPr>
+  </w:style>
+  <w:style w:customStyle="1" w:styleId="SpecialStringTok" w:type="character">
+    <w:name w:val="SpecialStringTok"/>
+    <w:basedOn w:val="VerbatimChar"/>
+    <w:rPr>
+      <w:color w:val="bb6688"/>
+    </w:rPr>
+  </w:style>
+  <w:style w:customStyle="1" w:styleId="ImportTok" w:type="character">
+    <w:name w:val="ImportTok"/>
+    <w:basedOn w:val="VerbatimChar"/>
+    <w:rPr>
+      <w:b/>
+      <w:color w:val="008000"/>
+    </w:rPr>
+  </w:style>
+  <w:style w:customStyle="1" w:styleId="CommentTok" w:type="character">
+    <w:name w:val="CommentTok"/>
+    <w:basedOn w:val="VerbatimChar"/>
+    <w:rPr>
+      <w:i/>
+      <w:color w:val="60a0b0"/>
+    </w:rPr>
+  </w:style>
+  <w:style w:customStyle="1" w:styleId="DocumentationTok" w:type="character">
+    <w:name w:val="DocumentationTok"/>
+    <w:basedOn w:val="VerbatimChar"/>
+    <w:rPr>
+      <w:i/>
+      <w:color w:val="ba2121"/>
+    </w:rPr>
+  </w:style>
+  <w:style w:customStyle="1" w:styleId="AnnotationTok" w:type="character">
+    <w:name w:val="AnnotationTok"/>
+    <w:basedOn w:val="VerbatimChar"/>
+    <w:rPr>
+      <w:b/>
+      <w:i/>
+      <w:color w:val="60a0b0"/>
+    </w:rPr>
+  </w:style>
+  <w:style w:customStyle="1" w:styleId="CommentVarTok" w:type="character">
+    <w:name w:val="CommentVarTok"/>
+    <w:basedOn w:val="VerbatimChar"/>
+    <w:rPr>
+      <w:b/>
+      <w:i/>
+      <w:color w:val="60a0b0"/>
+    </w:rPr>
+  </w:style>
+  <w:style w:customStyle="1" w:styleId="OtherTok" w:type="character">
+    <w:name w:val="OtherTok"/>
+    <w:basedOn w:val="VerbatimChar"/>
+    <w:rPr>
+      <w:color w:val="007020"/>
+    </w:rPr>
+  </w:style>
+  <w:style w:customStyle="1" w:styleId="FunctionTok" w:type="character">
+    <w:name w:val="FunctionTok"/>
+    <w:basedOn w:val="VerbatimChar"/>
+    <w:rPr>
+      <w:color w:val="06287e"/>
+    </w:rPr>
+  </w:style>
+  <w:style w:customStyle="1" w:styleId="VariableTok" w:type="character">
+    <w:name w:val="VariableTok"/>
+    <w:basedOn w:val="VerbatimChar"/>
+    <w:rPr>
+      <w:color w:val="19177c"/>
+    </w:rPr>
+  </w:style>
+  <w:style w:customStyle="1" w:styleId="ControlFlowTok" w:type="character">
+    <w:name w:val="ControlFlowTok"/>
+    <w:basedOn w:val="VerbatimChar"/>
+    <w:rPr>
+      <w:b/>
+      <w:color w:val="007020"/>
+    </w:rPr>
+  </w:style>
+  <w:style w:customStyle="1" w:styleId="OperatorTok" w:type="character">
+    <w:name w:val="OperatorTok"/>
+    <w:basedOn w:val="VerbatimChar"/>
+    <w:rPr>
+      <w:color w:val="666666"/>
+    </w:rPr>
+  </w:style>
+  <w:style w:customStyle="1" w:styleId="BuiltInTok" w:type="character">
+    <w:name w:val="BuiltInTok"/>
+    <w:basedOn w:val="VerbatimChar"/>
+    <w:rPr>
+      <w:color w:val="008000"/>
+    </w:rPr>
+  </w:style>
+  <w:style w:customStyle="1" w:styleId="ExtensionTok" w:type="character">
+    <w:name w:val="ExtensionTok"/>
+    <w:basedOn w:val="VerbatimChar"/>
+    <w:rPr/>
+  </w:style>
+  <w:style w:customStyle="1" w:styleId="PreprocessorTok" w:type="character">
+    <w:name w:val="PreprocessorTok"/>
+    <w:basedOn w:val="VerbatimChar"/>
+    <w:rPr>
+      <w:color w:val="bc7a00"/>
+    </w:rPr>
+  </w:style>
+  <w:style w:customStyle="1" w:styleId="AttributeTok" w:type="character">
+    <w:name w:val="AttributeTok"/>
+    <w:basedOn w:val="VerbatimChar"/>
+    <w:rPr>
+      <w:color w:val="7d9029"/>
+    </w:rPr>
+  </w:style>
+  <w:style w:customStyle="1" w:styleId="RegionMarkerTok" w:type="character">
+    <w:name w:val="RegionMarkerTok"/>
+    <w:basedOn w:val="VerbatimChar"/>
+    <w:rPr/>
+  </w:style>
+  <w:style w:customStyle="1" w:styleId="InformationTok" w:type="character">
+    <w:name w:val="InformationTok"/>
+    <w:basedOn w:val="VerbatimChar"/>
+    <w:rPr>
+      <w:b/>
+      <w:i/>
+      <w:color w:val="60a0b0"/>
+    </w:rPr>
+  </w:style>
+  <w:style w:customStyle="1" w:styleId="WarningTok" w:type="character">
+    <w:name w:val="WarningTok"/>
+    <w:basedOn w:val="VerbatimChar"/>
+    <w:rPr>
+      <w:b/>
+      <w:i/>
+      <w:color w:val="60a0b0"/>
+    </w:rPr>
+  </w:style>
+  <w:style w:customStyle="1" w:styleId="AlertTok" w:type="character">
+    <w:name w:val="AlertTok"/>
+    <w:basedOn w:val="VerbatimChar"/>
+    <w:rPr>
+      <w:b/>
+      <w:color w:val="ff0000"/>
+    </w:rPr>
+  </w:style>
+  <w:style w:customStyle="1" w:styleId="ErrorTok" w:type="character">
+    <w:name w:val="ErrorTok"/>
+    <w:basedOn w:val="VerbatimChar"/>
+    <w:rPr>
+      <w:b/>
+      <w:color w:val="ff0000"/>
+    </w:rPr>
+  </w:style>
+  <w:style w:customStyle="1" w:styleId="NormalTok" w:type="character">
+    <w:name w:val="NormalTok"/>
+    <w:basedOn w:val="VerbatimChar"/>
+    <w:rPr/>
   </w:style>
   <w:style w:customStyle="1" w:styleId="KeywordTok" w:type="character">
     <w:name w:val="KeywordTok"/>

</xml_diff>

<commit_message>
Document Serialist badge rollout
Co-authored-by: Copilot <223556219+Copilot@users.noreply.github.com>
</commit_message>
<xml_diff>
--- a/docs/BADGE-PIANO.docx
+++ b/docs/BADGE-PIANO.docx
@@ -91,13 +91,7 @@
         <w:t xml:space="preserve"> </w:t>
       </w:r>
       <w:r>
-        <w:t xml:space="preserve">Batch A1, Archivista (A2.1) e Nostalgico (A2.2) pubblicati;</w:t>
-      </w:r>
-      <w:r>
-        <w:t xml:space="preserve"> </w:t>
-      </w:r>
-      <w:r>
-        <w:t xml:space="preserve">Serialista (A2.3) completato localmente e in attesa di rollout</w:t>
+        <w:t xml:space="preserve">Batch A1 e Batch A2 pubblicati e verificati in produzione</w:t>
       </w:r>
     </w:p>
     <w:p>
@@ -10965,6 +10959,258 @@
         <w:t xml:space="preserve">permessi della cache.</w:t>
       </w:r>
     </w:p>
+    <w:p>
+      <w:pPr>
+        <w:pStyle w:val="Compact"/>
+        <w:numPr>
+          <w:ilvl w:val="0"/>
+          <w:numId w:val="1078"/>
+        </w:numPr>
+      </w:pPr>
+      <w:r>
+        <w:t xml:space="preserve">bundle monolitico verificato e distribuito prima dell’attivazione del catalogo;</w:t>
+      </w:r>
+    </w:p>
+    <w:p>
+      <w:pPr>
+        <w:pStyle w:val="Compact"/>
+        <w:numPr>
+          <w:ilvl w:val="0"/>
+          <w:numId w:val="1078"/>
+        </w:numPr>
+      </w:pPr>
+      <w:r>
+        <w:t xml:space="preserve">deploy Azure completato sul commit</w:t>
+      </w:r>
+      <w:r>
+        <w:t xml:space="preserve"> </w:t>
+      </w:r>
+      <w:r>
+        <w:rPr>
+          <w:rStyle w:val="VerbatimChar"/>
+        </w:rPr>
+        <w:t xml:space="preserve">1d4ecb9</w:t>
+      </w:r>
+      <w:r>
+        <w:t xml:space="preserve">;</w:t>
+      </w:r>
+    </w:p>
+    <w:p>
+      <w:pPr>
+        <w:pStyle w:val="Compact"/>
+        <w:numPr>
+          <w:ilvl w:val="0"/>
+          <w:numId w:val="1078"/>
+        </w:numPr>
+      </w:pPr>
+      <w:r>
+        <w:t xml:space="preserve">migration</w:t>
+      </w:r>
+      <w:r>
+        <w:t xml:space="preserve"> </w:t>
+      </w:r>
+      <w:r>
+        <w:rPr>
+          <w:rStyle w:val="VerbatimChar"/>
+        </w:rPr>
+        <w:t xml:space="preserve">0021_serialist_badge.sql</w:t>
+      </w:r>
+      <w:r>
+        <w:t xml:space="preserve"> </w:t>
+      </w:r>
+      <w:r>
+        <w:t xml:space="preserve">applicata con cache e RLS;</w:t>
+      </w:r>
+    </w:p>
+    <w:p>
+      <w:pPr>
+        <w:pStyle w:val="Compact"/>
+        <w:numPr>
+          <w:ilvl w:val="0"/>
+          <w:numId w:val="1078"/>
+        </w:numPr>
+      </w:pPr>
+      <w:r>
+        <w:t xml:space="preserve">test SQL transazionale superato senza dati residui;</w:t>
+      </w:r>
+    </w:p>
+    <w:p>
+      <w:pPr>
+        <w:pStyle w:val="Compact"/>
+        <w:numPr>
+          <w:ilvl w:val="0"/>
+          <w:numId w:val="1078"/>
+        </w:numPr>
+      </w:pPr>
+      <w:r>
+        <w:t xml:space="preserve">cache popolata con</w:t>
+      </w:r>
+      <w:r>
+        <w:t xml:space="preserve"> </w:t>
+      </w:r>
+      <w:r>
+        <w:rPr>
+          <w:rStyle w:val="VerbatimChar"/>
+        </w:rPr>
+        <w:t xml:space="preserve">127</w:t>
+      </w:r>
+      <w:r>
+        <w:t xml:space="preserve"> </w:t>
+      </w:r>
+      <w:r>
+        <w:t xml:space="preserve">serie candidate,</w:t>
+      </w:r>
+      <w:r>
+        <w:t xml:space="preserve"> </w:t>
+      </w:r>
+      <w:r>
+        <w:rPr>
+          <w:rStyle w:val="VerbatimChar"/>
+        </w:rPr>
+        <w:t xml:space="preserve">91</w:t>
+      </w:r>
+      <w:r>
+        <w:t xml:space="preserve"> </w:t>
+      </w:r>
+      <w:r>
+        <w:t xml:space="preserve">delle quali</w:t>
+      </w:r>
+      <w:r>
+        <w:t xml:space="preserve"> </w:t>
+      </w:r>
+      <w:r>
+        <w:rPr>
+          <w:rStyle w:val="VerbatimChar"/>
+        </w:rPr>
+        <w:t xml:space="preserve">Ended</w:t>
+      </w:r>
+      <w:r>
+        <w:t xml:space="preserve">;</w:t>
+      </w:r>
+    </w:p>
+    <w:p>
+      <w:pPr>
+        <w:pStyle w:val="Compact"/>
+        <w:numPr>
+          <w:ilvl w:val="0"/>
+          <w:numId w:val="1078"/>
+        </w:numPr>
+      </w:pPr>
+      <w:r>
+        <w:t xml:space="preserve">account</w:t>
+      </w:r>
+      <w:r>
+        <w:t xml:space="preserve"> </w:t>
+      </w:r>
+      <w:r>
+        <w:rPr>
+          <w:rStyle w:val="VerbatimChar"/>
+        </w:rPr>
+        <w:t xml:space="preserve">@testshowtime</w:t>
+      </w:r>
+      <w:r>
+        <w:t xml:space="preserve">:</w:t>
+      </w:r>
+      <w:r>
+        <w:t xml:space="preserve"> </w:t>
+      </w:r>
+      <w:r>
+        <w:rPr>
+          <w:rStyle w:val="VerbatimChar"/>
+        </w:rPr>
+        <w:t xml:space="preserve">0/25</w:t>
+      </w:r>
+      <w:r>
+        <w:t xml:space="preserve">, refresh idempotente e hero</w:t>
+      </w:r>
+      <w:r>
+        <w:t xml:space="preserve"> </w:t>
+      </w:r>
+      <w:r>
+        <w:rPr>
+          <w:rStyle w:val="VerbatimChar"/>
+        </w:rPr>
+        <w:t xml:space="preserve">3/19</w:t>
+      </w:r>
+      <w:r>
+        <w:t xml:space="preserve">;</w:t>
+      </w:r>
+    </w:p>
+    <w:p>
+      <w:pPr>
+        <w:pStyle w:val="Compact"/>
+        <w:numPr>
+          <w:ilvl w:val="0"/>
+          <w:numId w:val="1078"/>
+        </w:numPr>
+      </w:pPr>
+      <w:r>
+        <w:t xml:space="preserve">account principale:</w:t>
+      </w:r>
+      <w:r>
+        <w:t xml:space="preserve"> </w:t>
+      </w:r>
+      <w:r>
+        <w:rPr>
+          <w:rStyle w:val="VerbatimChar"/>
+        </w:rPr>
+        <w:t xml:space="preserve">91/100</w:t>
+      </w:r>
+      <w:r>
+        <w:t xml:space="preserve">, Bronzo sbloccato, hero</w:t>
+      </w:r>
+      <w:r>
+        <w:t xml:space="preserve"> </w:t>
+      </w:r>
+      <w:r>
+        <w:rPr>
+          <w:rStyle w:val="VerbatimChar"/>
+        </w:rPr>
+        <w:t xml:space="preserve">5/19</w:t>
+      </w:r>
+      <w:r>
+        <w:t xml:space="preserve">;</w:t>
+      </w:r>
+    </w:p>
+    <w:p>
+      <w:pPr>
+        <w:pStyle w:val="Compact"/>
+        <w:numPr>
+          <w:ilvl w:val="0"/>
+          <w:numId w:val="1078"/>
+        </w:numPr>
+      </w:pPr>
+      <w:r>
+        <w:t xml:space="preserve">secondo refresh dalla cache:</w:t>
+      </w:r>
+      <w:r>
+        <w:t xml:space="preserve"> </w:t>
+      </w:r>
+      <w:r>
+        <w:rPr>
+          <w:rStyle w:val="VerbatimChar"/>
+        </w:rPr>
+        <w:t xml:space="preserve">0</w:t>
+      </w:r>
+      <w:r>
+        <w:t xml:space="preserve"> </w:t>
+      </w:r>
+      <w:r>
+        <w:t xml:space="preserve">nuovi sblocchi;</w:t>
+      </w:r>
+    </w:p>
+    <w:p>
+      <w:pPr>
+        <w:pStyle w:val="Compact"/>
+        <w:numPr>
+          <w:ilvl w:val="0"/>
+          <w:numId w:val="1078"/>
+        </w:numPr>
+      </w:pPr>
+      <w:r>
+        <w:t xml:space="preserve">produzione senza overflow a 360/390 px.</w:t>
+      </w:r>
+    </w:p>
     <w:bookmarkStart w:id="85" w:name="batch-b-esplorazione-e-comportamento"/>
     <w:p>
       <w:pPr>
@@ -12645,7 +12891,7 @@
         <w:pStyle w:val="BodyText"/>
       </w:pPr>
       <w:r>
-        <w:t xml:space="preserve">Il prossimo passo operativo è completare il rollout di</w:t>
+        <w:t xml:space="preserve">Il</w:t>
       </w:r>
       <w:r>
         <w:t xml:space="preserve"> </w:t>
@@ -12655,10 +12901,16 @@
           <w:b/>
           <w:bCs/>
         </w:rPr>
-        <w:t xml:space="preserve">Serialista</w:t>
-      </w:r>
-      <w:r>
-        <w:t xml:space="preserve">:</w:t>
+        <w:t xml:space="preserve">Batch A2 è completato</w:t>
+      </w:r>
+      <w:r>
+        <w:t xml:space="preserve">. Il prossimo passo operativo è scegliere il primo badge</w:t>
+      </w:r>
+      <w:r>
+        <w:t xml:space="preserve"> </w:t>
+      </w:r>
+      <w:r>
+        <w:t xml:space="preserve">del Batch B:</w:t>
       </w:r>
     </w:p>
     <w:p>
@@ -12670,7 +12922,7 @@
         </w:numPr>
       </w:pPr>
       <w:r>
-        <w:t xml:space="preserve">distribuire la Edge Function con cache protetta;</w:t>
+        <w:t xml:space="preserve">Esploratore di generi;</w:t>
       </w:r>
     </w:p>
     <w:p>
@@ -12682,7 +12934,7 @@
         </w:numPr>
       </w:pPr>
       <w:r>
-        <w:t xml:space="preserve">pubblicare la patch subito sotto Cinefilo;</w:t>
+        <w:t xml:space="preserve">Ancora un episodio;</w:t>
       </w:r>
     </w:p>
     <w:p>
@@ -12694,55 +12946,46 @@
         </w:numPr>
       </w:pPr>
       <w:r>
-        <w:t xml:space="preserve">applicare la migration</w:t>
+        <w:t xml:space="preserve">Maratoneta;</w:t>
+      </w:r>
+    </w:p>
+    <w:p>
+      <w:pPr>
+        <w:pStyle w:val="Compact"/>
+        <w:numPr>
+          <w:ilvl w:val="0"/>
+          <w:numId w:val="1158"/>
+        </w:numPr>
+      </w:pPr>
+      <w:r>
+        <w:t xml:space="preserve">Encore.</w:t>
+      </w:r>
+    </w:p>
+    <w:p>
+      <w:pPr>
+        <w:pStyle w:val="FirstParagraph"/>
+      </w:pPr>
+      <w:r>
+        <w:t xml:space="preserve">La scelta consigliata è</w:t>
       </w:r>
       <w:r>
         <w:t xml:space="preserve"> </w:t>
       </w:r>
       <w:r>
         <w:rPr>
-          <w:rStyle w:val="VerbatimChar"/>
+          <w:b/>
+          <w:bCs/>
         </w:rPr>
-        <w:t xml:space="preserve">0021_serialist_badge.sql</w:t>
-      </w:r>
-      <w:r>
-        <w:t xml:space="preserve">;</w:t>
-      </w:r>
-    </w:p>
-    <w:p>
-      <w:pPr>
-        <w:pStyle w:val="Compact"/>
-        <w:numPr>
-          <w:ilvl w:val="0"/>
-          <w:numId w:val="1158"/>
-        </w:numPr>
-      </w:pPr>
-      <w:r>
-        <w:t xml:space="preserve">verificare cache, backfill e idempotenza sull’account Test;</w:t>
-      </w:r>
-    </w:p>
-    <w:p>
-      <w:pPr>
-        <w:pStyle w:val="Compact"/>
-        <w:numPr>
-          <w:ilvl w:val="0"/>
-          <w:numId w:val="1158"/>
-        </w:numPr>
-      </w:pPr>
-      <w:r>
-        <w:t xml:space="preserve">verificare progresso e sblocchi sull’account principale;</w:t>
-      </w:r>
-    </w:p>
-    <w:p>
-      <w:pPr>
-        <w:pStyle w:val="Compact"/>
-        <w:numPr>
-          <w:ilvl w:val="0"/>
-          <w:numId w:val="1158"/>
-        </w:numPr>
-      </w:pPr>
-      <w:r>
-        <w:t xml:space="preserve">chiudere il Batch A2 e scegliere il primo badge del Batch B.</w:t>
+        <w:t xml:space="preserve">Esploratore di generi</w:t>
+      </w:r>
+      <w:r>
+        <w:t xml:space="preserve">, perché riusa i metadati già presenti</w:t>
+      </w:r>
+      <w:r>
+        <w:t xml:space="preserve"> </w:t>
+      </w:r>
+      <w:r>
+        <w:t xml:space="preserve">e introduce la tassonomia canonica prima dei badge comportamentali più complessi.</w:t>
       </w:r>
     </w:p>
     <w:bookmarkEnd w:id="101"/>
@@ -27193,6 +27436,232 @@
     <w:basedOn w:val="VerbatimChar"/>
     <w:rPr/>
   </w:style>
+  <w:style w:customStyle="1" w:styleId="KeywordTok" w:type="character">
+    <w:name w:val="KeywordTok"/>
+    <w:basedOn w:val="VerbatimChar"/>
+    <w:rPr>
+      <w:b/>
+      <w:color w:val="007020"/>
+    </w:rPr>
+  </w:style>
+  <w:style w:customStyle="1" w:styleId="DataTypeTok" w:type="character">
+    <w:name w:val="DataTypeTok"/>
+    <w:basedOn w:val="VerbatimChar"/>
+    <w:rPr>
+      <w:color w:val="902000"/>
+    </w:rPr>
+  </w:style>
+  <w:style w:customStyle="1" w:styleId="DecValTok" w:type="character">
+    <w:name w:val="DecValTok"/>
+    <w:basedOn w:val="VerbatimChar"/>
+    <w:rPr>
+      <w:color w:val="40a070"/>
+    </w:rPr>
+  </w:style>
+  <w:style w:customStyle="1" w:styleId="BaseNTok" w:type="character">
+    <w:name w:val="BaseNTok"/>
+    <w:basedOn w:val="VerbatimChar"/>
+    <w:rPr>
+      <w:color w:val="40a070"/>
+    </w:rPr>
+  </w:style>
+  <w:style w:customStyle="1" w:styleId="FloatTok" w:type="character">
+    <w:name w:val="FloatTok"/>
+    <w:basedOn w:val="VerbatimChar"/>
+    <w:rPr>
+      <w:color w:val="40a070"/>
+    </w:rPr>
+  </w:style>
+  <w:style w:customStyle="1" w:styleId="ConstantTok" w:type="character">
+    <w:name w:val="ConstantTok"/>
+    <w:basedOn w:val="VerbatimChar"/>
+    <w:rPr>
+      <w:color w:val="880000"/>
+    </w:rPr>
+  </w:style>
+  <w:style w:customStyle="1" w:styleId="CharTok" w:type="character">
+    <w:name w:val="CharTok"/>
+    <w:basedOn w:val="VerbatimChar"/>
+    <w:rPr>
+      <w:color w:val="4070a0"/>
+    </w:rPr>
+  </w:style>
+  <w:style w:customStyle="1" w:styleId="SpecialCharTok" w:type="character">
+    <w:name w:val="SpecialCharTok"/>
+    <w:basedOn w:val="VerbatimChar"/>
+    <w:rPr>
+      <w:color w:val="4070a0"/>
+    </w:rPr>
+  </w:style>
+  <w:style w:customStyle="1" w:styleId="StringTok" w:type="character">
+    <w:name w:val="StringTok"/>
+    <w:basedOn w:val="VerbatimChar"/>
+    <w:rPr>
+      <w:color w:val="4070a0"/>
+    </w:rPr>
+  </w:style>
+  <w:style w:customStyle="1" w:styleId="VerbatimStringTok" w:type="character">
+    <w:name w:val="VerbatimStringTok"/>
+    <w:basedOn w:val="VerbatimChar"/>
+    <w:rPr>
+      <w:color w:val="4070a0"/>
+    </w:rPr>
+  </w:style>
+  <w:style w:customStyle="1" w:styleId="SpecialStringTok" w:type="character">
+    <w:name w:val="SpecialStringTok"/>
+    <w:basedOn w:val="VerbatimChar"/>
+    <w:rPr>
+      <w:color w:val="bb6688"/>
+    </w:rPr>
+  </w:style>
+  <w:style w:customStyle="1" w:styleId="ImportTok" w:type="character">
+    <w:name w:val="ImportTok"/>
+    <w:basedOn w:val="VerbatimChar"/>
+    <w:rPr>
+      <w:b/>
+      <w:color w:val="008000"/>
+    </w:rPr>
+  </w:style>
+  <w:style w:customStyle="1" w:styleId="CommentTok" w:type="character">
+    <w:name w:val="CommentTok"/>
+    <w:basedOn w:val="VerbatimChar"/>
+    <w:rPr>
+      <w:i/>
+      <w:color w:val="60a0b0"/>
+    </w:rPr>
+  </w:style>
+  <w:style w:customStyle="1" w:styleId="DocumentationTok" w:type="character">
+    <w:name w:val="DocumentationTok"/>
+    <w:basedOn w:val="VerbatimChar"/>
+    <w:rPr>
+      <w:i/>
+      <w:color w:val="ba2121"/>
+    </w:rPr>
+  </w:style>
+  <w:style w:customStyle="1" w:styleId="AnnotationTok" w:type="character">
+    <w:name w:val="AnnotationTok"/>
+    <w:basedOn w:val="VerbatimChar"/>
+    <w:rPr>
+      <w:b/>
+      <w:i/>
+      <w:color w:val="60a0b0"/>
+    </w:rPr>
+  </w:style>
+  <w:style w:customStyle="1" w:styleId="CommentVarTok" w:type="character">
+    <w:name w:val="CommentVarTok"/>
+    <w:basedOn w:val="VerbatimChar"/>
+    <w:rPr>
+      <w:b/>
+      <w:i/>
+      <w:color w:val="60a0b0"/>
+    </w:rPr>
+  </w:style>
+  <w:style w:customStyle="1" w:styleId="OtherTok" w:type="character">
+    <w:name w:val="OtherTok"/>
+    <w:basedOn w:val="VerbatimChar"/>
+    <w:rPr>
+      <w:color w:val="007020"/>
+    </w:rPr>
+  </w:style>
+  <w:style w:customStyle="1" w:styleId="FunctionTok" w:type="character">
+    <w:name w:val="FunctionTok"/>
+    <w:basedOn w:val="VerbatimChar"/>
+    <w:rPr>
+      <w:color w:val="06287e"/>
+    </w:rPr>
+  </w:style>
+  <w:style w:customStyle="1" w:styleId="VariableTok" w:type="character">
+    <w:name w:val="VariableTok"/>
+    <w:basedOn w:val="VerbatimChar"/>
+    <w:rPr>
+      <w:color w:val="19177c"/>
+    </w:rPr>
+  </w:style>
+  <w:style w:customStyle="1" w:styleId="ControlFlowTok" w:type="character">
+    <w:name w:val="ControlFlowTok"/>
+    <w:basedOn w:val="VerbatimChar"/>
+    <w:rPr>
+      <w:b/>
+      <w:color w:val="007020"/>
+    </w:rPr>
+  </w:style>
+  <w:style w:customStyle="1" w:styleId="OperatorTok" w:type="character">
+    <w:name w:val="OperatorTok"/>
+    <w:basedOn w:val="VerbatimChar"/>
+    <w:rPr>
+      <w:color w:val="666666"/>
+    </w:rPr>
+  </w:style>
+  <w:style w:customStyle="1" w:styleId="BuiltInTok" w:type="character">
+    <w:name w:val="BuiltInTok"/>
+    <w:basedOn w:val="VerbatimChar"/>
+    <w:rPr>
+      <w:color w:val="008000"/>
+    </w:rPr>
+  </w:style>
+  <w:style w:customStyle="1" w:styleId="ExtensionTok" w:type="character">
+    <w:name w:val="ExtensionTok"/>
+    <w:basedOn w:val="VerbatimChar"/>
+    <w:rPr/>
+  </w:style>
+  <w:style w:customStyle="1" w:styleId="PreprocessorTok" w:type="character">
+    <w:name w:val="PreprocessorTok"/>
+    <w:basedOn w:val="VerbatimChar"/>
+    <w:rPr>
+      <w:color w:val="bc7a00"/>
+    </w:rPr>
+  </w:style>
+  <w:style w:customStyle="1" w:styleId="AttributeTok" w:type="character">
+    <w:name w:val="AttributeTok"/>
+    <w:basedOn w:val="VerbatimChar"/>
+    <w:rPr>
+      <w:color w:val="7d9029"/>
+    </w:rPr>
+  </w:style>
+  <w:style w:customStyle="1" w:styleId="RegionMarkerTok" w:type="character">
+    <w:name w:val="RegionMarkerTok"/>
+    <w:basedOn w:val="VerbatimChar"/>
+    <w:rPr/>
+  </w:style>
+  <w:style w:customStyle="1" w:styleId="InformationTok" w:type="character">
+    <w:name w:val="InformationTok"/>
+    <w:basedOn w:val="VerbatimChar"/>
+    <w:rPr>
+      <w:b/>
+      <w:i/>
+      <w:color w:val="60a0b0"/>
+    </w:rPr>
+  </w:style>
+  <w:style w:customStyle="1" w:styleId="WarningTok" w:type="character">
+    <w:name w:val="WarningTok"/>
+    <w:basedOn w:val="VerbatimChar"/>
+    <w:rPr>
+      <w:b/>
+      <w:i/>
+      <w:color w:val="60a0b0"/>
+    </w:rPr>
+  </w:style>
+  <w:style w:customStyle="1" w:styleId="AlertTok" w:type="character">
+    <w:name w:val="AlertTok"/>
+    <w:basedOn w:val="VerbatimChar"/>
+    <w:rPr>
+      <w:b/>
+      <w:color w:val="ff0000"/>
+    </w:rPr>
+  </w:style>
+  <w:style w:customStyle="1" w:styleId="ErrorTok" w:type="character">
+    <w:name w:val="ErrorTok"/>
+    <w:basedOn w:val="VerbatimChar"/>
+    <w:rPr>
+      <w:b/>
+      <w:color w:val="ff0000"/>
+    </w:rPr>
+  </w:style>
+  <w:style w:customStyle="1" w:styleId="NormalTok" w:type="character">
+    <w:name w:val="NormalTok"/>
+    <w:basedOn w:val="VerbatimChar"/>
+    <w:rPr/>
+  </w:style>
   <w:style w:type="character" w:customStyle="1" w:styleId="KeywordTok">
     <w:name w:val="KeywordTok"/>
     <w:basedOn w:val="VerbatimChar"/>

</xml_diff>

<commit_message>
Add genre explorer badge progression
Co-authored-by: Copilot <223556219+Copilot@users.noreply.github.com>
</commit_message>
<xml_diff>
--- a/docs/BADGE-PIANO.docx
+++ b/docs/BADGE-PIANO.docx
@@ -2,7 +2,7 @@
 <file path=word/document.xml><?xml version="1.0" encoding="utf-8"?>
 <w:document xmlns:w="http://schemas.openxmlformats.org/wordprocessingml/2006/main" xmlns:m="http://schemas.openxmlformats.org/officeDocument/2006/math" xmlns:r="http://schemas.openxmlformats.org/officeDocument/2006/relationships" xmlns:o="urn:schemas-microsoft-com:office:office" xmlns:v="urn:schemas-microsoft-com:vml" xmlns:w10="urn:schemas-microsoft-com:office:word" xmlns:a="http://schemas.openxmlformats.org/drawingml/2006/main" xmlns:pic="http://schemas.openxmlformats.org/drawingml/2006/picture" xmlns:wp="http://schemas.openxmlformats.org/drawingml/2006/wordprocessingDrawing">
   <w:body>
-    <w:bookmarkStart w:id="102" w:name="badge-showtime-proposta-e-piano"/>
+    <w:bookmarkStart w:id="103" w:name="badge-showtime-proposta-e-piano"/>
     <w:p>
       <w:pPr>
         <w:pStyle w:val="Heading1"/>
@@ -91,7 +91,13 @@
         <w:t xml:space="preserve"> </w:t>
       </w:r>
       <w:r>
-        <w:t xml:space="preserve">Batch A1 e Batch A2 pubblicati e verificati in produzione</w:t>
+        <w:t xml:space="preserve">Batch A1 e Batch A2 pubblicati; Esploratore di generi (B1)</w:t>
+      </w:r>
+      <w:r>
+        <w:t xml:space="preserve"> </w:t>
+      </w:r>
+      <w:r>
+        <w:t xml:space="preserve">completato localmente e in attesa di rollout</w:t>
       </w:r>
     </w:p>
     <w:p>
@@ -8083,7 +8089,7 @@
     </w:p>
     <w:bookmarkEnd w:id="73"/>
     <w:bookmarkEnd w:id="74"/>
-    <w:bookmarkStart w:id="90" w:name="piano-di-implementazione"/>
+    <w:bookmarkStart w:id="91" w:name="piano-di-implementazione"/>
     <w:p>
       <w:pPr>
         <w:pStyle w:val="Heading2"/>
@@ -10635,7 +10641,7 @@
       </w:r>
     </w:p>
     <w:bookmarkEnd w:id="84"/>
-    <w:bookmarkStart w:id="87" w:name="verifica-batch-a2.3-serialista"/>
+    <w:bookmarkStart w:id="86" w:name="verifica-batch-a2.3-serialista"/>
     <w:p>
       <w:pPr>
         <w:pStyle w:val="Heading3"/>
@@ -11269,7 +11275,392 @@
       </w:r>
     </w:p>
     <w:bookmarkEnd w:id="85"/>
-    <w:bookmarkStart w:id="86" w:name="batch-c-diario-e-social"/>
+    <w:bookmarkEnd w:id="86"/>
+    <w:bookmarkStart w:id="88" w:name="verifica-batch-b1-esploratore-di-generi"/>
+    <w:p>
+      <w:pPr>
+        <w:pStyle w:val="Heading3"/>
+      </w:pPr>
+      <w:r>
+        <w:t xml:space="preserve">Verifica Batch B1 — Esploratore di generi</w:t>
+      </w:r>
+    </w:p>
+    <w:p>
+      <w:pPr>
+        <w:pStyle w:val="Compact"/>
+        <w:numPr>
+          <w:ilvl w:val="0"/>
+          <w:numId w:val="1083"/>
+        </w:numPr>
+      </w:pPr>
+      <w:r>
+        <w:t xml:space="preserve">migration</w:t>
+      </w:r>
+      <w:r>
+        <w:t xml:space="preserve"> </w:t>
+      </w:r>
+      <w:r>
+        <w:rPr>
+          <w:rStyle w:val="VerbatimChar"/>
+        </w:rPr>
+        <w:t xml:space="preserve">0022_genre_explorer_badge.sql</w:t>
+      </w:r>
+      <w:r>
+        <w:t xml:space="preserve"> </w:t>
+      </w:r>
+      <w:r>
+        <w:t xml:space="preserve">con soglie</w:t>
+      </w:r>
+      <w:r>
+        <w:t xml:space="preserve"> </w:t>
+      </w:r>
+      <w:r>
+        <w:rPr>
+          <w:rStyle w:val="VerbatimChar"/>
+        </w:rPr>
+        <w:t xml:space="preserve">5 / 8 / 12 / 15</w:t>
+      </w:r>
+      <w:r>
+        <w:t xml:space="preserve">;</w:t>
+      </w:r>
+    </w:p>
+    <w:p>
+      <w:pPr>
+        <w:pStyle w:val="Compact"/>
+        <w:numPr>
+          <w:ilvl w:val="0"/>
+          <w:numId w:val="1083"/>
+        </w:numPr>
+      </w:pPr>
+      <w:r>
+        <w:t xml:space="preserve">tassonomia canonica di 15 categorie condivisa tra film e serie;</w:t>
+      </w:r>
+    </w:p>
+    <w:p>
+      <w:pPr>
+        <w:pStyle w:val="Compact"/>
+        <w:numPr>
+          <w:ilvl w:val="0"/>
+          <w:numId w:val="1083"/>
+        </w:numPr>
+      </w:pPr>
+      <w:r>
+        <w:t xml:space="preserve">mapping sia dagli ID TMDB sia dalle etichette storiche italiane/inglesi;</w:t>
+      </w:r>
+    </w:p>
+    <w:p>
+      <w:pPr>
+        <w:pStyle w:val="Compact"/>
+        <w:numPr>
+          <w:ilvl w:val="0"/>
+          <w:numId w:val="1083"/>
+        </w:numPr>
+      </w:pPr>
+      <w:r>
+        <w:t xml:space="preserve">verificate tutte le 24 etichette realmente presenti nel database;</w:t>
+      </w:r>
+    </w:p>
+    <w:p>
+      <w:pPr>
+        <w:pStyle w:val="Compact"/>
+        <w:numPr>
+          <w:ilvl w:val="0"/>
+          <w:numId w:val="1083"/>
+        </w:numPr>
+      </w:pPr>
+      <w:r>
+        <w:rPr>
+          <w:rStyle w:val="VerbatimChar"/>
+        </w:rPr>
+        <w:t xml:space="preserve">TV Movie</w:t>
+      </w:r>
+      <w:r>
+        <w:t xml:space="preserve"> </w:t>
+      </w:r>
+      <w:r>
+        <w:t xml:space="preserve">e l’etichetta localizzata</w:t>
+      </w:r>
+      <w:r>
+        <w:t xml:space="preserve"> </w:t>
+      </w:r>
+      <w:r>
+        <w:rPr>
+          <w:rStyle w:val="VerbatimChar"/>
+        </w:rPr>
+        <w:t xml:space="preserve">televisione film</w:t>
+      </w:r>
+      <w:r>
+        <w:t xml:space="preserve"> </w:t>
+      </w:r>
+      <w:r>
+        <w:t xml:space="preserve">escluse;</w:t>
+      </w:r>
+    </w:p>
+    <w:p>
+      <w:pPr>
+        <w:pStyle w:val="Compact"/>
+        <w:numPr>
+          <w:ilvl w:val="0"/>
+          <w:numId w:val="1083"/>
+        </w:numPr>
+      </w:pPr>
+      <w:r>
+        <w:t xml:space="preserve">un titolo contribuisce una volta a ogni categoria canonica associata;</w:t>
+      </w:r>
+    </w:p>
+    <w:p>
+      <w:pPr>
+        <w:pStyle w:val="Compact"/>
+        <w:numPr>
+          <w:ilvl w:val="0"/>
+          <w:numId w:val="1083"/>
+        </w:numPr>
+      </w:pPr>
+      <w:r>
+        <w:t xml:space="preserve">include storico importato;</w:t>
+      </w:r>
+    </w:p>
+    <w:p>
+      <w:pPr>
+        <w:pStyle w:val="Compact"/>
+        <w:numPr>
+          <w:ilvl w:val="0"/>
+          <w:numId w:val="1083"/>
+        </w:numPr>
+      </w:pPr>
+      <w:r>
+        <w:t xml:space="preserve">cache protetta degli ID genere TMDB per i titoli senza metadati;</w:t>
+      </w:r>
+    </w:p>
+    <w:p>
+      <w:pPr>
+        <w:pStyle w:val="Compact"/>
+        <w:numPr>
+          <w:ilvl w:val="0"/>
+          <w:numId w:val="1083"/>
+        </w:numPr>
+      </w:pPr>
+      <w:r>
+        <w:t xml:space="preserve">cache senza permessi client, TTL 30 giorni e scrittura</w:t>
+      </w:r>
+      <w:r>
+        <w:t xml:space="preserve"> </w:t>
+      </w:r>
+      <w:r>
+        <w:rPr>
+          <w:rStyle w:val="VerbatimChar"/>
+        </w:rPr>
+        <w:t xml:space="preserve">service_role</w:t>
+      </w:r>
+      <w:r>
+        <w:t xml:space="preserve">;</w:t>
+      </w:r>
+    </w:p>
+    <w:p>
+      <w:pPr>
+        <w:pStyle w:val="Compact"/>
+        <w:numPr>
+          <w:ilvl w:val="0"/>
+          <w:numId w:val="1083"/>
+        </w:numPr>
+      </w:pPr>
+      <w:r>
+        <w:t xml:space="preserve">account principale: 64 titoli completati senza generi da completare nel backfill;</w:t>
+      </w:r>
+    </w:p>
+    <w:p>
+      <w:pPr>
+        <w:pStyle w:val="Compact"/>
+        <w:numPr>
+          <w:ilvl w:val="0"/>
+          <w:numId w:val="1083"/>
+        </w:numPr>
+      </w:pPr>
+      <w:r>
+        <w:t xml:space="preserve">account Test: nessun titolo completato senza generi;</w:t>
+      </w:r>
+    </w:p>
+    <w:p>
+      <w:pPr>
+        <w:pStyle w:val="Compact"/>
+        <w:numPr>
+          <w:ilvl w:val="0"/>
+          <w:numId w:val="1083"/>
+        </w:numPr>
+      </w:pPr>
+      <w:r>
+        <w:t xml:space="preserve">massimo 4 richieste TMDB concorrenti e retry esplicito su</w:t>
+      </w:r>
+      <w:r>
+        <w:t xml:space="preserve"> </w:t>
+      </w:r>
+      <w:r>
+        <w:rPr>
+          <w:rStyle w:val="VerbatimChar"/>
+        </w:rPr>
+        <w:t xml:space="preserve">429</w:t>
+      </w:r>
+      <w:r>
+        <w:t xml:space="preserve">;</w:t>
+      </w:r>
+    </w:p>
+    <w:p>
+      <w:pPr>
+        <w:pStyle w:val="Compact"/>
+        <w:numPr>
+          <w:ilvl w:val="0"/>
+          <w:numId w:val="1083"/>
+        </w:numPr>
+      </w:pPr>
+      <w:r>
+        <w:t xml:space="preserve">rivalutazioni dopo cambi di stato, progresso serie e arricchimento metadati;</w:t>
+      </w:r>
+    </w:p>
+    <w:p>
+      <w:pPr>
+        <w:pStyle w:val="Compact"/>
+        <w:numPr>
+          <w:ilvl w:val="0"/>
+          <w:numId w:val="1083"/>
+        </w:numPr>
+      </w:pPr>
+      <w:r>
+        <w:t xml:space="preserve">evidenza privata composta soltanto dalle chiavi dei generi canonici;</w:t>
+      </w:r>
+    </w:p>
+    <w:p>
+      <w:pPr>
+        <w:pStyle w:val="Compact"/>
+        <w:numPr>
+          <w:ilvl w:val="0"/>
+          <w:numId w:val="1083"/>
+        </w:numPr>
+      </w:pPr>
+      <w:r>
+        <w:t xml:space="preserve">patch originale a bussola nelle quattro varianti metalliche;</w:t>
+      </w:r>
+    </w:p>
+    <w:p>
+      <w:pPr>
+        <w:pStyle w:val="Compact"/>
+        <w:numPr>
+          <w:ilvl w:val="0"/>
+          <w:numId w:val="1083"/>
+        </w:numPr>
+      </w:pPr>
+      <w:r>
+        <w:t xml:space="preserve">preview locale:</w:t>
+      </w:r>
+      <w:r>
+        <w:t xml:space="preserve"> </w:t>
+      </w:r>
+      <w:r>
+        <w:rPr>
+          <w:rStyle w:val="VerbatimChar"/>
+        </w:rPr>
+        <w:t xml:space="preserve">Esploratore di generi 0/4</w:t>
+      </w:r>
+      <w:r>
+        <w:t xml:space="preserve">, progresso</w:t>
+      </w:r>
+      <w:r>
+        <w:t xml:space="preserve"> </w:t>
+      </w:r>
+      <w:r>
+        <w:rPr>
+          <w:rStyle w:val="VerbatimChar"/>
+        </w:rPr>
+        <w:t xml:space="preserve">4/5</w:t>
+      </w:r>
+      <w:r>
+        <w:t xml:space="preserve">, hero</w:t>
+      </w:r>
+      <w:r>
+        <w:t xml:space="preserve"> </w:t>
+      </w:r>
+      <w:r>
+        <w:rPr>
+          <w:rStyle w:val="VerbatimChar"/>
+        </w:rPr>
+        <w:t xml:space="preserve">3/23</w:t>
+      </w:r>
+      <w:r>
+        <w:t xml:space="preserve">;</w:t>
+      </w:r>
+    </w:p>
+    <w:p>
+      <w:pPr>
+        <w:pStyle w:val="Compact"/>
+        <w:numPr>
+          <w:ilvl w:val="0"/>
+          <w:numId w:val="1083"/>
+        </w:numPr>
+      </w:pPr>
+      <w:r>
+        <w:t xml:space="preserve">patch e accordion verificati senza overflow a 360 e 390 px;</w:t>
+      </w:r>
+    </w:p>
+    <w:p>
+      <w:pPr>
+        <w:pStyle w:val="Compact"/>
+        <w:numPr>
+          <w:ilvl w:val="0"/>
+          <w:numId w:val="1083"/>
+        </w:numPr>
+      </w:pPr>
+      <w:r>
+        <w:rPr>
+          <w:rStyle w:val="VerbatimChar"/>
+        </w:rPr>
+        <w:t xml:space="preserve">29/29</w:t>
+      </w:r>
+      <w:r>
+        <w:t xml:space="preserve"> </w:t>
+      </w:r>
+      <w:r>
+        <w:t xml:space="preserve">test engine superati;</w:t>
+      </w:r>
+    </w:p>
+    <w:p>
+      <w:pPr>
+        <w:pStyle w:val="Compact"/>
+        <w:numPr>
+          <w:ilvl w:val="0"/>
+          <w:numId w:val="1083"/>
+        </w:numPr>
+      </w:pPr>
+      <w:r>
+        <w:t xml:space="preserve">test SQL transazionale pronto per soglia</w:t>
+      </w:r>
+      <w:r>
+        <w:t xml:space="preserve"> </w:t>
+      </w:r>
+      <w:r>
+        <w:rPr>
+          <w:rStyle w:val="VerbatimChar"/>
+        </w:rPr>
+        <w:t xml:space="preserve">12</w:t>
+      </w:r>
+      <w:r>
+        <w:t xml:space="preserve">, regressione a</w:t>
+      </w:r>
+      <w:r>
+        <w:t xml:space="preserve"> </w:t>
+      </w:r>
+      <w:r>
+        <w:rPr>
+          <w:rStyle w:val="VerbatimChar"/>
+        </w:rPr>
+        <w:t xml:space="preserve">0</w:t>
+      </w:r>
+      <w:r>
+        <w:t xml:space="preserve"> </w:t>
+      </w:r>
+      <w:r>
+        <w:t xml:space="preserve">e permessi cache.</w:t>
+      </w:r>
+    </w:p>
+    <w:bookmarkStart w:id="87" w:name="batch-c-diario-e-social"/>
     <w:p>
       <w:pPr>
         <w:pStyle w:val="Heading4"/>
@@ -11283,7 +11674,7 @@
         <w:pStyle w:val="Compact"/>
         <w:numPr>
           <w:ilvl w:val="0"/>
-          <w:numId w:val="1083"/>
+          <w:numId w:val="1084"/>
         </w:numPr>
       </w:pPr>
       <w:r>
@@ -11295,16 +11686,16 @@
         <w:pStyle w:val="Compact"/>
         <w:numPr>
           <w:ilvl w:val="0"/>
-          <w:numId w:val="1084"/>
+          <w:numId w:val="1085"/>
         </w:numPr>
       </w:pPr>
       <w:r>
         <w:t xml:space="preserve">Passaparola</w:t>
       </w:r>
     </w:p>
-    <w:bookmarkEnd w:id="86"/>
     <w:bookmarkEnd w:id="87"/>
-    <w:bookmarkStart w:id="88" w:name="fase-4-profilo-e-rifiniture"/>
+    <w:bookmarkEnd w:id="88"/>
+    <w:bookmarkStart w:id="89" w:name="fase-4-profilo-e-rifiniture"/>
     <w:p>
       <w:pPr>
         <w:pStyle w:val="Heading3"/>
@@ -11318,7 +11709,7 @@
         <w:pStyle w:val="Compact"/>
         <w:numPr>
           <w:ilvl w:val="0"/>
-          <w:numId w:val="1085"/>
+          <w:numId w:val="1086"/>
         </w:numPr>
       </w:pPr>
       <w:r>
@@ -11330,7 +11721,7 @@
         <w:pStyle w:val="Compact"/>
         <w:numPr>
           <w:ilvl w:val="0"/>
-          <w:numId w:val="1086"/>
+          <w:numId w:val="1087"/>
         </w:numPr>
       </w:pPr>
       <w:r>
@@ -11342,7 +11733,7 @@
         <w:pStyle w:val="Compact"/>
         <w:numPr>
           <w:ilvl w:val="0"/>
-          <w:numId w:val="1087"/>
+          <w:numId w:val="1088"/>
         </w:numPr>
       </w:pPr>
       <w:r>
@@ -11354,7 +11745,7 @@
         <w:pStyle w:val="Compact"/>
         <w:numPr>
           <w:ilvl w:val="0"/>
-          <w:numId w:val="1088"/>
+          <w:numId w:val="1089"/>
         </w:numPr>
       </w:pPr>
       <w:r>
@@ -11366,7 +11757,7 @@
         <w:pStyle w:val="Compact"/>
         <w:numPr>
           <w:ilvl w:val="0"/>
-          <w:numId w:val="1089"/>
+          <w:numId w:val="1090"/>
         </w:numPr>
       </w:pPr>
       <w:r>
@@ -11378,15 +11769,15 @@
         <w:pStyle w:val="Compact"/>
         <w:numPr>
           <w:ilvl w:val="0"/>
-          <w:numId w:val="1090"/>
+          <w:numId w:val="1091"/>
         </w:numPr>
       </w:pPr>
       <w:r>
         <w:t xml:space="preserve">Riconciliazione completa</w:t>
       </w:r>
     </w:p>
-    <w:bookmarkEnd w:id="88"/>
-    <w:bookmarkStart w:id="89" w:name="fase-5-crediti-tmdb"/>
+    <w:bookmarkEnd w:id="89"/>
+    <w:bookmarkStart w:id="90" w:name="fase-5-crediti-tmdb"/>
     <w:p>
       <w:pPr>
         <w:pStyle w:val="Heading3"/>
@@ -11400,7 +11791,7 @@
         <w:pStyle w:val="Compact"/>
         <w:numPr>
           <w:ilvl w:val="0"/>
-          <w:numId w:val="1091"/>
+          <w:numId w:val="1092"/>
         </w:numPr>
       </w:pPr>
       <w:r>
@@ -11412,7 +11803,7 @@
         <w:pStyle w:val="Compact"/>
         <w:numPr>
           <w:ilvl w:val="0"/>
-          <w:numId w:val="1092"/>
+          <w:numId w:val="1093"/>
         </w:numPr>
       </w:pPr>
       <w:r>
@@ -11424,7 +11815,7 @@
         <w:pStyle w:val="Compact"/>
         <w:numPr>
           <w:ilvl w:val="0"/>
-          <w:numId w:val="1093"/>
+          <w:numId w:val="1094"/>
         </w:numPr>
       </w:pPr>
       <w:r>
@@ -11436,7 +11827,7 @@
         <w:pStyle w:val="Compact"/>
         <w:numPr>
           <w:ilvl w:val="0"/>
-          <w:numId w:val="1094"/>
+          <w:numId w:val="1095"/>
         </w:numPr>
       </w:pPr>
       <w:r>
@@ -11448,7 +11839,7 @@
         <w:pStyle w:val="Compact"/>
         <w:numPr>
           <w:ilvl w:val="0"/>
-          <w:numId w:val="1095"/>
+          <w:numId w:val="1096"/>
         </w:numPr>
       </w:pPr>
       <w:r>
@@ -11460,7 +11851,7 @@
         <w:pStyle w:val="Compact"/>
         <w:numPr>
           <w:ilvl w:val="0"/>
-          <w:numId w:val="1096"/>
+          <w:numId w:val="1097"/>
         </w:numPr>
       </w:pPr>
       <w:r>
@@ -11472,7 +11863,7 @@
         <w:pStyle w:val="Compact"/>
         <w:numPr>
           <w:ilvl w:val="0"/>
-          <w:numId w:val="1097"/>
+          <w:numId w:val="1098"/>
         </w:numPr>
       </w:pPr>
       <w:r>
@@ -11486,9 +11877,9 @@
         </w:pict>
       </w:r>
     </w:p>
-    <w:bookmarkEnd w:id="89"/>
     <w:bookmarkEnd w:id="90"/>
-    <w:bookmarkStart w:id="91" w:name="criteri-di-accettazione-v1"/>
+    <w:bookmarkEnd w:id="91"/>
+    <w:bookmarkStart w:id="92" w:name="criteri-di-accettazione-v1"/>
     <w:p>
       <w:pPr>
         <w:pStyle w:val="Heading2"/>
@@ -11502,7 +11893,7 @@
         <w:pStyle w:val="Compact"/>
         <w:numPr>
           <w:ilvl w:val="0"/>
-          <w:numId w:val="1098"/>
+          <w:numId w:val="1099"/>
         </w:numPr>
       </w:pPr>
       <w:r>
@@ -11514,7 +11905,7 @@
         <w:pStyle w:val="Compact"/>
         <w:numPr>
           <w:ilvl w:val="0"/>
-          <w:numId w:val="1098"/>
+          <w:numId w:val="1099"/>
         </w:numPr>
       </w:pPr>
       <w:r>
@@ -11526,7 +11917,7 @@
         <w:pStyle w:val="Compact"/>
         <w:numPr>
           <w:ilvl w:val="0"/>
-          <w:numId w:val="1098"/>
+          <w:numId w:val="1099"/>
         </w:numPr>
       </w:pPr>
       <w:r>
@@ -11538,7 +11929,7 @@
         <w:pStyle w:val="Compact"/>
         <w:numPr>
           <w:ilvl w:val="0"/>
-          <w:numId w:val="1098"/>
+          <w:numId w:val="1099"/>
         </w:numPr>
       </w:pPr>
       <w:r>
@@ -11550,7 +11941,7 @@
         <w:pStyle w:val="Compact"/>
         <w:numPr>
           <w:ilvl w:val="0"/>
-          <w:numId w:val="1098"/>
+          <w:numId w:val="1099"/>
         </w:numPr>
       </w:pPr>
       <w:r>
@@ -11562,7 +11953,7 @@
         <w:pStyle w:val="Compact"/>
         <w:numPr>
           <w:ilvl w:val="0"/>
-          <w:numId w:val="1098"/>
+          <w:numId w:val="1099"/>
         </w:numPr>
       </w:pPr>
       <w:r>
@@ -11574,7 +11965,7 @@
         <w:pStyle w:val="Compact"/>
         <w:numPr>
           <w:ilvl w:val="0"/>
-          <w:numId w:val="1098"/>
+          <w:numId w:val="1099"/>
         </w:numPr>
       </w:pPr>
       <w:r>
@@ -11586,7 +11977,7 @@
         <w:pStyle w:val="Compact"/>
         <w:numPr>
           <w:ilvl w:val="0"/>
-          <w:numId w:val="1098"/>
+          <w:numId w:val="1099"/>
         </w:numPr>
       </w:pPr>
       <w:r>
@@ -11598,7 +11989,7 @@
         <w:pStyle w:val="Compact"/>
         <w:numPr>
           <w:ilvl w:val="0"/>
-          <w:numId w:val="1098"/>
+          <w:numId w:val="1099"/>
         </w:numPr>
       </w:pPr>
       <w:r>
@@ -11610,7 +12001,7 @@
         <w:pStyle w:val="Compact"/>
         <w:numPr>
           <w:ilvl w:val="0"/>
-          <w:numId w:val="1098"/>
+          <w:numId w:val="1099"/>
         </w:numPr>
       </w:pPr>
       <w:r>
@@ -11624,8 +12015,8 @@
         </w:pict>
       </w:r>
     </w:p>
-    <w:bookmarkEnd w:id="91"/>
-    <w:bookmarkStart w:id="100" w:name="decisioni-v1-confermate"/>
+    <w:bookmarkEnd w:id="92"/>
+    <w:bookmarkStart w:id="101" w:name="decisioni-v1-confermate"/>
     <w:p>
       <w:pPr>
         <w:pStyle w:val="Heading2"/>
@@ -11634,7 +12025,7 @@
         <w:t xml:space="preserve">12. Decisioni V1 confermate</w:t>
       </w:r>
     </w:p>
-    <w:bookmarkStart w:id="92" w:name="nomi"/>
+    <w:bookmarkStart w:id="93" w:name="nomi"/>
     <w:p>
       <w:pPr>
         <w:pStyle w:val="Heading3"/>
@@ -11648,7 +12039,7 @@
         <w:pStyle w:val="Compact"/>
         <w:numPr>
           <w:ilvl w:val="0"/>
-          <w:numId w:val="1099"/>
+          <w:numId w:val="1100"/>
         </w:numPr>
       </w:pPr>
       <w:r>
@@ -11660,7 +12051,7 @@
         <w:pStyle w:val="Compact"/>
         <w:numPr>
           <w:ilvl w:val="0"/>
-          <w:numId w:val="1100"/>
+          <w:numId w:val="1101"/>
         </w:numPr>
       </w:pPr>
       <w:r>
@@ -11672,7 +12063,7 @@
         <w:pStyle w:val="Compact"/>
         <w:numPr>
           <w:ilvl w:val="0"/>
-          <w:numId w:val="1101"/>
+          <w:numId w:val="1102"/>
         </w:numPr>
       </w:pPr>
       <w:r>
@@ -11684,7 +12075,7 @@
         <w:pStyle w:val="Compact"/>
         <w:numPr>
           <w:ilvl w:val="0"/>
-          <w:numId w:val="1102"/>
+          <w:numId w:val="1103"/>
         </w:numPr>
       </w:pPr>
       <w:r>
@@ -11696,15 +12087,15 @@
         <w:pStyle w:val="Compact"/>
         <w:numPr>
           <w:ilvl w:val="0"/>
-          <w:numId w:val="1103"/>
+          <w:numId w:val="1104"/>
         </w:numPr>
       </w:pPr>
       <w:r>
         <w:t xml:space="preserve">“Coppia d’oro”</w:t>
       </w:r>
     </w:p>
-    <w:bookmarkEnd w:id="92"/>
-    <w:bookmarkStart w:id="93" w:name="soglie"/>
+    <w:bookmarkEnd w:id="93"/>
+    <w:bookmarkStart w:id="94" w:name="soglie"/>
     <w:p>
       <w:pPr>
         <w:pStyle w:val="Heading3"/>
@@ -11718,7 +12109,7 @@
         <w:pStyle w:val="Compact"/>
         <w:numPr>
           <w:ilvl w:val="0"/>
-          <w:numId w:val="1104"/>
+          <w:numId w:val="1105"/>
         </w:numPr>
       </w:pPr>
       <w:r>
@@ -11730,7 +12121,7 @@
         <w:pStyle w:val="Compact"/>
         <w:numPr>
           <w:ilvl w:val="0"/>
-          <w:numId w:val="1105"/>
+          <w:numId w:val="1106"/>
         </w:numPr>
       </w:pPr>
       <w:r>
@@ -11742,7 +12133,7 @@
         <w:pStyle w:val="Compact"/>
         <w:numPr>
           <w:ilvl w:val="0"/>
-          <w:numId w:val="1106"/>
+          <w:numId w:val="1107"/>
         </w:numPr>
       </w:pPr>
       <w:r>
@@ -11754,7 +12145,7 @@
         <w:pStyle w:val="Compact"/>
         <w:numPr>
           <w:ilvl w:val="0"/>
-          <w:numId w:val="1107"/>
+          <w:numId w:val="1108"/>
         </w:numPr>
       </w:pPr>
       <w:r>
@@ -11766,7 +12157,7 @@
         <w:pStyle w:val="Compact"/>
         <w:numPr>
           <w:ilvl w:val="0"/>
-          <w:numId w:val="1108"/>
+          <w:numId w:val="1109"/>
         </w:numPr>
       </w:pPr>
       <w:r>
@@ -11778,7 +12169,7 @@
         <w:pStyle w:val="Compact"/>
         <w:numPr>
           <w:ilvl w:val="0"/>
-          <w:numId w:val="1109"/>
+          <w:numId w:val="1110"/>
         </w:numPr>
       </w:pPr>
       <w:r>
@@ -11790,15 +12181,15 @@
         <w:pStyle w:val="Compact"/>
         <w:numPr>
           <w:ilvl w:val="0"/>
-          <w:numId w:val="1110"/>
+          <w:numId w:val="1111"/>
         </w:numPr>
       </w:pPr>
       <w:r>
         <w:t xml:space="preserve">Critico conta tutte le voci distinte con nota, incluse revisioni e rewatch</w:t>
       </w:r>
     </w:p>
-    <w:bookmarkEnd w:id="93"/>
-    <w:bookmarkStart w:id="94" w:name="badge-introduttivi-1"/>
+    <w:bookmarkEnd w:id="94"/>
+    <w:bookmarkStart w:id="95" w:name="badge-introduttivi-1"/>
     <w:p>
       <w:pPr>
         <w:pStyle w:val="Heading3"/>
@@ -11812,7 +12203,7 @@
         <w:pStyle w:val="Compact"/>
         <w:numPr>
           <w:ilvl w:val="0"/>
-          <w:numId w:val="1111"/>
+          <w:numId w:val="1112"/>
         </w:numPr>
       </w:pPr>
       <w:r>
@@ -11824,7 +12215,7 @@
         <w:pStyle w:val="Compact"/>
         <w:numPr>
           <w:ilvl w:val="0"/>
-          <w:numId w:val="1112"/>
+          <w:numId w:val="1113"/>
         </w:numPr>
       </w:pPr>
       <w:r>
@@ -11836,7 +12227,7 @@
         <w:pStyle w:val="Compact"/>
         <w:numPr>
           <w:ilvl w:val="0"/>
-          <w:numId w:val="1113"/>
+          <w:numId w:val="1114"/>
         </w:numPr>
       </w:pPr>
       <w:r>
@@ -11848,7 +12239,7 @@
         <w:pStyle w:val="Compact"/>
         <w:numPr>
           <w:ilvl w:val="0"/>
-          <w:numId w:val="1114"/>
+          <w:numId w:val="1115"/>
         </w:numPr>
       </w:pPr>
       <w:r>
@@ -11860,15 +12251,15 @@
         <w:pStyle w:val="Compact"/>
         <w:numPr>
           <w:ilvl w:val="0"/>
-          <w:numId w:val="1115"/>
+          <w:numId w:val="1116"/>
         </w:numPr>
       </w:pPr>
       <w:r>
         <w:t xml:space="preserve">Stagione 0 / Speciali esclusa da Stagione chiusa</w:t>
       </w:r>
     </w:p>
-    <w:bookmarkEnd w:id="94"/>
-    <w:bookmarkStart w:id="95" w:name="serie-completata"/>
+    <w:bookmarkEnd w:id="95"/>
+    <w:bookmarkStart w:id="96" w:name="serie-completata"/>
     <w:p>
       <w:pPr>
         <w:pStyle w:val="Heading3"/>
@@ -11882,7 +12273,7 @@
         <w:pStyle w:val="Compact"/>
         <w:numPr>
           <w:ilvl w:val="0"/>
-          <w:numId w:val="1116"/>
+          <w:numId w:val="1117"/>
         </w:numPr>
       </w:pPr>
       <w:r>
@@ -11903,7 +12294,7 @@
         <w:pStyle w:val="Compact"/>
         <w:numPr>
           <w:ilvl w:val="0"/>
-          <w:numId w:val="1117"/>
+          <w:numId w:val="1118"/>
         </w:numPr>
       </w:pPr>
       <w:r>
@@ -11915,7 +12306,7 @@
         <w:pStyle w:val="Compact"/>
         <w:numPr>
           <w:ilvl w:val="0"/>
-          <w:numId w:val="1118"/>
+          <w:numId w:val="1119"/>
         </w:numPr>
       </w:pPr>
       <w:r>
@@ -11927,15 +12318,15 @@
         <w:pStyle w:val="Compact"/>
         <w:numPr>
           <w:ilvl w:val="0"/>
-          <w:numId w:val="1119"/>
+          <w:numId w:val="1120"/>
         </w:numPr>
       </w:pPr>
       <w:r>
         <w:t xml:space="preserve">Sblocco permanente anche dopo modifiche ai metadati TMDB</w:t>
       </w:r>
     </w:p>
-    <w:bookmarkEnd w:id="95"/>
-    <w:bookmarkStart w:id="96" w:name="generi-canonici"/>
+    <w:bookmarkEnd w:id="96"/>
+    <w:bookmarkStart w:id="97" w:name="generi-canonici"/>
     <w:p>
       <w:pPr>
         <w:pStyle w:val="Heading3"/>
@@ -11949,7 +12340,7 @@
         <w:pStyle w:val="Compact"/>
         <w:numPr>
           <w:ilvl w:val="0"/>
-          <w:numId w:val="1120"/>
+          <w:numId w:val="1121"/>
         </w:numPr>
       </w:pPr>
       <w:r>
@@ -11961,7 +12352,7 @@
         <w:pStyle w:val="Compact"/>
         <w:numPr>
           <w:ilvl w:val="0"/>
-          <w:numId w:val="1121"/>
+          <w:numId w:val="1122"/>
         </w:numPr>
       </w:pPr>
       <w:r>
@@ -11973,7 +12364,7 @@
         <w:pStyle w:val="Compact"/>
         <w:numPr>
           <w:ilvl w:val="0"/>
-          <w:numId w:val="1122"/>
+          <w:numId w:val="1123"/>
         </w:numPr>
       </w:pPr>
       <w:r>
@@ -11985,7 +12376,7 @@
         <w:pStyle w:val="Compact"/>
         <w:numPr>
           <w:ilvl w:val="0"/>
-          <w:numId w:val="1123"/>
+          <w:numId w:val="1124"/>
         </w:numPr>
       </w:pPr>
       <w:r>
@@ -12413,8 +12804,8 @@
         <w:t xml:space="preserve">genere narrativo. Gli altri generi associati allo stesso titolo restano validi.</w:t>
       </w:r>
     </w:p>
-    <w:bookmarkEnd w:id="96"/>
-    <w:bookmarkStart w:id="97" w:name="social"/>
+    <w:bookmarkEnd w:id="97"/>
+    <w:bookmarkStart w:id="98" w:name="social"/>
     <w:p>
       <w:pPr>
         <w:pStyle w:val="Heading3"/>
@@ -12428,7 +12819,7 @@
         <w:pStyle w:val="Compact"/>
         <w:numPr>
           <w:ilvl w:val="0"/>
-          <w:numId w:val="1124"/>
+          <w:numId w:val="1125"/>
         </w:numPr>
       </w:pPr>
       <w:r>
@@ -12440,7 +12831,7 @@
         <w:pStyle w:val="Compact"/>
         <w:numPr>
           <w:ilvl w:val="0"/>
-          <w:numId w:val="1125"/>
+          <w:numId w:val="1126"/>
         </w:numPr>
       </w:pPr>
       <w:r>
@@ -12452,7 +12843,7 @@
         <w:pStyle w:val="Compact"/>
         <w:numPr>
           <w:ilvl w:val="0"/>
-          <w:numId w:val="1126"/>
+          <w:numId w:val="1127"/>
         </w:numPr>
       </w:pPr>
       <w:r>
@@ -12464,7 +12855,7 @@
         <w:pStyle w:val="Compact"/>
         <w:numPr>
           <w:ilvl w:val="0"/>
-          <w:numId w:val="1127"/>
+          <w:numId w:val="1128"/>
         </w:numPr>
       </w:pPr>
       <w:r>
@@ -12476,15 +12867,15 @@
         <w:pStyle w:val="Compact"/>
         <w:numPr>
           <w:ilvl w:val="0"/>
-          <w:numId w:val="1128"/>
+          <w:numId w:val="1129"/>
         </w:numPr>
       </w:pPr>
       <w:r>
         <w:t xml:space="preserve">Reinvii e riaperture non incrementano il progresso</w:t>
       </w:r>
     </w:p>
-    <w:bookmarkEnd w:id="97"/>
-    <w:bookmarkStart w:id="98" w:name="ux"/>
+    <w:bookmarkEnd w:id="98"/>
+    <w:bookmarkStart w:id="99" w:name="ux"/>
     <w:p>
       <w:pPr>
         <w:pStyle w:val="Heading3"/>
@@ -12498,7 +12889,7 @@
         <w:pStyle w:val="Compact"/>
         <w:numPr>
           <w:ilvl w:val="0"/>
-          <w:numId w:val="1129"/>
+          <w:numId w:val="1130"/>
         </w:numPr>
       </w:pPr>
       <w:r>
@@ -12510,7 +12901,7 @@
         <w:pStyle w:val="Compact"/>
         <w:numPr>
           <w:ilvl w:val="0"/>
-          <w:numId w:val="1130"/>
+          <w:numId w:val="1131"/>
         </w:numPr>
       </w:pPr>
       <w:r>
@@ -12522,7 +12913,7 @@
         <w:pStyle w:val="Compact"/>
         <w:numPr>
           <w:ilvl w:val="0"/>
-          <w:numId w:val="1131"/>
+          <w:numId w:val="1132"/>
         </w:numPr>
       </w:pPr>
       <w:r>
@@ -12534,7 +12925,7 @@
         <w:pStyle w:val="Compact"/>
         <w:numPr>
           <w:ilvl w:val="0"/>
-          <w:numId w:val="1132"/>
+          <w:numId w:val="1133"/>
         </w:numPr>
       </w:pPr>
       <w:r>
@@ -12546,7 +12937,7 @@
         <w:pStyle w:val="Compact"/>
         <w:numPr>
           <w:ilvl w:val="0"/>
-          <w:numId w:val="1133"/>
+          <w:numId w:val="1134"/>
         </w:numPr>
       </w:pPr>
       <w:r>
@@ -12558,7 +12949,7 @@
         <w:pStyle w:val="Compact"/>
         <w:numPr>
           <w:ilvl w:val="0"/>
-          <w:numId w:val="1134"/>
+          <w:numId w:val="1135"/>
         </w:numPr>
       </w:pPr>
       <w:r>
@@ -12570,7 +12961,7 @@
         <w:pStyle w:val="Compact"/>
         <w:numPr>
           <w:ilvl w:val="0"/>
-          <w:numId w:val="1135"/>
+          <w:numId w:val="1136"/>
         </w:numPr>
       </w:pPr>
       <w:r>
@@ -12582,7 +12973,7 @@
         <w:pStyle w:val="Compact"/>
         <w:numPr>
           <w:ilvl w:val="0"/>
-          <w:numId w:val="1136"/>
+          <w:numId w:val="1137"/>
         </w:numPr>
       </w:pPr>
       <w:r>
@@ -12594,7 +12985,7 @@
         <w:pStyle w:val="Compact"/>
         <w:numPr>
           <w:ilvl w:val="0"/>
-          <w:numId w:val="1137"/>
+          <w:numId w:val="1138"/>
         </w:numPr>
       </w:pPr>
       <w:r>
@@ -12606,7 +12997,7 @@
         <w:pStyle w:val="Compact"/>
         <w:numPr>
           <w:ilvl w:val="0"/>
-          <w:numId w:val="1138"/>
+          <w:numId w:val="1139"/>
         </w:numPr>
       </w:pPr>
       <w:r>
@@ -12618,15 +13009,15 @@
         <w:pStyle w:val="Compact"/>
         <w:numPr>
           <w:ilvl w:val="0"/>
-          <w:numId w:val="1139"/>
+          <w:numId w:val="1140"/>
         </w:numPr>
       </w:pPr>
       <w:r>
         <w:t xml:space="preserve">Banner di sblocco con sfondo pieno, senza trasparenza</w:t>
       </w:r>
     </w:p>
-    <w:bookmarkEnd w:id="98"/>
-    <w:bookmarkStart w:id="99" w:name="operatività"/>
+    <w:bookmarkEnd w:id="99"/>
+    <w:bookmarkStart w:id="100" w:name="operatività"/>
     <w:p>
       <w:pPr>
         <w:pStyle w:val="Heading3"/>
@@ -12640,7 +13031,7 @@
         <w:pStyle w:val="Compact"/>
         <w:numPr>
           <w:ilvl w:val="0"/>
-          <w:numId w:val="1140"/>
+          <w:numId w:val="1141"/>
         </w:numPr>
       </w:pPr>
       <w:r>
@@ -12652,7 +13043,7 @@
         <w:pStyle w:val="Compact"/>
         <w:numPr>
           <w:ilvl w:val="0"/>
-          <w:numId w:val="1141"/>
+          <w:numId w:val="1142"/>
         </w:numPr>
       </w:pPr>
       <w:r>
@@ -12664,7 +13055,7 @@
         <w:pStyle w:val="Compact"/>
         <w:numPr>
           <w:ilvl w:val="0"/>
-          <w:numId w:val="1142"/>
+          <w:numId w:val="1143"/>
         </w:numPr>
       </w:pPr>
       <w:r>
@@ -12676,7 +13067,7 @@
         <w:pStyle w:val="Compact"/>
         <w:numPr>
           <w:ilvl w:val="0"/>
-          <w:numId w:val="1143"/>
+          <w:numId w:val="1144"/>
         </w:numPr>
       </w:pPr>
       <w:r>
@@ -12697,7 +13088,7 @@
         <w:pStyle w:val="Compact"/>
         <w:numPr>
           <w:ilvl w:val="0"/>
-          <w:numId w:val="1144"/>
+          <w:numId w:val="1145"/>
         </w:numPr>
       </w:pPr>
       <w:r>
@@ -12709,7 +13100,7 @@
         <w:pStyle w:val="Compact"/>
         <w:numPr>
           <w:ilvl w:val="0"/>
-          <w:numId w:val="1145"/>
+          <w:numId w:val="1146"/>
         </w:numPr>
       </w:pPr>
       <w:r>
@@ -12721,7 +13112,7 @@
         <w:pStyle w:val="Compact"/>
         <w:numPr>
           <w:ilvl w:val="0"/>
-          <w:numId w:val="1146"/>
+          <w:numId w:val="1147"/>
         </w:numPr>
       </w:pPr>
       <w:r>
@@ -12733,7 +13124,7 @@
         <w:pStyle w:val="Compact"/>
         <w:numPr>
           <w:ilvl w:val="0"/>
-          <w:numId w:val="1147"/>
+          <w:numId w:val="1148"/>
         </w:numPr>
       </w:pPr>
       <w:r>
@@ -12745,7 +13136,7 @@
         <w:pStyle w:val="Compact"/>
         <w:numPr>
           <w:ilvl w:val="0"/>
-          <w:numId w:val="1148"/>
+          <w:numId w:val="1149"/>
         </w:numPr>
       </w:pPr>
       <w:r>
@@ -12757,7 +13148,7 @@
         <w:pStyle w:val="Compact"/>
         <w:numPr>
           <w:ilvl w:val="0"/>
-          <w:numId w:val="1149"/>
+          <w:numId w:val="1150"/>
         </w:numPr>
       </w:pPr>
       <w:r>
@@ -12769,7 +13160,7 @@
         <w:pStyle w:val="Compact"/>
         <w:numPr>
           <w:ilvl w:val="0"/>
-          <w:numId w:val="1150"/>
+          <w:numId w:val="1151"/>
         </w:numPr>
       </w:pPr>
       <w:r>
@@ -12781,7 +13172,7 @@
         <w:pStyle w:val="Compact"/>
         <w:numPr>
           <w:ilvl w:val="0"/>
-          <w:numId w:val="1151"/>
+          <w:numId w:val="1152"/>
         </w:numPr>
       </w:pPr>
       <w:r>
@@ -12793,7 +13184,7 @@
         <w:pStyle w:val="Compact"/>
         <w:numPr>
           <w:ilvl w:val="0"/>
-          <w:numId w:val="1152"/>
+          <w:numId w:val="1153"/>
         </w:numPr>
       </w:pPr>
       <w:r>
@@ -12805,7 +13196,7 @@
         <w:pStyle w:val="Compact"/>
         <w:numPr>
           <w:ilvl w:val="0"/>
-          <w:numId w:val="1153"/>
+          <w:numId w:val="1154"/>
         </w:numPr>
       </w:pPr>
       <w:r>
@@ -12817,7 +13208,7 @@
         <w:pStyle w:val="Compact"/>
         <w:numPr>
           <w:ilvl w:val="0"/>
-          <w:numId w:val="1154"/>
+          <w:numId w:val="1155"/>
         </w:numPr>
       </w:pPr>
       <w:r>
@@ -12829,7 +13220,7 @@
         <w:pStyle w:val="Compact"/>
         <w:numPr>
           <w:ilvl w:val="0"/>
-          <w:numId w:val="1155"/>
+          <w:numId w:val="1156"/>
         </w:numPr>
       </w:pPr>
       <w:r>
@@ -12841,7 +13232,7 @@
         <w:pStyle w:val="Compact"/>
         <w:numPr>
           <w:ilvl w:val="0"/>
-          <w:numId w:val="1156"/>
+          <w:numId w:val="1157"/>
         </w:numPr>
       </w:pPr>
       <w:r>
@@ -12853,7 +13244,7 @@
         <w:pStyle w:val="Compact"/>
         <w:numPr>
           <w:ilvl w:val="0"/>
-          <w:numId w:val="1157"/>
+          <w:numId w:val="1158"/>
         </w:numPr>
       </w:pPr>
       <w:r>
@@ -12867,9 +13258,9 @@
         </w:pict>
       </w:r>
     </w:p>
-    <w:bookmarkEnd w:id="99"/>
     <w:bookmarkEnd w:id="100"/>
-    <w:bookmarkStart w:id="101" w:name="prossimo-passo-consigliato"/>
+    <w:bookmarkEnd w:id="101"/>
+    <w:bookmarkStart w:id="102" w:name="prossimo-passo-consigliato"/>
     <w:p>
       <w:pPr>
         <w:pStyle w:val="Heading2"/>
@@ -12891,82 +13282,7 @@
         <w:pStyle w:val="BodyText"/>
       </w:pPr>
       <w:r>
-        <w:t xml:space="preserve">Il</w:t>
-      </w:r>
-      <w:r>
-        <w:t xml:space="preserve"> </w:t>
-      </w:r>
-      <w:r>
-        <w:rPr>
-          <w:b/>
-          <w:bCs/>
-        </w:rPr>
-        <w:t xml:space="preserve">Batch A2 è completato</w:t>
-      </w:r>
-      <w:r>
-        <w:t xml:space="preserve">. Il prossimo passo operativo è scegliere il primo badge</w:t>
-      </w:r>
-      <w:r>
-        <w:t xml:space="preserve"> </w:t>
-      </w:r>
-      <w:r>
-        <w:t xml:space="preserve">del Batch B:</w:t>
-      </w:r>
-    </w:p>
-    <w:p>
-      <w:pPr>
-        <w:pStyle w:val="Compact"/>
-        <w:numPr>
-          <w:ilvl w:val="0"/>
-          <w:numId w:val="1158"/>
-        </w:numPr>
-      </w:pPr>
-      <w:r>
-        <w:t xml:space="preserve">Esploratore di generi;</w:t>
-      </w:r>
-    </w:p>
-    <w:p>
-      <w:pPr>
-        <w:pStyle w:val="Compact"/>
-        <w:numPr>
-          <w:ilvl w:val="0"/>
-          <w:numId w:val="1158"/>
-        </w:numPr>
-      </w:pPr>
-      <w:r>
-        <w:t xml:space="preserve">Ancora un episodio;</w:t>
-      </w:r>
-    </w:p>
-    <w:p>
-      <w:pPr>
-        <w:pStyle w:val="Compact"/>
-        <w:numPr>
-          <w:ilvl w:val="0"/>
-          <w:numId w:val="1158"/>
-        </w:numPr>
-      </w:pPr>
-      <w:r>
-        <w:t xml:space="preserve">Maratoneta;</w:t>
-      </w:r>
-    </w:p>
-    <w:p>
-      <w:pPr>
-        <w:pStyle w:val="Compact"/>
-        <w:numPr>
-          <w:ilvl w:val="0"/>
-          <w:numId w:val="1158"/>
-        </w:numPr>
-      </w:pPr>
-      <w:r>
-        <w:t xml:space="preserve">Encore.</w:t>
-      </w:r>
-    </w:p>
-    <w:p>
-      <w:pPr>
-        <w:pStyle w:val="FirstParagraph"/>
-      </w:pPr>
-      <w:r>
-        <w:t xml:space="preserve">La scelta consigliata è</w:t>
+        <w:t xml:space="preserve">Il prossimo passo operativo è completare il rollout di</w:t>
       </w:r>
       <w:r>
         <w:t xml:space="preserve"> </w:t>
@@ -12979,17 +13295,95 @@
         <w:t xml:space="preserve">Esploratore di generi</w:t>
       </w:r>
       <w:r>
-        <w:t xml:space="preserve">, perché riusa i metadati già presenti</w:t>
+        <w:t xml:space="preserve">:</w:t>
+      </w:r>
+    </w:p>
+    <w:p>
+      <w:pPr>
+        <w:pStyle w:val="Compact"/>
+        <w:numPr>
+          <w:ilvl w:val="0"/>
+          <w:numId w:val="1159"/>
+        </w:numPr>
+      </w:pPr>
+      <w:r>
+        <w:t xml:space="preserve">distribuire la Edge Function con cache generi protetta;</w:t>
+      </w:r>
+    </w:p>
+    <w:p>
+      <w:pPr>
+        <w:pStyle w:val="Compact"/>
+        <w:numPr>
+          <w:ilvl w:val="0"/>
+          <w:numId w:val="1159"/>
+        </w:numPr>
+      </w:pPr>
+      <w:r>
+        <w:t xml:space="preserve">pubblicare la patch a bussola;</w:t>
+      </w:r>
+    </w:p>
+    <w:p>
+      <w:pPr>
+        <w:pStyle w:val="Compact"/>
+        <w:numPr>
+          <w:ilvl w:val="0"/>
+          <w:numId w:val="1159"/>
+        </w:numPr>
+      </w:pPr>
+      <w:r>
+        <w:t xml:space="preserve">applicare la migration</w:t>
       </w:r>
       <w:r>
         <w:t xml:space="preserve"> </w:t>
       </w:r>
       <w:r>
-        <w:t xml:space="preserve">e introduce la tassonomia canonica prima dei badge comportamentali più complessi.</w:t>
-      </w:r>
-    </w:p>
-    <w:bookmarkEnd w:id="101"/>
+        <w:rPr>
+          <w:rStyle w:val="VerbatimChar"/>
+        </w:rPr>
+        <w:t xml:space="preserve">0022_genre_explorer_badge.sql</w:t>
+      </w:r>
+      <w:r>
+        <w:t xml:space="preserve">;</w:t>
+      </w:r>
+    </w:p>
+    <w:p>
+      <w:pPr>
+        <w:pStyle w:val="Compact"/>
+        <w:numPr>
+          <w:ilvl w:val="0"/>
+          <w:numId w:val="1159"/>
+        </w:numPr>
+      </w:pPr>
+      <w:r>
+        <w:t xml:space="preserve">verificare backfill e cache sugli account reali;</w:t>
+      </w:r>
+    </w:p>
+    <w:p>
+      <w:pPr>
+        <w:pStyle w:val="Compact"/>
+        <w:numPr>
+          <w:ilvl w:val="0"/>
+          <w:numId w:val="1159"/>
+        </w:numPr>
+      </w:pPr>
+      <w:r>
+        <w:t xml:space="preserve">controllare gli eventuali sblocchi multipli aggregati;</w:t>
+      </w:r>
+    </w:p>
+    <w:p>
+      <w:pPr>
+        <w:pStyle w:val="Compact"/>
+        <w:numPr>
+          <w:ilvl w:val="0"/>
+          <w:numId w:val="1159"/>
+        </w:numPr>
+      </w:pPr>
+      <w:r>
+        <w:t xml:space="preserve">proseguire con Ancora un episodio.</w:t>
+      </w:r>
+    </w:p>
     <w:bookmarkEnd w:id="102"/>
+    <w:bookmarkEnd w:id="103"/>
     <w:sectPr>
       <w:footerReference r:id="rId9" w:type="default"/>
       <w:pgSz w:h="15840" w:w="12240"/>
@@ -13951,7 +14345,7 @@
     <w:abstractNumId w:val="991"/>
   </w:num>
   <w:num w:numId="1079">
-    <w:abstractNumId w:val="992"/>
+    <w:abstractNumId w:val="993"/>
   </w:num>
   <w:num w:numId="1080">
     <w:abstractNumId w:val="992"/>
@@ -13963,7 +14357,7 @@
     <w:abstractNumId w:val="992"/>
   </w:num>
   <w:num w:numId="1083">
-    <w:abstractNumId w:val="992"/>
+    <w:abstractNumId w:val="991"/>
   </w:num>
   <w:num w:numId="1084">
     <w:abstractNumId w:val="992"/>
@@ -14008,10 +14402,10 @@
     <w:abstractNumId w:val="992"/>
   </w:num>
   <w:num w:numId="1098">
-    <w:abstractNumId w:val="991"/>
+    <w:abstractNumId w:val="992"/>
   </w:num>
   <w:num w:numId="1099">
-    <w:abstractNumId w:val="993"/>
+    <w:abstractNumId w:val="991"/>
   </w:num>
   <w:num w:numId="1100">
     <w:abstractNumId w:val="993"/>
@@ -14188,6 +14582,9 @@
     <w:abstractNumId w:val="993"/>
   </w:num>
   <w:num w:numId="1158">
+    <w:abstractNumId w:val="993"/>
+  </w:num>
+  <w:num w:numId="1159">
     <w:abstractNumId w:val="99411"/>
     <w:lvlOverride w:ilvl="0">
       <w:startOverride w:val="1"/>
@@ -26079,6 +26476,232 @@
     <w:pPr>
       <w:wordWrap w:val="off"/>
     </w:pPr>
+  </w:style>
+  <w:style w:customStyle="1" w:styleId="KeywordTok" w:type="character">
+    <w:name w:val="KeywordTok"/>
+    <w:basedOn w:val="VerbatimChar"/>
+    <w:rPr>
+      <w:b/>
+      <w:color w:val="007020"/>
+    </w:rPr>
+  </w:style>
+  <w:style w:customStyle="1" w:styleId="DataTypeTok" w:type="character">
+    <w:name w:val="DataTypeTok"/>
+    <w:basedOn w:val="VerbatimChar"/>
+    <w:rPr>
+      <w:color w:val="902000"/>
+    </w:rPr>
+  </w:style>
+  <w:style w:customStyle="1" w:styleId="DecValTok" w:type="character">
+    <w:name w:val="DecValTok"/>
+    <w:basedOn w:val="VerbatimChar"/>
+    <w:rPr>
+      <w:color w:val="40a070"/>
+    </w:rPr>
+  </w:style>
+  <w:style w:customStyle="1" w:styleId="BaseNTok" w:type="character">
+    <w:name w:val="BaseNTok"/>
+    <w:basedOn w:val="VerbatimChar"/>
+    <w:rPr>
+      <w:color w:val="40a070"/>
+    </w:rPr>
+  </w:style>
+  <w:style w:customStyle="1" w:styleId="FloatTok" w:type="character">
+    <w:name w:val="FloatTok"/>
+    <w:basedOn w:val="VerbatimChar"/>
+    <w:rPr>
+      <w:color w:val="40a070"/>
+    </w:rPr>
+  </w:style>
+  <w:style w:customStyle="1" w:styleId="ConstantTok" w:type="character">
+    <w:name w:val="ConstantTok"/>
+    <w:basedOn w:val="VerbatimChar"/>
+    <w:rPr>
+      <w:color w:val="880000"/>
+    </w:rPr>
+  </w:style>
+  <w:style w:customStyle="1" w:styleId="CharTok" w:type="character">
+    <w:name w:val="CharTok"/>
+    <w:basedOn w:val="VerbatimChar"/>
+    <w:rPr>
+      <w:color w:val="4070a0"/>
+    </w:rPr>
+  </w:style>
+  <w:style w:customStyle="1" w:styleId="SpecialCharTok" w:type="character">
+    <w:name w:val="SpecialCharTok"/>
+    <w:basedOn w:val="VerbatimChar"/>
+    <w:rPr>
+      <w:color w:val="4070a0"/>
+    </w:rPr>
+  </w:style>
+  <w:style w:customStyle="1" w:styleId="StringTok" w:type="character">
+    <w:name w:val="StringTok"/>
+    <w:basedOn w:val="VerbatimChar"/>
+    <w:rPr>
+      <w:color w:val="4070a0"/>
+    </w:rPr>
+  </w:style>
+  <w:style w:customStyle="1" w:styleId="VerbatimStringTok" w:type="character">
+    <w:name w:val="VerbatimStringTok"/>
+    <w:basedOn w:val="VerbatimChar"/>
+    <w:rPr>
+      <w:color w:val="4070a0"/>
+    </w:rPr>
+  </w:style>
+  <w:style w:customStyle="1" w:styleId="SpecialStringTok" w:type="character">
+    <w:name w:val="SpecialStringTok"/>
+    <w:basedOn w:val="VerbatimChar"/>
+    <w:rPr>
+      <w:color w:val="bb6688"/>
+    </w:rPr>
+  </w:style>
+  <w:style w:customStyle="1" w:styleId="ImportTok" w:type="character">
+    <w:name w:val="ImportTok"/>
+    <w:basedOn w:val="VerbatimChar"/>
+    <w:rPr>
+      <w:b/>
+      <w:color w:val="008000"/>
+    </w:rPr>
+  </w:style>
+  <w:style w:customStyle="1" w:styleId="CommentTok" w:type="character">
+    <w:name w:val="CommentTok"/>
+    <w:basedOn w:val="VerbatimChar"/>
+    <w:rPr>
+      <w:i/>
+      <w:color w:val="60a0b0"/>
+    </w:rPr>
+  </w:style>
+  <w:style w:customStyle="1" w:styleId="DocumentationTok" w:type="character">
+    <w:name w:val="DocumentationTok"/>
+    <w:basedOn w:val="VerbatimChar"/>
+    <w:rPr>
+      <w:i/>
+      <w:color w:val="ba2121"/>
+    </w:rPr>
+  </w:style>
+  <w:style w:customStyle="1" w:styleId="AnnotationTok" w:type="character">
+    <w:name w:val="AnnotationTok"/>
+    <w:basedOn w:val="VerbatimChar"/>
+    <w:rPr>
+      <w:b/>
+      <w:i/>
+      <w:color w:val="60a0b0"/>
+    </w:rPr>
+  </w:style>
+  <w:style w:customStyle="1" w:styleId="CommentVarTok" w:type="character">
+    <w:name w:val="CommentVarTok"/>
+    <w:basedOn w:val="VerbatimChar"/>
+    <w:rPr>
+      <w:b/>
+      <w:i/>
+      <w:color w:val="60a0b0"/>
+    </w:rPr>
+  </w:style>
+  <w:style w:customStyle="1" w:styleId="OtherTok" w:type="character">
+    <w:name w:val="OtherTok"/>
+    <w:basedOn w:val="VerbatimChar"/>
+    <w:rPr>
+      <w:color w:val="007020"/>
+    </w:rPr>
+  </w:style>
+  <w:style w:customStyle="1" w:styleId="FunctionTok" w:type="character">
+    <w:name w:val="FunctionTok"/>
+    <w:basedOn w:val="VerbatimChar"/>
+    <w:rPr>
+      <w:color w:val="06287e"/>
+    </w:rPr>
+  </w:style>
+  <w:style w:customStyle="1" w:styleId="VariableTok" w:type="character">
+    <w:name w:val="VariableTok"/>
+    <w:basedOn w:val="VerbatimChar"/>
+    <w:rPr>
+      <w:color w:val="19177c"/>
+    </w:rPr>
+  </w:style>
+  <w:style w:customStyle="1" w:styleId="ControlFlowTok" w:type="character">
+    <w:name w:val="ControlFlowTok"/>
+    <w:basedOn w:val="VerbatimChar"/>
+    <w:rPr>
+      <w:b/>
+      <w:color w:val="007020"/>
+    </w:rPr>
+  </w:style>
+  <w:style w:customStyle="1" w:styleId="OperatorTok" w:type="character">
+    <w:name w:val="OperatorTok"/>
+    <w:basedOn w:val="VerbatimChar"/>
+    <w:rPr>
+      <w:color w:val="666666"/>
+    </w:rPr>
+  </w:style>
+  <w:style w:customStyle="1" w:styleId="BuiltInTok" w:type="character">
+    <w:name w:val="BuiltInTok"/>
+    <w:basedOn w:val="VerbatimChar"/>
+    <w:rPr>
+      <w:color w:val="008000"/>
+    </w:rPr>
+  </w:style>
+  <w:style w:customStyle="1" w:styleId="ExtensionTok" w:type="character">
+    <w:name w:val="ExtensionTok"/>
+    <w:basedOn w:val="VerbatimChar"/>
+    <w:rPr/>
+  </w:style>
+  <w:style w:customStyle="1" w:styleId="PreprocessorTok" w:type="character">
+    <w:name w:val="PreprocessorTok"/>
+    <w:basedOn w:val="VerbatimChar"/>
+    <w:rPr>
+      <w:color w:val="bc7a00"/>
+    </w:rPr>
+  </w:style>
+  <w:style w:customStyle="1" w:styleId="AttributeTok" w:type="character">
+    <w:name w:val="AttributeTok"/>
+    <w:basedOn w:val="VerbatimChar"/>
+    <w:rPr>
+      <w:color w:val="7d9029"/>
+    </w:rPr>
+  </w:style>
+  <w:style w:customStyle="1" w:styleId="RegionMarkerTok" w:type="character">
+    <w:name w:val="RegionMarkerTok"/>
+    <w:basedOn w:val="VerbatimChar"/>
+    <w:rPr/>
+  </w:style>
+  <w:style w:customStyle="1" w:styleId="InformationTok" w:type="character">
+    <w:name w:val="InformationTok"/>
+    <w:basedOn w:val="VerbatimChar"/>
+    <w:rPr>
+      <w:b/>
+      <w:i/>
+      <w:color w:val="60a0b0"/>
+    </w:rPr>
+  </w:style>
+  <w:style w:customStyle="1" w:styleId="WarningTok" w:type="character">
+    <w:name w:val="WarningTok"/>
+    <w:basedOn w:val="VerbatimChar"/>
+    <w:rPr>
+      <w:b/>
+      <w:i/>
+      <w:color w:val="60a0b0"/>
+    </w:rPr>
+  </w:style>
+  <w:style w:customStyle="1" w:styleId="AlertTok" w:type="character">
+    <w:name w:val="AlertTok"/>
+    <w:basedOn w:val="VerbatimChar"/>
+    <w:rPr>
+      <w:b/>
+      <w:color w:val="ff0000"/>
+    </w:rPr>
+  </w:style>
+  <w:style w:customStyle="1" w:styleId="ErrorTok" w:type="character">
+    <w:name w:val="ErrorTok"/>
+    <w:basedOn w:val="VerbatimChar"/>
+    <w:rPr>
+      <w:b/>
+      <w:color w:val="ff0000"/>
+    </w:rPr>
+  </w:style>
+  <w:style w:customStyle="1" w:styleId="NormalTok" w:type="character">
+    <w:name w:val="NormalTok"/>
+    <w:basedOn w:val="VerbatimChar"/>
+    <w:rPr/>
   </w:style>
   <w:style w:customStyle="1" w:styleId="KeywordTok" w:type="character">
     <w:name w:val="KeywordTok"/>

</xml_diff>

<commit_message>
Document genre explorer rollout
Co-authored-by: Copilot <223556219+Copilot@users.noreply.github.com>
</commit_message>
<xml_diff>
--- a/docs/BADGE-PIANO.docx
+++ b/docs/BADGE-PIANO.docx
@@ -91,13 +91,13 @@
         <w:t xml:space="preserve"> </w:t>
       </w:r>
       <w:r>
-        <w:t xml:space="preserve">Batch A1 e Batch A2 pubblicati; Esploratore di generi (B1)</w:t>
+        <w:t xml:space="preserve">Batch A1, Batch A2 ed Esploratore di generi (B1) pubblicati e</w:t>
       </w:r>
       <w:r>
         <w:t xml:space="preserve"> </w:t>
       </w:r>
       <w:r>
-        <w:t xml:space="preserve">completato localmente e in attesa di rollout</w:t>
+        <w:t xml:space="preserve">verificati in produzione</w:t>
       </w:r>
     </w:p>
     <w:p>
@@ -11660,6 +11660,243 @@
         <w:t xml:space="preserve">e permessi cache.</w:t>
       </w:r>
     </w:p>
+    <w:p>
+      <w:pPr>
+        <w:pStyle w:val="Compact"/>
+        <w:numPr>
+          <w:ilvl w:val="0"/>
+          <w:numId w:val="1083"/>
+        </w:numPr>
+      </w:pPr>
+      <w:r>
+        <w:t xml:space="preserve">bundle monolitico verificato e distribuito prima dell’attivazione del catalogo;</w:t>
+      </w:r>
+    </w:p>
+    <w:p>
+      <w:pPr>
+        <w:pStyle w:val="Compact"/>
+        <w:numPr>
+          <w:ilvl w:val="0"/>
+          <w:numId w:val="1083"/>
+        </w:numPr>
+      </w:pPr>
+      <w:r>
+        <w:t xml:space="preserve">deploy Azure completato sul commit</w:t>
+      </w:r>
+      <w:r>
+        <w:t xml:space="preserve"> </w:t>
+      </w:r>
+      <w:r>
+        <w:rPr>
+          <w:rStyle w:val="VerbatimChar"/>
+        </w:rPr>
+        <w:t xml:space="preserve">13efa1a</w:t>
+      </w:r>
+      <w:r>
+        <w:t xml:space="preserve">;</w:t>
+      </w:r>
+    </w:p>
+    <w:p>
+      <w:pPr>
+        <w:pStyle w:val="Compact"/>
+        <w:numPr>
+          <w:ilvl w:val="0"/>
+          <w:numId w:val="1083"/>
+        </w:numPr>
+      </w:pPr>
+      <w:r>
+        <w:t xml:space="preserve">migration</w:t>
+      </w:r>
+      <w:r>
+        <w:t xml:space="preserve"> </w:t>
+      </w:r>
+      <w:r>
+        <w:rPr>
+          <w:rStyle w:val="VerbatimChar"/>
+        </w:rPr>
+        <w:t xml:space="preserve">0022_genre_explorer_badge.sql</w:t>
+      </w:r>
+      <w:r>
+        <w:t xml:space="preserve"> </w:t>
+      </w:r>
+      <w:r>
+        <w:t xml:space="preserve">applicata con cache e RLS;</w:t>
+      </w:r>
+    </w:p>
+    <w:p>
+      <w:pPr>
+        <w:pStyle w:val="Compact"/>
+        <w:numPr>
+          <w:ilvl w:val="0"/>
+          <w:numId w:val="1083"/>
+        </w:numPr>
+      </w:pPr>
+      <w:r>
+        <w:t xml:space="preserve">test SQL transazionale superato senza dati residui;</w:t>
+      </w:r>
+    </w:p>
+    <w:p>
+      <w:pPr>
+        <w:pStyle w:val="Compact"/>
+        <w:numPr>
+          <w:ilvl w:val="0"/>
+          <w:numId w:val="1083"/>
+        </w:numPr>
+      </w:pPr>
+      <w:r>
+        <w:t xml:space="preserve">cache condivisa popolata con</w:t>
+      </w:r>
+      <w:r>
+        <w:t xml:space="preserve"> </w:t>
+      </w:r>
+      <w:r>
+        <w:rPr>
+          <w:rStyle w:val="VerbatimChar"/>
+        </w:rPr>
+        <w:t xml:space="preserve">125</w:t>
+      </w:r>
+      <w:r>
+        <w:t xml:space="preserve"> </w:t>
+      </w:r>
+      <w:r>
+        <w:t xml:space="preserve">titoli;</w:t>
+      </w:r>
+    </w:p>
+    <w:p>
+      <w:pPr>
+        <w:pStyle w:val="Compact"/>
+        <w:numPr>
+          <w:ilvl w:val="0"/>
+          <w:numId w:val="1083"/>
+        </w:numPr>
+      </w:pPr>
+      <w:r>
+        <w:t xml:space="preserve">account principale:</w:t>
+      </w:r>
+      <w:r>
+        <w:t xml:space="preserve"> </w:t>
+      </w:r>
+      <w:r>
+        <w:rPr>
+          <w:rStyle w:val="VerbatimChar"/>
+        </w:rPr>
+        <w:t xml:space="preserve">15/15</w:t>
+      </w:r>
+      <w:r>
+        <w:t xml:space="preserve">, tutti e quattro i livelli sbloccati, hero</w:t>
+      </w:r>
+      <w:r>
+        <w:t xml:space="preserve"> </w:t>
+      </w:r>
+      <w:r>
+        <w:rPr>
+          <w:rStyle w:val="VerbatimChar"/>
+        </w:rPr>
+        <w:t xml:space="preserve">9/23</w:t>
+      </w:r>
+      <w:r>
+        <w:t xml:space="preserve">;</w:t>
+      </w:r>
+    </w:p>
+    <w:p>
+      <w:pPr>
+        <w:pStyle w:val="Compact"/>
+        <w:numPr>
+          <w:ilvl w:val="0"/>
+          <w:numId w:val="1083"/>
+        </w:numPr>
+      </w:pPr>
+      <w:r>
+        <w:t xml:space="preserve">i quattro sblocchi sono stati mostrati in un unico banner aggregato;</w:t>
+      </w:r>
+    </w:p>
+    <w:p>
+      <w:pPr>
+        <w:pStyle w:val="Compact"/>
+        <w:numPr>
+          <w:ilvl w:val="0"/>
+          <w:numId w:val="1083"/>
+        </w:numPr>
+      </w:pPr>
+      <w:r>
+        <w:t xml:space="preserve">account</w:t>
+      </w:r>
+      <w:r>
+        <w:t xml:space="preserve"> </w:t>
+      </w:r>
+      <w:r>
+        <w:rPr>
+          <w:rStyle w:val="VerbatimChar"/>
+        </w:rPr>
+        <w:t xml:space="preserve">@testshowtime</w:t>
+      </w:r>
+      <w:r>
+        <w:t xml:space="preserve">:</w:t>
+      </w:r>
+      <w:r>
+        <w:t xml:space="preserve"> </w:t>
+      </w:r>
+      <w:r>
+        <w:rPr>
+          <w:rStyle w:val="VerbatimChar"/>
+        </w:rPr>
+        <w:t xml:space="preserve">3/5</w:t>
+      </w:r>
+      <w:r>
+        <w:t xml:space="preserve">, nessuno sblocco, hero</w:t>
+      </w:r>
+      <w:r>
+        <w:t xml:space="preserve"> </w:t>
+      </w:r>
+      <w:r>
+        <w:rPr>
+          <w:rStyle w:val="VerbatimChar"/>
+        </w:rPr>
+        <w:t xml:space="preserve">3/23</w:t>
+      </w:r>
+      <w:r>
+        <w:t xml:space="preserve">;</w:t>
+      </w:r>
+    </w:p>
+    <w:p>
+      <w:pPr>
+        <w:pStyle w:val="Compact"/>
+        <w:numPr>
+          <w:ilvl w:val="0"/>
+          <w:numId w:val="1083"/>
+        </w:numPr>
+      </w:pPr>
+      <w:r>
+        <w:t xml:space="preserve">secondo refresh su entrambi:</w:t>
+      </w:r>
+      <w:r>
+        <w:t xml:space="preserve"> </w:t>
+      </w:r>
+      <w:r>
+        <w:rPr>
+          <w:rStyle w:val="VerbatimChar"/>
+        </w:rPr>
+        <w:t xml:space="preserve">0</w:t>
+      </w:r>
+      <w:r>
+        <w:t xml:space="preserve"> </w:t>
+      </w:r>
+      <w:r>
+        <w:t xml:space="preserve">nuovi sblocchi;</w:t>
+      </w:r>
+    </w:p>
+    <w:p>
+      <w:pPr>
+        <w:pStyle w:val="Compact"/>
+        <w:numPr>
+          <w:ilvl w:val="0"/>
+          <w:numId w:val="1083"/>
+        </w:numPr>
+      </w:pPr>
+      <w:r>
+        <w:t xml:space="preserve">produzione senza overflow a 360/390 px.</w:t>
+      </w:r>
+    </w:p>
     <w:bookmarkStart w:id="87" w:name="batch-c-diario-e-social"/>
     <w:p>
       <w:pPr>
@@ -13282,7 +13519,7 @@
         <w:pStyle w:val="BodyText"/>
       </w:pPr>
       <w:r>
-        <w:t xml:space="preserve">Il prossimo passo operativo è completare il rollout di</w:t>
+        <w:t xml:space="preserve">Il prossimo passo operativo è</w:t>
       </w:r>
       <w:r>
         <w:t xml:space="preserve"> </w:t>
@@ -13292,7 +13529,7 @@
           <w:b/>
           <w:bCs/>
         </w:rPr>
-        <w:t xml:space="preserve">Esploratore di generi</w:t>
+        <w:t xml:space="preserve">Ancora un episodio</w:t>
       </w:r>
       <w:r>
         <w:t xml:space="preserve">:</w:t>
@@ -13307,31 +13544,7 @@
         </w:numPr>
       </w:pPr>
       <w:r>
-        <w:t xml:space="preserve">distribuire la Edge Function con cache generi protetta;</w:t>
-      </w:r>
-    </w:p>
-    <w:p>
-      <w:pPr>
-        <w:pStyle w:val="Compact"/>
-        <w:numPr>
-          <w:ilvl w:val="0"/>
-          <w:numId w:val="1159"/>
-        </w:numPr>
-      </w:pPr>
-      <w:r>
-        <w:t xml:space="preserve">pubblicare la patch a bussola;</w:t>
-      </w:r>
-    </w:p>
-    <w:p>
-      <w:pPr>
-        <w:pStyle w:val="Compact"/>
-        <w:numPr>
-          <w:ilvl w:val="0"/>
-          <w:numId w:val="1159"/>
-        </w:numPr>
-      </w:pPr>
-      <w:r>
-        <w:t xml:space="preserve">applicare la migration</w:t>
+        <w:t xml:space="preserve">usare soltanto episodi</w:t>
       </w:r>
       <w:r>
         <w:t xml:space="preserve"> </w:t>
@@ -13340,7 +13553,7 @@
         <w:rPr>
           <w:rStyle w:val="VerbatimChar"/>
         </w:rPr>
-        <w:t xml:space="preserve">0022_genre_explorer_badge.sql</w:t>
+        <w:t xml:space="preserve">tracked</w:t>
       </w:r>
       <w:r>
         <w:t xml:space="preserve">;</w:t>
@@ -13355,7 +13568,7 @@
         </w:numPr>
       </w:pPr>
       <w:r>
-        <w:t xml:space="preserve">verificare backfill e cache sugli account reali;</w:t>
+        <w:t xml:space="preserve">raggruppare per serie e data reale;</w:t>
       </w:r>
     </w:p>
     <w:p>
@@ -13367,7 +13580,19 @@
         </w:numPr>
       </w:pPr>
       <w:r>
-        <w:t xml:space="preserve">controllare gli eventuali sblocchi multipli aggregati;</w:t>
+        <w:t xml:space="preserve">applicare le soglie</w:t>
+      </w:r>
+      <w:r>
+        <w:t xml:space="preserve"> </w:t>
+      </w:r>
+      <w:r>
+        <w:rPr>
+          <w:rStyle w:val="VerbatimChar"/>
+        </w:rPr>
+        <w:t xml:space="preserve">3 / 5 / 8 / 12</w:t>
+      </w:r>
+      <w:r>
+        <w:t xml:space="preserve">;</w:t>
       </w:r>
     </w:p>
     <w:p>
@@ -13379,7 +13604,31 @@
         </w:numPr>
       </w:pPr>
       <w:r>
-        <w:t xml:space="preserve">proseguire con Ancora un episodio.</w:t>
+        <w:t xml:space="preserve">escludere episodi importati;</w:t>
+      </w:r>
+    </w:p>
+    <w:p>
+      <w:pPr>
+        <w:pStyle w:val="Compact"/>
+        <w:numPr>
+          <w:ilvl w:val="0"/>
+          <w:numId w:val="1159"/>
+        </w:numPr>
+      </w:pPr>
+      <w:r>
+        <w:t xml:space="preserve">creare patch e accordion dedicati;</w:t>
+      </w:r>
+    </w:p>
+    <w:p>
+      <w:pPr>
+        <w:pStyle w:val="Compact"/>
+        <w:numPr>
+          <w:ilvl w:val="0"/>
+          <w:numId w:val="1159"/>
+        </w:numPr>
+      </w:pPr>
+      <w:r>
+        <w:t xml:space="preserve">verificare rewatch e deduplica degli eventi.</w:t>
       </w:r>
     </w:p>
     <w:bookmarkEnd w:id="102"/>
@@ -28285,6 +28534,232 @@
     <w:basedOn w:val="VerbatimChar"/>
     <w:rPr/>
   </w:style>
+  <w:style w:customStyle="1" w:styleId="KeywordTok" w:type="character">
+    <w:name w:val="KeywordTok"/>
+    <w:basedOn w:val="VerbatimChar"/>
+    <w:rPr>
+      <w:b/>
+      <w:color w:val="007020"/>
+    </w:rPr>
+  </w:style>
+  <w:style w:customStyle="1" w:styleId="DataTypeTok" w:type="character">
+    <w:name w:val="DataTypeTok"/>
+    <w:basedOn w:val="VerbatimChar"/>
+    <w:rPr>
+      <w:color w:val="902000"/>
+    </w:rPr>
+  </w:style>
+  <w:style w:customStyle="1" w:styleId="DecValTok" w:type="character">
+    <w:name w:val="DecValTok"/>
+    <w:basedOn w:val="VerbatimChar"/>
+    <w:rPr>
+      <w:color w:val="40a070"/>
+    </w:rPr>
+  </w:style>
+  <w:style w:customStyle="1" w:styleId="BaseNTok" w:type="character">
+    <w:name w:val="BaseNTok"/>
+    <w:basedOn w:val="VerbatimChar"/>
+    <w:rPr>
+      <w:color w:val="40a070"/>
+    </w:rPr>
+  </w:style>
+  <w:style w:customStyle="1" w:styleId="FloatTok" w:type="character">
+    <w:name w:val="FloatTok"/>
+    <w:basedOn w:val="VerbatimChar"/>
+    <w:rPr>
+      <w:color w:val="40a070"/>
+    </w:rPr>
+  </w:style>
+  <w:style w:customStyle="1" w:styleId="ConstantTok" w:type="character">
+    <w:name w:val="ConstantTok"/>
+    <w:basedOn w:val="VerbatimChar"/>
+    <w:rPr>
+      <w:color w:val="880000"/>
+    </w:rPr>
+  </w:style>
+  <w:style w:customStyle="1" w:styleId="CharTok" w:type="character">
+    <w:name w:val="CharTok"/>
+    <w:basedOn w:val="VerbatimChar"/>
+    <w:rPr>
+      <w:color w:val="4070a0"/>
+    </w:rPr>
+  </w:style>
+  <w:style w:customStyle="1" w:styleId="SpecialCharTok" w:type="character">
+    <w:name w:val="SpecialCharTok"/>
+    <w:basedOn w:val="VerbatimChar"/>
+    <w:rPr>
+      <w:color w:val="4070a0"/>
+    </w:rPr>
+  </w:style>
+  <w:style w:customStyle="1" w:styleId="StringTok" w:type="character">
+    <w:name w:val="StringTok"/>
+    <w:basedOn w:val="VerbatimChar"/>
+    <w:rPr>
+      <w:color w:val="4070a0"/>
+    </w:rPr>
+  </w:style>
+  <w:style w:customStyle="1" w:styleId="VerbatimStringTok" w:type="character">
+    <w:name w:val="VerbatimStringTok"/>
+    <w:basedOn w:val="VerbatimChar"/>
+    <w:rPr>
+      <w:color w:val="4070a0"/>
+    </w:rPr>
+  </w:style>
+  <w:style w:customStyle="1" w:styleId="SpecialStringTok" w:type="character">
+    <w:name w:val="SpecialStringTok"/>
+    <w:basedOn w:val="VerbatimChar"/>
+    <w:rPr>
+      <w:color w:val="bb6688"/>
+    </w:rPr>
+  </w:style>
+  <w:style w:customStyle="1" w:styleId="ImportTok" w:type="character">
+    <w:name w:val="ImportTok"/>
+    <w:basedOn w:val="VerbatimChar"/>
+    <w:rPr>
+      <w:b/>
+      <w:color w:val="008000"/>
+    </w:rPr>
+  </w:style>
+  <w:style w:customStyle="1" w:styleId="CommentTok" w:type="character">
+    <w:name w:val="CommentTok"/>
+    <w:basedOn w:val="VerbatimChar"/>
+    <w:rPr>
+      <w:i/>
+      <w:color w:val="60a0b0"/>
+    </w:rPr>
+  </w:style>
+  <w:style w:customStyle="1" w:styleId="DocumentationTok" w:type="character">
+    <w:name w:val="DocumentationTok"/>
+    <w:basedOn w:val="VerbatimChar"/>
+    <w:rPr>
+      <w:i/>
+      <w:color w:val="ba2121"/>
+    </w:rPr>
+  </w:style>
+  <w:style w:customStyle="1" w:styleId="AnnotationTok" w:type="character">
+    <w:name w:val="AnnotationTok"/>
+    <w:basedOn w:val="VerbatimChar"/>
+    <w:rPr>
+      <w:b/>
+      <w:i/>
+      <w:color w:val="60a0b0"/>
+    </w:rPr>
+  </w:style>
+  <w:style w:customStyle="1" w:styleId="CommentVarTok" w:type="character">
+    <w:name w:val="CommentVarTok"/>
+    <w:basedOn w:val="VerbatimChar"/>
+    <w:rPr>
+      <w:b/>
+      <w:i/>
+      <w:color w:val="60a0b0"/>
+    </w:rPr>
+  </w:style>
+  <w:style w:customStyle="1" w:styleId="OtherTok" w:type="character">
+    <w:name w:val="OtherTok"/>
+    <w:basedOn w:val="VerbatimChar"/>
+    <w:rPr>
+      <w:color w:val="007020"/>
+    </w:rPr>
+  </w:style>
+  <w:style w:customStyle="1" w:styleId="FunctionTok" w:type="character">
+    <w:name w:val="FunctionTok"/>
+    <w:basedOn w:val="VerbatimChar"/>
+    <w:rPr>
+      <w:color w:val="06287e"/>
+    </w:rPr>
+  </w:style>
+  <w:style w:customStyle="1" w:styleId="VariableTok" w:type="character">
+    <w:name w:val="VariableTok"/>
+    <w:basedOn w:val="VerbatimChar"/>
+    <w:rPr>
+      <w:color w:val="19177c"/>
+    </w:rPr>
+  </w:style>
+  <w:style w:customStyle="1" w:styleId="ControlFlowTok" w:type="character">
+    <w:name w:val="ControlFlowTok"/>
+    <w:basedOn w:val="VerbatimChar"/>
+    <w:rPr>
+      <w:b/>
+      <w:color w:val="007020"/>
+    </w:rPr>
+  </w:style>
+  <w:style w:customStyle="1" w:styleId="OperatorTok" w:type="character">
+    <w:name w:val="OperatorTok"/>
+    <w:basedOn w:val="VerbatimChar"/>
+    <w:rPr>
+      <w:color w:val="666666"/>
+    </w:rPr>
+  </w:style>
+  <w:style w:customStyle="1" w:styleId="BuiltInTok" w:type="character">
+    <w:name w:val="BuiltInTok"/>
+    <w:basedOn w:val="VerbatimChar"/>
+    <w:rPr>
+      <w:color w:val="008000"/>
+    </w:rPr>
+  </w:style>
+  <w:style w:customStyle="1" w:styleId="ExtensionTok" w:type="character">
+    <w:name w:val="ExtensionTok"/>
+    <w:basedOn w:val="VerbatimChar"/>
+    <w:rPr/>
+  </w:style>
+  <w:style w:customStyle="1" w:styleId="PreprocessorTok" w:type="character">
+    <w:name w:val="PreprocessorTok"/>
+    <w:basedOn w:val="VerbatimChar"/>
+    <w:rPr>
+      <w:color w:val="bc7a00"/>
+    </w:rPr>
+  </w:style>
+  <w:style w:customStyle="1" w:styleId="AttributeTok" w:type="character">
+    <w:name w:val="AttributeTok"/>
+    <w:basedOn w:val="VerbatimChar"/>
+    <w:rPr>
+      <w:color w:val="7d9029"/>
+    </w:rPr>
+  </w:style>
+  <w:style w:customStyle="1" w:styleId="RegionMarkerTok" w:type="character">
+    <w:name w:val="RegionMarkerTok"/>
+    <w:basedOn w:val="VerbatimChar"/>
+    <w:rPr/>
+  </w:style>
+  <w:style w:customStyle="1" w:styleId="InformationTok" w:type="character">
+    <w:name w:val="InformationTok"/>
+    <w:basedOn w:val="VerbatimChar"/>
+    <w:rPr>
+      <w:b/>
+      <w:i/>
+      <w:color w:val="60a0b0"/>
+    </w:rPr>
+  </w:style>
+  <w:style w:customStyle="1" w:styleId="WarningTok" w:type="character">
+    <w:name w:val="WarningTok"/>
+    <w:basedOn w:val="VerbatimChar"/>
+    <w:rPr>
+      <w:b/>
+      <w:i/>
+      <w:color w:val="60a0b0"/>
+    </w:rPr>
+  </w:style>
+  <w:style w:customStyle="1" w:styleId="AlertTok" w:type="character">
+    <w:name w:val="AlertTok"/>
+    <w:basedOn w:val="VerbatimChar"/>
+    <w:rPr>
+      <w:b/>
+      <w:color w:val="ff0000"/>
+    </w:rPr>
+  </w:style>
+  <w:style w:customStyle="1" w:styleId="ErrorTok" w:type="character">
+    <w:name w:val="ErrorTok"/>
+    <w:basedOn w:val="VerbatimChar"/>
+    <w:rPr>
+      <w:b/>
+      <w:color w:val="ff0000"/>
+    </w:rPr>
+  </w:style>
+  <w:style w:customStyle="1" w:styleId="NormalTok" w:type="character">
+    <w:name w:val="NormalTok"/>
+    <w:basedOn w:val="VerbatimChar"/>
+    <w:rPr/>
+  </w:style>
   <w:style w:type="character" w:customStyle="1" w:styleId="KeywordTok">
     <w:name w:val="KeywordTok"/>
     <w:basedOn w:val="VerbatimChar"/>

</xml_diff>

<commit_message>
Add one more episode badge
Align Expo SDK 57 patch dependencies.

Co-authored-by: Copilot <223556219+Copilot@users.noreply.github.com>
</commit_message>
<xml_diff>
--- a/docs/BADGE-PIANO.docx
+++ b/docs/BADGE-PIANO.docx
@@ -2,7 +2,7 @@
 <file path=word/document.xml><?xml version="1.0" encoding="utf-8"?>
 <w:document xmlns:w="http://schemas.openxmlformats.org/wordprocessingml/2006/main" xmlns:m="http://schemas.openxmlformats.org/officeDocument/2006/math" xmlns:r="http://schemas.openxmlformats.org/officeDocument/2006/relationships" xmlns:o="urn:schemas-microsoft-com:office:office" xmlns:v="urn:schemas-microsoft-com:vml" xmlns:w10="urn:schemas-microsoft-com:office:word" xmlns:a="http://schemas.openxmlformats.org/drawingml/2006/main" xmlns:pic="http://schemas.openxmlformats.org/drawingml/2006/picture" xmlns:wp="http://schemas.openxmlformats.org/drawingml/2006/wordprocessingDrawing">
   <w:body>
-    <w:bookmarkStart w:id="103" w:name="badge-showtime-proposta-e-piano"/>
+    <w:bookmarkStart w:id="104" w:name="badge-showtime-proposta-e-piano"/>
     <w:p>
       <w:pPr>
         <w:pStyle w:val="Heading1"/>
@@ -91,13 +91,13 @@
         <w:t xml:space="preserve"> </w:t>
       </w:r>
       <w:r>
-        <w:t xml:space="preserve">Batch A1, Batch A2 ed Esploratore di generi (B1) pubblicati e</w:t>
+        <w:t xml:space="preserve">fino a Esploratore di generi (B1) pubblicato; Ancora un episodio</w:t>
       </w:r>
       <w:r>
         <w:t xml:space="preserve"> </w:t>
       </w:r>
       <w:r>
-        <w:t xml:space="preserve">verificati in produzione</w:t>
+        <w:t xml:space="preserve">(B2) completato localmente e in attesa di rollout</w:t>
       </w:r>
     </w:p>
     <w:p>
@@ -8089,7 +8089,7 @@
     </w:p>
     <w:bookmarkEnd w:id="73"/>
     <w:bookmarkEnd w:id="74"/>
-    <w:bookmarkStart w:id="91" w:name="piano-di-implementazione"/>
+    <w:bookmarkStart w:id="92" w:name="piano-di-implementazione"/>
     <w:p>
       <w:pPr>
         <w:pStyle w:val="Heading2"/>
@@ -11276,7 +11276,7 @@
     </w:p>
     <w:bookmarkEnd w:id="85"/>
     <w:bookmarkEnd w:id="86"/>
-    <w:bookmarkStart w:id="88" w:name="verifica-batch-b1-esploratore-di-generi"/>
+    <w:bookmarkStart w:id="87" w:name="verifica-batch-b1-esploratore-di-generi"/>
     <w:p>
       <w:pPr>
         <w:pStyle w:val="Heading3"/>
@@ -11897,7 +11897,335 @@
         <w:t xml:space="preserve">produzione senza overflow a 360/390 px.</w:t>
       </w:r>
     </w:p>
-    <w:bookmarkStart w:id="87" w:name="batch-c-diario-e-social"/>
+    <w:bookmarkEnd w:id="87"/>
+    <w:bookmarkStart w:id="89" w:name="verifica-batch-b2-ancora-un-episodio"/>
+    <w:p>
+      <w:pPr>
+        <w:pStyle w:val="Heading3"/>
+      </w:pPr>
+      <w:r>
+        <w:t xml:space="preserve">Verifica Batch B2 — Ancora un episodio</w:t>
+      </w:r>
+    </w:p>
+    <w:p>
+      <w:pPr>
+        <w:pStyle w:val="Compact"/>
+        <w:numPr>
+          <w:ilvl w:val="0"/>
+          <w:numId w:val="1084"/>
+        </w:numPr>
+      </w:pPr>
+      <w:r>
+        <w:t xml:space="preserve">migration</w:t>
+      </w:r>
+      <w:r>
+        <w:t xml:space="preserve"> </w:t>
+      </w:r>
+      <w:r>
+        <w:rPr>
+          <w:rStyle w:val="VerbatimChar"/>
+        </w:rPr>
+        <w:t xml:space="preserve">0023_one_more_episode_badge.sql</w:t>
+      </w:r>
+      <w:r>
+        <w:t xml:space="preserve"> </w:t>
+      </w:r>
+      <w:r>
+        <w:t xml:space="preserve">con soglie</w:t>
+      </w:r>
+      <w:r>
+        <w:t xml:space="preserve"> </w:t>
+      </w:r>
+      <w:r>
+        <w:rPr>
+          <w:rStyle w:val="VerbatimChar"/>
+        </w:rPr>
+        <w:t xml:space="preserve">3 / 5 / 8 / 12</w:t>
+      </w:r>
+      <w:r>
+        <w:t xml:space="preserve">;</w:t>
+      </w:r>
+    </w:p>
+    <w:p>
+      <w:pPr>
+        <w:pStyle w:val="Compact"/>
+        <w:numPr>
+          <w:ilvl w:val="0"/>
+          <w:numId w:val="1084"/>
+        </w:numPr>
+      </w:pPr>
+      <w:r>
+        <w:t xml:space="preserve">usa soltanto</w:t>
+      </w:r>
+      <w:r>
+        <w:t xml:space="preserve"> </w:t>
+      </w:r>
+      <w:r>
+        <w:rPr>
+          <w:rStyle w:val="VerbatimChar"/>
+        </w:rPr>
+        <w:t xml:space="preserve">episode_watches.source = tracked</w:t>
+      </w:r>
+      <w:r>
+        <w:t xml:space="preserve">;</w:t>
+      </w:r>
+    </w:p>
+    <w:p>
+      <w:pPr>
+        <w:pStyle w:val="Compact"/>
+        <w:numPr>
+          <w:ilvl w:val="0"/>
+          <w:numId w:val="1084"/>
+        </w:numPr>
+      </w:pPr>
+      <w:r>
+        <w:t xml:space="preserve">raggruppa gli episodi per stessa serie e stessa data reale;</w:t>
+      </w:r>
+    </w:p>
+    <w:p>
+      <w:pPr>
+        <w:pStyle w:val="Compact"/>
+        <w:numPr>
+          <w:ilvl w:val="0"/>
+          <w:numId w:val="1084"/>
+        </w:numPr>
+      </w:pPr>
+      <w:r>
+        <w:t xml:space="preserve">deduplica la coppia stagione + episodio;</w:t>
+      </w:r>
+    </w:p>
+    <w:p>
+      <w:pPr>
+        <w:pStyle w:val="Compact"/>
+        <w:numPr>
+          <w:ilvl w:val="0"/>
+          <w:numId w:val="1084"/>
+        </w:numPr>
+      </w:pPr>
+      <w:r>
+        <w:t xml:space="preserve">non combina serie o date differenti;</w:t>
+      </w:r>
+    </w:p>
+    <w:p>
+      <w:pPr>
+        <w:pStyle w:val="Compact"/>
+        <w:numPr>
+          <w:ilvl w:val="0"/>
+          <w:numId w:val="1084"/>
+        </w:numPr>
+      </w:pPr>
+      <w:r>
+        <w:t xml:space="preserve">in caso di parità usa il gruppo più recente;</w:t>
+      </w:r>
+    </w:p>
+    <w:p>
+      <w:pPr>
+        <w:pStyle w:val="Compact"/>
+        <w:numPr>
+          <w:ilvl w:val="0"/>
+          <w:numId w:val="1084"/>
+        </w:numPr>
+      </w:pPr>
+      <w:r>
+        <w:t xml:space="preserve">Stagione 0 / Speciali esclusa;</w:t>
+      </w:r>
+    </w:p>
+    <w:p>
+      <w:pPr>
+        <w:pStyle w:val="Compact"/>
+        <w:numPr>
+          <w:ilvl w:val="0"/>
+          <w:numId w:val="1084"/>
+        </w:numPr>
+      </w:pPr>
+      <w:r>
+        <w:t xml:space="preserve">episodi importati esclusi;</w:t>
+      </w:r>
+    </w:p>
+    <w:p>
+      <w:pPr>
+        <w:pStyle w:val="Compact"/>
+        <w:numPr>
+          <w:ilvl w:val="0"/>
+          <w:numId w:val="1084"/>
+        </w:numPr>
+      </w:pPr>
+      <w:r>
+        <w:t xml:space="preserve">evidenza privata limitata agli ID tecnici del gruppo determinante e alla data;</w:t>
+      </w:r>
+    </w:p>
+    <w:p>
+      <w:pPr>
+        <w:pStyle w:val="Compact"/>
+        <w:numPr>
+          <w:ilvl w:val="0"/>
+          <w:numId w:val="1084"/>
+        </w:numPr>
+      </w:pPr>
+      <w:r>
+        <w:t xml:space="preserve">rivalutazioni dopo spunta singola, stagione in blocco e cambio origine;</w:t>
+      </w:r>
+    </w:p>
+    <w:p>
+      <w:pPr>
+        <w:pStyle w:val="Compact"/>
+        <w:numPr>
+          <w:ilvl w:val="0"/>
+          <w:numId w:val="1084"/>
+        </w:numPr>
+      </w:pPr>
+      <w:r>
+        <w:t xml:space="preserve">patch originale a pila di episodi numerati;</w:t>
+      </w:r>
+    </w:p>
+    <w:p>
+      <w:pPr>
+        <w:pStyle w:val="Compact"/>
+        <w:numPr>
+          <w:ilvl w:val="0"/>
+          <w:numId w:val="1084"/>
+        </w:numPr>
+      </w:pPr>
+      <w:r>
+        <w:t xml:space="preserve">preview locale:</w:t>
+      </w:r>
+      <w:r>
+        <w:t xml:space="preserve"> </w:t>
+      </w:r>
+      <w:r>
+        <w:rPr>
+          <w:rStyle w:val="VerbatimChar"/>
+        </w:rPr>
+        <w:t xml:space="preserve">Ancora un episodio 0/4</w:t>
+      </w:r>
+      <w:r>
+        <w:t xml:space="preserve">, progresso</w:t>
+      </w:r>
+      <w:r>
+        <w:t xml:space="preserve"> </w:t>
+      </w:r>
+      <w:r>
+        <w:rPr>
+          <w:rStyle w:val="VerbatimChar"/>
+        </w:rPr>
+        <w:t xml:space="preserve">2/3</w:t>
+      </w:r>
+      <w:r>
+        <w:t xml:space="preserve">, hero</w:t>
+      </w:r>
+      <w:r>
+        <w:t xml:space="preserve"> </w:t>
+      </w:r>
+      <w:r>
+        <w:rPr>
+          <w:rStyle w:val="VerbatimChar"/>
+        </w:rPr>
+        <w:t xml:space="preserve">3/27</w:t>
+      </w:r>
+      <w:r>
+        <w:t xml:space="preserve">;</w:t>
+      </w:r>
+    </w:p>
+    <w:p>
+      <w:pPr>
+        <w:pStyle w:val="Compact"/>
+        <w:numPr>
+          <w:ilvl w:val="0"/>
+          <w:numId w:val="1084"/>
+        </w:numPr>
+      </w:pPr>
+      <w:r>
+        <w:t xml:space="preserve">patch e accordion verificati senza overflow a 360 e 390 px;</w:t>
+      </w:r>
+    </w:p>
+    <w:p>
+      <w:pPr>
+        <w:pStyle w:val="Compact"/>
+        <w:numPr>
+          <w:ilvl w:val="0"/>
+          <w:numId w:val="1084"/>
+        </w:numPr>
+      </w:pPr>
+      <w:r>
+        <w:t xml:space="preserve">dati reali attuali: progresso atteso</w:t>
+      </w:r>
+      <w:r>
+        <w:t xml:space="preserve"> </w:t>
+      </w:r>
+      <w:r>
+        <w:rPr>
+          <w:rStyle w:val="VerbatimChar"/>
+        </w:rPr>
+        <w:t xml:space="preserve">0/3</w:t>
+      </w:r>
+      <w:r>
+        <w:t xml:space="preserve"> </w:t>
+      </w:r>
+      <w:r>
+        <w:t xml:space="preserve">su account principale e Test;</w:t>
+      </w:r>
+    </w:p>
+    <w:p>
+      <w:pPr>
+        <w:pStyle w:val="Compact"/>
+        <w:numPr>
+          <w:ilvl w:val="0"/>
+          <w:numId w:val="1084"/>
+        </w:numPr>
+      </w:pPr>
+      <w:r>
+        <w:rPr>
+          <w:rStyle w:val="VerbatimChar"/>
+        </w:rPr>
+        <w:t xml:space="preserve">33/33</w:t>
+      </w:r>
+      <w:r>
+        <w:t xml:space="preserve"> </w:t>
+      </w:r>
+      <w:r>
+        <w:t xml:space="preserve">test engine superati;</w:t>
+      </w:r>
+    </w:p>
+    <w:p>
+      <w:pPr>
+        <w:pStyle w:val="Compact"/>
+        <w:numPr>
+          <w:ilvl w:val="0"/>
+          <w:numId w:val="1084"/>
+        </w:numPr>
+      </w:pPr>
+      <w:r>
+        <w:t xml:space="preserve">test SQL transazionale pronto per soglia</w:t>
+      </w:r>
+      <w:r>
+        <w:t xml:space="preserve"> </w:t>
+      </w:r>
+      <w:r>
+        <w:rPr>
+          <w:rStyle w:val="VerbatimChar"/>
+        </w:rPr>
+        <w:t xml:space="preserve">8</w:t>
+      </w:r>
+      <w:r>
+        <w:t xml:space="preserve">, regressione a</w:t>
+      </w:r>
+      <w:r>
+        <w:t xml:space="preserve"> </w:t>
+      </w:r>
+      <w:r>
+        <w:rPr>
+          <w:rStyle w:val="VerbatimChar"/>
+        </w:rPr>
+        <w:t xml:space="preserve">0</w:t>
+      </w:r>
+      <w:r>
+        <w:t xml:space="preserve"> </w:t>
+      </w:r>
+      <w:r>
+        <w:t xml:space="preserve">e permanenza.</w:t>
+      </w:r>
+    </w:p>
+    <w:bookmarkStart w:id="88" w:name="batch-c-diario-e-social"/>
     <w:p>
       <w:pPr>
         <w:pStyle w:val="Heading4"/>
@@ -11911,7 +12239,7 @@
         <w:pStyle w:val="Compact"/>
         <w:numPr>
           <w:ilvl w:val="0"/>
-          <w:numId w:val="1084"/>
+          <w:numId w:val="1085"/>
         </w:numPr>
       </w:pPr>
       <w:r>
@@ -11923,16 +12251,16 @@
         <w:pStyle w:val="Compact"/>
         <w:numPr>
           <w:ilvl w:val="0"/>
-          <w:numId w:val="1085"/>
+          <w:numId w:val="1086"/>
         </w:numPr>
       </w:pPr>
       <w:r>
         <w:t xml:space="preserve">Passaparola</w:t>
       </w:r>
     </w:p>
-    <w:bookmarkEnd w:id="87"/>
     <w:bookmarkEnd w:id="88"/>
-    <w:bookmarkStart w:id="89" w:name="fase-4-profilo-e-rifiniture"/>
+    <w:bookmarkEnd w:id="89"/>
+    <w:bookmarkStart w:id="90" w:name="fase-4-profilo-e-rifiniture"/>
     <w:p>
       <w:pPr>
         <w:pStyle w:val="Heading3"/>
@@ -11946,7 +12274,7 @@
         <w:pStyle w:val="Compact"/>
         <w:numPr>
           <w:ilvl w:val="0"/>
-          <w:numId w:val="1086"/>
+          <w:numId w:val="1087"/>
         </w:numPr>
       </w:pPr>
       <w:r>
@@ -11958,7 +12286,7 @@
         <w:pStyle w:val="Compact"/>
         <w:numPr>
           <w:ilvl w:val="0"/>
-          <w:numId w:val="1087"/>
+          <w:numId w:val="1088"/>
         </w:numPr>
       </w:pPr>
       <w:r>
@@ -11970,7 +12298,7 @@
         <w:pStyle w:val="Compact"/>
         <w:numPr>
           <w:ilvl w:val="0"/>
-          <w:numId w:val="1088"/>
+          <w:numId w:val="1089"/>
         </w:numPr>
       </w:pPr>
       <w:r>
@@ -11982,7 +12310,7 @@
         <w:pStyle w:val="Compact"/>
         <w:numPr>
           <w:ilvl w:val="0"/>
-          <w:numId w:val="1089"/>
+          <w:numId w:val="1090"/>
         </w:numPr>
       </w:pPr>
       <w:r>
@@ -11994,7 +12322,7 @@
         <w:pStyle w:val="Compact"/>
         <w:numPr>
           <w:ilvl w:val="0"/>
-          <w:numId w:val="1090"/>
+          <w:numId w:val="1091"/>
         </w:numPr>
       </w:pPr>
       <w:r>
@@ -12006,15 +12334,15 @@
         <w:pStyle w:val="Compact"/>
         <w:numPr>
           <w:ilvl w:val="0"/>
-          <w:numId w:val="1091"/>
+          <w:numId w:val="1092"/>
         </w:numPr>
       </w:pPr>
       <w:r>
         <w:t xml:space="preserve">Riconciliazione completa</w:t>
       </w:r>
     </w:p>
-    <w:bookmarkEnd w:id="89"/>
-    <w:bookmarkStart w:id="90" w:name="fase-5-crediti-tmdb"/>
+    <w:bookmarkEnd w:id="90"/>
+    <w:bookmarkStart w:id="91" w:name="fase-5-crediti-tmdb"/>
     <w:p>
       <w:pPr>
         <w:pStyle w:val="Heading3"/>
@@ -12028,7 +12356,7 @@
         <w:pStyle w:val="Compact"/>
         <w:numPr>
           <w:ilvl w:val="0"/>
-          <w:numId w:val="1092"/>
+          <w:numId w:val="1093"/>
         </w:numPr>
       </w:pPr>
       <w:r>
@@ -12040,7 +12368,7 @@
         <w:pStyle w:val="Compact"/>
         <w:numPr>
           <w:ilvl w:val="0"/>
-          <w:numId w:val="1093"/>
+          <w:numId w:val="1094"/>
         </w:numPr>
       </w:pPr>
       <w:r>
@@ -12052,7 +12380,7 @@
         <w:pStyle w:val="Compact"/>
         <w:numPr>
           <w:ilvl w:val="0"/>
-          <w:numId w:val="1094"/>
+          <w:numId w:val="1095"/>
         </w:numPr>
       </w:pPr>
       <w:r>
@@ -12064,7 +12392,7 @@
         <w:pStyle w:val="Compact"/>
         <w:numPr>
           <w:ilvl w:val="0"/>
-          <w:numId w:val="1095"/>
+          <w:numId w:val="1096"/>
         </w:numPr>
       </w:pPr>
       <w:r>
@@ -12076,7 +12404,7 @@
         <w:pStyle w:val="Compact"/>
         <w:numPr>
           <w:ilvl w:val="0"/>
-          <w:numId w:val="1096"/>
+          <w:numId w:val="1097"/>
         </w:numPr>
       </w:pPr>
       <w:r>
@@ -12088,7 +12416,7 @@
         <w:pStyle w:val="Compact"/>
         <w:numPr>
           <w:ilvl w:val="0"/>
-          <w:numId w:val="1097"/>
+          <w:numId w:val="1098"/>
         </w:numPr>
       </w:pPr>
       <w:r>
@@ -12100,7 +12428,7 @@
         <w:pStyle w:val="Compact"/>
         <w:numPr>
           <w:ilvl w:val="0"/>
-          <w:numId w:val="1098"/>
+          <w:numId w:val="1099"/>
         </w:numPr>
       </w:pPr>
       <w:r>
@@ -12114,9 +12442,9 @@
         </w:pict>
       </w:r>
     </w:p>
-    <w:bookmarkEnd w:id="90"/>
     <w:bookmarkEnd w:id="91"/>
-    <w:bookmarkStart w:id="92" w:name="criteri-di-accettazione-v1"/>
+    <w:bookmarkEnd w:id="92"/>
+    <w:bookmarkStart w:id="93" w:name="criteri-di-accettazione-v1"/>
     <w:p>
       <w:pPr>
         <w:pStyle w:val="Heading2"/>
@@ -12130,7 +12458,7 @@
         <w:pStyle w:val="Compact"/>
         <w:numPr>
           <w:ilvl w:val="0"/>
-          <w:numId w:val="1099"/>
+          <w:numId w:val="1100"/>
         </w:numPr>
       </w:pPr>
       <w:r>
@@ -12142,7 +12470,7 @@
         <w:pStyle w:val="Compact"/>
         <w:numPr>
           <w:ilvl w:val="0"/>
-          <w:numId w:val="1099"/>
+          <w:numId w:val="1100"/>
         </w:numPr>
       </w:pPr>
       <w:r>
@@ -12154,7 +12482,7 @@
         <w:pStyle w:val="Compact"/>
         <w:numPr>
           <w:ilvl w:val="0"/>
-          <w:numId w:val="1099"/>
+          <w:numId w:val="1100"/>
         </w:numPr>
       </w:pPr>
       <w:r>
@@ -12166,7 +12494,7 @@
         <w:pStyle w:val="Compact"/>
         <w:numPr>
           <w:ilvl w:val="0"/>
-          <w:numId w:val="1099"/>
+          <w:numId w:val="1100"/>
         </w:numPr>
       </w:pPr>
       <w:r>
@@ -12178,7 +12506,7 @@
         <w:pStyle w:val="Compact"/>
         <w:numPr>
           <w:ilvl w:val="0"/>
-          <w:numId w:val="1099"/>
+          <w:numId w:val="1100"/>
         </w:numPr>
       </w:pPr>
       <w:r>
@@ -12190,7 +12518,7 @@
         <w:pStyle w:val="Compact"/>
         <w:numPr>
           <w:ilvl w:val="0"/>
-          <w:numId w:val="1099"/>
+          <w:numId w:val="1100"/>
         </w:numPr>
       </w:pPr>
       <w:r>
@@ -12202,7 +12530,7 @@
         <w:pStyle w:val="Compact"/>
         <w:numPr>
           <w:ilvl w:val="0"/>
-          <w:numId w:val="1099"/>
+          <w:numId w:val="1100"/>
         </w:numPr>
       </w:pPr>
       <w:r>
@@ -12214,7 +12542,7 @@
         <w:pStyle w:val="Compact"/>
         <w:numPr>
           <w:ilvl w:val="0"/>
-          <w:numId w:val="1099"/>
+          <w:numId w:val="1100"/>
         </w:numPr>
       </w:pPr>
       <w:r>
@@ -12226,7 +12554,7 @@
         <w:pStyle w:val="Compact"/>
         <w:numPr>
           <w:ilvl w:val="0"/>
-          <w:numId w:val="1099"/>
+          <w:numId w:val="1100"/>
         </w:numPr>
       </w:pPr>
       <w:r>
@@ -12238,7 +12566,7 @@
         <w:pStyle w:val="Compact"/>
         <w:numPr>
           <w:ilvl w:val="0"/>
-          <w:numId w:val="1099"/>
+          <w:numId w:val="1100"/>
         </w:numPr>
       </w:pPr>
       <w:r>
@@ -12252,8 +12580,8 @@
         </w:pict>
       </w:r>
     </w:p>
-    <w:bookmarkEnd w:id="92"/>
-    <w:bookmarkStart w:id="101" w:name="decisioni-v1-confermate"/>
+    <w:bookmarkEnd w:id="93"/>
+    <w:bookmarkStart w:id="102" w:name="decisioni-v1-confermate"/>
     <w:p>
       <w:pPr>
         <w:pStyle w:val="Heading2"/>
@@ -12262,7 +12590,7 @@
         <w:t xml:space="preserve">12. Decisioni V1 confermate</w:t>
       </w:r>
     </w:p>
-    <w:bookmarkStart w:id="93" w:name="nomi"/>
+    <w:bookmarkStart w:id="94" w:name="nomi"/>
     <w:p>
       <w:pPr>
         <w:pStyle w:val="Heading3"/>
@@ -12276,7 +12604,7 @@
         <w:pStyle w:val="Compact"/>
         <w:numPr>
           <w:ilvl w:val="0"/>
-          <w:numId w:val="1100"/>
+          <w:numId w:val="1101"/>
         </w:numPr>
       </w:pPr>
       <w:r>
@@ -12288,7 +12616,7 @@
         <w:pStyle w:val="Compact"/>
         <w:numPr>
           <w:ilvl w:val="0"/>
-          <w:numId w:val="1101"/>
+          <w:numId w:val="1102"/>
         </w:numPr>
       </w:pPr>
       <w:r>
@@ -12300,7 +12628,7 @@
         <w:pStyle w:val="Compact"/>
         <w:numPr>
           <w:ilvl w:val="0"/>
-          <w:numId w:val="1102"/>
+          <w:numId w:val="1103"/>
         </w:numPr>
       </w:pPr>
       <w:r>
@@ -12312,7 +12640,7 @@
         <w:pStyle w:val="Compact"/>
         <w:numPr>
           <w:ilvl w:val="0"/>
-          <w:numId w:val="1103"/>
+          <w:numId w:val="1104"/>
         </w:numPr>
       </w:pPr>
       <w:r>
@@ -12324,15 +12652,15 @@
         <w:pStyle w:val="Compact"/>
         <w:numPr>
           <w:ilvl w:val="0"/>
-          <w:numId w:val="1104"/>
+          <w:numId w:val="1105"/>
         </w:numPr>
       </w:pPr>
       <w:r>
         <w:t xml:space="preserve">“Coppia d’oro”</w:t>
       </w:r>
     </w:p>
-    <w:bookmarkEnd w:id="93"/>
-    <w:bookmarkStart w:id="94" w:name="soglie"/>
+    <w:bookmarkEnd w:id="94"/>
+    <w:bookmarkStart w:id="95" w:name="soglie"/>
     <w:p>
       <w:pPr>
         <w:pStyle w:val="Heading3"/>
@@ -12346,7 +12674,7 @@
         <w:pStyle w:val="Compact"/>
         <w:numPr>
           <w:ilvl w:val="0"/>
-          <w:numId w:val="1105"/>
+          <w:numId w:val="1106"/>
         </w:numPr>
       </w:pPr>
       <w:r>
@@ -12358,7 +12686,7 @@
         <w:pStyle w:val="Compact"/>
         <w:numPr>
           <w:ilvl w:val="0"/>
-          <w:numId w:val="1106"/>
+          <w:numId w:val="1107"/>
         </w:numPr>
       </w:pPr>
       <w:r>
@@ -12370,7 +12698,7 @@
         <w:pStyle w:val="Compact"/>
         <w:numPr>
           <w:ilvl w:val="0"/>
-          <w:numId w:val="1107"/>
+          <w:numId w:val="1108"/>
         </w:numPr>
       </w:pPr>
       <w:r>
@@ -12382,7 +12710,7 @@
         <w:pStyle w:val="Compact"/>
         <w:numPr>
           <w:ilvl w:val="0"/>
-          <w:numId w:val="1108"/>
+          <w:numId w:val="1109"/>
         </w:numPr>
       </w:pPr>
       <w:r>
@@ -12394,7 +12722,7 @@
         <w:pStyle w:val="Compact"/>
         <w:numPr>
           <w:ilvl w:val="0"/>
-          <w:numId w:val="1109"/>
+          <w:numId w:val="1110"/>
         </w:numPr>
       </w:pPr>
       <w:r>
@@ -12406,7 +12734,7 @@
         <w:pStyle w:val="Compact"/>
         <w:numPr>
           <w:ilvl w:val="0"/>
-          <w:numId w:val="1110"/>
+          <w:numId w:val="1111"/>
         </w:numPr>
       </w:pPr>
       <w:r>
@@ -12418,15 +12746,15 @@
         <w:pStyle w:val="Compact"/>
         <w:numPr>
           <w:ilvl w:val="0"/>
-          <w:numId w:val="1111"/>
+          <w:numId w:val="1112"/>
         </w:numPr>
       </w:pPr>
       <w:r>
         <w:t xml:space="preserve">Critico conta tutte le voci distinte con nota, incluse revisioni e rewatch</w:t>
       </w:r>
     </w:p>
-    <w:bookmarkEnd w:id="94"/>
-    <w:bookmarkStart w:id="95" w:name="badge-introduttivi-1"/>
+    <w:bookmarkEnd w:id="95"/>
+    <w:bookmarkStart w:id="96" w:name="badge-introduttivi-1"/>
     <w:p>
       <w:pPr>
         <w:pStyle w:val="Heading3"/>
@@ -12440,7 +12768,7 @@
         <w:pStyle w:val="Compact"/>
         <w:numPr>
           <w:ilvl w:val="0"/>
-          <w:numId w:val="1112"/>
+          <w:numId w:val="1113"/>
         </w:numPr>
       </w:pPr>
       <w:r>
@@ -12452,7 +12780,7 @@
         <w:pStyle w:val="Compact"/>
         <w:numPr>
           <w:ilvl w:val="0"/>
-          <w:numId w:val="1113"/>
+          <w:numId w:val="1114"/>
         </w:numPr>
       </w:pPr>
       <w:r>
@@ -12464,7 +12792,7 @@
         <w:pStyle w:val="Compact"/>
         <w:numPr>
           <w:ilvl w:val="0"/>
-          <w:numId w:val="1114"/>
+          <w:numId w:val="1115"/>
         </w:numPr>
       </w:pPr>
       <w:r>
@@ -12476,7 +12804,7 @@
         <w:pStyle w:val="Compact"/>
         <w:numPr>
           <w:ilvl w:val="0"/>
-          <w:numId w:val="1115"/>
+          <w:numId w:val="1116"/>
         </w:numPr>
       </w:pPr>
       <w:r>
@@ -12488,15 +12816,15 @@
         <w:pStyle w:val="Compact"/>
         <w:numPr>
           <w:ilvl w:val="0"/>
-          <w:numId w:val="1116"/>
+          <w:numId w:val="1117"/>
         </w:numPr>
       </w:pPr>
       <w:r>
         <w:t xml:space="preserve">Stagione 0 / Speciali esclusa da Stagione chiusa</w:t>
       </w:r>
     </w:p>
-    <w:bookmarkEnd w:id="95"/>
-    <w:bookmarkStart w:id="96" w:name="serie-completata"/>
+    <w:bookmarkEnd w:id="96"/>
+    <w:bookmarkStart w:id="97" w:name="serie-completata"/>
     <w:p>
       <w:pPr>
         <w:pStyle w:val="Heading3"/>
@@ -12510,7 +12838,7 @@
         <w:pStyle w:val="Compact"/>
         <w:numPr>
           <w:ilvl w:val="0"/>
-          <w:numId w:val="1117"/>
+          <w:numId w:val="1118"/>
         </w:numPr>
       </w:pPr>
       <w:r>
@@ -12531,7 +12859,7 @@
         <w:pStyle w:val="Compact"/>
         <w:numPr>
           <w:ilvl w:val="0"/>
-          <w:numId w:val="1118"/>
+          <w:numId w:val="1119"/>
         </w:numPr>
       </w:pPr>
       <w:r>
@@ -12543,7 +12871,7 @@
         <w:pStyle w:val="Compact"/>
         <w:numPr>
           <w:ilvl w:val="0"/>
-          <w:numId w:val="1119"/>
+          <w:numId w:val="1120"/>
         </w:numPr>
       </w:pPr>
       <w:r>
@@ -12555,15 +12883,15 @@
         <w:pStyle w:val="Compact"/>
         <w:numPr>
           <w:ilvl w:val="0"/>
-          <w:numId w:val="1120"/>
+          <w:numId w:val="1121"/>
         </w:numPr>
       </w:pPr>
       <w:r>
         <w:t xml:space="preserve">Sblocco permanente anche dopo modifiche ai metadati TMDB</w:t>
       </w:r>
     </w:p>
-    <w:bookmarkEnd w:id="96"/>
-    <w:bookmarkStart w:id="97" w:name="generi-canonici"/>
+    <w:bookmarkEnd w:id="97"/>
+    <w:bookmarkStart w:id="98" w:name="generi-canonici"/>
     <w:p>
       <w:pPr>
         <w:pStyle w:val="Heading3"/>
@@ -12577,7 +12905,7 @@
         <w:pStyle w:val="Compact"/>
         <w:numPr>
           <w:ilvl w:val="0"/>
-          <w:numId w:val="1121"/>
+          <w:numId w:val="1122"/>
         </w:numPr>
       </w:pPr>
       <w:r>
@@ -12589,7 +12917,7 @@
         <w:pStyle w:val="Compact"/>
         <w:numPr>
           <w:ilvl w:val="0"/>
-          <w:numId w:val="1122"/>
+          <w:numId w:val="1123"/>
         </w:numPr>
       </w:pPr>
       <w:r>
@@ -12601,7 +12929,7 @@
         <w:pStyle w:val="Compact"/>
         <w:numPr>
           <w:ilvl w:val="0"/>
-          <w:numId w:val="1123"/>
+          <w:numId w:val="1124"/>
         </w:numPr>
       </w:pPr>
       <w:r>
@@ -12613,7 +12941,7 @@
         <w:pStyle w:val="Compact"/>
         <w:numPr>
           <w:ilvl w:val="0"/>
-          <w:numId w:val="1124"/>
+          <w:numId w:val="1125"/>
         </w:numPr>
       </w:pPr>
       <w:r>
@@ -13041,8 +13369,8 @@
         <w:t xml:space="preserve">genere narrativo. Gli altri generi associati allo stesso titolo restano validi.</w:t>
       </w:r>
     </w:p>
-    <w:bookmarkEnd w:id="97"/>
-    <w:bookmarkStart w:id="98" w:name="social"/>
+    <w:bookmarkEnd w:id="98"/>
+    <w:bookmarkStart w:id="99" w:name="social"/>
     <w:p>
       <w:pPr>
         <w:pStyle w:val="Heading3"/>
@@ -13056,7 +13384,7 @@
         <w:pStyle w:val="Compact"/>
         <w:numPr>
           <w:ilvl w:val="0"/>
-          <w:numId w:val="1125"/>
+          <w:numId w:val="1126"/>
         </w:numPr>
       </w:pPr>
       <w:r>
@@ -13068,7 +13396,7 @@
         <w:pStyle w:val="Compact"/>
         <w:numPr>
           <w:ilvl w:val="0"/>
-          <w:numId w:val="1126"/>
+          <w:numId w:val="1127"/>
         </w:numPr>
       </w:pPr>
       <w:r>
@@ -13080,7 +13408,7 @@
         <w:pStyle w:val="Compact"/>
         <w:numPr>
           <w:ilvl w:val="0"/>
-          <w:numId w:val="1127"/>
+          <w:numId w:val="1128"/>
         </w:numPr>
       </w:pPr>
       <w:r>
@@ -13092,7 +13420,7 @@
         <w:pStyle w:val="Compact"/>
         <w:numPr>
           <w:ilvl w:val="0"/>
-          <w:numId w:val="1128"/>
+          <w:numId w:val="1129"/>
         </w:numPr>
       </w:pPr>
       <w:r>
@@ -13104,15 +13432,15 @@
         <w:pStyle w:val="Compact"/>
         <w:numPr>
           <w:ilvl w:val="0"/>
-          <w:numId w:val="1129"/>
+          <w:numId w:val="1130"/>
         </w:numPr>
       </w:pPr>
       <w:r>
         <w:t xml:space="preserve">Reinvii e riaperture non incrementano il progresso</w:t>
       </w:r>
     </w:p>
-    <w:bookmarkEnd w:id="98"/>
-    <w:bookmarkStart w:id="99" w:name="ux"/>
+    <w:bookmarkEnd w:id="99"/>
+    <w:bookmarkStart w:id="100" w:name="ux"/>
     <w:p>
       <w:pPr>
         <w:pStyle w:val="Heading3"/>
@@ -13126,7 +13454,7 @@
         <w:pStyle w:val="Compact"/>
         <w:numPr>
           <w:ilvl w:val="0"/>
-          <w:numId w:val="1130"/>
+          <w:numId w:val="1131"/>
         </w:numPr>
       </w:pPr>
       <w:r>
@@ -13138,7 +13466,7 @@
         <w:pStyle w:val="Compact"/>
         <w:numPr>
           <w:ilvl w:val="0"/>
-          <w:numId w:val="1131"/>
+          <w:numId w:val="1132"/>
         </w:numPr>
       </w:pPr>
       <w:r>
@@ -13150,7 +13478,7 @@
         <w:pStyle w:val="Compact"/>
         <w:numPr>
           <w:ilvl w:val="0"/>
-          <w:numId w:val="1132"/>
+          <w:numId w:val="1133"/>
         </w:numPr>
       </w:pPr>
       <w:r>
@@ -13162,7 +13490,7 @@
         <w:pStyle w:val="Compact"/>
         <w:numPr>
           <w:ilvl w:val="0"/>
-          <w:numId w:val="1133"/>
+          <w:numId w:val="1134"/>
         </w:numPr>
       </w:pPr>
       <w:r>
@@ -13174,7 +13502,7 @@
         <w:pStyle w:val="Compact"/>
         <w:numPr>
           <w:ilvl w:val="0"/>
-          <w:numId w:val="1134"/>
+          <w:numId w:val="1135"/>
         </w:numPr>
       </w:pPr>
       <w:r>
@@ -13186,7 +13514,7 @@
         <w:pStyle w:val="Compact"/>
         <w:numPr>
           <w:ilvl w:val="0"/>
-          <w:numId w:val="1135"/>
+          <w:numId w:val="1136"/>
         </w:numPr>
       </w:pPr>
       <w:r>
@@ -13198,7 +13526,7 @@
         <w:pStyle w:val="Compact"/>
         <w:numPr>
           <w:ilvl w:val="0"/>
-          <w:numId w:val="1136"/>
+          <w:numId w:val="1137"/>
         </w:numPr>
       </w:pPr>
       <w:r>
@@ -13210,7 +13538,7 @@
         <w:pStyle w:val="Compact"/>
         <w:numPr>
           <w:ilvl w:val="0"/>
-          <w:numId w:val="1137"/>
+          <w:numId w:val="1138"/>
         </w:numPr>
       </w:pPr>
       <w:r>
@@ -13222,7 +13550,7 @@
         <w:pStyle w:val="Compact"/>
         <w:numPr>
           <w:ilvl w:val="0"/>
-          <w:numId w:val="1138"/>
+          <w:numId w:val="1139"/>
         </w:numPr>
       </w:pPr>
       <w:r>
@@ -13234,7 +13562,7 @@
         <w:pStyle w:val="Compact"/>
         <w:numPr>
           <w:ilvl w:val="0"/>
-          <w:numId w:val="1139"/>
+          <w:numId w:val="1140"/>
         </w:numPr>
       </w:pPr>
       <w:r>
@@ -13246,15 +13574,15 @@
         <w:pStyle w:val="Compact"/>
         <w:numPr>
           <w:ilvl w:val="0"/>
-          <w:numId w:val="1140"/>
+          <w:numId w:val="1141"/>
         </w:numPr>
       </w:pPr>
       <w:r>
         <w:t xml:space="preserve">Banner di sblocco con sfondo pieno, senza trasparenza</w:t>
       </w:r>
     </w:p>
-    <w:bookmarkEnd w:id="99"/>
-    <w:bookmarkStart w:id="100" w:name="operatività"/>
+    <w:bookmarkEnd w:id="100"/>
+    <w:bookmarkStart w:id="101" w:name="operatività"/>
     <w:p>
       <w:pPr>
         <w:pStyle w:val="Heading3"/>
@@ -13268,7 +13596,7 @@
         <w:pStyle w:val="Compact"/>
         <w:numPr>
           <w:ilvl w:val="0"/>
-          <w:numId w:val="1141"/>
+          <w:numId w:val="1142"/>
         </w:numPr>
       </w:pPr>
       <w:r>
@@ -13280,7 +13608,7 @@
         <w:pStyle w:val="Compact"/>
         <w:numPr>
           <w:ilvl w:val="0"/>
-          <w:numId w:val="1142"/>
+          <w:numId w:val="1143"/>
         </w:numPr>
       </w:pPr>
       <w:r>
@@ -13292,7 +13620,7 @@
         <w:pStyle w:val="Compact"/>
         <w:numPr>
           <w:ilvl w:val="0"/>
-          <w:numId w:val="1143"/>
+          <w:numId w:val="1144"/>
         </w:numPr>
       </w:pPr>
       <w:r>
@@ -13304,7 +13632,7 @@
         <w:pStyle w:val="Compact"/>
         <w:numPr>
           <w:ilvl w:val="0"/>
-          <w:numId w:val="1144"/>
+          <w:numId w:val="1145"/>
         </w:numPr>
       </w:pPr>
       <w:r>
@@ -13325,7 +13653,7 @@
         <w:pStyle w:val="Compact"/>
         <w:numPr>
           <w:ilvl w:val="0"/>
-          <w:numId w:val="1145"/>
+          <w:numId w:val="1146"/>
         </w:numPr>
       </w:pPr>
       <w:r>
@@ -13337,7 +13665,7 @@
         <w:pStyle w:val="Compact"/>
         <w:numPr>
           <w:ilvl w:val="0"/>
-          <w:numId w:val="1146"/>
+          <w:numId w:val="1147"/>
         </w:numPr>
       </w:pPr>
       <w:r>
@@ -13349,7 +13677,7 @@
         <w:pStyle w:val="Compact"/>
         <w:numPr>
           <w:ilvl w:val="0"/>
-          <w:numId w:val="1147"/>
+          <w:numId w:val="1148"/>
         </w:numPr>
       </w:pPr>
       <w:r>
@@ -13361,7 +13689,7 @@
         <w:pStyle w:val="Compact"/>
         <w:numPr>
           <w:ilvl w:val="0"/>
-          <w:numId w:val="1148"/>
+          <w:numId w:val="1149"/>
         </w:numPr>
       </w:pPr>
       <w:r>
@@ -13373,7 +13701,7 @@
         <w:pStyle w:val="Compact"/>
         <w:numPr>
           <w:ilvl w:val="0"/>
-          <w:numId w:val="1149"/>
+          <w:numId w:val="1150"/>
         </w:numPr>
       </w:pPr>
       <w:r>
@@ -13385,7 +13713,7 @@
         <w:pStyle w:val="Compact"/>
         <w:numPr>
           <w:ilvl w:val="0"/>
-          <w:numId w:val="1150"/>
+          <w:numId w:val="1151"/>
         </w:numPr>
       </w:pPr>
       <w:r>
@@ -13397,7 +13725,7 @@
         <w:pStyle w:val="Compact"/>
         <w:numPr>
           <w:ilvl w:val="0"/>
-          <w:numId w:val="1151"/>
+          <w:numId w:val="1152"/>
         </w:numPr>
       </w:pPr>
       <w:r>
@@ -13409,7 +13737,7 @@
         <w:pStyle w:val="Compact"/>
         <w:numPr>
           <w:ilvl w:val="0"/>
-          <w:numId w:val="1152"/>
+          <w:numId w:val="1153"/>
         </w:numPr>
       </w:pPr>
       <w:r>
@@ -13421,7 +13749,7 @@
         <w:pStyle w:val="Compact"/>
         <w:numPr>
           <w:ilvl w:val="0"/>
-          <w:numId w:val="1153"/>
+          <w:numId w:val="1154"/>
         </w:numPr>
       </w:pPr>
       <w:r>
@@ -13433,7 +13761,7 @@
         <w:pStyle w:val="Compact"/>
         <w:numPr>
           <w:ilvl w:val="0"/>
-          <w:numId w:val="1154"/>
+          <w:numId w:val="1155"/>
         </w:numPr>
       </w:pPr>
       <w:r>
@@ -13445,7 +13773,7 @@
         <w:pStyle w:val="Compact"/>
         <w:numPr>
           <w:ilvl w:val="0"/>
-          <w:numId w:val="1155"/>
+          <w:numId w:val="1156"/>
         </w:numPr>
       </w:pPr>
       <w:r>
@@ -13457,7 +13785,7 @@
         <w:pStyle w:val="Compact"/>
         <w:numPr>
           <w:ilvl w:val="0"/>
-          <w:numId w:val="1156"/>
+          <w:numId w:val="1157"/>
         </w:numPr>
       </w:pPr>
       <w:r>
@@ -13469,7 +13797,7 @@
         <w:pStyle w:val="Compact"/>
         <w:numPr>
           <w:ilvl w:val="0"/>
-          <w:numId w:val="1157"/>
+          <w:numId w:val="1158"/>
         </w:numPr>
       </w:pPr>
       <w:r>
@@ -13481,7 +13809,7 @@
         <w:pStyle w:val="Compact"/>
         <w:numPr>
           <w:ilvl w:val="0"/>
-          <w:numId w:val="1158"/>
+          <w:numId w:val="1159"/>
         </w:numPr>
       </w:pPr>
       <w:r>
@@ -13495,9 +13823,9 @@
         </w:pict>
       </w:r>
     </w:p>
-    <w:bookmarkEnd w:id="100"/>
     <w:bookmarkEnd w:id="101"/>
-    <w:bookmarkStart w:id="102" w:name="prossimo-passo-consigliato"/>
+    <w:bookmarkEnd w:id="102"/>
+    <w:bookmarkStart w:id="103" w:name="prossimo-passo-consigliato"/>
     <w:p>
       <w:pPr>
         <w:pStyle w:val="Heading2"/>
@@ -13519,7 +13847,7 @@
         <w:pStyle w:val="BodyText"/>
       </w:pPr>
       <w:r>
-        <w:t xml:space="preserve">Il prossimo passo operativo è</w:t>
+        <w:t xml:space="preserve">Il prossimo passo operativo è completare il rollout di</w:t>
       </w:r>
       <w:r>
         <w:t xml:space="preserve"> </w:t>
@@ -13540,11 +13868,35 @@
         <w:pStyle w:val="Compact"/>
         <w:numPr>
           <w:ilvl w:val="0"/>
-          <w:numId w:val="1159"/>
-        </w:numPr>
-      </w:pPr>
-      <w:r>
-        <w:t xml:space="preserve">usare soltanto episodi</w:t>
+          <w:numId w:val="1160"/>
+        </w:numPr>
+      </w:pPr>
+      <w:r>
+        <w:t xml:space="preserve">distribuire la Edge Function aggiornata;</w:t>
+      </w:r>
+    </w:p>
+    <w:p>
+      <w:pPr>
+        <w:pStyle w:val="Compact"/>
+        <w:numPr>
+          <w:ilvl w:val="0"/>
+          <w:numId w:val="1160"/>
+        </w:numPr>
+      </w:pPr>
+      <w:r>
+        <w:t xml:space="preserve">pubblicare la patch a episodi;</w:t>
+      </w:r>
+    </w:p>
+    <w:p>
+      <w:pPr>
+        <w:pStyle w:val="Compact"/>
+        <w:numPr>
+          <w:ilvl w:val="0"/>
+          <w:numId w:val="1160"/>
+        </w:numPr>
+      </w:pPr>
+      <w:r>
+        <w:t xml:space="preserve">applicare la migration</w:t>
       </w:r>
       <w:r>
         <w:t xml:space="preserve"> </w:t>
@@ -13553,7 +13905,7 @@
         <w:rPr>
           <w:rStyle w:val="VerbatimChar"/>
         </w:rPr>
-        <w:t xml:space="preserve">tracked</w:t>
+        <w:t xml:space="preserve">0023_one_more_episode_badge.sql</w:t>
       </w:r>
       <w:r>
         <w:t xml:space="preserve">;</w:t>
@@ -13564,23 +13916,11 @@
         <w:pStyle w:val="Compact"/>
         <w:numPr>
           <w:ilvl w:val="0"/>
-          <w:numId w:val="1159"/>
-        </w:numPr>
-      </w:pPr>
-      <w:r>
-        <w:t xml:space="preserve">raggruppare per serie e data reale;</w:t>
-      </w:r>
-    </w:p>
-    <w:p>
-      <w:pPr>
-        <w:pStyle w:val="Compact"/>
-        <w:numPr>
-          <w:ilvl w:val="0"/>
-          <w:numId w:val="1159"/>
-        </w:numPr>
-      </w:pPr>
-      <w:r>
-        <w:t xml:space="preserve">applicare le soglie</w:t>
+          <w:numId w:val="1160"/>
+        </w:numPr>
+      </w:pPr>
+      <w:r>
+        <w:t xml:space="preserve">verificare backfill</w:t>
       </w:r>
       <w:r>
         <w:t xml:space="preserve"> </w:t>
@@ -13589,50 +13929,41 @@
         <w:rPr>
           <w:rStyle w:val="VerbatimChar"/>
         </w:rPr>
-        <w:t xml:space="preserve">3 / 5 / 8 / 12</w:t>
-      </w:r>
-      <w:r>
-        <w:t xml:space="preserve">;</w:t>
-      </w:r>
-    </w:p>
-    <w:p>
-      <w:pPr>
-        <w:pStyle w:val="Compact"/>
-        <w:numPr>
-          <w:ilvl w:val="0"/>
-          <w:numId w:val="1159"/>
-        </w:numPr>
-      </w:pPr>
-      <w:r>
-        <w:t xml:space="preserve">escludere episodi importati;</w:t>
-      </w:r>
-    </w:p>
-    <w:p>
-      <w:pPr>
-        <w:pStyle w:val="Compact"/>
-        <w:numPr>
-          <w:ilvl w:val="0"/>
-          <w:numId w:val="1159"/>
-        </w:numPr>
-      </w:pPr>
-      <w:r>
-        <w:t xml:space="preserve">creare patch e accordion dedicati;</w:t>
-      </w:r>
-    </w:p>
-    <w:p>
-      <w:pPr>
-        <w:pStyle w:val="Compact"/>
-        <w:numPr>
-          <w:ilvl w:val="0"/>
-          <w:numId w:val="1159"/>
-        </w:numPr>
-      </w:pPr>
-      <w:r>
-        <w:t xml:space="preserve">verificare rewatch e deduplica degli eventi.</w:t>
-      </w:r>
-    </w:p>
-    <w:bookmarkEnd w:id="102"/>
+        <w:t xml:space="preserve">0/3</w:t>
+      </w:r>
+      <w:r>
+        <w:t xml:space="preserve"> </w:t>
+      </w:r>
+      <w:r>
+        <w:t xml:space="preserve">e idempotenza sugli account reali;</w:t>
+      </w:r>
+    </w:p>
+    <w:p>
+      <w:pPr>
+        <w:pStyle w:val="Compact"/>
+        <w:numPr>
+          <w:ilvl w:val="0"/>
+          <w:numId w:val="1160"/>
+        </w:numPr>
+      </w:pPr>
+      <w:r>
+        <w:t xml:space="preserve">eseguire un test reversibile con tre episodi tracked nella stessa data;</w:t>
+      </w:r>
+    </w:p>
+    <w:p>
+      <w:pPr>
+        <w:pStyle w:val="Compact"/>
+        <w:numPr>
+          <w:ilvl w:val="0"/>
+          <w:numId w:val="1160"/>
+        </w:numPr>
+      </w:pPr>
+      <w:r>
+        <w:t xml:space="preserve">proseguire con Maratoneta.</w:t>
+      </w:r>
+    </w:p>
     <w:bookmarkEnd w:id="103"/>
+    <w:bookmarkEnd w:id="104"/>
     <w:sectPr>
       <w:footerReference r:id="rId9" w:type="default"/>
       <w:pgSz w:h="15840" w:w="12240"/>
@@ -14597,7 +14928,7 @@
     <w:abstractNumId w:val="993"/>
   </w:num>
   <w:num w:numId="1080">
-    <w:abstractNumId w:val="992"/>
+    <w:abstractNumId w:val="993"/>
   </w:num>
   <w:num w:numId="1081">
     <w:abstractNumId w:val="992"/>
@@ -14609,7 +14940,7 @@
     <w:abstractNumId w:val="991"/>
   </w:num>
   <w:num w:numId="1084">
-    <w:abstractNumId w:val="992"/>
+    <w:abstractNumId w:val="991"/>
   </w:num>
   <w:num w:numId="1085">
     <w:abstractNumId w:val="992"/>
@@ -14654,10 +14985,10 @@
     <w:abstractNumId w:val="992"/>
   </w:num>
   <w:num w:numId="1099">
-    <w:abstractNumId w:val="991"/>
+    <w:abstractNumId w:val="992"/>
   </w:num>
   <w:num w:numId="1100">
-    <w:abstractNumId w:val="993"/>
+    <w:abstractNumId w:val="991"/>
   </w:num>
   <w:num w:numId="1101">
     <w:abstractNumId w:val="993"/>
@@ -14834,6 +15165,9 @@
     <w:abstractNumId w:val="993"/>
   </w:num>
   <w:num w:numId="1159">
+    <w:abstractNumId w:val="993"/>
+  </w:num>
+  <w:num w:numId="1160">
     <w:abstractNumId w:val="99411"/>
     <w:lvlOverride w:ilvl="0">
       <w:startOverride w:val="1"/>
@@ -26725,6 +27059,232 @@
     <w:pPr>
       <w:wordWrap w:val="off"/>
     </w:pPr>
+  </w:style>
+  <w:style w:customStyle="1" w:styleId="KeywordTok" w:type="character">
+    <w:name w:val="KeywordTok"/>
+    <w:basedOn w:val="VerbatimChar"/>
+    <w:rPr>
+      <w:b/>
+      <w:color w:val="007020"/>
+    </w:rPr>
+  </w:style>
+  <w:style w:customStyle="1" w:styleId="DataTypeTok" w:type="character">
+    <w:name w:val="DataTypeTok"/>
+    <w:basedOn w:val="VerbatimChar"/>
+    <w:rPr>
+      <w:color w:val="902000"/>
+    </w:rPr>
+  </w:style>
+  <w:style w:customStyle="1" w:styleId="DecValTok" w:type="character">
+    <w:name w:val="DecValTok"/>
+    <w:basedOn w:val="VerbatimChar"/>
+    <w:rPr>
+      <w:color w:val="40a070"/>
+    </w:rPr>
+  </w:style>
+  <w:style w:customStyle="1" w:styleId="BaseNTok" w:type="character">
+    <w:name w:val="BaseNTok"/>
+    <w:basedOn w:val="VerbatimChar"/>
+    <w:rPr>
+      <w:color w:val="40a070"/>
+    </w:rPr>
+  </w:style>
+  <w:style w:customStyle="1" w:styleId="FloatTok" w:type="character">
+    <w:name w:val="FloatTok"/>
+    <w:basedOn w:val="VerbatimChar"/>
+    <w:rPr>
+      <w:color w:val="40a070"/>
+    </w:rPr>
+  </w:style>
+  <w:style w:customStyle="1" w:styleId="ConstantTok" w:type="character">
+    <w:name w:val="ConstantTok"/>
+    <w:basedOn w:val="VerbatimChar"/>
+    <w:rPr>
+      <w:color w:val="880000"/>
+    </w:rPr>
+  </w:style>
+  <w:style w:customStyle="1" w:styleId="CharTok" w:type="character">
+    <w:name w:val="CharTok"/>
+    <w:basedOn w:val="VerbatimChar"/>
+    <w:rPr>
+      <w:color w:val="4070a0"/>
+    </w:rPr>
+  </w:style>
+  <w:style w:customStyle="1" w:styleId="SpecialCharTok" w:type="character">
+    <w:name w:val="SpecialCharTok"/>
+    <w:basedOn w:val="VerbatimChar"/>
+    <w:rPr>
+      <w:color w:val="4070a0"/>
+    </w:rPr>
+  </w:style>
+  <w:style w:customStyle="1" w:styleId="StringTok" w:type="character">
+    <w:name w:val="StringTok"/>
+    <w:basedOn w:val="VerbatimChar"/>
+    <w:rPr>
+      <w:color w:val="4070a0"/>
+    </w:rPr>
+  </w:style>
+  <w:style w:customStyle="1" w:styleId="VerbatimStringTok" w:type="character">
+    <w:name w:val="VerbatimStringTok"/>
+    <w:basedOn w:val="VerbatimChar"/>
+    <w:rPr>
+      <w:color w:val="4070a0"/>
+    </w:rPr>
+  </w:style>
+  <w:style w:customStyle="1" w:styleId="SpecialStringTok" w:type="character">
+    <w:name w:val="SpecialStringTok"/>
+    <w:basedOn w:val="VerbatimChar"/>
+    <w:rPr>
+      <w:color w:val="bb6688"/>
+    </w:rPr>
+  </w:style>
+  <w:style w:customStyle="1" w:styleId="ImportTok" w:type="character">
+    <w:name w:val="ImportTok"/>
+    <w:basedOn w:val="VerbatimChar"/>
+    <w:rPr>
+      <w:b/>
+      <w:color w:val="008000"/>
+    </w:rPr>
+  </w:style>
+  <w:style w:customStyle="1" w:styleId="CommentTok" w:type="character">
+    <w:name w:val="CommentTok"/>
+    <w:basedOn w:val="VerbatimChar"/>
+    <w:rPr>
+      <w:i/>
+      <w:color w:val="60a0b0"/>
+    </w:rPr>
+  </w:style>
+  <w:style w:customStyle="1" w:styleId="DocumentationTok" w:type="character">
+    <w:name w:val="DocumentationTok"/>
+    <w:basedOn w:val="VerbatimChar"/>
+    <w:rPr>
+      <w:i/>
+      <w:color w:val="ba2121"/>
+    </w:rPr>
+  </w:style>
+  <w:style w:customStyle="1" w:styleId="AnnotationTok" w:type="character">
+    <w:name w:val="AnnotationTok"/>
+    <w:basedOn w:val="VerbatimChar"/>
+    <w:rPr>
+      <w:b/>
+      <w:i/>
+      <w:color w:val="60a0b0"/>
+    </w:rPr>
+  </w:style>
+  <w:style w:customStyle="1" w:styleId="CommentVarTok" w:type="character">
+    <w:name w:val="CommentVarTok"/>
+    <w:basedOn w:val="VerbatimChar"/>
+    <w:rPr>
+      <w:b/>
+      <w:i/>
+      <w:color w:val="60a0b0"/>
+    </w:rPr>
+  </w:style>
+  <w:style w:customStyle="1" w:styleId="OtherTok" w:type="character">
+    <w:name w:val="OtherTok"/>
+    <w:basedOn w:val="VerbatimChar"/>
+    <w:rPr>
+      <w:color w:val="007020"/>
+    </w:rPr>
+  </w:style>
+  <w:style w:customStyle="1" w:styleId="FunctionTok" w:type="character">
+    <w:name w:val="FunctionTok"/>
+    <w:basedOn w:val="VerbatimChar"/>
+    <w:rPr>
+      <w:color w:val="06287e"/>
+    </w:rPr>
+  </w:style>
+  <w:style w:customStyle="1" w:styleId="VariableTok" w:type="character">
+    <w:name w:val="VariableTok"/>
+    <w:basedOn w:val="VerbatimChar"/>
+    <w:rPr>
+      <w:color w:val="19177c"/>
+    </w:rPr>
+  </w:style>
+  <w:style w:customStyle="1" w:styleId="ControlFlowTok" w:type="character">
+    <w:name w:val="ControlFlowTok"/>
+    <w:basedOn w:val="VerbatimChar"/>
+    <w:rPr>
+      <w:b/>
+      <w:color w:val="007020"/>
+    </w:rPr>
+  </w:style>
+  <w:style w:customStyle="1" w:styleId="OperatorTok" w:type="character">
+    <w:name w:val="OperatorTok"/>
+    <w:basedOn w:val="VerbatimChar"/>
+    <w:rPr>
+      <w:color w:val="666666"/>
+    </w:rPr>
+  </w:style>
+  <w:style w:customStyle="1" w:styleId="BuiltInTok" w:type="character">
+    <w:name w:val="BuiltInTok"/>
+    <w:basedOn w:val="VerbatimChar"/>
+    <w:rPr>
+      <w:color w:val="008000"/>
+    </w:rPr>
+  </w:style>
+  <w:style w:customStyle="1" w:styleId="ExtensionTok" w:type="character">
+    <w:name w:val="ExtensionTok"/>
+    <w:basedOn w:val="VerbatimChar"/>
+    <w:rPr/>
+  </w:style>
+  <w:style w:customStyle="1" w:styleId="PreprocessorTok" w:type="character">
+    <w:name w:val="PreprocessorTok"/>
+    <w:basedOn w:val="VerbatimChar"/>
+    <w:rPr>
+      <w:color w:val="bc7a00"/>
+    </w:rPr>
+  </w:style>
+  <w:style w:customStyle="1" w:styleId="AttributeTok" w:type="character">
+    <w:name w:val="AttributeTok"/>
+    <w:basedOn w:val="VerbatimChar"/>
+    <w:rPr>
+      <w:color w:val="7d9029"/>
+    </w:rPr>
+  </w:style>
+  <w:style w:customStyle="1" w:styleId="RegionMarkerTok" w:type="character">
+    <w:name w:val="RegionMarkerTok"/>
+    <w:basedOn w:val="VerbatimChar"/>
+    <w:rPr/>
+  </w:style>
+  <w:style w:customStyle="1" w:styleId="InformationTok" w:type="character">
+    <w:name w:val="InformationTok"/>
+    <w:basedOn w:val="VerbatimChar"/>
+    <w:rPr>
+      <w:b/>
+      <w:i/>
+      <w:color w:val="60a0b0"/>
+    </w:rPr>
+  </w:style>
+  <w:style w:customStyle="1" w:styleId="WarningTok" w:type="character">
+    <w:name w:val="WarningTok"/>
+    <w:basedOn w:val="VerbatimChar"/>
+    <w:rPr>
+      <w:b/>
+      <w:i/>
+      <w:color w:val="60a0b0"/>
+    </w:rPr>
+  </w:style>
+  <w:style w:customStyle="1" w:styleId="AlertTok" w:type="character">
+    <w:name w:val="AlertTok"/>
+    <w:basedOn w:val="VerbatimChar"/>
+    <w:rPr>
+      <w:b/>
+      <w:color w:val="ff0000"/>
+    </w:rPr>
+  </w:style>
+  <w:style w:customStyle="1" w:styleId="ErrorTok" w:type="character">
+    <w:name w:val="ErrorTok"/>
+    <w:basedOn w:val="VerbatimChar"/>
+    <w:rPr>
+      <w:b/>
+      <w:color w:val="ff0000"/>
+    </w:rPr>
+  </w:style>
+  <w:style w:customStyle="1" w:styleId="NormalTok" w:type="character">
+    <w:name w:val="NormalTok"/>
+    <w:basedOn w:val="VerbatimChar"/>
+    <w:rPr/>
   </w:style>
   <w:style w:customStyle="1" w:styleId="KeywordTok" w:type="character">
     <w:name w:val="KeywordTok"/>

</xml_diff>

<commit_message>
Document one more episode rollout
Co-authored-by: Copilot <223556219+Copilot@users.noreply.github.com>
</commit_message>
<xml_diff>
--- a/docs/BADGE-PIANO.docx
+++ b/docs/BADGE-PIANO.docx
@@ -83,21 +83,14 @@
       <w:r>
         <w:rPr>
           <w:b/>
-          <w:bCs/>
         </w:rPr>
-        <w:t xml:space="preserve">Implementazione:</w:t>
-      </w:r>
-      <w:r>
-        <w:t xml:space="preserve"> </w:t>
-      </w:r>
-      <w:r>
-        <w:t xml:space="preserve">fino a Esploratore di generi (B1) pubblicato; Ancora un episodio</w:t>
-      </w:r>
-      <w:r>
-        <w:t xml:space="preserve"> </w:t>
-      </w:r>
-      <w:r>
-        <w:t xml:space="preserve">(B2) completato localmente e in attesa di rollout</w:t>
+        <w:t>Implementazione:</w:t>
+      </w:r>
+      <w:r>
+        <w:rPr>
+          <w:b w:val="0"/>
+        </w:rPr>
+        <w:t xml:space="preserve"> fino ad Ancora un episodio (B2) pubblicato e verificato in produzione</w:t>
       </w:r>
     </w:p>
     <w:p>
@@ -12195,34 +12188,91 @@
         </w:numPr>
       </w:pPr>
       <w:r>
-        <w:t xml:space="preserve">test SQL transazionale pronto per soglia</w:t>
-      </w:r>
-      <w:r>
-        <w:t xml:space="preserve"> </w:t>
-      </w:r>
-      <w:r>
-        <w:rPr>
-          <w:rStyle w:val="VerbatimChar"/>
-        </w:rPr>
-        <w:t xml:space="preserve">8</w:t>
-      </w:r>
-      <w:r>
-        <w:t xml:space="preserve">, regressione a</w:t>
-      </w:r>
-      <w:r>
-        <w:t xml:space="preserve"> </w:t>
-      </w:r>
-      <w:r>
-        <w:rPr>
-          <w:rStyle w:val="VerbatimChar"/>
-        </w:rPr>
-        <w:t xml:space="preserve">0</w:t>
-      </w:r>
-      <w:r>
-        <w:t xml:space="preserve"> </w:t>
-      </w:r>
-      <w:r>
-        <w:t xml:space="preserve">e permanenza.</w:t>
+        <w:t>test SQL transazionale superato senza dati residui;</w:t>
+      </w:r>
+    </w:p>
+    <w:p>
+      <w:pPr>
+        <w:pStyle w:val="Compact"/>
+        <w:numPr>
+          <w:ilvl w:val="0"/>
+          <w:numId w:val="1084"/>
+        </w:numPr>
+      </w:pPr>
+      <w:r>
+        <w:t>bundle monolitico verificato e distribuito prima dell’attivazione del catalogo;</w:t>
+      </w:r>
+    </w:p>
+    <w:p>
+      <w:pPr>
+        <w:pStyle w:val="Compact"/>
+        <w:numPr>
+          <w:ilvl w:val="0"/>
+          <w:numId w:val="1084"/>
+        </w:numPr>
+      </w:pPr>
+      <w:r>
+        <w:t>Edge Function aggiornata e migration applicate in produzione;</w:t>
+      </w:r>
+    </w:p>
+    <w:p>
+      <w:pPr>
+        <w:pStyle w:val="Compact"/>
+        <w:numPr>
+          <w:ilvl w:val="0"/>
+          <w:numId w:val="1084"/>
+        </w:numPr>
+      </w:pPr>
+      <w:r>
+        <w:t>deploy Azure completato sul commit 3bcd8df;</w:t>
+      </w:r>
+    </w:p>
+    <w:p>
+      <w:pPr>
+        <w:pStyle w:val="Compact"/>
+        <w:numPr>
+          <w:ilvl w:val="0"/>
+          <w:numId w:val="1084"/>
+        </w:numPr>
+      </w:pPr>
+      <w:r>
+        <w:t>backfill reale: account principale e @testshowtime entrambi a 0/3;</w:t>
+      </w:r>
+    </w:p>
+    <w:p>
+      <w:pPr>
+        <w:pStyle w:val="Compact"/>
+        <w:numPr>
+          <w:ilvl w:val="0"/>
+          <w:numId w:val="1084"/>
+        </w:numPr>
+      </w:pPr>
+      <w:r>
+        <w:t>test live reversibile su @testshowtime: tre episodi temporaneamente tracked della stessa serie e data hanno prodotto 3/5, Bronzo e un solo banner;</w:t>
+      </w:r>
+    </w:p>
+    <w:p>
+      <w:pPr>
+        <w:pStyle w:val="Compact"/>
+        <w:numPr>
+          <w:ilvl w:val="0"/>
+          <w:numId w:val="1084"/>
+        </w:numPr>
+      </w:pPr>
+      <w:r>
+        <w:t>secondo refresh idempotente: 0 nuovi sblocchi;</w:t>
+      </w:r>
+    </w:p>
+    <w:p>
+      <w:pPr>
+        <w:pStyle w:val="Compact"/>
+        <w:numPr>
+          <w:ilvl w:val="0"/>
+          <w:numId w:val="1084"/>
+        </w:numPr>
+      </w:pPr>
+      <w:r>
+        <w:t>rollback completo verificato: visioni ripristinate come imported con la data originale, sblocco di prova rimosso, progresso e massimo a 0, UI tornata a 0/3.</w:t>
       </w:r>
     </w:p>
     <w:bookmarkStart w:id="88" w:name="batch-c-diario-e-social"/>
@@ -13817,6 +13867,18 @@
       </w:r>
     </w:p>
     <w:p>
+      <w:pPr>
+        <w:pStyle w:val="Compact"/>
+        <w:numPr>
+          <w:ilvl w:val="0"/>
+          <w:numId w:val="1159"/>
+        </w:numPr>
+      </w:pPr>
+      <w:r>
+        <w:t>Secondo batch successivo: Esploratore di generi e Ancora un episodio</w:t>
+      </w:r>
+    </w:p>
+    <w:p>
       <w:r>
         <w:pict>
           <v:rect style="width:0;height:1.5pt" o:hralign="center" o:hrstd="t" o:hr="t"/>
@@ -13847,20 +13909,22 @@
         <w:pStyle w:val="BodyText"/>
       </w:pPr>
       <w:r>
-        <w:t xml:space="preserve">Il prossimo passo operativo è completare il rollout di</w:t>
-      </w:r>
-      <w:r>
-        <w:t xml:space="preserve"> </w:t>
+        <w:rPr>
+          <w:b w:val="0"/>
+        </w:rPr>
+        <w:t xml:space="preserve">Il prossimo passo operativo è </w:t>
       </w:r>
       <w:r>
         <w:rPr>
           <w:b/>
-          <w:bCs/>
         </w:rPr>
-        <w:t xml:space="preserve">Ancora un episodio</w:t>
-      </w:r>
-      <w:r>
-        <w:t xml:space="preserve">:</w:t>
+        <w:t>Maratoneta</w:t>
+      </w:r>
+      <w:r>
+        <w:rPr>
+          <w:b w:val="0"/>
+        </w:rPr>
+        <w:t>:</w:t>
       </w:r>
     </w:p>
     <w:p>
@@ -13872,7 +13936,7 @@
         </w:numPr>
       </w:pPr>
       <w:r>
-        <w:t xml:space="preserve">distribuire la Edge Function aggiornata;</w:t>
+        <w:t>formalizzare la regola già approvata per stagioni da almeno 8 episodi;</w:t>
       </w:r>
     </w:p>
     <w:p>
@@ -13884,7 +13948,7 @@
         </w:numPr>
       </w:pPr>
       <w:r>
-        <w:t xml:space="preserve">pubblicare la patch a episodi;</w:t>
+        <w:t>usare soltanto attività tracked;</w:t>
       </w:r>
     </w:p>
     <w:p>
@@ -13896,19 +13960,7 @@
         </w:numPr>
       </w:pPr>
       <w:r>
-        <w:t xml:space="preserve">applicare la migration</w:t>
-      </w:r>
-      <w:r>
-        <w:t xml:space="preserve"> </w:t>
-      </w:r>
-      <w:r>
-        <w:rPr>
-          <w:rStyle w:val="VerbatimChar"/>
-        </w:rPr>
-        <w:t xml:space="preserve">0023_one_more_episode_badge.sql</w:t>
-      </w:r>
-      <w:r>
-        <w:t xml:space="preserve">;</w:t>
+        <w:t>richiedere l’intera stagione nella stessa data o in due date consecutive;</w:t>
       </w:r>
     </w:p>
     <w:p>
@@ -13920,22 +13972,7 @@
         </w:numPr>
       </w:pPr>
       <w:r>
-        <w:t xml:space="preserve">verificare backfill</w:t>
-      </w:r>
-      <w:r>
-        <w:t xml:space="preserve"> </w:t>
-      </w:r>
-      <w:r>
-        <w:rPr>
-          <w:rStyle w:val="VerbatimChar"/>
-        </w:rPr>
-        <w:t xml:space="preserve">0/3</w:t>
-      </w:r>
-      <w:r>
-        <w:t xml:space="preserve"> </w:t>
-      </w:r>
-      <w:r>
-        <w:t xml:space="preserve">e idempotenza sugli account reali;</w:t>
+        <w:t>rendere il risultato indipendente dall’ordine di registrazione;</w:t>
       </w:r>
     </w:p>
     <w:p>
@@ -13947,7 +13984,7 @@
         </w:numPr>
       </w:pPr>
       <w:r>
-        <w:t xml:space="preserve">eseguire un test reversibile con tre episodi tracked nella stessa data;</w:t>
+        <w:t>implementare valutatore, migration, test e patch dedicata;</w:t>
       </w:r>
     </w:p>
     <w:p>
@@ -13959,7 +13996,7 @@
         </w:numPr>
       </w:pPr>
       <w:r>
-        <w:t xml:space="preserve">proseguire con Maratoneta.</w:t>
+        <w:t>verificare localmente e poi con un rollout reversibile.</w:t>
       </w:r>
     </w:p>
     <w:bookmarkEnd w:id="103"/>

</xml_diff>

<commit_message>
Add Marathon badge progression
Co-authored-by: Copilot <223556219+Copilot@users.noreply.github.com>
</commit_message>
<xml_diff>
--- a/docs/BADGE-PIANO.docx
+++ b/docs/BADGE-PIANO.docx
@@ -90,7 +90,7 @@
         <w:rPr>
           <w:b w:val="0"/>
         </w:rPr>
-        <w:t xml:space="preserve"> fino ad Ancora un episodio (B2) pubblicato e verificato in produzione</w:t>
+        <w:t xml:space="preserve"> fino ad Ancora un episodio (B2) pubblicato; Maratoneta (B3) completato localmente e in attesa di rollout</w:t>
       </w:r>
     </w:p>
     <w:p>
@@ -2949,14 +2949,110 @@
         <w:t xml:space="preserve">Completa rapidamente una stagione di almeno 8 episodi.</w:t>
       </w:r>
     </w:p>
-    <w:p>
-      <w:pPr>
-        <w:pStyle w:val="BodyText"/>
-      </w:pPr>
-      <w:r>
-        <w:t xml:space="preserve">Proposta V1:</w:t>
-      </w:r>
-    </w:p>
+    <w:tbl>
+      <w:tblPr>
+        <w:tblStyle w:val="Table"/>
+        <w:tblW w:type="auto" w:w="0"/>
+        <w:tblLook w:firstRow="1" w:lastRow="0" w:firstColumn="0" w:lastColumn="0" w:noHBand="0" w:noVBand="0" w:val="0020"/>
+      </w:tblPr>
+      <w:tblGrid>
+        <w:gridCol w:w="3960"/>
+        <w:gridCol w:w="3960"/>
+      </w:tblGrid>
+      <w:tr>
+        <w:trPr>
+          <w:tblHeader w:val="on"/>
+        </w:trPr>
+        <w:tc>
+          <w:tcPr/>
+          <w:p>
+            <w:r>
+              <w:t>Livello</w:t>
+            </w:r>
+          </w:p>
+        </w:tc>
+        <w:tc>
+          <w:tcPr/>
+          <w:p>
+            <w:r>
+              <w:t>Requisito</w:t>
+            </w:r>
+          </w:p>
+        </w:tc>
+      </w:tr>
+      <w:tr>
+        <w:tc>
+          <w:tcPr/>
+          <w:p>
+            <w:r>
+              <w:t>Bronzo</w:t>
+            </w:r>
+          </w:p>
+        </w:tc>
+        <w:tc>
+          <w:tcPr/>
+          <w:p>
+            <w:r>
+              <w:t>1 stagione</w:t>
+            </w:r>
+          </w:p>
+        </w:tc>
+      </w:tr>
+      <w:tr>
+        <w:tc>
+          <w:tcPr/>
+          <w:p>
+            <w:r>
+              <w:t>Argento</w:t>
+            </w:r>
+          </w:p>
+        </w:tc>
+        <w:tc>
+          <w:tcPr/>
+          <w:p>
+            <w:r>
+              <w:t>5 stagioni</w:t>
+            </w:r>
+          </w:p>
+        </w:tc>
+      </w:tr>
+      <w:tr>
+        <w:tc>
+          <w:tcPr/>
+          <w:p>
+            <w:r>
+              <w:t>Oro</w:t>
+            </w:r>
+          </w:p>
+        </w:tc>
+        <w:tc>
+          <w:tcPr/>
+          <w:p>
+            <w:r>
+              <w:t>15 stagioni</w:t>
+            </w:r>
+          </w:p>
+        </w:tc>
+      </w:tr>
+      <w:tr>
+        <w:tc>
+          <w:tcPr/>
+          <w:p>
+            <w:r>
+              <w:t>Platino</w:t>
+            </w:r>
+          </w:p>
+        </w:tc>
+        <w:tc>
+          <w:tcPr/>
+          <w:p>
+            <w:r>
+              <w:t>30 stagioni</w:t>
+            </w:r>
+          </w:p>
+        </w:tc>
+      </w:tr>
+    </w:tbl>
     <w:p>
       <w:pPr>
         <w:pStyle w:val="Compact"/>
@@ -2990,19 +3086,7 @@
         </w:numPr>
       </w:pPr>
       <w:r>
-        <w:t xml:space="preserve">solo attività</w:t>
-      </w:r>
-      <w:r>
-        <w:t xml:space="preserve"> </w:t>
-      </w:r>
-      <w:r>
-        <w:rPr>
-          <w:rStyle w:val="VerbatimChar"/>
-        </w:rPr>
-        <w:t xml:space="preserve">tracked</w:t>
-      </w:r>
-      <w:r>
-        <w:t xml:space="preserve">.</w:t>
+        <w:t>solo attività tracked;</w:t>
       </w:r>
     </w:p>
     <w:p>
@@ -3026,7 +3110,19 @@
         </w:numPr>
       </w:pPr>
       <w:r>
-        <w:t xml:space="preserve">l’intera stagione deve rientrare nella stessa finestra di una o due date.</w:t>
+        <w:t>l’intera stagione deve rientrare nella stessa finestra di una o due date;</w:t>
+      </w:r>
+    </w:p>
+    <w:p>
+      <w:pPr>
+        <w:pStyle w:val="Compact"/>
+        <w:numPr>
+          <w:ilvl w:val="0"/>
+          <w:numId w:val="1023"/>
+        </w:numPr>
+      </w:pPr>
+      <w:r>
+        <w:t>ogni stagione distinta contribuisce una sola volta.</w:t>
       </w:r>
     </w:p>
     <w:p>
@@ -12275,6 +12371,218 @@
         <w:t>rollback completo verificato: visioni ripristinate come imported con la data originale, sblocco di prova rimosso, progresso e massimo a 0, UI tornata a 0/3.</w:t>
       </w:r>
     </w:p>
+    <w:p>
+      <w:pPr>
+        <w:pStyle w:val="Heading3"/>
+      </w:pPr>
+      <w:r>
+        <w:t>Verifica Batch B3 — Maratoneta</w:t>
+      </w:r>
+    </w:p>
+    <w:p>
+      <w:pPr>
+        <w:pStyle w:val="Compact"/>
+        <w:numPr>
+          <w:ilvl w:val="0"/>
+          <w:numId w:val="1084"/>
+        </w:numPr>
+      </w:pPr>
+      <w:r>
+        <w:t>soglie progressive confermate: 1 / 5 / 15 / 30 stagioni distinte;</w:t>
+      </w:r>
+    </w:p>
+    <w:p>
+      <w:pPr>
+        <w:pStyle w:val="Compact"/>
+        <w:numPr>
+          <w:ilvl w:val="0"/>
+          <w:numId w:val="1084"/>
+        </w:numPr>
+      </w:pPr>
+      <w:r>
+        <w:t>una stagione deve contenere almeno 8 episodi regolari secondo TMDB;</w:t>
+      </w:r>
+    </w:p>
+    <w:p>
+      <w:pPr>
+        <w:pStyle w:val="Compact"/>
+        <w:numPr>
+          <w:ilvl w:val="0"/>
+          <w:numId w:val="1084"/>
+        </w:numPr>
+      </w:pPr>
+      <w:r>
+        <w:t>tutti gli episodi ufficiali della stagione devono essere tracked;</w:t>
+      </w:r>
+    </w:p>
+    <w:p>
+      <w:pPr>
+        <w:pStyle w:val="Compact"/>
+        <w:numPr>
+          <w:ilvl w:val="0"/>
+          <w:numId w:val="1084"/>
+        </w:numPr>
+      </w:pPr>
+      <w:r>
+        <w:t>Stagione 0 / Speciali e storico importato esclusi;</w:t>
+      </w:r>
+    </w:p>
+    <w:p>
+      <w:pPr>
+        <w:pStyle w:val="Compact"/>
+        <w:numPr>
+          <w:ilvl w:val="0"/>
+          <w:numId w:val="1084"/>
+        </w:numPr>
+      </w:pPr>
+      <w:r>
+        <w:t>la finestra ammette una sola data o due date di calendario consecutive;</w:t>
+      </w:r>
+    </w:p>
+    <w:p>
+      <w:pPr>
+        <w:pStyle w:val="Compact"/>
+        <w:numPr>
+          <w:ilvl w:val="0"/>
+          <w:numId w:val="1084"/>
+        </w:numPr>
+      </w:pPr>
+      <w:r>
+        <w:t>l’ordine di registrazione non modifica il risultato;</w:t>
+      </w:r>
+    </w:p>
+    <w:p>
+      <w:pPr>
+        <w:pStyle w:val="Compact"/>
+        <w:numPr>
+          <w:ilvl w:val="0"/>
+          <w:numId w:val="1084"/>
+        </w:numPr>
+      </w:pPr>
+      <w:r>
+        <w:t>il cambio mese o anno viene gestito come consecutivo quando la differenza è un giorno;</w:t>
+      </w:r>
+    </w:p>
+    <w:p>
+      <w:pPr>
+        <w:pStyle w:val="Compact"/>
+        <w:numPr>
+          <w:ilvl w:val="0"/>
+          <w:numId w:val="1084"/>
+        </w:numPr>
+      </w:pPr>
+      <w:r>
+        <w:t>stagioni incomplete, date distanti e serie differenti non vengono combinate;</w:t>
+      </w:r>
+    </w:p>
+    <w:p>
+      <w:pPr>
+        <w:pStyle w:val="Compact"/>
+        <w:numPr>
+          <w:ilvl w:val="0"/>
+          <w:numId w:val="1084"/>
+        </w:numPr>
+      </w:pPr>
+      <w:r>
+        <w:t>riusa la cache TMDB protetta di Serialista, con TTL 7 giorni;</w:t>
+      </w:r>
+    </w:p>
+    <w:p>
+      <w:pPr>
+        <w:pStyle w:val="Compact"/>
+        <w:numPr>
+          <w:ilvl w:val="0"/>
+          <w:numId w:val="1084"/>
+        </w:numPr>
+      </w:pPr>
+      <w:r>
+        <w:t>evidenza privata limitata alle chiavi tecniche delle stagioni valide;</w:t>
+      </w:r>
+    </w:p>
+    <w:p>
+      <w:pPr>
+        <w:pStyle w:val="Compact"/>
+        <w:numPr>
+          <w:ilvl w:val="0"/>
+          <w:numId w:val="1084"/>
+        </w:numPr>
+      </w:pPr>
+      <w:r>
+        <w:t>rivalutazioni dopo spunta singola, stagione in blocco e cambio origine;</w:t>
+      </w:r>
+    </w:p>
+    <w:p>
+      <w:pPr>
+        <w:pStyle w:val="Compact"/>
+        <w:numPr>
+          <w:ilvl w:val="0"/>
+          <w:numId w:val="1084"/>
+        </w:numPr>
+      </w:pPr>
+      <w:r>
+        <w:t>migration 0024_marathon_badge.sql e test SQL transazionale pronti;</w:t>
+      </w:r>
+    </w:p>
+    <w:p>
+      <w:pPr>
+        <w:pStyle w:val="Compact"/>
+        <w:numPr>
+          <w:ilvl w:val="0"/>
+          <w:numId w:val="1084"/>
+        </w:numPr>
+      </w:pPr>
+      <w:r>
+        <w:t>patch originale a cronometro, otto episodi e traguardo;</w:t>
+      </w:r>
+    </w:p>
+    <w:p>
+      <w:pPr>
+        <w:pStyle w:val="Compact"/>
+        <w:numPr>
+          <w:ilvl w:val="0"/>
+          <w:numId w:val="1084"/>
+        </w:numPr>
+      </w:pPr>
+      <w:r>
+        <w:t>preview locale con catalogo intercettato: Maratoneta 0/4, progresso 0/1, hero 3/31;</w:t>
+      </w:r>
+    </w:p>
+    <w:p>
+      <w:pPr>
+        <w:pStyle w:val="Compact"/>
+        <w:numPr>
+          <w:ilvl w:val="0"/>
+          <w:numId w:val="1084"/>
+        </w:numPr>
+      </w:pPr>
+      <w:r>
+        <w:t>patch e accordion verificati senza overflow a 360 e 390 px e senza errori console;</w:t>
+      </w:r>
+    </w:p>
+    <w:p>
+      <w:pPr>
+        <w:pStyle w:val="Compact"/>
+        <w:numPr>
+          <w:ilvl w:val="0"/>
+          <w:numId w:val="1084"/>
+        </w:numPr>
+      </w:pPr>
+      <w:r>
+        <w:t>38/38 test engine superati;</w:t>
+      </w:r>
+    </w:p>
+    <w:p>
+      <w:pPr>
+        <w:pStyle w:val="Compact"/>
+        <w:numPr>
+          <w:ilvl w:val="0"/>
+          <w:numId w:val="1084"/>
+        </w:numPr>
+      </w:pPr>
+      <w:r>
+        <w:t>typecheck e lint mirato superati.</w:t>
+      </w:r>
+    </w:p>
     <w:bookmarkStart w:id="88" w:name="batch-c-diario-e-social"/>
     <w:p>
       <w:pPr>
@@ -12789,6 +13097,18 @@
       </w:pPr>
       <w:r>
         <w:t xml:space="preserve">Maratoneta accetta lo stesso giorno o due date consecutive</w:t>
+      </w:r>
+    </w:p>
+    <w:p>
+      <w:pPr>
+        <w:pStyle w:val="Compact"/>
+        <w:numPr>
+          <w:ilvl w:val="0"/>
+          <w:numId w:val="1111"/>
+        </w:numPr>
+      </w:pPr>
+      <w:r>
+        <w:t>Maratoneta conta stagioni distinte con soglie 1 / 5 / 15 / 30</w:t>
       </w:r>
     </w:p>
     <w:p>
@@ -13912,7 +14232,7 @@
         <w:rPr>
           <w:b w:val="0"/>
         </w:rPr>
-        <w:t xml:space="preserve">Il prossimo passo operativo è </w:t>
+        <w:t xml:space="preserve">Il prossimo passo operativo è completare il rollout di </w:t>
       </w:r>
       <w:r>
         <w:rPr>
@@ -13936,7 +14256,7 @@
         </w:numPr>
       </w:pPr>
       <w:r>
-        <w:t>formalizzare la regola già approvata per stagioni da almeno 8 episodi;</w:t>
+        <w:t>verificare patch e accordion a 360 e 390 px;</w:t>
       </w:r>
     </w:p>
     <w:p>
@@ -13948,7 +14268,7 @@
         </w:numPr>
       </w:pPr>
       <w:r>
-        <w:t>usare soltanto attività tracked;</w:t>
+        <w:t>distribuire la Edge Function aggiornata;</w:t>
       </w:r>
     </w:p>
     <w:p>
@@ -13960,7 +14280,7 @@
         </w:numPr>
       </w:pPr>
       <w:r>
-        <w:t>richiedere l’intera stagione nella stessa data o in due date consecutive;</w:t>
+        <w:t>applicare la migration 0024_marathon_badge.sql;</w:t>
       </w:r>
     </w:p>
     <w:p>
@@ -13972,7 +14292,7 @@
         </w:numPr>
       </w:pPr>
       <w:r>
-        <w:t>rendere il risultato indipendente dall’ordine di registrazione;</w:t>
+        <w:t>eseguire il test SQL transazionale;</w:t>
       </w:r>
     </w:p>
     <w:p>
@@ -13984,7 +14304,7 @@
         </w:numPr>
       </w:pPr>
       <w:r>
-        <w:t>implementare valutatore, migration, test e patch dedicata;</w:t>
+        <w:t>verificare backfill e idempotenza sugli account reali;</w:t>
       </w:r>
     </w:p>
     <w:p>
@@ -13996,7 +14316,7 @@
         </w:numPr>
       </w:pPr>
       <w:r>
-        <w:t>verificare localmente e poi con un rollout reversibile.</w:t>
+        <w:t>pubblicare il client e completare un test live reversibile.</w:t>
       </w:r>
     </w:p>
     <w:bookmarkEnd w:id="103"/>

</xml_diff>

<commit_message>
Document Marathon badge rollout
Co-authored-by: Copilot <223556219+Copilot@users.noreply.github.com>
</commit_message>
<xml_diff>
--- a/docs/BADGE-PIANO.docx
+++ b/docs/BADGE-PIANO.docx
@@ -90,7 +90,7 @@
         <w:rPr>
           <w:b w:val="0"/>
         </w:rPr>
-        <w:t xml:space="preserve"> fino ad Ancora un episodio (B2) pubblicato; Maratoneta (B3) completato localmente e in attesa di rollout</w:t>
+        <w:t xml:space="preserve"> fino a Maratoneta (B3) pubblicato e verificato in produzione</w:t>
       </w:r>
     </w:p>
     <w:p>
@@ -12583,6 +12583,138 @@
         <w:t>typecheck e lint mirato superati.</w:t>
       </w:r>
     </w:p>
+    <w:p>
+      <w:pPr>
+        <w:pStyle w:val="Compact"/>
+        <w:numPr>
+          <w:ilvl w:val="0"/>
+          <w:numId w:val="1084"/>
+        </w:numPr>
+      </w:pPr>
+      <w:r>
+        <w:t>bundle monolitico verificato e distribuito con valutatore, loader e routing Maratoneta;</w:t>
+      </w:r>
+    </w:p>
+    <w:p>
+      <w:pPr>
+        <w:pStyle w:val="Compact"/>
+        <w:numPr>
+          <w:ilvl w:val="0"/>
+          <w:numId w:val="1084"/>
+        </w:numPr>
+      </w:pPr>
+      <w:r>
+        <w:t>migration 0024_marathon_badge.sql applicata in produzione;</w:t>
+      </w:r>
+    </w:p>
+    <w:p>
+      <w:pPr>
+        <w:pStyle w:val="Compact"/>
+        <w:numPr>
+          <w:ilvl w:val="0"/>
+          <w:numId w:val="1084"/>
+        </w:numPr>
+      </w:pPr>
+      <w:r>
+        <w:t>test SQL transazionale superato senza dati residui;</w:t>
+      </w:r>
+    </w:p>
+    <w:p>
+      <w:pPr>
+        <w:pStyle w:val="Compact"/>
+        <w:numPr>
+          <w:ilvl w:val="0"/>
+          <w:numId w:val="1084"/>
+        </w:numPr>
+      </w:pPr>
+      <w:r>
+        <w:t>deploy Azure completato sul commit f535eb3, run 37588921439;</w:t>
+      </w:r>
+    </w:p>
+    <w:p>
+      <w:pPr>
+        <w:pStyle w:val="Compact"/>
+        <w:numPr>
+          <w:ilvl w:val="0"/>
+          <w:numId w:val="1084"/>
+        </w:numPr>
+      </w:pPr>
+      <w:r>
+        <w:t>account @testshowtime: backfill 0/1, nessuno sblocco, hero 3/31;</w:t>
+      </w:r>
+    </w:p>
+    <w:p>
+      <w:pPr>
+        <w:pStyle w:val="Compact"/>
+        <w:numPr>
+          <w:ilvl w:val="0"/>
+          <w:numId w:val="1084"/>
+        </w:numPr>
+      </w:pPr>
+      <w:r>
+        <w:t>secondo refresh reale: 0 nuovi sblocchi;</w:t>
+      </w:r>
+    </w:p>
+    <w:p>
+      <w:pPr>
+        <w:pStyle w:val="Compact"/>
+        <w:numPr>
+          <w:ilvl w:val="0"/>
+          <w:numId w:val="1084"/>
+        </w:numPr>
+      </w:pPr>
+      <w:r>
+        <w:t>test live reversibile su Breaking Bad S2: 13 episodi tracked distribuiti su due date consecutive hanno prodotto Bronzo, 1/5 e un solo banner;</w:t>
+      </w:r>
+    </w:p>
+    <w:p>
+      <w:pPr>
+        <w:pStyle w:val="Compact"/>
+        <w:numPr>
+          <w:ilvl w:val="0"/>
+          <w:numId w:val="1084"/>
+        </w:numPr>
+      </w:pPr>
+      <w:r>
+        <w:t>secondo refresh della prova idempotente: 0 nuovi sblocchi;</w:t>
+      </w:r>
+    </w:p>
+    <w:p>
+      <w:pPr>
+        <w:pStyle w:val="Compact"/>
+        <w:numPr>
+          <w:ilvl w:val="0"/>
+          <w:numId w:val="1084"/>
+        </w:numPr>
+      </w:pPr>
+      <w:r>
+        <w:t>rollback completo verificato: 13 episodi ripristinati come imported con la data originale, sblocco rimosso, progresso e massimo a 0, UI tornata a 0/1;</w:t>
+      </w:r>
+    </w:p>
+    <w:p>
+      <w:pPr>
+        <w:pStyle w:val="Compact"/>
+        <w:numPr>
+          <w:ilvl w:val="0"/>
+          <w:numId w:val="1084"/>
+        </w:numPr>
+      </w:pPr>
+      <w:r>
+        <w:t>produzione verificata senza overflow a 360/390 px e senza errori console;</w:t>
+      </w:r>
+    </w:p>
+    <w:p>
+      <w:pPr>
+        <w:pStyle w:val="Compact"/>
+        <w:numPr>
+          <w:ilvl w:val="0"/>
+          <w:numId w:val="1084"/>
+        </w:numPr>
+      </w:pPr>
+      <w:r>
+        <w:t>gerarchia titoli verificata: Sala trofei 32 px, gruppi badge 28 px.</w:t>
+      </w:r>
+    </w:p>
     <w:bookmarkStart w:id="88" w:name="batch-c-diario-e-social"/>
     <w:p>
       <w:pPr>
@@ -14232,13 +14364,13 @@
         <w:rPr>
           <w:b w:val="0"/>
         </w:rPr>
-        <w:t xml:space="preserve">Il prossimo passo operativo è completare il rollout di </w:t>
+        <w:t xml:space="preserve">Il prossimo passo operativo è </w:t>
       </w:r>
       <w:r>
         <w:rPr>
           <w:b/>
         </w:rPr>
-        <w:t>Maratoneta</w:t>
+        <w:t>Encore</w:t>
       </w:r>
       <w:r>
         <w:rPr>
@@ -14256,7 +14388,7 @@
         </w:numPr>
       </w:pPr>
       <w:r>
-        <w:t>verificare patch e accordion a 360 e 390 px;</w:t>
+        <w:t>contare titoli distinti con almeno una revisione reale;</w:t>
       </w:r>
     </w:p>
     <w:p>
@@ -14268,7 +14400,7 @@
         </w:numPr>
       </w:pPr>
       <w:r>
-        <w:t>distribuire la Edge Function aggiornata;</w:t>
+        <w:t>accettare una prima visione importata seguita da una visione tracked;</w:t>
       </w:r>
     </w:p>
     <w:p>
@@ -14280,7 +14412,7 @@
         </w:numPr>
       </w:pPr>
       <w:r>
-        <w:t>applicare la migration 0024_marathon_badge.sql;</w:t>
+        <w:t>usare gli storici film e serie senza duplicare lo stesso titolo;</w:t>
       </w:r>
     </w:p>
     <w:p>
@@ -14292,7 +14424,7 @@
         </w:numPr>
       </w:pPr>
       <w:r>
-        <w:t>eseguire il test SQL transazionale;</w:t>
+        <w:t>applicare le soglie 5 / 25 / 100 / 250;</w:t>
       </w:r>
     </w:p>
     <w:p>
@@ -14304,7 +14436,7 @@
         </w:numPr>
       </w:pPr>
       <w:r>
-        <w:t>verificare backfill e idempotenza sugli account reali;</w:t>
+        <w:t>implementare valutatore, loader, migration, test e patch dedicata;</w:t>
       </w:r>
     </w:p>
     <w:p>
@@ -14316,7 +14448,7 @@
         </w:numPr>
       </w:pPr>
       <w:r>
-        <w:t>pubblicare il client e completare un test live reversibile.</w:t>
+        <w:t>verificare localmente e poi con un rollout reversibile.</w:t>
       </w:r>
     </w:p>
     <w:bookmarkEnd w:id="103"/>

</xml_diff>

<commit_message>
Add Encore badge progression
Co-authored-by: Copilot <223556219+Copilot@users.noreply.github.com>
</commit_message>
<xml_diff>
--- a/docs/BADGE-PIANO.docx
+++ b/docs/BADGE-PIANO.docx
@@ -90,7 +90,7 @@
         <w:rPr>
           <w:b w:val="0"/>
         </w:rPr>
-        <w:t xml:space="preserve"> fino a Maratoneta (B3) pubblicato e verificato in produzione</w:t>
+        <w:t xml:space="preserve"> fino a Maratoneta (B3) pubblicato; Encore (B4) completato localmente e in attesa di rollout</w:t>
       </w:r>
     </w:p>
     <w:p>
@@ -3337,7 +3337,19 @@
         </w:numPr>
       </w:pPr>
       <w:r>
-        <w:t xml:space="preserve">storico visioni episodio, per una futura variante specifica.</w:t>
+        <w:t>completamento iniziale delle serie tramite episode_watches;</w:t>
+      </w:r>
+    </w:p>
+    <w:p>
+      <w:pPr>
+        <w:pStyle w:val="Compact"/>
+        <w:numPr>
+          <w:ilvl w:val="0"/>
+          <w:numId w:val="1024"/>
+        </w:numPr>
+      </w:pPr>
+      <w:r>
+        <w:t>storico visioni episodio, per una futura variante specifica e non incluso nella V1.</w:t>
       </w:r>
     </w:p>
     <w:p>
@@ -3428,6 +3440,14 @@
       </w:r>
       <w:r>
         <w:t xml:space="preserve">.</w:t>
+      </w:r>
+    </w:p>
+    <w:p>
+      <w:pPr>
+        <w:pStyle w:val="BodyText"/>
+      </w:pPr>
+      <w:r>
+        <w:t>Anche un completamento iniziale interamente tracked seguito da una voce series_viewings conta come rewatch. Un completamento episodio misto tra importato e tracked non viene considerato una prima visione completa.</w:t>
       </w:r>
     </w:p>
     <w:bookmarkEnd w:id="39"/>
@@ -7206,38 +7226,8 @@
         <w:tc>
           <w:tcPr/>
           <w:p>
-            <w:pPr>
-              <w:pStyle w:val="Compact"/>
-            </w:pPr>
-            <w:r>
-              <w:rPr>
-                <w:rStyle w:val="VerbatimChar"/>
-              </w:rPr>
-              <w:t xml:space="preserve">viewings</w:t>
-            </w:r>
-            <w:r>
-              <w:t xml:space="preserve">,</w:t>
-            </w:r>
-            <w:r>
-              <w:t xml:space="preserve"> </w:t>
-            </w:r>
-            <w:r>
-              <w:rPr>
-                <w:rStyle w:val="VerbatimChar"/>
-              </w:rPr>
-              <w:t xml:space="preserve">series_viewings</w:t>
-            </w:r>
-            <w:r>
-              <w:t xml:space="preserve">,</w:t>
-            </w:r>
-            <w:r>
-              <w:t xml:space="preserve"> </w:t>
-            </w:r>
-            <w:r>
-              <w:rPr>
-                <w:rStyle w:val="VerbatimChar"/>
-              </w:rPr>
-              <w:t xml:space="preserve">episode_viewings</w:t>
+            <w:r>
+              <w:t>viewings, series_viewings, episode_watches</w:t>
             </w:r>
           </w:p>
         </w:tc>
@@ -12713,6 +12703,218 @@
       </w:pPr>
       <w:r>
         <w:t>gerarchia titoli verificata: Sala trofei 32 px, gruppi badge 28 px.</w:t>
+      </w:r>
+    </w:p>
+    <w:p>
+      <w:pPr>
+        <w:pStyle w:val="Heading3"/>
+      </w:pPr>
+      <w:r>
+        <w:t>Verifica Batch B4 — Encore</w:t>
+      </w:r>
+    </w:p>
+    <w:p>
+      <w:pPr>
+        <w:pStyle w:val="Compact"/>
+        <w:numPr>
+          <w:ilvl w:val="0"/>
+          <w:numId w:val="1084"/>
+        </w:numPr>
+      </w:pPr>
+      <w:r>
+        <w:t>soglie 5 / 25 / 100 / 250 titoli distinti rivisti;</w:t>
+      </w:r>
+    </w:p>
+    <w:p>
+      <w:pPr>
+        <w:pStyle w:val="Compact"/>
+        <w:numPr>
+          <w:ilvl w:val="0"/>
+          <w:numId w:val="1084"/>
+        </w:numPr>
+      </w:pPr>
+      <w:r>
+        <w:t>film valido con almeno due righe viewings, oppure import iniziale e una visione reale;</w:t>
+      </w:r>
+    </w:p>
+    <w:p>
+      <w:pPr>
+        <w:pStyle w:val="Compact"/>
+        <w:numPr>
+          <w:ilvl w:val="0"/>
+          <w:numId w:val="1084"/>
+        </w:numPr>
+      </w:pPr>
+      <w:r>
+        <w:t>serie valida con almeno due righe series_viewings;</w:t>
+      </w:r>
+    </w:p>
+    <w:p>
+      <w:pPr>
+        <w:pStyle w:val="Compact"/>
+        <w:numPr>
+          <w:ilvl w:val="0"/>
+          <w:numId w:val="1084"/>
+        </w:numPr>
+      </w:pPr>
+      <w:r>
+        <w:t>una serie è valida anche con completamento iniziale uniforme tracked o imported seguito da una riga series_viewings;</w:t>
+      </w:r>
+    </w:p>
+    <w:p>
+      <w:pPr>
+        <w:pStyle w:val="Compact"/>
+        <w:numPr>
+          <w:ilvl w:val="0"/>
+          <w:numId w:val="1084"/>
+        </w:numPr>
+      </w:pPr>
+      <w:r>
+        <w:t>progressi episodio misti tra tracked e imported non simulano una visione iniziale;</w:t>
+      </w:r>
+    </w:p>
+    <w:p>
+      <w:pPr>
+        <w:pStyle w:val="Compact"/>
+        <w:numPr>
+          <w:ilvl w:val="0"/>
+          <w:numId w:val="1084"/>
+        </w:numPr>
+      </w:pPr>
+      <w:r>
+        <w:t>episode_viewings escluso dalla V1 e riservato a una futura variante;</w:t>
+      </w:r>
+    </w:p>
+    <w:p>
+      <w:pPr>
+        <w:pStyle w:val="Compact"/>
+        <w:numPr>
+          <w:ilvl w:val="0"/>
+          <w:numId w:val="1084"/>
+        </w:numPr>
+      </w:pPr>
+      <w:r>
+        <w:t>riusa la cache TMDB protetta per verificare tutti gli episodi regolari delle serie;</w:t>
+      </w:r>
+    </w:p>
+    <w:p>
+      <w:pPr>
+        <w:pStyle w:val="Compact"/>
+        <w:numPr>
+          <w:ilvl w:val="0"/>
+          <w:numId w:val="1084"/>
+        </w:numPr>
+      </w:pPr>
+      <w:r>
+        <w:t>deduplica sia le visioni sia i titoli;</w:t>
+      </w:r>
+    </w:p>
+    <w:p>
+      <w:pPr>
+        <w:pStyle w:val="Compact"/>
+        <w:numPr>
+          <w:ilvl w:val="0"/>
+          <w:numId w:val="1084"/>
+        </w:numPr>
+      </w:pPr>
+      <w:r>
+        <w:t>evidenza privata limitata agli ID tecnici dei titoli validi;</w:t>
+      </w:r>
+    </w:p>
+    <w:p>
+      <w:pPr>
+        <w:pStyle w:val="Compact"/>
+        <w:numPr>
+          <w:ilvl w:val="0"/>
+          <w:numId w:val="1084"/>
+        </w:numPr>
+      </w:pPr>
+      <w:r>
+        <w:t>rivalutazioni dopo visioni film/serie, riclassificazioni e cambi al progresso episodio;</w:t>
+      </w:r>
+    </w:p>
+    <w:p>
+      <w:pPr>
+        <w:pStyle w:val="Compact"/>
+        <w:numPr>
+          <w:ilvl w:val="0"/>
+          <w:numId w:val="1084"/>
+        </w:numPr>
+      </w:pPr>
+      <w:r>
+        <w:t>riclassificazione film resa atomica rispetto alla coda badge, evitando sblocchi intermedi;</w:t>
+      </w:r>
+    </w:p>
+    <w:p>
+      <w:pPr>
+        <w:pStyle w:val="Compact"/>
+        <w:numPr>
+          <w:ilvl w:val="0"/>
+          <w:numId w:val="1084"/>
+        </w:numPr>
+      </w:pPr>
+      <w:r>
+        <w:t>migration 0025_encore_badge.sql e test SQL transazionale pronti;</w:t>
+      </w:r>
+    </w:p>
+    <w:p>
+      <w:pPr>
+        <w:pStyle w:val="Compact"/>
+        <w:numPr>
+          <w:ilvl w:val="0"/>
+          <w:numId w:val="1084"/>
+        </w:numPr>
+      </w:pPr>
+      <w:r>
+        <w:t>patch originale con doppio fotogramma e circuito di replay;</w:t>
+      </w:r>
+    </w:p>
+    <w:p>
+      <w:pPr>
+        <w:pStyle w:val="Compact"/>
+        <w:numPr>
+          <w:ilvl w:val="0"/>
+          <w:numId w:val="1084"/>
+        </w:numPr>
+      </w:pPr>
+      <w:r>
+        <w:t>preview locale con catalogo intercettato: Encore 0/4, progresso 0/5, hero 3/35;</w:t>
+      </w:r>
+    </w:p>
+    <w:p>
+      <w:pPr>
+        <w:pStyle w:val="Compact"/>
+        <w:numPr>
+          <w:ilvl w:val="0"/>
+          <w:numId w:val="1084"/>
+        </w:numPr>
+      </w:pPr>
+      <w:r>
+        <w:t>patch e accordion verificati senza overflow a 360 e 390 px e senza errori console;</w:t>
+      </w:r>
+    </w:p>
+    <w:p>
+      <w:pPr>
+        <w:pStyle w:val="Compact"/>
+        <w:numPr>
+          <w:ilvl w:val="0"/>
+          <w:numId w:val="1084"/>
+        </w:numPr>
+      </w:pPr>
+      <w:r>
+        <w:t>43/43 test engine superati;</w:t>
+      </w:r>
+    </w:p>
+    <w:p>
+      <w:pPr>
+        <w:pStyle w:val="Compact"/>
+        <w:numPr>
+          <w:ilvl w:val="0"/>
+          <w:numId w:val="1084"/>
+        </w:numPr>
+      </w:pPr>
+      <w:r>
+        <w:t>typecheck e lint mirato superati.</w:t>
       </w:r>
     </w:p>
     <w:bookmarkStart w:id="88" w:name="batch-c-diario-e-social"/>
@@ -14364,7 +14566,7 @@
         <w:rPr>
           <w:b w:val="0"/>
         </w:rPr>
-        <w:t xml:space="preserve">Il prossimo passo operativo è </w:t>
+        <w:t xml:space="preserve">Il prossimo passo operativo è completare il rollout di </w:t>
       </w:r>
       <w:r>
         <w:rPr>
@@ -14388,7 +14590,7 @@
         </w:numPr>
       </w:pPr>
       <w:r>
-        <w:t>contare titoli distinti con almeno una revisione reale;</w:t>
+        <w:t>distribuire la Edge Function aggiornata;</w:t>
       </w:r>
     </w:p>
     <w:p>
@@ -14400,7 +14602,7 @@
         </w:numPr>
       </w:pPr>
       <w:r>
-        <w:t>accettare una prima visione importata seguita da una visione tracked;</w:t>
+        <w:t>pubblicare la patch con doppio fotogramma e replay;</w:t>
       </w:r>
     </w:p>
     <w:p>
@@ -14412,7 +14614,7 @@
         </w:numPr>
       </w:pPr>
       <w:r>
-        <w:t>usare gli storici film e serie senza duplicare lo stesso titolo;</w:t>
+        <w:t>applicare la migration 0025_encore_badge.sql;</w:t>
       </w:r>
     </w:p>
     <w:p>
@@ -14424,7 +14626,7 @@
         </w:numPr>
       </w:pPr>
       <w:r>
-        <w:t>applicare le soglie 5 / 25 / 100 / 250;</w:t>
+        <w:t>eseguire il test SQL transazionale;</w:t>
       </w:r>
     </w:p>
     <w:p>
@@ -14436,7 +14638,7 @@
         </w:numPr>
       </w:pPr>
       <w:r>
-        <w:t>implementare valutatore, loader, migration, test e patch dedicata;</w:t>
+        <w:t>verificare backfill e idempotenza sugli account reali;</w:t>
       </w:r>
     </w:p>
     <w:p>
@@ -14448,7 +14650,7 @@
         </w:numPr>
       </w:pPr>
       <w:r>
-        <w:t>verificare localmente e poi con un rollout reversibile.</w:t>
+        <w:t>completare un test live reversibile.</w:t>
       </w:r>
     </w:p>
     <w:bookmarkEnd w:id="103"/>

</xml_diff>

<commit_message>
Document Encore badge rollout
Co-authored-by: Copilot <223556219+Copilot@users.noreply.github.com>
</commit_message>
<xml_diff>
--- a/docs/BADGE-PIANO.docx
+++ b/docs/BADGE-PIANO.docx
@@ -90,7 +90,7 @@
         <w:rPr>
           <w:b w:val="0"/>
         </w:rPr>
-        <w:t xml:space="preserve"> fino a Maratoneta (B3) pubblicato; Encore (B4) completato localmente e in attesa di rollout</w:t>
+        <w:t xml:space="preserve"> fino a Encore (B4) pubblicato e verificato in produzione</w:t>
       </w:r>
     </w:p>
     <w:p>
@@ -12917,6 +12917,126 @@
         <w:t>typecheck e lint mirato superati.</w:t>
       </w:r>
     </w:p>
+    <w:p>
+      <w:pPr>
+        <w:pStyle w:val="Compact"/>
+        <w:numPr>
+          <w:ilvl w:val="0"/>
+          <w:numId w:val="1084"/>
+        </w:numPr>
+      </w:pPr>
+      <w:r>
+        <w:t>bundle monolitico verificato e distribuito con valutatore, loader e routing Encore;</w:t>
+      </w:r>
+    </w:p>
+    <w:p>
+      <w:pPr>
+        <w:pStyle w:val="Compact"/>
+        <w:numPr>
+          <w:ilvl w:val="0"/>
+          <w:numId w:val="1084"/>
+        </w:numPr>
+      </w:pPr>
+      <w:r>
+        <w:t>migration 0025_encore_badge.sql applicata in produzione;</w:t>
+      </w:r>
+    </w:p>
+    <w:p>
+      <w:pPr>
+        <w:pStyle w:val="Compact"/>
+        <w:numPr>
+          <w:ilvl w:val="0"/>
+          <w:numId w:val="1084"/>
+        </w:numPr>
+      </w:pPr>
+      <w:r>
+        <w:t>test SQL transazionale superato senza dati residui;</w:t>
+      </w:r>
+    </w:p>
+    <w:p>
+      <w:pPr>
+        <w:pStyle w:val="Compact"/>
+        <w:numPr>
+          <w:ilvl w:val="0"/>
+          <w:numId w:val="1084"/>
+        </w:numPr>
+      </w:pPr>
+      <w:r>
+        <w:t>deploy Azure completato sul commit 3f14c23, run 37591927243;</w:t>
+      </w:r>
+    </w:p>
+    <w:p>
+      <w:pPr>
+        <w:pStyle w:val="Compact"/>
+        <w:numPr>
+          <w:ilvl w:val="0"/>
+          <w:numId w:val="1084"/>
+        </w:numPr>
+      </w:pPr>
+      <w:r>
+        <w:t>account @testshowtime: backfill reale 1/5, nessuno sblocco, hero 3/35;</w:t>
+      </w:r>
+    </w:p>
+    <w:p>
+      <w:pPr>
+        <w:pStyle w:val="Compact"/>
+        <w:numPr>
+          <w:ilvl w:val="0"/>
+          <w:numId w:val="1084"/>
+        </w:numPr>
+      </w:pPr>
+      <w:r>
+        <w:t>secondo refresh reale: 0 nuovi sblocchi;</w:t>
+      </w:r>
+    </w:p>
+    <w:p>
+      <w:pPr>
+        <w:pStyle w:val="Compact"/>
+        <w:numPr>
+          <w:ilvl w:val="0"/>
+          <w:numId w:val="1084"/>
+        </w:numPr>
+      </w:pPr>
+      <w:r>
+        <w:t>test live reversibile: una visione su ciascuno dei 3 film importati e due visioni su ciascuna delle 2 serie hanno portato 5 titoli distinti, Bronzo, 5/25 e un banner;</w:t>
+      </w:r>
+    </w:p>
+    <w:p>
+      <w:pPr>
+        <w:pStyle w:val="Compact"/>
+        <w:numPr>
+          <w:ilvl w:val="0"/>
+          <w:numId w:val="1084"/>
+        </w:numPr>
+      </w:pPr>
+      <w:r>
+        <w:t>secondo refresh della prova idempotente: 0 nuovi sblocchi;</w:t>
+      </w:r>
+    </w:p>
+    <w:p>
+      <w:pPr>
+        <w:pStyle w:val="Compact"/>
+        <w:numPr>
+          <w:ilvl w:val="0"/>
+          <w:numId w:val="1084"/>
+        </w:numPr>
+      </w:pPr>
+      <w:r>
+        <w:t>rollback completo verificato: 3 righe viewings e 4 righe series_viewings eliminate, sblocco rimosso, progresso e massimo reali ripristinati a 1, UI 1/5;</w:t>
+      </w:r>
+    </w:p>
+    <w:p>
+      <w:pPr>
+        <w:pStyle w:val="Compact"/>
+        <w:numPr>
+          <w:ilvl w:val="0"/>
+          <w:numId w:val="1084"/>
+        </w:numPr>
+      </w:pPr>
+      <w:r>
+        <w:t>produzione verificata senza overflow a 360/390 px e senza errori console.</w:t>
+      </w:r>
+    </w:p>
     <w:bookmarkStart w:id="88" w:name="batch-c-diario-e-social"/>
     <w:p>
       <w:pPr>
@@ -14533,6 +14653,18 @@
       </w:r>
     </w:p>
     <w:p>
+      <w:pPr>
+        <w:pStyle w:val="Compact"/>
+        <w:numPr>
+          <w:ilvl w:val="0"/>
+          <w:numId w:val="1159"/>
+        </w:numPr>
+      </w:pPr>
+      <w:r>
+        <w:t>Terzo batch successivo: Maratoneta ed Encore</w:t>
+      </w:r>
+    </w:p>
+    <w:p>
       <w:r>
         <w:pict>
           <v:rect style="width:0;height:1.5pt" o:hralign="center" o:hrstd="t" o:hr="t"/>
@@ -14566,13 +14698,13 @@
         <w:rPr>
           <w:b w:val="0"/>
         </w:rPr>
-        <w:t xml:space="preserve">Il prossimo passo operativo è completare il rollout di </w:t>
+        <w:t xml:space="preserve">Il prossimo passo operativo è </w:t>
       </w:r>
       <w:r>
         <w:rPr>
           <w:b/>
         </w:rPr>
-        <w:t>Encore</w:t>
+        <w:t>Critico</w:t>
       </w:r>
       <w:r>
         <w:rPr>
@@ -14590,7 +14722,7 @@
         </w:numPr>
       </w:pPr>
       <w:r>
-        <w:t>distribuire la Edge Function aggiornata;</w:t>
+        <w:t>contare tutte le voci distinte con nota testuale non vuota;</w:t>
       </w:r>
     </w:p>
     <w:p>
@@ -14602,7 +14734,7 @@
         </w:numPr>
       </w:pPr>
       <w:r>
-        <w:t>pubblicare la patch con doppio fotogramma e replay;</w:t>
+        <w:t>includere film, episodi e visioni complete serie;</w:t>
       </w:r>
     </w:p>
     <w:p>
@@ -14614,7 +14746,7 @@
         </w:numPr>
       </w:pPr>
       <w:r>
-        <w:t>applicare la migration 0025_encore_badge.sql;</w:t>
+        <w:t>includere revisioni e rewatch come voci distinte;</w:t>
       </w:r>
     </w:p>
     <w:p>
@@ -14626,7 +14758,7 @@
         </w:numPr>
       </w:pPr>
       <w:r>
-        <w:t>eseguire il test SQL transazionale;</w:t>
+        <w:t>escludere attività con solo voto;</w:t>
       </w:r>
     </w:p>
     <w:p>
@@ -14638,7 +14770,7 @@
         </w:numPr>
       </w:pPr>
       <w:r>
-        <w:t>verificare backfill e idempotenza sugli account reali;</w:t>
+        <w:t>applicare le soglie 50 / 150 / 250 / 500;</w:t>
       </w:r>
     </w:p>
     <w:p>
@@ -14650,7 +14782,7 @@
         </w:numPr>
       </w:pPr>
       <w:r>
-        <w:t>completare un test live reversibile.</w:t>
+        <w:t>implementare valutatore, loader, migration, test e patch dedicata.</w:t>
       </w:r>
     </w:p>
     <w:bookmarkEnd w:id="103"/>

</xml_diff>

<commit_message>
Add Critic badge progression
Co-authored-by: Copilot <223556219+Copilot@users.noreply.github.com>
</commit_message>
<xml_diff>
--- a/docs/BADGE-PIANO.docx
+++ b/docs/BADGE-PIANO.docx
@@ -90,7 +90,7 @@
         <w:rPr>
           <w:b w:val="0"/>
         </w:rPr>
-        <w:t xml:space="preserve"> fino a Encore (B4) pubblicato e verificato in produzione</w:t>
+        <w:t xml:space="preserve"> fino a Encore (B4) pubblicato; Critico (C1) completato localmente e in attesa di rollout</w:t>
       </w:r>
     </w:p>
     <w:p>
@@ -13070,6 +13070,206 @@
         <w:t xml:space="preserve">Passaparola</w:t>
       </w:r>
     </w:p>
+    <w:p>
+      <w:pPr>
+        <w:pStyle w:val="Heading3"/>
+      </w:pPr>
+      <w:r>
+        <w:t>Verifica Batch C1 — Critico</w:t>
+      </w:r>
+    </w:p>
+    <w:p>
+      <w:pPr>
+        <w:pStyle w:val="Compact"/>
+        <w:numPr>
+          <w:ilvl w:val="0"/>
+          <w:numId w:val="1084"/>
+        </w:numPr>
+      </w:pPr>
+      <w:r>
+        <w:t>soglie 50 / 150 / 250 / 500 attività commentate distinte;</w:t>
+      </w:r>
+    </w:p>
+    <w:p>
+      <w:pPr>
+        <w:pStyle w:val="Compact"/>
+        <w:numPr>
+          <w:ilvl w:val="0"/>
+          <w:numId w:val="1084"/>
+        </w:numPr>
+      </w:pPr>
+      <w:r>
+        <w:t>conta note testuali non vuote in viewings, episode_viewings e series_viewings;</w:t>
+      </w:r>
+    </w:p>
+    <w:p>
+      <w:pPr>
+        <w:pStyle w:val="Compact"/>
+        <w:numPr>
+          <w:ilvl w:val="0"/>
+          <w:numId w:val="1084"/>
+        </w:numPr>
+      </w:pPr>
+      <w:r>
+        <w:t>attività con solo voto escluse;</w:t>
+      </w:r>
+    </w:p>
+    <w:p>
+      <w:pPr>
+        <w:pStyle w:val="Compact"/>
+        <w:numPr>
+          <w:ilvl w:val="0"/>
+          <w:numId w:val="1084"/>
+        </w:numPr>
+      </w:pPr>
+      <w:r>
+        <w:t>revisioni e rewatch dello stesso titolo contano come voci distinte;</w:t>
+      </w:r>
+    </w:p>
+    <w:p>
+      <w:pPr>
+        <w:pStyle w:val="Compact"/>
+        <w:numPr>
+          <w:ilvl w:val="0"/>
+          <w:numId w:val="1084"/>
+        </w:numPr>
+      </w:pPr>
+      <w:r>
+        <w:t>deduplica per ID attività, con prefisso specifico per ogni tabella;</w:t>
+      </w:r>
+    </w:p>
+    <w:p>
+      <w:pPr>
+        <w:pStyle w:val="Compact"/>
+        <w:numPr>
+          <w:ilvl w:val="0"/>
+          <w:numId w:val="1084"/>
+        </w:numPr>
+      </w:pPr>
+      <w:r>
+        <w:t>modificare una riga esistente non incrementa il progresso;</w:t>
+      </w:r>
+    </w:p>
+    <w:p>
+      <w:pPr>
+        <w:pStyle w:val="Compact"/>
+        <w:numPr>
+          <w:ilvl w:val="0"/>
+          <w:numId w:val="1084"/>
+        </w:numPr>
+      </w:pPr>
+      <w:r>
+        <w:t>eliminare una riga riduce il progresso corrente senza revocare livelli già sbloccati;</w:t>
+      </w:r>
+    </w:p>
+    <w:p>
+      <w:pPr>
+        <w:pStyle w:val="Compact"/>
+        <w:numPr>
+          <w:ilvl w:val="0"/>
+          <w:numId w:val="1084"/>
+        </w:numPr>
+      </w:pPr>
+      <w:r>
+        <w:t>riusa il loader validato di Prima recensione, esteso a tutte le note paginando oltre 1.000;</w:t>
+      </w:r>
+    </w:p>
+    <w:p>
+      <w:pPr>
+        <w:pStyle w:val="Compact"/>
+        <w:numPr>
+          <w:ilvl w:val="0"/>
+          <w:numId w:val="1084"/>
+        </w:numPr>
+      </w:pPr>
+      <w:r>
+        <w:t>evidenza privata limitata agli ID tecnici delle attività, senza salvare i testi;</w:t>
+      </w:r>
+    </w:p>
+    <w:p>
+      <w:pPr>
+        <w:pStyle w:val="Compact"/>
+        <w:numPr>
+          <w:ilvl w:val="0"/>
+          <w:numId w:val="1084"/>
+        </w:numPr>
+      </w:pPr>
+      <w:r>
+        <w:t>rivalutazioni dopo inserimento o rimozione di note film, episodio e serie;</w:t>
+      </w:r>
+    </w:p>
+    <w:p>
+      <w:pPr>
+        <w:pStyle w:val="Compact"/>
+        <w:numPr>
+          <w:ilvl w:val="0"/>
+          <w:numId w:val="1084"/>
+        </w:numPr>
+      </w:pPr>
+      <w:r>
+        <w:t>migration 0026_critic_badge.sql e test SQL transazionale pronti;</w:t>
+      </w:r>
+    </w:p>
+    <w:p>
+      <w:pPr>
+        <w:pStyle w:val="Compact"/>
+        <w:numPr>
+          <w:ilvl w:val="0"/>
+          <w:numId w:val="1084"/>
+        </w:numPr>
+      </w:pPr>
+      <w:r>
+        <w:t>patch originale a scheda-recensione con citazioni e penna;</w:t>
+      </w:r>
+    </w:p>
+    <w:p>
+      <w:pPr>
+        <w:pStyle w:val="Compact"/>
+        <w:numPr>
+          <w:ilvl w:val="0"/>
+          <w:numId w:val="1084"/>
+        </w:numPr>
+      </w:pPr>
+      <w:r>
+        <w:t>preview locale con catalogo intercettato: Critico 0/4, progresso 0/50, hero 3/39;</w:t>
+      </w:r>
+    </w:p>
+    <w:p>
+      <w:pPr>
+        <w:pStyle w:val="Compact"/>
+        <w:numPr>
+          <w:ilvl w:val="0"/>
+          <w:numId w:val="1084"/>
+        </w:numPr>
+      </w:pPr>
+      <w:r>
+        <w:t>patch e accordion verificati senza overflow a 360 e 390 px e senza errori console;</w:t>
+      </w:r>
+    </w:p>
+    <w:p>
+      <w:pPr>
+        <w:pStyle w:val="Compact"/>
+        <w:numPr>
+          <w:ilvl w:val="0"/>
+          <w:numId w:val="1084"/>
+        </w:numPr>
+      </w:pPr>
+      <w:r>
+        <w:t>46/46 test engine superati;</w:t>
+      </w:r>
+    </w:p>
+    <w:p>
+      <w:pPr>
+        <w:pStyle w:val="Compact"/>
+        <w:numPr>
+          <w:ilvl w:val="0"/>
+          <w:numId w:val="1084"/>
+        </w:numPr>
+      </w:pPr>
+      <w:r>
+        <w:t>typecheck e lint mirato superati.</w:t>
+      </w:r>
+    </w:p>
     <w:bookmarkEnd w:id="88"/>
     <w:bookmarkEnd w:id="89"/>
     <w:bookmarkStart w:id="90" w:name="fase-4-profilo-e-rifiniture"/>
@@ -14698,7 +14898,7 @@
         <w:rPr>
           <w:b w:val="0"/>
         </w:rPr>
-        <w:t xml:space="preserve">Il prossimo passo operativo è </w:t>
+        <w:t xml:space="preserve">Il prossimo passo operativo è completare il rollout di </w:t>
       </w:r>
       <w:r>
         <w:rPr>
@@ -14722,7 +14922,7 @@
         </w:numPr>
       </w:pPr>
       <w:r>
-        <w:t>contare tutte le voci distinte con nota testuale non vuota;</w:t>
+        <w:t>distribuire la Edge Function aggiornata;</w:t>
       </w:r>
     </w:p>
     <w:p>
@@ -14734,7 +14934,7 @@
         </w:numPr>
       </w:pPr>
       <w:r>
-        <w:t>includere film, episodi e visioni complete serie;</w:t>
+        <w:t>pubblicare la patch a scheda-recensione e penna;</w:t>
       </w:r>
     </w:p>
     <w:p>
@@ -14746,7 +14946,7 @@
         </w:numPr>
       </w:pPr>
       <w:r>
-        <w:t>includere revisioni e rewatch come voci distinte;</w:t>
+        <w:t>applicare la migration 0026_critic_badge.sql;</w:t>
       </w:r>
     </w:p>
     <w:p>
@@ -14758,7 +14958,7 @@
         </w:numPr>
       </w:pPr>
       <w:r>
-        <w:t>escludere attività con solo voto;</w:t>
+        <w:t>eseguire il test SQL transazionale;</w:t>
       </w:r>
     </w:p>
     <w:p>
@@ -14770,7 +14970,7 @@
         </w:numPr>
       </w:pPr>
       <w:r>
-        <w:t>applicare le soglie 50 / 150 / 250 / 500;</w:t>
+        <w:t>verificare backfill e idempotenza sugli account reali;</w:t>
       </w:r>
     </w:p>
     <w:p>
@@ -14782,7 +14982,7 @@
         </w:numPr>
       </w:pPr>
       <w:r>
-        <w:t>implementare valutatore, loader, migration, test e patch dedicata.</w:t>
+        <w:t>completare un test live reversibile.</w:t>
       </w:r>
     </w:p>
     <w:bookmarkEnd w:id="103"/>

</xml_diff>

<commit_message>
Document Critic badge rollout
Co-authored-by: Copilot <223556219+Copilot@users.noreply.github.com>
</commit_message>
<xml_diff>
--- a/docs/BADGE-PIANO.docx
+++ b/docs/BADGE-PIANO.docx
@@ -90,7 +90,7 @@
         <w:rPr>
           <w:b w:val="0"/>
         </w:rPr>
-        <w:t xml:space="preserve"> fino a Encore (B4) pubblicato; Critico (C1) completato localmente e in attesa di rollout</w:t>
+        <w:t xml:space="preserve"> fino a Critico (C1) pubblicato e verificato in produzione</w:t>
       </w:r>
     </w:p>
     <w:p>
@@ -13270,6 +13270,126 @@
         <w:t>typecheck e lint mirato superati.</w:t>
       </w:r>
     </w:p>
+    <w:p>
+      <w:pPr>
+        <w:pStyle w:val="Compact"/>
+        <w:numPr>
+          <w:ilvl w:val="0"/>
+          <w:numId w:val="1084"/>
+        </w:numPr>
+      </w:pPr>
+      <w:r>
+        <w:t>bundle monolitico verificato e distribuito con valutatore, loader e routing Critico;</w:t>
+      </w:r>
+    </w:p>
+    <w:p>
+      <w:pPr>
+        <w:pStyle w:val="Compact"/>
+        <w:numPr>
+          <w:ilvl w:val="0"/>
+          <w:numId w:val="1084"/>
+        </w:numPr>
+      </w:pPr>
+      <w:r>
+        <w:t>migration 0026_critic_badge.sql applicata in produzione;</w:t>
+      </w:r>
+    </w:p>
+    <w:p>
+      <w:pPr>
+        <w:pStyle w:val="Compact"/>
+        <w:numPr>
+          <w:ilvl w:val="0"/>
+          <w:numId w:val="1084"/>
+        </w:numPr>
+      </w:pPr>
+      <w:r>
+        <w:t>test SQL transazionale superato senza dati residui;</w:t>
+      </w:r>
+    </w:p>
+    <w:p>
+      <w:pPr>
+        <w:pStyle w:val="Compact"/>
+        <w:numPr>
+          <w:ilvl w:val="0"/>
+          <w:numId w:val="1084"/>
+        </w:numPr>
+      </w:pPr>
+      <w:r>
+        <w:t>deploy Azure completato sul commit 8952fe7, run 37597739742;</w:t>
+      </w:r>
+    </w:p>
+    <w:p>
+      <w:pPr>
+        <w:pStyle w:val="Compact"/>
+        <w:numPr>
+          <w:ilvl w:val="0"/>
+          <w:numId w:val="1084"/>
+        </w:numPr>
+      </w:pPr>
+      <w:r>
+        <w:t>account @testshowtime: backfill reale 2/50, nessuno sblocco, hero 3/39;</w:t>
+      </w:r>
+    </w:p>
+    <w:p>
+      <w:pPr>
+        <w:pStyle w:val="Compact"/>
+        <w:numPr>
+          <w:ilvl w:val="0"/>
+          <w:numId w:val="1084"/>
+        </w:numPr>
+      </w:pPr>
+      <w:r>
+        <w:t>secondo refresh reale: 0 nuovi sblocchi;</w:t>
+      </w:r>
+    </w:p>
+    <w:p>
+      <w:pPr>
+        <w:pStyle w:val="Compact"/>
+        <w:numPr>
+          <w:ilvl w:val="0"/>
+          <w:numId w:val="1084"/>
+        </w:numPr>
+      </w:pPr>
+      <w:r>
+        <w:t>test live reversibile: 48 note temporanee su un film hanno portato il progresso esattamente a 50/150, Bronzo e un solo banner;</w:t>
+      </w:r>
+    </w:p>
+    <w:p>
+      <w:pPr>
+        <w:pStyle w:val="Compact"/>
+        <w:numPr>
+          <w:ilvl w:val="0"/>
+          <w:numId w:val="1084"/>
+        </w:numPr>
+      </w:pPr>
+      <w:r>
+        <w:t>secondo refresh della prova idempotente: 0 nuovi sblocchi;</w:t>
+      </w:r>
+    </w:p>
+    <w:p>
+      <w:pPr>
+        <w:pStyle w:val="Compact"/>
+        <w:numPr>
+          <w:ilvl w:val="0"/>
+          <w:numId w:val="1084"/>
+        </w:numPr>
+      </w:pPr>
+      <w:r>
+        <w:t>rollback completo verificato: 48 righe viewings eliminate, sblocco rimosso, progresso e massimo reali ripristinati a 2, UI 2/50;</w:t>
+      </w:r>
+    </w:p>
+    <w:p>
+      <w:pPr>
+        <w:pStyle w:val="Compact"/>
+        <w:numPr>
+          <w:ilvl w:val="0"/>
+          <w:numId w:val="1084"/>
+        </w:numPr>
+      </w:pPr>
+      <w:r>
+        <w:t>produzione verificata senza overflow a 360/390 px e senza errori console.</w:t>
+      </w:r>
+    </w:p>
     <w:bookmarkEnd w:id="88"/>
     <w:bookmarkEnd w:id="89"/>
     <w:bookmarkStart w:id="90" w:name="fase-4-profilo-e-rifiniture"/>
@@ -14865,6 +14985,18 @@
       </w:r>
     </w:p>
     <w:p>
+      <w:pPr>
+        <w:pStyle w:val="Compact"/>
+        <w:numPr>
+          <w:ilvl w:val="0"/>
+          <w:numId w:val="1159"/>
+        </w:numPr>
+      </w:pPr>
+      <w:r>
+        <w:t>Primo batch Diario: Critico</w:t>
+      </w:r>
+    </w:p>
+    <w:p>
       <w:r>
         <w:pict>
           <v:rect style="width:0;height:1.5pt" o:hralign="center" o:hrstd="t" o:hr="t"/>
@@ -14898,13 +15030,13 @@
         <w:rPr>
           <w:b w:val="0"/>
         </w:rPr>
-        <w:t xml:space="preserve">Il prossimo passo operativo è completare il rollout di </w:t>
+        <w:t xml:space="preserve">Il prossimo passo operativo è </w:t>
       </w:r>
       <w:r>
         <w:rPr>
           <w:b/>
         </w:rPr>
-        <w:t>Critico</w:t>
+        <w:t>Passaparola</w:t>
       </w:r>
       <w:r>
         <w:rPr>
@@ -14922,7 +15054,7 @@
         </w:numPr>
       </w:pPr>
       <w:r>
-        <w:t>distribuire la Edge Function aggiornata;</w:t>
+        <w:t>contare soltanto condivisioni realmente lette;</w:t>
       </w:r>
     </w:p>
     <w:p>
@@ -14934,7 +15066,7 @@
         </w:numPr>
       </w:pPr>
       <w:r>
-        <w:t>pubblicare la patch a scheda-recensione e penna;</w:t>
+        <w:t>deduplicare per coppia titolo + destinatario;</w:t>
       </w:r>
     </w:p>
     <w:p>
@@ -14946,7 +15078,7 @@
         </w:numPr>
       </w:pPr>
       <w:r>
-        <w:t>applicare la migration 0026_critic_badge.sql;</w:t>
+        <w:t>ignorare reinvii e riaperture;</w:t>
       </w:r>
     </w:p>
     <w:p>
@@ -14958,7 +15090,7 @@
         </w:numPr>
       </w:pPr>
       <w:r>
-        <w:t>eseguire il test SQL transazionale;</w:t>
+        <w:t>escludere condivisioni senza read_at;</w:t>
       </w:r>
     </w:p>
     <w:p>
@@ -14970,7 +15102,7 @@
         </w:numPr>
       </w:pPr>
       <w:r>
-        <w:t>verificare backfill e idempotenza sugli account reali;</w:t>
+        <w:t>applicare le soglie 25 / 100 / 250 / 500;</w:t>
       </w:r>
     </w:p>
     <w:p>
@@ -14982,7 +15114,7 @@
         </w:numPr>
       </w:pPr>
       <w:r>
-        <w:t>completare un test live reversibile.</w:t>
+        <w:t>implementare valutatore, loader, migration, test e patch dedicata.</w:t>
       </w:r>
     </w:p>
     <w:bookmarkEnd w:id="103"/>

</xml_diff>

<commit_message>
Add Word of Mouth badge progression
Co-authored-by: Copilot <223556219+Copilot@users.noreply.github.com>
</commit_message>
<xml_diff>
--- a/docs/BADGE-PIANO.docx
+++ b/docs/BADGE-PIANO.docx
@@ -90,7 +90,7 @@
         <w:rPr>
           <w:b w:val="0"/>
         </w:rPr>
-        <w:t xml:space="preserve"> fino a Critico (C1) pubblicato e verificato in produzione</w:t>
+        <w:t xml:space="preserve"> fino a Critico (C1) pubblicato; Passaparola (C2) completato localmente e in attesa di rollout</w:t>
       </w:r>
     </w:p>
     <w:p>
@@ -13390,6 +13390,218 @@
         <w:t>produzione verificata senza overflow a 360/390 px e senza errori console.</w:t>
       </w:r>
     </w:p>
+    <w:p>
+      <w:pPr>
+        <w:pStyle w:val="Heading3"/>
+      </w:pPr>
+      <w:r>
+        <w:t>Verifica Batch C2 — Passaparola</w:t>
+      </w:r>
+    </w:p>
+    <w:p>
+      <w:pPr>
+        <w:pStyle w:val="Compact"/>
+        <w:numPr>
+          <w:ilvl w:val="0"/>
+          <w:numId w:val="1084"/>
+        </w:numPr>
+      </w:pPr>
+      <w:r>
+        <w:t>soglie 25 / 100 / 250 / 500 coppie titolo + destinatario;</w:t>
+      </w:r>
+    </w:p>
+    <w:p>
+      <w:pPr>
+        <w:pStyle w:val="Compact"/>
+        <w:numPr>
+          <w:ilvl w:val="0"/>
+          <w:numId w:val="1084"/>
+        </w:numPr>
+      </w:pPr>
+      <w:r>
+        <w:t>conta soltanto righe title_shares con read_at non nullo;</w:t>
+      </w:r>
+    </w:p>
+    <w:p>
+      <w:pPr>
+        <w:pStyle w:val="Compact"/>
+        <w:numPr>
+          <w:ilvl w:val="0"/>
+          <w:numId w:val="1084"/>
+        </w:numPr>
+      </w:pPr>
+      <w:r>
+        <w:t>chiave canonica composta da tipo media, ID TMDB e destinatario;</w:t>
+      </w:r>
+    </w:p>
+    <w:p>
+      <w:pPr>
+        <w:pStyle w:val="Compact"/>
+        <w:numPr>
+          <w:ilvl w:val="0"/>
+          <w:numId w:val="1084"/>
+        </w:numPr>
+      </w:pPr>
+      <w:r>
+        <w:t>reinvii e riaperture della stessa coppia non incrementano il progresso;</w:t>
+      </w:r>
+    </w:p>
+    <w:p>
+      <w:pPr>
+        <w:pStyle w:val="Compact"/>
+        <w:numPr>
+          <w:ilvl w:val="0"/>
+          <w:numId w:val="1084"/>
+        </w:numPr>
+      </w:pPr>
+      <w:r>
+        <w:t>lo stesso titolo letto da destinatari differenti contribuisce una volta per ciascuno;</w:t>
+      </w:r>
+    </w:p>
+    <w:p>
+      <w:pPr>
+        <w:pStyle w:val="Compact"/>
+        <w:numPr>
+          <w:ilvl w:val="0"/>
+          <w:numId w:val="1084"/>
+        </w:numPr>
+      </w:pPr>
+      <w:r>
+        <w:t>gli invii non letti sono esclusi;</w:t>
+      </w:r>
+    </w:p>
+    <w:p>
+      <w:pPr>
+        <w:pStyle w:val="Compact"/>
+        <w:numPr>
+          <w:ilvl w:val="0"/>
+          <w:numId w:val="1084"/>
+        </w:numPr>
+      </w:pPr>
+      <w:r>
+        <w:t>loader paginato oltre 1.000 con evidenza privata limitata alle chiavi tecniche;</w:t>
+      </w:r>
+    </w:p>
+    <w:p>
+      <w:pPr>
+        <w:pStyle w:val="Compact"/>
+        <w:numPr>
+          <w:ilvl w:val="0"/>
+          <w:numId w:val="1084"/>
+        </w:numPr>
+      </w:pPr>
+      <w:r>
+        <w:t>riconciliazione cross-user mirata dopo lettura interna o accettazione invito esterno;</w:t>
+      </w:r>
+    </w:p>
+    <w:p>
+      <w:pPr>
+        <w:pStyle w:val="Compact"/>
+        <w:numPr>
+          <w:ilvl w:val="0"/>
+          <w:numId w:val="1084"/>
+        </w:numPr>
+      </w:pPr>
+      <w:r>
+        <w:t>la Edge Function verifica share ID, destinatario autenticato e read_at prima di valutare esclusivamente Passaparola del mittente;</w:t>
+      </w:r>
+    </w:p>
+    <w:p>
+      <w:pPr>
+        <w:pStyle w:val="Compact"/>
+        <w:numPr>
+          <w:ilvl w:val="0"/>
+          <w:numId w:val="1084"/>
+        </w:numPr>
+      </w:pPr>
+      <w:r>
+        <w:t>la risposta al destinatario non espone progresso, livelli o nuovi sblocchi del mittente;</w:t>
+      </w:r>
+    </w:p>
+    <w:p>
+      <w:pPr>
+        <w:pStyle w:val="Compact"/>
+        <w:numPr>
+          <w:ilvl w:val="0"/>
+          <w:numId w:val="1084"/>
+        </w:numPr>
+      </w:pPr>
+      <w:r>
+        <w:t>richieste ripetute sono idempotenti e la riconciliazione fallita non blocca l’apertura;</w:t>
+      </w:r>
+    </w:p>
+    <w:p>
+      <w:pPr>
+        <w:pStyle w:val="Compact"/>
+        <w:numPr>
+          <w:ilvl w:val="0"/>
+          <w:numId w:val="1084"/>
+        </w:numPr>
+      </w:pPr>
+      <w:r>
+        <w:t>migration 0027_word_of_mouth_badge.sql e test SQL transazionale pronti;</w:t>
+      </w:r>
+    </w:p>
+    <w:p>
+      <w:pPr>
+        <w:pStyle w:val="Compact"/>
+        <w:numPr>
+          <w:ilvl w:val="0"/>
+          <w:numId w:val="1084"/>
+        </w:numPr>
+      </w:pPr>
+      <w:r>
+        <w:t>patch originale con messaggio video, freccia e conferma di lettura;</w:t>
+      </w:r>
+    </w:p>
+    <w:p>
+      <w:pPr>
+        <w:pStyle w:val="Compact"/>
+        <w:numPr>
+          <w:ilvl w:val="0"/>
+          <w:numId w:val="1084"/>
+        </w:numPr>
+      </w:pPr>
+      <w:r>
+        <w:t>preview locale con catalogo intercettato: Passaparola 0/4, progresso 0/25, hero 3/43;</w:t>
+      </w:r>
+    </w:p>
+    <w:p>
+      <w:pPr>
+        <w:pStyle w:val="Compact"/>
+        <w:numPr>
+          <w:ilvl w:val="0"/>
+          <w:numId w:val="1084"/>
+        </w:numPr>
+      </w:pPr>
+      <w:r>
+        <w:t>patch e accordion verificati senza overflow a 360 e 390 px e senza errori console;</w:t>
+      </w:r>
+    </w:p>
+    <w:p>
+      <w:pPr>
+        <w:pStyle w:val="Compact"/>
+        <w:numPr>
+          <w:ilvl w:val="0"/>
+          <w:numId w:val="1084"/>
+        </w:numPr>
+      </w:pPr>
+      <w:r>
+        <w:t>49/49 test engine superati;</w:t>
+      </w:r>
+    </w:p>
+    <w:p>
+      <w:pPr>
+        <w:pStyle w:val="Compact"/>
+        <w:numPr>
+          <w:ilvl w:val="0"/>
+          <w:numId w:val="1084"/>
+        </w:numPr>
+      </w:pPr>
+      <w:r>
+        <w:t>typecheck e lint mirato superati.</w:t>
+      </w:r>
+    </w:p>
     <w:bookmarkEnd w:id="88"/>
     <w:bookmarkEnd w:id="89"/>
     <w:bookmarkStart w:id="90" w:name="fase-4-profilo-e-rifiniture"/>
@@ -15030,7 +15242,7 @@
         <w:rPr>
           <w:b w:val="0"/>
         </w:rPr>
-        <w:t xml:space="preserve">Il prossimo passo operativo è </w:t>
+        <w:t xml:space="preserve">Il prossimo passo operativo è completare il rollout di </w:t>
       </w:r>
       <w:r>
         <w:rPr>
@@ -15054,7 +15266,7 @@
         </w:numPr>
       </w:pPr>
       <w:r>
-        <w:t>contare soltanto condivisioni realmente lette;</w:t>
+        <w:t>distribuire la Edge Function con riconciliazione cross-user;</w:t>
       </w:r>
     </w:p>
     <w:p>
@@ -15066,7 +15278,7 @@
         </w:numPr>
       </w:pPr>
       <w:r>
-        <w:t>deduplicare per coppia titolo + destinatario;</w:t>
+        <w:t>pubblicare la patch con condivisione e conferma di lettura;</w:t>
       </w:r>
     </w:p>
     <w:p>
@@ -15078,7 +15290,7 @@
         </w:numPr>
       </w:pPr>
       <w:r>
-        <w:t>ignorare reinvii e riaperture;</w:t>
+        <w:t>applicare la migration 0027_word_of_mouth_badge.sql;</w:t>
       </w:r>
     </w:p>
     <w:p>
@@ -15090,7 +15302,7 @@
         </w:numPr>
       </w:pPr>
       <w:r>
-        <w:t>escludere condivisioni senza read_at;</w:t>
+        <w:t>eseguire il test SQL transazionale;</w:t>
       </w:r>
     </w:p>
     <w:p>
@@ -15102,7 +15314,7 @@
         </w:numPr>
       </w:pPr>
       <w:r>
-        <w:t>applicare le soglie 25 / 100 / 250 / 500;</w:t>
+        <w:t>verificare backfill, privacy e idempotenza sugli account reali;</w:t>
       </w:r>
     </w:p>
     <w:p>
@@ -15114,7 +15326,7 @@
         </w:numPr>
       </w:pPr>
       <w:r>
-        <w:t>implementare valutatore, loader, migration, test e patch dedicata.</w:t>
+        <w:t>completare un test live reversibile.</w:t>
       </w:r>
     </w:p>
     <w:bookmarkEnd w:id="103"/>

</xml_diff>

<commit_message>
Document Word of Mouth badge rollout
Co-authored-by: Copilot <223556219+Copilot@users.noreply.github.com>
</commit_message>
<xml_diff>
--- a/docs/BADGE-PIANO.docx
+++ b/docs/BADGE-PIANO.docx
@@ -90,7 +90,7 @@
         <w:rPr>
           <w:b w:val="0"/>
         </w:rPr>
-        <w:t xml:space="preserve"> fino a Critico (C1) pubblicato; Passaparola (C2) completato localmente e in attesa di rollout</w:t>
+        <w:t xml:space="preserve"> catalogo badge V1 fino a Passaparola (C2) pubblicato e verificato in produzione</w:t>
       </w:r>
     </w:p>
     <w:p>
@@ -13602,6 +13602,162 @@
         <w:t>typecheck e lint mirato superati.</w:t>
       </w:r>
     </w:p>
+    <w:p>
+      <w:pPr>
+        <w:pStyle w:val="Compact"/>
+        <w:numPr>
+          <w:ilvl w:val="0"/>
+          <w:numId w:val="1084"/>
+        </w:numPr>
+      </w:pPr>
+      <w:r>
+        <w:t>bundle monolitico verificato e distribuito con loader, routing e autorizzazione cross-user Passaparola;</w:t>
+      </w:r>
+    </w:p>
+    <w:p>
+      <w:pPr>
+        <w:pStyle w:val="Compact"/>
+        <w:numPr>
+          <w:ilvl w:val="0"/>
+          <w:numId w:val="1084"/>
+        </w:numPr>
+      </w:pPr>
+      <w:r>
+        <w:t>migration 0027_word_of_mouth_badge.sql applicata in produzione;</w:t>
+      </w:r>
+    </w:p>
+    <w:p>
+      <w:pPr>
+        <w:pStyle w:val="Compact"/>
+        <w:numPr>
+          <w:ilvl w:val="0"/>
+          <w:numId w:val="1084"/>
+        </w:numPr>
+      </w:pPr>
+      <w:r>
+        <w:t>test SQL transazionale superato senza dati residui;</w:t>
+      </w:r>
+    </w:p>
+    <w:p>
+      <w:pPr>
+        <w:pStyle w:val="Compact"/>
+        <w:numPr>
+          <w:ilvl w:val="0"/>
+          <w:numId w:val="1084"/>
+        </w:numPr>
+      </w:pPr>
+      <w:r>
+        <w:t>deploy Azure completato sul commit 11dcaf3, run 37600140951;</w:t>
+      </w:r>
+    </w:p>
+    <w:p>
+      <w:pPr>
+        <w:pStyle w:val="Compact"/>
+        <w:numPr>
+          <w:ilvl w:val="0"/>
+          <w:numId w:val="1084"/>
+        </w:numPr>
+      </w:pPr>
+      <w:r>
+        <w:t>account @testshowtime: backfill reale 0/25, nessuno sblocco, hero 3/43;</w:t>
+      </w:r>
+    </w:p>
+    <w:p>
+      <w:pPr>
+        <w:pStyle w:val="Compact"/>
+        <w:numPr>
+          <w:ilvl w:val="0"/>
+          <w:numId w:val="1084"/>
+        </w:numPr>
+      </w:pPr>
+      <w:r>
+        <w:t>secondo refresh reale: 0 nuovi sblocchi;</w:t>
+      </w:r>
+    </w:p>
+    <w:p>
+      <w:pPr>
+        <w:pStyle w:val="Compact"/>
+        <w:numPr>
+          <w:ilvl w:val="0"/>
+          <w:numId w:val="1084"/>
+        </w:numPr>
+      </w:pPr>
+      <w:r>
+        <w:t>test cross-user autorizzato sul profilo ale: 5 coppie reali + 20 temporanee hanno prodotto 25/100 e un solo Bronzo sul mittente;</w:t>
+      </w:r>
+    </w:p>
+    <w:p>
+      <w:pPr>
+        <w:pStyle w:val="Compact"/>
+        <w:numPr>
+          <w:ilvl w:val="0"/>
+          <w:numId w:val="1084"/>
+        </w:numPr>
+      </w:pPr>
+      <w:r>
+        <w:t>risposta al destinatario verificata con 200, totalNewUnlocks: 0 e results: [];</w:t>
+      </w:r>
+    </w:p>
+    <w:p>
+      <w:pPr>
+        <w:pStyle w:val="Compact"/>
+        <w:numPr>
+          <w:ilvl w:val="0"/>
+          <w:numId w:val="1084"/>
+        </w:numPr>
+      </w:pPr>
+      <w:r>
+        <w:t>seconda riconciliazione autorizzata idempotente, senza duplicare lo sblocco;</w:t>
+      </w:r>
+    </w:p>
+    <w:p>
+      <w:pPr>
+        <w:pStyle w:val="Compact"/>
+        <w:numPr>
+          <w:ilvl w:val="0"/>
+          <w:numId w:val="1084"/>
+        </w:numPr>
+      </w:pPr>
+      <w:r>
+        <w:t>richiesta con Test come mittente, e quindi non destinatario, bloccata con 403 share_read_forbidden;</w:t>
+      </w:r>
+    </w:p>
+    <w:p>
+      <w:pPr>
+        <w:pStyle w:val="Compact"/>
+        <w:numPr>
+          <w:ilvl w:val="0"/>
+          <w:numId w:val="1084"/>
+        </w:numPr>
+      </w:pPr>
+      <w:r>
+        <w:t>account Test rimasto invariato a 0/25;</w:t>
+      </w:r>
+    </w:p>
+    <w:p>
+      <w:pPr>
+        <w:pStyle w:val="Compact"/>
+        <w:numPr>
+          <w:ilvl w:val="0"/>
+          <w:numId w:val="1084"/>
+        </w:numPr>
+      </w:pPr>
+      <w:r>
+        <w:t>rollback completo verificato: 21 condivisioni temporanee eliminate, profilo ale tornato a 5 coppie reali senza progressi o sblocchi Passaparola persistiti;</w:t>
+      </w:r>
+    </w:p>
+    <w:p>
+      <w:pPr>
+        <w:pStyle w:val="Compact"/>
+        <w:numPr>
+          <w:ilvl w:val="0"/>
+          <w:numId w:val="1084"/>
+        </w:numPr>
+      </w:pPr>
+      <w:r>
+        <w:t>produzione verificata senza overflow a 360/390 px e senza errori console.</w:t>
+      </w:r>
+    </w:p>
     <w:bookmarkEnd w:id="88"/>
     <w:bookmarkEnd w:id="89"/>
     <w:bookmarkStart w:id="90" w:name="fase-4-profilo-e-rifiniture"/>
@@ -15209,6 +15365,18 @@
       </w:r>
     </w:p>
     <w:p>
+      <w:pPr>
+        <w:pStyle w:val="Compact"/>
+        <w:numPr>
+          <w:ilvl w:val="0"/>
+          <w:numId w:val="1159"/>
+        </w:numPr>
+      </w:pPr>
+      <w:r>
+        <w:t>Secondo batch Diario e Social: Passaparola</w:t>
+      </w:r>
+    </w:p>
+    <w:p>
       <w:r>
         <w:pict>
           <v:rect style="width:0;height:1.5pt" o:hralign="center" o:hrstd="t" o:hr="t"/>
@@ -15242,13 +15410,13 @@
         <w:rPr>
           <w:b w:val="0"/>
         </w:rPr>
-        <w:t xml:space="preserve">Il prossimo passo operativo è completare il rollout di </w:t>
+        <w:t xml:space="preserve">Il prossimo passo operativo è la </w:t>
       </w:r>
       <w:r>
         <w:rPr>
           <w:b/>
         </w:rPr>
-        <w:t>Passaparola</w:t>
+        <w:t>selezione dei badge pubblici</w:t>
       </w:r>
       <w:r>
         <w:rPr>
@@ -15266,7 +15434,7 @@
         </w:numPr>
       </w:pPr>
       <w:r>
-        <w:t>distribuire la Edge Function con riconciliazione cross-user;</w:t>
+        <w:t>permettere di scegliere fino a 3 badge sbloccati;</w:t>
       </w:r>
     </w:p>
     <w:p>
@@ -15278,7 +15446,7 @@
         </w:numPr>
       </w:pPr>
       <w:r>
-        <w:t>pubblicare la patch con condivisione e conferma di lettura;</w:t>
+        <w:t>mostrare la selezione nel profilo personale;</w:t>
       </w:r>
     </w:p>
     <w:p>
@@ -15290,7 +15458,7 @@
         </w:numPr>
       </w:pPr>
       <w:r>
-        <w:t>applicare la migration 0027_word_of_mouth_badge.sql;</w:t>
+        <w:t>esporre soltanto i badge scelti ai follower accettati;</w:t>
       </w:r>
     </w:p>
     <w:p>
@@ -15302,7 +15470,7 @@
         </w:numPr>
       </w:pPr>
       <w:r>
-        <w:t>eseguire il test SQL transazionale;</w:t>
+        <w:t>mantenere privati progressi, badge bloccati ed evidenze;</w:t>
       </w:r>
     </w:p>
     <w:p>
@@ -15314,7 +15482,7 @@
         </w:numPr>
       </w:pPr>
       <w:r>
-        <w:t>verificare backfill, privacy e idempotenza sugli account reali;</w:t>
+        <w:t>gestire ordine, sostituzione e rimozione della selezione;</w:t>
       </w:r>
     </w:p>
     <w:p>
@@ -15326,7 +15494,7 @@
         </w:numPr>
       </w:pPr>
       <w:r>
-        <w:t>completare un test live reversibile.</w:t>
+        <w:t>verificare accessibilità e layout mobile.</w:t>
       </w:r>
     </w:p>
     <w:bookmarkEnd w:id="103"/>

</xml_diff>

<commit_message>
Add compact profile trophies
Co-authored-by: Copilot <223556219+Copilot@users.noreply.github.com>
</commit_message>
<xml_diff>
--- a/docs/BADGE-PIANO.docx
+++ b/docs/BADGE-PIANO.docx
@@ -90,7 +90,7 @@
         <w:rPr>
           <w:b w:val="0"/>
         </w:rPr>
-        <w:t xml:space="preserve"> catalogo badge V1 fino a Passaparola (C2) pubblicato e verificato in produzione</w:t>
+        <w:t xml:space="preserve"> catalogo badge V1 pubblicato; trofei profilo (Fase 4.1) completati localmente e in attesa di rollout</w:t>
       </w:r>
     </w:p>
     <w:p>
@@ -8022,19 +8022,103 @@
         <w:pStyle w:val="FirstParagraph"/>
       </w:pPr>
       <w:r>
-        <w:t xml:space="preserve">Ogni utente può scegliere fino a 3 badge sbloccati da mettere in evidenza.</w:t>
-      </w:r>
-      <w:r>
-        <w:t xml:space="preserve"> </w:t>
-      </w:r>
-      <w:r>
-        <w:t xml:space="preserve">I badge selezionati sono visibili a tutti i follower accettati, con le stesse regole di</w:t>
-      </w:r>
-      <w:r>
-        <w:t xml:space="preserve"> </w:t>
-      </w:r>
-      <w:r>
-        <w:t xml:space="preserve">accesso già usate per Libreria e Diario.</w:t>
+        <w:t>Il profilo mostra automaticamente tutti i badge sbloccati.</w:t>
+      </w:r>
+    </w:p>
+    <w:p>
+      <w:pPr>
+        <w:pStyle w:val="Compact"/>
+        <w:numPr>
+          <w:ilvl w:val="0"/>
+          <w:numId w:val="1048"/>
+        </w:numPr>
+      </w:pPr>
+      <w:r>
+        <w:t>Per ogni famiglia progressiva viene mostrato soltanto il livello permanente più alto.</w:t>
+      </w:r>
+    </w:p>
+    <w:p>
+      <w:pPr>
+        <w:pStyle w:val="Compact"/>
+        <w:numPr>
+          <w:ilvl w:val="0"/>
+          <w:numId w:val="1048"/>
+        </w:numPr>
+      </w:pPr>
+      <w:r>
+        <w:t>I badge introduttivi vengono mostrati singolarmente.</w:t>
+      </w:r>
+    </w:p>
+    <w:p>
+      <w:pPr>
+        <w:pStyle w:val="Compact"/>
+        <w:numPr>
+          <w:ilvl w:val="0"/>
+          <w:numId w:val="1048"/>
+        </w:numPr>
+      </w:pPr>
+      <w:r>
+        <w:t>Non è richiesta una selezione manuale.</w:t>
+      </w:r>
+    </w:p>
+    <w:p>
+      <w:pPr>
+        <w:pStyle w:val="Compact"/>
+        <w:numPr>
+          <w:ilvl w:val="0"/>
+          <w:numId w:val="1048"/>
+        </w:numPr>
+      </w:pPr>
+      <w:r>
+        <w:t>La griglia è identica sul profilo personale e per tutti i follower accettati.</w:t>
+      </w:r>
+    </w:p>
+    <w:p>
+      <w:pPr>
+        <w:pStyle w:val="Compact"/>
+        <w:numPr>
+          <w:ilvl w:val="0"/>
+          <w:numId w:val="1048"/>
+        </w:numPr>
+      </w:pPr>
+      <w:r>
+        <w:t>L’accesso usa le stesse regole già applicate a Libreria e Diario.</w:t>
+      </w:r>
+    </w:p>
+    <w:p>
+      <w:pPr>
+        <w:pStyle w:val="Compact"/>
+        <w:numPr>
+          <w:ilvl w:val="0"/>
+          <w:numId w:val="1048"/>
+        </w:numPr>
+      </w:pPr>
+      <w:r>
+        <w:t>L’ordine privilegia Platino, Oro, Argento e Bronzo; i badge introduttivi seguono.</w:t>
+      </w:r>
+    </w:p>
+    <w:p>
+      <w:pPr>
+        <w:pStyle w:val="Compact"/>
+        <w:numPr>
+          <w:ilvl w:val="0"/>
+          <w:numId w:val="1048"/>
+        </w:numPr>
+      </w:pPr>
+      <w:r>
+        <w:t>A parità di metallo resta valido l’ordine della Sala trofei.</w:t>
+      </w:r>
+    </w:p>
+    <w:p>
+      <w:pPr>
+        <w:pStyle w:val="Compact"/>
+        <w:numPr>
+          <w:ilvl w:val="0"/>
+          <w:numId w:val="1048"/>
+        </w:numPr>
+      </w:pPr>
+      <w:r>
+        <w:t>Oltre 6 trofei la sezione parte compatta e offre Mostra tutti / Mostra meno.</w:t>
       </w:r>
     </w:p>
     <w:p>
@@ -8043,6 +8127,18 @@
       </w:pPr>
       <w:r>
         <w:t xml:space="preserve">Da mantenere privati:</w:t>
+      </w:r>
+    </w:p>
+    <w:p>
+      <w:pPr>
+        <w:pStyle w:val="Compact"/>
+        <w:numPr>
+          <w:ilvl w:val="0"/>
+          <w:numId w:val="1048"/>
+        </w:numPr>
+      </w:pPr>
+      <w:r>
+        <w:t>livelli inferiori della stessa famiglia;</w:t>
       </w:r>
     </w:p>
     <w:p>
@@ -13778,7 +13874,7 @@
         </w:numPr>
       </w:pPr>
       <w:r>
-        <w:t xml:space="preserve">Selezione di 1–3 badge pubblici</w:t>
+        <w:t>Tutti i badge sbloccati sul profilo, uno per famiglia al livello più alto</w:t>
       </w:r>
     </w:p>
     <w:p>
@@ -13790,7 +13886,7 @@
         </w:numPr>
       </w:pPr>
       <w:r>
-        <w:t xml:space="preserve">Badge in evidenza sul profilo follower</w:t>
+        <w:t>Griglia trofei compatta sul profilo personale e follower</w:t>
       </w:r>
     </w:p>
     <w:p>
@@ -13839,6 +13935,242 @@
       </w:pPr>
       <w:r>
         <w:t xml:space="preserve">Riconciliazione completa</w:t>
+      </w:r>
+    </w:p>
+    <w:p>
+      <w:pPr>
+        <w:pStyle w:val="Heading3"/>
+      </w:pPr>
+      <w:r>
+        <w:t>Verifica Fase 4.1 — Trofei profilo</w:t>
+      </w:r>
+    </w:p>
+    <w:p>
+      <w:pPr>
+        <w:pStyle w:val="Compact"/>
+        <w:numPr>
+          <w:ilvl w:val="0"/>
+          <w:numId w:val="1048"/>
+        </w:numPr>
+      </w:pPr>
+      <w:r>
+        <w:t>nuova RPC get_followed_profile_badges protetta da require_viewable_profile;</w:t>
+      </w:r>
+    </w:p>
+    <w:p>
+      <w:pPr>
+        <w:pStyle w:val="Compact"/>
+        <w:numPr>
+          <w:ilvl w:val="0"/>
+          <w:numId w:val="1048"/>
+        </w:numPr>
+      </w:pPr>
+      <w:r>
+        <w:t>stesso accesso del profilo: proprietario o follower accettato;</w:t>
+      </w:r>
+    </w:p>
+    <w:p>
+      <w:pPr>
+        <w:pStyle w:val="Compact"/>
+        <w:numPr>
+          <w:ilvl w:val="0"/>
+          <w:numId w:val="1048"/>
+        </w:numPr>
+      </w:pPr>
+      <w:r>
+        <w:t>restituisce soltanto famiglie sbloccate e un’unica riga per badge;</w:t>
+      </w:r>
+    </w:p>
+    <w:p>
+      <w:pPr>
+        <w:pStyle w:val="Compact"/>
+        <w:numPr>
+          <w:ilvl w:val="0"/>
+          <w:numId w:val="1048"/>
+        </w:numPr>
+      </w:pPr>
+      <w:r>
+        <w:t>selezione server-side del livello numerico più alto, indipendente dal progresso corrente;</w:t>
+      </w:r>
+    </w:p>
+    <w:p>
+      <w:pPr>
+        <w:pStyle w:val="Compact"/>
+        <w:numPr>
+          <w:ilvl w:val="0"/>
+          <w:numId w:val="1048"/>
+        </w:numPr>
+      </w:pPr>
+      <w:r>
+        <w:t>badge introduttivi inclusi come traguardi singoli;</w:t>
+      </w:r>
+    </w:p>
+    <w:p>
+      <w:pPr>
+        <w:pStyle w:val="Compact"/>
+        <w:numPr>
+          <w:ilvl w:val="0"/>
+          <w:numId w:val="1048"/>
+        </w:numPr>
+      </w:pPr>
+      <w:r>
+        <w:t>nessuna esposizione di progresso, soglia, badge bloccati, evidenze o livelli inferiori;</w:t>
+      </w:r>
+    </w:p>
+    <w:p>
+      <w:pPr>
+        <w:pStyle w:val="Compact"/>
+        <w:numPr>
+          <w:ilvl w:val="0"/>
+          <w:numId w:val="1048"/>
+        </w:numPr>
+      </w:pPr>
+      <w:r>
+        <w:t>renderer patch condiviso tra Sala trofei e profilo;</w:t>
+      </w:r>
+    </w:p>
+    <w:p>
+      <w:pPr>
+        <w:pStyle w:val="Compact"/>
+        <w:numPr>
+          <w:ilvl w:val="0"/>
+          <w:numId w:val="1048"/>
+        </w:numPr>
+      </w:pPr>
+      <w:r>
+        <w:t>ordine per valore: Platino, Oro, Argento, Bronzo, poi badge introduttivi;</w:t>
+      </w:r>
+    </w:p>
+    <w:p>
+      <w:pPr>
+        <w:pStyle w:val="Compact"/>
+        <w:numPr>
+          <w:ilvl w:val="0"/>
+          <w:numId w:val="1048"/>
+        </w:numPr>
+      </w:pPr>
+      <w:r>
+        <w:t>ordine Sala trofei usato come spareggio tra badge dello stesso metallo;</w:t>
+      </w:r>
+    </w:p>
+    <w:p>
+      <w:pPr>
+        <w:pStyle w:val="Compact"/>
+        <w:numPr>
+          <w:ilvl w:val="0"/>
+          <w:numId w:val="1048"/>
+        </w:numPr>
+      </w:pPr>
+      <w:r>
+        <w:t>griglia compatta a tre colonne su mobile e fluida su schermi più ampi;</w:t>
+      </w:r>
+    </w:p>
+    <w:p>
+      <w:pPr>
+        <w:pStyle w:val="Compact"/>
+        <w:numPr>
+          <w:ilvl w:val="0"/>
+          <w:numId w:val="1048"/>
+        </w:numPr>
+      </w:pPr>
+      <w:r>
+        <w:t>massimo 6 trofei iniziali, con toggle Mostra tutti / Mostra meno oltre la soglia;</w:t>
+      </w:r>
+    </w:p>
+    <w:p>
+      <w:pPr>
+        <w:pStyle w:val="Compact"/>
+        <w:numPr>
+          <w:ilvl w:val="0"/>
+          <w:numId w:val="1048"/>
+        </w:numPr>
+      </w:pPr>
+      <w:r>
+        <w:t>errore trofei isolato: Libreria e Diario del profilo restano disponibili;</w:t>
+      </w:r>
+    </w:p>
+    <w:p>
+      <w:pPr>
+        <w:pStyle w:val="Compact"/>
+        <w:numPr>
+          <w:ilvl w:val="0"/>
+          <w:numId w:val="1048"/>
+        </w:numPr>
+      </w:pPr>
+      <w:r>
+        <w:t>migration 0028_profile_trophies.sql e test SQL del massimo livello pronti;</w:t>
+      </w:r>
+    </w:p>
+    <w:p>
+      <w:pPr>
+        <w:pStyle w:val="Compact"/>
+        <w:numPr>
+          <w:ilvl w:val="0"/>
+          <w:numId w:val="1048"/>
+        </w:numPr>
+      </w:pPr>
+      <w:r>
+        <w:t>preview profilo Test: 3 trofei introduttivi reali in una riga;</w:t>
+      </w:r>
+    </w:p>
+    <w:p>
+      <w:pPr>
+        <w:pStyle w:val="Compact"/>
+        <w:numPr>
+          <w:ilvl w:val="0"/>
+          <w:numId w:val="1048"/>
+        </w:numPr>
+      </w:pPr>
+      <w:r>
+        <w:t>preview follower ale: 6 trofei reali in due righe, Cinefilo Argento ed Esploratore di generi Platino;</w:t>
+      </w:r>
+    </w:p>
+    <w:p>
+      <w:pPr>
+        <w:pStyle w:val="Compact"/>
+        <w:numPr>
+          <w:ilvl w:val="0"/>
+          <w:numId w:val="1048"/>
+        </w:numPr>
+      </w:pPr>
+      <w:r>
+        <w:t>Critico correttamente escluso dal profilo ale: progresso 4/50, nessuno sblocco;</w:t>
+      </w:r>
+    </w:p>
+    <w:p>
+      <w:pPr>
+        <w:pStyle w:val="Compact"/>
+        <w:numPr>
+          <w:ilvl w:val="0"/>
+          <w:numId w:val="1048"/>
+        </w:numPr>
+      </w:pPr>
+      <w:r>
+        <w:t>nessun overflow o errore console a 360 e 390 px;</w:t>
+      </w:r>
+    </w:p>
+    <w:p>
+      <w:pPr>
+        <w:pStyle w:val="Compact"/>
+        <w:numPr>
+          <w:ilvl w:val="0"/>
+          <w:numId w:val="1048"/>
+        </w:numPr>
+      </w:pPr>
+      <w:r>
+        <w:t>51/51 test badge e 3/3 test statistiche superati;</w:t>
+      </w:r>
+    </w:p>
+    <w:p>
+      <w:pPr>
+        <w:pStyle w:val="Compact"/>
+        <w:numPr>
+          <w:ilvl w:val="0"/>
+          <w:numId w:val="1048"/>
+        </w:numPr>
+      </w:pPr>
+      <w:r>
+        <w:t>typecheck e lint mirato superati.</w:t>
       </w:r>
     </w:p>
     <w:bookmarkEnd w:id="90"/>
@@ -14070,7 +14402,7 @@
         </w:numPr>
       </w:pPr>
       <w:r>
-        <w:t xml:space="preserve">Le superfici follower espongono solo badge scelti dall’utente.</w:t>
+        <w:t>Le superfici follower espongono solo il massimo livello sbloccato di ogni famiglia.</w:t>
       </w:r>
     </w:p>
     <w:p>
@@ -14900,7 +15232,7 @@
         </w:numPr>
       </w:pPr>
       <w:r>
-        <w:t xml:space="preserve">Fino a 3 badge pubblici scelti dall’utente</w:t>
+        <w:t>Tutti i badge sbloccati sono visibili ai follower accettati</w:t>
       </w:r>
     </w:p>
     <w:p>
@@ -14912,7 +15244,43 @@
         </w:numPr>
       </w:pPr>
       <w:r>
-        <w:t xml:space="preserve">Badge pubblici visibili a tutti i follower accettati</w:t>
+        <w:t>Un solo badge per famiglia, sempre al livello permanente più alto</w:t>
+      </w:r>
+    </w:p>
+    <w:p>
+      <w:pPr>
+        <w:pStyle w:val="Compact"/>
+        <w:numPr>
+          <w:ilvl w:val="0"/>
+          <w:numId w:val="1048"/>
+        </w:numPr>
+      </w:pPr>
+      <w:r>
+        <w:t>Badge introduttivi visibili come traguardi singoli</w:t>
+      </w:r>
+    </w:p>
+    <w:p>
+      <w:pPr>
+        <w:pStyle w:val="Compact"/>
+        <w:numPr>
+          <w:ilvl w:val="0"/>
+          <w:numId w:val="1048"/>
+        </w:numPr>
+      </w:pPr>
+      <w:r>
+        <w:t>Ordinamento per metallo; badge introduttivi dopo quelli progressivi</w:t>
+      </w:r>
+    </w:p>
+    <w:p>
+      <w:pPr>
+        <w:pStyle w:val="Compact"/>
+        <w:numPr>
+          <w:ilvl w:val="0"/>
+          <w:numId w:val="1048"/>
+        </w:numPr>
+      </w:pPr>
+      <w:r>
+        <w:t>Sezione compatta a 6 trofei con espansione opzionale</w:t>
       </w:r>
     </w:p>
     <w:p>
@@ -15410,13 +15778,13 @@
         <w:rPr>
           <w:b w:val="0"/>
         </w:rPr>
-        <w:t xml:space="preserve">Il prossimo passo operativo è la </w:t>
+        <w:t xml:space="preserve">Il prossimo passo operativo è completare il rollout dei </w:t>
       </w:r>
       <w:r>
         <w:rPr>
           <w:b/>
         </w:rPr>
-        <w:t>selezione dei badge pubblici</w:t>
+        <w:t>trofei profilo</w:t>
       </w:r>
       <w:r>
         <w:rPr>
@@ -15434,7 +15802,7 @@
         </w:numPr>
       </w:pPr>
       <w:r>
-        <w:t>permettere di scegliere fino a 3 badge sbloccati;</w:t>
+        <w:t>applicare la migration 0028_profile_trophies.sql;</w:t>
       </w:r>
     </w:p>
     <w:p>
@@ -15446,7 +15814,7 @@
         </w:numPr>
       </w:pPr>
       <w:r>
-        <w:t>mostrare la selezione nel profilo personale;</w:t>
+        <w:t>eseguire il test SQL del livello massimo per famiglia;</w:t>
       </w:r>
     </w:p>
     <w:p>
@@ -15458,7 +15826,7 @@
         </w:numPr>
       </w:pPr>
       <w:r>
-        <w:t>esporre soltanto i badge scelti ai follower accettati;</w:t>
+        <w:t>pubblicare la griglia compatta;</w:t>
       </w:r>
     </w:p>
     <w:p>
@@ -15470,7 +15838,7 @@
         </w:numPr>
       </w:pPr>
       <w:r>
-        <w:t>mantenere privati progressi, badge bloccati ed evidenze;</w:t>
+        <w:t>verificare profilo personale e follower accettato con dati reali;</w:t>
       </w:r>
     </w:p>
     <w:p>
@@ -15482,7 +15850,7 @@
         </w:numPr>
       </w:pPr>
       <w:r>
-        <w:t>gestire ordine, sostituzione e rimozione della selezione;</w:t>
+        <w:t>controllare che nessun dato privato venga restituito;</w:t>
       </w:r>
     </w:p>
     <w:p>
@@ -15494,7 +15862,7 @@
         </w:numPr>
       </w:pPr>
       <w:r>
-        <w:t>verificare accessibilità e layout mobile.</w:t>
+        <w:t>completare lo smoke responsive in produzione.</w:t>
       </w:r>
     </w:p>
     <w:bookmarkEnd w:id="103"/>

</xml_diff>

<commit_message>
Document profile trophy rollout
Co-authored-by: Copilot <223556219+Copilot@users.noreply.github.com>
</commit_message>
<xml_diff>
--- a/docs/BADGE-PIANO.docx
+++ b/docs/BADGE-PIANO.docx
@@ -90,7 +90,7 @@
         <w:rPr>
           <w:b w:val="0"/>
         </w:rPr>
-        <w:t xml:space="preserve"> catalogo badge V1 pubblicato; trofei profilo (Fase 4.1) completati localmente e in attesa di rollout</w:t>
+        <w:t xml:space="preserve"> catalogo badge V1 e trofei profilo (Fase 4.1) pubblicati e verificati in produzione</w:t>
       </w:r>
     </w:p>
     <w:p>
@@ -14173,6 +14173,138 @@
         <w:t>typecheck e lint mirato superati.</w:t>
       </w:r>
     </w:p>
+    <w:p>
+      <w:pPr>
+        <w:pStyle w:val="Compact"/>
+        <w:numPr>
+          <w:ilvl w:val="0"/>
+          <w:numId w:val="1048"/>
+        </w:numPr>
+      </w:pPr>
+      <w:r>
+        <w:t>migration 0028_profile_trophies.sql applicata in produzione;</w:t>
+      </w:r>
+    </w:p>
+    <w:p>
+      <w:pPr>
+        <w:pStyle w:val="Compact"/>
+        <w:numPr>
+          <w:ilvl w:val="0"/>
+          <w:numId w:val="1048"/>
+        </w:numPr>
+      </w:pPr>
+      <w:r>
+        <w:t>test SQL transazionale superato: Cinefilo restituito una sola volta al livello 2;</w:t>
+      </w:r>
+    </w:p>
+    <w:p>
+      <w:pPr>
+        <w:pStyle w:val="Compact"/>
+        <w:numPr>
+          <w:ilvl w:val="0"/>
+          <w:numId w:val="1048"/>
+        </w:numPr>
+      </w:pPr>
+      <w:r>
+        <w:t>deploy Azure completato sul commit d44bfc5, run 37610160775;</w:t>
+      </w:r>
+    </w:p>
+    <w:p>
+      <w:pPr>
+        <w:pStyle w:val="Compact"/>
+        <w:numPr>
+          <w:ilvl w:val="0"/>
+          <w:numId w:val="1048"/>
+        </w:numPr>
+      </w:pPr>
+      <w:r>
+        <w:t>profilo Test reale: 3 trofei introduttivi e nessun controllo di espansione;</w:t>
+      </w:r>
+    </w:p>
+    <w:p>
+      <w:pPr>
+        <w:pStyle w:val="Compact"/>
+        <w:numPr>
+          <w:ilvl w:val="0"/>
+          <w:numId w:val="1048"/>
+        </w:numPr>
+      </w:pPr>
+      <w:r>
+        <w:t>profilo ale reale: 6 trofei ordinati Esploratore Platino, Cinefilo Argento, Serialista Bronzo e tre introduttivi;</w:t>
+      </w:r>
+    </w:p>
+    <w:p>
+      <w:pPr>
+        <w:pStyle w:val="Compact"/>
+        <w:numPr>
+          <w:ilvl w:val="0"/>
+          <w:numId w:val="1048"/>
+        </w:numPr>
+      </w:pPr>
+      <w:r>
+        <w:t>Critico escluso correttamente dal profilo ale con progresso 4/50 ma nessuno sblocco;</w:t>
+      </w:r>
+    </w:p>
+    <w:p>
+      <w:pPr>
+        <w:pStyle w:val="Compact"/>
+        <w:numPr>
+          <w:ilvl w:val="0"/>
+          <w:numId w:val="1048"/>
+        </w:numPr>
+      </w:pPr>
+      <w:r>
+        <w:t>risposta RPC verificata con soli 7 campi pubblici, senza progresso, soglie o evidenze;</w:t>
+      </w:r>
+    </w:p>
+    <w:p>
+      <w:pPr>
+        <w:pStyle w:val="Compact"/>
+        <w:numPr>
+          <w:ilvl w:val="0"/>
+          <w:numId w:val="1048"/>
+        </w:numPr>
+      </w:pPr>
+      <w:r>
+        <w:t>accesso Test verso arianna8 bloccato con 403, confermando require_viewable_profile;</w:t>
+      </w:r>
+    </w:p>
+    <w:p>
+      <w:pPr>
+        <w:pStyle w:val="Compact"/>
+        <w:numPr>
+          <w:ilvl w:val="0"/>
+          <w:numId w:val="1048"/>
+        </w:numPr>
+      </w:pPr>
+      <w:r>
+        <w:t>chiamata RPC nel contesto proprietario arianna8 verificata con 8 famiglie;</w:t>
+      </w:r>
+    </w:p>
+    <w:p>
+      <w:pPr>
+        <w:pStyle w:val="Compact"/>
+        <w:numPr>
+          <w:ilvl w:val="0"/>
+          <w:numId w:val="1048"/>
+        </w:numPr>
+      </w:pPr>
+      <w:r>
+        <w:t>limite 6, espansione a 8 e ritorno a 6 coperti dal test automatico;</w:t>
+      </w:r>
+    </w:p>
+    <w:p>
+      <w:pPr>
+        <w:pStyle w:val="Compact"/>
+        <w:numPr>
+          <w:ilvl w:val="0"/>
+          <w:numId w:val="1048"/>
+        </w:numPr>
+      </w:pPr>
+      <w:r>
+        <w:t>produzione senza overflow sul profilo ale a 390 px e senza errori console.</w:t>
+      </w:r>
+    </w:p>
     <w:bookmarkEnd w:id="90"/>
     <w:bookmarkStart w:id="91" w:name="fase-5-crediti-tmdb"/>
     <w:p>
@@ -15778,13 +15910,13 @@
         <w:rPr>
           <w:b w:val="0"/>
         </w:rPr>
-        <w:t xml:space="preserve">Il prossimo passo operativo è completare il rollout dei </w:t>
+        <w:t>Il prossimo passo operativo è l’</w:t>
       </w:r>
       <w:r>
         <w:rPr>
           <w:b/>
         </w:rPr>
-        <w:t>trofei profilo</w:t>
+        <w:t>accessibilità della Sala trofei e dei profili</w:t>
       </w:r>
       <w:r>
         <w:rPr>
@@ -15802,7 +15934,7 @@
         </w:numPr>
       </w:pPr>
       <w:r>
-        <w:t>applicare la migration 0028_profile_trophies.sql;</w:t>
+        <w:t>verificare ordine di lettura e label di tutte le patch;</w:t>
       </w:r>
     </w:p>
     <w:p>
@@ -15814,7 +15946,7 @@
         </w:numPr>
       </w:pPr>
       <w:r>
-        <w:t>eseguire il test SQL del livello massimo per famiglia;</w:t>
+        <w:t>controllare contrasto di testo, metalli e stati bloccati;</w:t>
       </w:r>
     </w:p>
     <w:p>
@@ -15826,7 +15958,7 @@
         </w:numPr>
       </w:pPr>
       <w:r>
-        <w:t>pubblicare la griglia compatta;</w:t>
+        <w:t>validare focus, tastiera e controlli Mostra tutti / Mostra meno sul web;</w:t>
       </w:r>
     </w:p>
     <w:p>
@@ -15838,7 +15970,7 @@
         </w:numPr>
       </w:pPr>
       <w:r>
-        <w:t>verificare profilo personale e follower accettato con dati reali;</w:t>
+        <w:t>verificare dimensioni minime dei target touch;</w:t>
       </w:r>
     </w:p>
     <w:p>
@@ -15850,7 +15982,7 @@
         </w:numPr>
       </w:pPr>
       <w:r>
-        <w:t>controllare che nessun dato privato venga restituito;</w:t>
+        <w:t>testare ridimensionamento testo e layout mobile;</w:t>
       </w:r>
     </w:p>
     <w:p>
@@ -15862,7 +15994,7 @@
         </w:numPr>
       </w:pPr>
       <w:r>
-        <w:t>completare lo smoke responsive in produzione.</w:t>
+        <w:t>documentare gli eventuali aggiustamenti.</w:t>
       </w:r>
     </w:p>
     <w:bookmarkEnd w:id="103"/>

</xml_diff>